<commit_message>
diagram pu i opis
</commit_message>
<xml_diff>
--- a/projektFirmaRolnicza.docx
+++ b/projektFirmaRolnicza.docx
@@ -6,12 +6,14 @@
       <w:pPr>
         <w:jc w:val="both"/>
         <w:rPr>
+          <w:rFonts w:ascii="Times New Roman" w:hAnsi="Times New Roman" w:cs="Times New Roman"/>
           <w:b/>
           <w:bCs/>
         </w:rPr>
       </w:pPr>
       <w:r>
         <w:rPr>
+          <w:rFonts w:ascii="Times New Roman" w:hAnsi="Times New Roman" w:cs="Times New Roman"/>
           <w:b/>
           <w:bCs/>
         </w:rPr>
@@ -19,6 +21,7 @@
       </w:r>
       <w:r>
         <w:rPr>
+          <w:rFonts w:ascii="Times New Roman" w:hAnsi="Times New Roman" w:cs="Times New Roman"/>
           <w:b/>
           <w:bCs/>
         </w:rPr>
@@ -26,6 +29,7 @@
       </w:r>
       <w:r>
         <w:rPr>
+          <w:rFonts w:ascii="Times New Roman" w:hAnsi="Times New Roman" w:cs="Times New Roman"/>
           <w:b/>
           <w:bCs/>
         </w:rPr>
@@ -35,59 +39,80 @@
     <w:p>
       <w:pPr>
         <w:jc w:val="both"/>
-      </w:pPr>
-      <w:r>
-        <w:rPr>
+        <w:rPr>
+          <w:rFonts w:ascii="Times New Roman" w:hAnsi="Times New Roman" w:cs="Times New Roman"/>
+        </w:rPr>
+      </w:pPr>
+      <w:r>
+        <w:rPr>
+          <w:rFonts w:ascii="Times New Roman" w:hAnsi="Times New Roman" w:cs="Times New Roman"/>
           <w:b/>
           <w:bCs/>
         </w:rPr>
         <w:t>Przedmiot:</w:t>
       </w:r>
       <w:r>
-        <w:t xml:space="preserve"> </w:t>
-      </w:r>
-      <w:r>
-        <w:t xml:space="preserve">Inżynieria Oprogramowania </w:t>
-      </w:r>
-    </w:p>
-    <w:p>
-      <w:pPr>
-        <w:jc w:val="both"/>
-      </w:pPr>
-      <w:r>
-        <w:rPr>
+        <w:rPr>
+          <w:rFonts w:ascii="Times New Roman" w:hAnsi="Times New Roman" w:cs="Times New Roman"/>
+        </w:rPr>
+        <w:t xml:space="preserve"> Inżynieria Oprogramowania </w:t>
+      </w:r>
+    </w:p>
+    <w:p>
+      <w:pPr>
+        <w:jc w:val="both"/>
+        <w:rPr>
+          <w:rFonts w:ascii="Times New Roman" w:hAnsi="Times New Roman" w:cs="Times New Roman"/>
+        </w:rPr>
+      </w:pPr>
+      <w:r>
+        <w:rPr>
+          <w:rFonts w:ascii="Times New Roman" w:hAnsi="Times New Roman" w:cs="Times New Roman"/>
           <w:b/>
           <w:bCs/>
         </w:rPr>
         <w:t>Prowadzący:</w:t>
       </w:r>
       <w:r>
-        <w:t xml:space="preserve"> </w:t>
-      </w:r>
-      <w:r>
-        <w:t>Marcin Czajkowski</w:t>
-      </w:r>
-    </w:p>
-    <w:p>
-      <w:pPr>
-        <w:jc w:val="both"/>
-      </w:pPr>
-      <w:r>
-        <w:rPr>
+        <w:rPr>
+          <w:rFonts w:ascii="Times New Roman" w:hAnsi="Times New Roman" w:cs="Times New Roman"/>
+        </w:rPr>
+        <w:t xml:space="preserve"> Marcin Czajkowski</w:t>
+      </w:r>
+    </w:p>
+    <w:p>
+      <w:pPr>
+        <w:jc w:val="both"/>
+        <w:rPr>
+          <w:rFonts w:ascii="Times New Roman" w:hAnsi="Times New Roman" w:cs="Times New Roman"/>
+        </w:rPr>
+      </w:pPr>
+      <w:r>
+        <w:rPr>
+          <w:rFonts w:ascii="Times New Roman" w:hAnsi="Times New Roman" w:cs="Times New Roman"/>
           <w:b/>
           <w:bCs/>
         </w:rPr>
         <w:t>Data:</w:t>
       </w:r>
       <w:r>
+        <w:rPr>
+          <w:rFonts w:ascii="Times New Roman" w:hAnsi="Times New Roman" w:cs="Times New Roman"/>
+        </w:rPr>
         <w:t xml:space="preserve"> </w:t>
       </w:r>
     </w:p>
     <w:p>
       <w:pPr>
         <w:jc w:val="both"/>
-      </w:pPr>
-      <w:r>
+        <w:rPr>
+          <w:rFonts w:ascii="Times New Roman" w:hAnsi="Times New Roman" w:cs="Times New Roman"/>
+        </w:rPr>
+      </w:pPr>
+      <w:r>
+        <w:rPr>
+          <w:rFonts w:ascii="Times New Roman" w:hAnsi="Times New Roman" w:cs="Times New Roman"/>
+        </w:rPr>
         <w:pict w14:anchorId="25E70BDD">
           <v:rect id="_x0000_i1025" style="width:0;height:1.5pt" o:hralign="center" o:hrstd="t" o:hr="t" fillcolor="#a0a0a0" stroked="f"/>
         </w:pict>
@@ -97,12 +122,14 @@
       <w:pPr>
         <w:jc w:val="both"/>
         <w:rPr>
+          <w:rFonts w:ascii="Times New Roman" w:hAnsi="Times New Roman" w:cs="Times New Roman"/>
           <w:b/>
           <w:bCs/>
         </w:rPr>
       </w:pPr>
       <w:r>
         <w:rPr>
+          <w:rFonts w:ascii="Times New Roman" w:hAnsi="Times New Roman" w:cs="Times New Roman"/>
           <w:b/>
           <w:bCs/>
         </w:rPr>
@@ -116,9 +143,9 @@
         <w:tblLook w:val="04A0" w:firstRow="1" w:lastRow="0" w:firstColumn="1" w:lastColumn="0" w:noHBand="0" w:noVBand="1"/>
       </w:tblPr>
       <w:tblGrid>
-        <w:gridCol w:w="2614"/>
-        <w:gridCol w:w="1865"/>
-        <w:gridCol w:w="2498"/>
+        <w:gridCol w:w="2446"/>
+        <w:gridCol w:w="1819"/>
+        <w:gridCol w:w="2396"/>
       </w:tblGrid>
       <w:tr>
         <w:tc>
@@ -130,9 +157,13 @@
             <w:pPr>
               <w:spacing w:after="160" w:line="278" w:lineRule="auto"/>
               <w:jc w:val="both"/>
+              <w:rPr>
+                <w:rFonts w:ascii="Times New Roman" w:hAnsi="Times New Roman" w:cs="Times New Roman"/>
+              </w:rPr>
             </w:pPr>
             <w:r>
               <w:rPr>
+                <w:rFonts w:ascii="Times New Roman" w:hAnsi="Times New Roman" w:cs="Times New Roman"/>
                 <w:b/>
                 <w:bCs/>
               </w:rPr>
@@ -149,9 +180,13 @@
             <w:pPr>
               <w:spacing w:after="160" w:line="278" w:lineRule="auto"/>
               <w:jc w:val="both"/>
+              <w:rPr>
+                <w:rFonts w:ascii="Times New Roman" w:hAnsi="Times New Roman" w:cs="Times New Roman"/>
+              </w:rPr>
             </w:pPr>
             <w:r>
               <w:rPr>
+                <w:rFonts w:ascii="Times New Roman" w:hAnsi="Times New Roman" w:cs="Times New Roman"/>
                 <w:b/>
                 <w:bCs/>
               </w:rPr>
@@ -169,12 +204,14 @@
               <w:spacing w:after="160" w:line="278" w:lineRule="auto"/>
               <w:jc w:val="both"/>
               <w:rPr>
+                <w:rFonts w:ascii="Times New Roman" w:hAnsi="Times New Roman" w:cs="Times New Roman"/>
                 <w:b/>
                 <w:bCs/>
               </w:rPr>
             </w:pPr>
             <w:r>
               <w:rPr>
+                <w:rFonts w:ascii="Times New Roman" w:hAnsi="Times New Roman" w:cs="Times New Roman"/>
                 <w:b/>
                 <w:bCs/>
               </w:rPr>
@@ -193,9 +230,13 @@
             <w:pPr>
               <w:spacing w:after="160" w:line="278" w:lineRule="auto"/>
               <w:jc w:val="both"/>
+              <w:rPr>
+                <w:rFonts w:ascii="Times New Roman" w:hAnsi="Times New Roman" w:cs="Times New Roman"/>
+              </w:rPr>
             </w:pPr>
             <w:r>
               <w:rPr>
+                <w:rFonts w:ascii="Times New Roman" w:hAnsi="Times New Roman" w:cs="Times New Roman"/>
                 <w:b/>
                 <w:bCs/>
               </w:rPr>
@@ -204,6 +245,7 @@
             <w:proofErr w:type="spellStart"/>
             <w:r>
               <w:rPr>
+                <w:rFonts w:ascii="Times New Roman" w:hAnsi="Times New Roman" w:cs="Times New Roman"/>
                 <w:b/>
                 <w:bCs/>
               </w:rPr>
@@ -211,6 +253,7 @@
             </w:r>
             <w:r>
               <w:rPr>
+                <w:rFonts w:ascii="Times New Roman" w:hAnsi="Times New Roman" w:cs="Times New Roman"/>
                 <w:b/>
                 <w:bCs/>
               </w:rPr>
@@ -218,6 +261,7 @@
             </w:r>
             <w:r>
               <w:rPr>
+                <w:rFonts w:ascii="Times New Roman" w:hAnsi="Times New Roman" w:cs="Times New Roman"/>
                 <w:b/>
                 <w:bCs/>
               </w:rPr>
@@ -225,6 +269,7 @@
             </w:r>
             <w:r>
               <w:rPr>
+                <w:rFonts w:ascii="Times New Roman" w:hAnsi="Times New Roman" w:cs="Times New Roman"/>
                 <w:b/>
                 <w:bCs/>
               </w:rPr>
@@ -232,6 +277,7 @@
             </w:r>
             <w:r>
               <w:rPr>
+                <w:rFonts w:ascii="Times New Roman" w:hAnsi="Times New Roman" w:cs="Times New Roman"/>
                 <w:b/>
                 <w:bCs/>
               </w:rPr>
@@ -248,14 +294,26 @@
           <w:p>
             <w:pPr>
               <w:jc w:val="both"/>
+              <w:rPr>
+                <w:rFonts w:ascii="Times New Roman" w:hAnsi="Times New Roman" w:cs="Times New Roman"/>
+              </w:rPr>
             </w:pPr>
             <w:r>
+              <w:rPr>
+                <w:rFonts w:ascii="Times New Roman" w:hAnsi="Times New Roman" w:cs="Times New Roman"/>
+              </w:rPr>
               <w:t>[</w:t>
             </w:r>
             <w:r>
+              <w:rPr>
+                <w:rFonts w:ascii="Times New Roman" w:hAnsi="Times New Roman" w:cs="Times New Roman"/>
+              </w:rPr>
               <w:t>117325</w:t>
             </w:r>
             <w:r>
+              <w:rPr>
+                <w:rFonts w:ascii="Times New Roman" w:hAnsi="Times New Roman" w:cs="Times New Roman"/>
+              </w:rPr>
               <w:t>]</w:t>
             </w:r>
           </w:p>
@@ -269,6 +327,9 @@
             <w:pPr>
               <w:spacing w:after="160" w:line="278" w:lineRule="auto"/>
               <w:jc w:val="both"/>
+              <w:rPr>
+                <w:rFonts w:ascii="Times New Roman" w:hAnsi="Times New Roman" w:cs="Times New Roman"/>
+              </w:rPr>
             </w:pPr>
           </w:p>
         </w:tc>
@@ -284,12 +345,14 @@
               <w:spacing w:after="160" w:line="278" w:lineRule="auto"/>
               <w:jc w:val="both"/>
               <w:rPr>
+                <w:rFonts w:ascii="Times New Roman" w:hAnsi="Times New Roman" w:cs="Times New Roman"/>
                 <w:b/>
                 <w:bCs/>
               </w:rPr>
             </w:pPr>
             <w:r>
               <w:rPr>
+                <w:rFonts w:ascii="Times New Roman" w:hAnsi="Times New Roman" w:cs="Times New Roman"/>
                 <w:b/>
                 <w:bCs/>
               </w:rPr>
@@ -306,8 +369,14 @@
             <w:pPr>
               <w:spacing w:after="160" w:line="278" w:lineRule="auto"/>
               <w:jc w:val="both"/>
+              <w:rPr>
+                <w:rFonts w:ascii="Times New Roman" w:hAnsi="Times New Roman" w:cs="Times New Roman"/>
+              </w:rPr>
             </w:pPr>
             <w:r>
+              <w:rPr>
+                <w:rFonts w:ascii="Times New Roman" w:hAnsi="Times New Roman" w:cs="Times New Roman"/>
+              </w:rPr>
               <w:t>[117279]</w:t>
             </w:r>
           </w:p>
@@ -321,6 +390,9 @@
             <w:pPr>
               <w:spacing w:after="160" w:line="278" w:lineRule="auto"/>
               <w:jc w:val="both"/>
+              <w:rPr>
+                <w:rFonts w:ascii="Times New Roman" w:hAnsi="Times New Roman" w:cs="Times New Roman"/>
+              </w:rPr>
             </w:pPr>
           </w:p>
         </w:tc>
@@ -335,9 +407,13 @@
             <w:pPr>
               <w:spacing w:after="160" w:line="278" w:lineRule="auto"/>
               <w:jc w:val="both"/>
+              <w:rPr>
+                <w:rFonts w:ascii="Times New Roman" w:hAnsi="Times New Roman" w:cs="Times New Roman"/>
+              </w:rPr>
             </w:pPr>
             <w:r>
               <w:rPr>
+                <w:rFonts w:ascii="Times New Roman" w:hAnsi="Times New Roman" w:cs="Times New Roman"/>
                 <w:b/>
                 <w:bCs/>
               </w:rPr>
@@ -354,14 +430,26 @@
             <w:pPr>
               <w:spacing w:after="160" w:line="278" w:lineRule="auto"/>
               <w:jc w:val="both"/>
+              <w:rPr>
+                <w:rFonts w:ascii="Times New Roman" w:hAnsi="Times New Roman" w:cs="Times New Roman"/>
+              </w:rPr>
             </w:pPr>
             <w:r>
+              <w:rPr>
+                <w:rFonts w:ascii="Times New Roman" w:hAnsi="Times New Roman" w:cs="Times New Roman"/>
+              </w:rPr>
               <w:t>[</w:t>
             </w:r>
             <w:r>
+              <w:rPr>
+                <w:rFonts w:ascii="Times New Roman" w:hAnsi="Times New Roman" w:cs="Times New Roman"/>
+              </w:rPr>
               <w:t>117316</w:t>
             </w:r>
             <w:r>
+              <w:rPr>
+                <w:rFonts w:ascii="Times New Roman" w:hAnsi="Times New Roman" w:cs="Times New Roman"/>
+              </w:rPr>
               <w:t>]</w:t>
             </w:r>
           </w:p>
@@ -375,6 +463,9 @@
             <w:pPr>
               <w:spacing w:after="160" w:line="278" w:lineRule="auto"/>
               <w:jc w:val="both"/>
+              <w:rPr>
+                <w:rFonts w:ascii="Times New Roman" w:hAnsi="Times New Roman" w:cs="Times New Roman"/>
+              </w:rPr>
             </w:pPr>
           </w:p>
         </w:tc>
@@ -383,6 +474,7 @@
     <w:p>
       <w:pPr>
         <w:rPr>
+          <w:rFonts w:ascii="Times New Roman" w:hAnsi="Times New Roman" w:cs="Times New Roman"/>
           <w:b/>
           <w:bCs/>
         </w:rPr>
@@ -391,6 +483,7 @@
     <w:p>
       <w:pPr>
         <w:rPr>
+          <w:rFonts w:ascii="Times New Roman" w:hAnsi="Times New Roman" w:cs="Times New Roman"/>
           <w:b/>
           <w:bCs/>
         </w:rPr>
@@ -399,6 +492,7 @@
     <w:p>
       <w:pPr>
         <w:rPr>
+          <w:rFonts w:ascii="Times New Roman" w:hAnsi="Times New Roman" w:cs="Times New Roman"/>
           <w:b/>
           <w:bCs/>
         </w:rPr>
@@ -407,6 +501,7 @@
     <w:p>
       <w:pPr>
         <w:rPr>
+          <w:rFonts w:ascii="Times New Roman" w:hAnsi="Times New Roman" w:cs="Times New Roman"/>
           <w:b/>
           <w:bCs/>
         </w:rPr>
@@ -415,6 +510,7 @@
     <w:p>
       <w:pPr>
         <w:rPr>
+          <w:rFonts w:ascii="Times New Roman" w:hAnsi="Times New Roman" w:cs="Times New Roman"/>
           <w:b/>
           <w:bCs/>
         </w:rPr>
@@ -423,6 +519,7 @@
     <w:p>
       <w:pPr>
         <w:rPr>
+          <w:rFonts w:ascii="Times New Roman" w:hAnsi="Times New Roman" w:cs="Times New Roman"/>
           <w:b/>
           <w:bCs/>
         </w:rPr>
@@ -431,6 +528,7 @@
     <w:p>
       <w:pPr>
         <w:rPr>
+          <w:rFonts w:ascii="Times New Roman" w:hAnsi="Times New Roman" w:cs="Times New Roman"/>
           <w:b/>
           <w:bCs/>
         </w:rPr>
@@ -439,6 +537,7 @@
     <w:p>
       <w:pPr>
         <w:rPr>
+          <w:rFonts w:ascii="Times New Roman" w:hAnsi="Times New Roman" w:cs="Times New Roman"/>
           <w:b/>
           <w:bCs/>
         </w:rPr>
@@ -447,6 +546,7 @@
     <w:p>
       <w:pPr>
         <w:rPr>
+          <w:rFonts w:ascii="Times New Roman" w:hAnsi="Times New Roman" w:cs="Times New Roman"/>
           <w:b/>
           <w:bCs/>
         </w:rPr>
@@ -455,6 +555,7 @@
     <w:p>
       <w:pPr>
         <w:rPr>
+          <w:rFonts w:ascii="Times New Roman" w:hAnsi="Times New Roman" w:cs="Times New Roman"/>
           <w:b/>
           <w:bCs/>
         </w:rPr>
@@ -463,6 +564,7 @@
     <w:p>
       <w:pPr>
         <w:rPr>
+          <w:rFonts w:ascii="Times New Roman" w:hAnsi="Times New Roman" w:cs="Times New Roman"/>
           <w:b/>
           <w:bCs/>
         </w:rPr>
@@ -471,6 +573,7 @@
     <w:p>
       <w:pPr>
         <w:rPr>
+          <w:rFonts w:ascii="Times New Roman" w:hAnsi="Times New Roman" w:cs="Times New Roman"/>
           <w:b/>
           <w:bCs/>
         </w:rPr>
@@ -479,6 +582,7 @@
     <w:p>
       <w:pPr>
         <w:rPr>
+          <w:rFonts w:ascii="Times New Roman" w:hAnsi="Times New Roman" w:cs="Times New Roman"/>
           <w:b/>
           <w:bCs/>
         </w:rPr>
@@ -487,6 +591,7 @@
     <w:p>
       <w:pPr>
         <w:rPr>
+          <w:rFonts w:ascii="Times New Roman" w:hAnsi="Times New Roman" w:cs="Times New Roman"/>
           <w:b/>
           <w:bCs/>
         </w:rPr>
@@ -495,6 +600,7 @@
     <w:p>
       <w:pPr>
         <w:rPr>
+          <w:rFonts w:ascii="Times New Roman" w:hAnsi="Times New Roman" w:cs="Times New Roman"/>
           <w:b/>
           <w:bCs/>
         </w:rPr>
@@ -503,6 +609,7 @@
     <w:p>
       <w:pPr>
         <w:rPr>
+          <w:rFonts w:ascii="Times New Roman" w:hAnsi="Times New Roman" w:cs="Times New Roman"/>
           <w:b/>
           <w:bCs/>
         </w:rPr>
@@ -511,6 +618,7 @@
     <w:p>
       <w:pPr>
         <w:rPr>
+          <w:rFonts w:ascii="Times New Roman" w:hAnsi="Times New Roman" w:cs="Times New Roman"/>
           <w:b/>
           <w:bCs/>
         </w:rPr>
@@ -519,6 +627,7 @@
     <w:p>
       <w:pPr>
         <w:rPr>
+          <w:rFonts w:ascii="Times New Roman" w:hAnsi="Times New Roman" w:cs="Times New Roman"/>
           <w:b/>
           <w:bCs/>
         </w:rPr>
@@ -527,60 +636,141 @@
     <w:p>
       <w:pPr>
         <w:rPr>
+          <w:rFonts w:ascii="Times New Roman" w:hAnsi="Times New Roman" w:cs="Times New Roman"/>
           <w:b/>
           <w:bCs/>
         </w:rPr>
       </w:pPr>
-      <w:r>
-        <w:rPr>
+    </w:p>
+    <w:p>
+      <w:pPr>
+        <w:jc w:val="both"/>
+        <w:rPr>
+          <w:rFonts w:ascii="Times New Roman" w:hAnsi="Times New Roman" w:cs="Times New Roman"/>
+          <w:sz w:val="28"/>
+          <w:szCs w:val="28"/>
+        </w:rPr>
+      </w:pPr>
+      <w:r>
+        <w:rPr>
+          <w:rFonts w:ascii="Times New Roman" w:hAnsi="Times New Roman" w:cs="Times New Roman"/>
+          <w:sz w:val="28"/>
+          <w:szCs w:val="28"/>
+        </w:rPr>
+        <w:lastRenderedPageBreak/>
+        <w:t xml:space="preserve">    1. Treść zadania projektowego</w:t>
+      </w:r>
+    </w:p>
+    <w:p>
+      <w:pPr>
+        <w:jc w:val="both"/>
+        <w:rPr>
+          <w:rFonts w:ascii="Times New Roman" w:hAnsi="Times New Roman" w:cs="Times New Roman"/>
+          <w:sz w:val="28"/>
+          <w:szCs w:val="28"/>
+        </w:rPr>
+      </w:pPr>
+      <w:r>
+        <w:rPr>
+          <w:rFonts w:ascii="Times New Roman" w:hAnsi="Times New Roman" w:cs="Times New Roman"/>
+          <w:sz w:val="28"/>
+          <w:szCs w:val="28"/>
+        </w:rPr>
+        <w:t xml:space="preserve">    2. Cel budowania systemu, jego zakres oraz kontekst, przewidywalne mierzalne (z podaniem konkretnych wartości i sposobów ich wyliczenia) i niemierzalne korzyści z jego wdrożenia</w:t>
+      </w:r>
+    </w:p>
+    <w:p>
+      <w:pPr>
+        <w:jc w:val="both"/>
+        <w:rPr>
+          <w:rFonts w:ascii="Times New Roman" w:hAnsi="Times New Roman" w:cs="Times New Roman"/>
+          <w:sz w:val="36"/>
+          <w:szCs w:val="36"/>
+        </w:rPr>
+      </w:pPr>
+      <w:r>
+        <w:rPr>
+          <w:rFonts w:ascii="Times New Roman" w:hAnsi="Times New Roman" w:cs="Times New Roman"/>
           <w:b/>
           <w:bCs/>
-        </w:rPr>
-        <w:lastRenderedPageBreak/>
-        <w:t>Cel budowania systemu</w:t>
-      </w:r>
-    </w:p>
-    <w:p>
-      <w:pPr>
-        <w:jc w:val="both"/>
-      </w:pPr>
-      <w:r>
-        <w:t xml:space="preserve">Głównym celem stworzenia systemu jest cyfryzacja oraz usprawnienie procesów związanych z ofertą </w:t>
-      </w:r>
-      <w:r>
-        <w:t xml:space="preserve">dużej </w:t>
-      </w:r>
-      <w:r>
-        <w:t>firmy rolniczej. Aplikacja ma za zadanie ułatwić klientom szybki dostęp do usług i maszyn, a firmie rolniczej umożliwić efektywne zarządzanie zasobami, harmonogramami pracowników oraz sprzedażą towarów rolniczych. System ma</w:t>
-      </w:r>
-      <w:r>
-        <w:t xml:space="preserve"> zminimalizować</w:t>
-      </w:r>
-      <w:r>
-        <w:t xml:space="preserve"> ryzyko błędów komunikacyjnych, zwłaszcza w zakresie dokładnej lokalizacji miejsca wykonania usługi.</w:t>
-      </w:r>
-    </w:p>
-    <w:p>
-      <w:pPr>
-        <w:jc w:val="both"/>
-        <w:rPr>
+          <w:sz w:val="36"/>
+          <w:szCs w:val="36"/>
+        </w:rPr>
+        <w:t xml:space="preserve">Piotr </w:t>
+      </w:r>
+      <w:proofErr w:type="spellStart"/>
+      <w:r>
+        <w:rPr>
+          <w:rFonts w:ascii="Times New Roman" w:hAnsi="Times New Roman" w:cs="Times New Roman"/>
           <w:b/>
           <w:bCs/>
-        </w:rPr>
-      </w:pPr>
-      <w:r>
-        <w:rPr>
+          <w:sz w:val="36"/>
+          <w:szCs w:val="36"/>
+        </w:rPr>
+        <w:t>Poletyło</w:t>
+      </w:r>
+      <w:proofErr w:type="spellEnd"/>
+    </w:p>
+    <w:p>
+      <w:pPr>
+        <w:rPr>
+          <w:rFonts w:ascii="Times New Roman" w:hAnsi="Times New Roman" w:cs="Times New Roman"/>
           <w:b/>
           <w:bCs/>
         </w:rPr>
+      </w:pPr>
+      <w:r>
+        <w:rPr>
+          <w:rFonts w:ascii="Times New Roman" w:hAnsi="Times New Roman" w:cs="Times New Roman"/>
+          <w:b/>
+          <w:bCs/>
+        </w:rPr>
+        <w:t>Cel budowania systemu</w:t>
+      </w:r>
+    </w:p>
+    <w:p>
+      <w:pPr>
+        <w:jc w:val="both"/>
+        <w:rPr>
+          <w:rFonts w:ascii="Times New Roman" w:hAnsi="Times New Roman" w:cs="Times New Roman"/>
+        </w:rPr>
+      </w:pPr>
+      <w:r>
+        <w:rPr>
+          <w:rFonts w:ascii="Times New Roman" w:hAnsi="Times New Roman" w:cs="Times New Roman"/>
+        </w:rPr>
+        <w:t>Głównym celem stworzenia systemu jest cyfryzacja oraz usprawnienie procesów związanych z ofertą dużej firmy rolniczej. Aplikacja ma za zadanie ułatwić klientom szybki dostęp do usług i maszyn, a firmie rolniczej umożliwić efektywne zarządzanie zasobami, harmonogramami pracowników oraz sprzedażą towarów rolniczych. System ma zminimalizować ryzyko błędów komunikacyjnych, zwłaszcza w zakresie dokładnej lokalizacji miejsca wykonania usługi.</w:t>
+      </w:r>
+    </w:p>
+    <w:p>
+      <w:pPr>
+        <w:jc w:val="both"/>
+        <w:rPr>
+          <w:rFonts w:ascii="Times New Roman" w:hAnsi="Times New Roman" w:cs="Times New Roman"/>
+          <w:b/>
+          <w:bCs/>
+        </w:rPr>
+      </w:pPr>
+      <w:r>
+        <w:rPr>
+          <w:rFonts w:ascii="Times New Roman" w:hAnsi="Times New Roman" w:cs="Times New Roman"/>
+          <w:b/>
+          <w:bCs/>
+        </w:rPr>
         <w:t>Zakres systemu</w:t>
       </w:r>
     </w:p>
     <w:p>
       <w:pPr>
         <w:jc w:val="both"/>
-      </w:pPr>
-      <w:r>
+        <w:rPr>
+          <w:rFonts w:ascii="Times New Roman" w:hAnsi="Times New Roman" w:cs="Times New Roman"/>
+        </w:rPr>
+      </w:pPr>
+      <w:r>
+        <w:rPr>
+          <w:rFonts w:ascii="Times New Roman" w:hAnsi="Times New Roman" w:cs="Times New Roman"/>
+        </w:rPr>
         <w:t>System obejmuje następujące główne moduły funkcjonalne:</w:t>
       </w:r>
     </w:p>
@@ -591,15 +781,22 @@
           <w:numId w:val="2"/>
         </w:numPr>
         <w:jc w:val="both"/>
-      </w:pPr>
-      <w:r>
-        <w:rPr>
+        <w:rPr>
+          <w:rFonts w:ascii="Times New Roman" w:hAnsi="Times New Roman" w:cs="Times New Roman"/>
+        </w:rPr>
+      </w:pPr>
+      <w:r>
+        <w:rPr>
+          <w:rFonts w:ascii="Times New Roman" w:hAnsi="Times New Roman" w:cs="Times New Roman"/>
           <w:b/>
           <w:bCs/>
         </w:rPr>
         <w:t>Moduł wypożyczalni maszyn rolniczych:</w:t>
       </w:r>
       <w:r>
+        <w:rPr>
+          <w:rFonts w:ascii="Times New Roman" w:hAnsi="Times New Roman" w:cs="Times New Roman"/>
+        </w:rPr>
         <w:t xml:space="preserve"> Przeglądanie katalogu dostępnych maszyn (np. ciągniki, kombajny, siewniki), sprawdzanie ich dostępności w kalendarzu oraz proces rezerwacji.</w:t>
       </w:r>
     </w:p>
@@ -610,15 +807,22 @@
           <w:numId w:val="2"/>
         </w:numPr>
         <w:jc w:val="both"/>
-      </w:pPr>
-      <w:r>
-        <w:rPr>
+        <w:rPr>
+          <w:rFonts w:ascii="Times New Roman" w:hAnsi="Times New Roman" w:cs="Times New Roman"/>
+        </w:rPr>
+      </w:pPr>
+      <w:r>
+        <w:rPr>
+          <w:rFonts w:ascii="Times New Roman" w:hAnsi="Times New Roman" w:cs="Times New Roman"/>
           <w:b/>
           <w:bCs/>
         </w:rPr>
         <w:t>Moduł zamawiania usług:</w:t>
       </w:r>
       <w:r>
+        <w:rPr>
+          <w:rFonts w:ascii="Times New Roman" w:hAnsi="Times New Roman" w:cs="Times New Roman"/>
+        </w:rPr>
         <w:t xml:space="preserve"> Możliwość zlecenia konkretnych prac polowych (np. orka, siew, zbiór).</w:t>
       </w:r>
     </w:p>
@@ -629,9 +833,13 @@
           <w:numId w:val="2"/>
         </w:numPr>
         <w:jc w:val="both"/>
-      </w:pPr>
-      <w:r>
-        <w:rPr>
+        <w:rPr>
+          <w:rFonts w:ascii="Times New Roman" w:hAnsi="Times New Roman" w:cs="Times New Roman"/>
+        </w:rPr>
+      </w:pPr>
+      <w:r>
+        <w:rPr>
+          <w:rFonts w:ascii="Times New Roman" w:hAnsi="Times New Roman" w:cs="Times New Roman"/>
           <w:b/>
           <w:bCs/>
         </w:rPr>
@@ -640,6 +848,7 @@
       <w:proofErr w:type="spellStart"/>
       <w:r>
         <w:rPr>
+          <w:rFonts w:ascii="Times New Roman" w:hAnsi="Times New Roman" w:cs="Times New Roman"/>
           <w:b/>
           <w:bCs/>
         </w:rPr>
@@ -648,12 +857,16 @@
       <w:proofErr w:type="spellEnd"/>
       <w:r>
         <w:rPr>
+          <w:rFonts w:ascii="Times New Roman" w:hAnsi="Times New Roman" w:cs="Times New Roman"/>
           <w:b/>
           <w:bCs/>
         </w:rPr>
         <w:t xml:space="preserve"> (mapy):</w:t>
       </w:r>
       <w:r>
+        <w:rPr>
+          <w:rFonts w:ascii="Times New Roman" w:hAnsi="Times New Roman" w:cs="Times New Roman"/>
+        </w:rPr>
         <w:t xml:space="preserve"> Funkcjonalność pozwalająca klientowi na precyzyjne zaznaczenie na mapie (pinezka/obszar) lokalizacji pola lub działki, na której ma zostać wykonana usługa.</w:t>
       </w:r>
     </w:p>
@@ -664,15 +877,22 @@
           <w:numId w:val="2"/>
         </w:numPr>
         <w:jc w:val="both"/>
-      </w:pPr>
-      <w:r>
-        <w:rPr>
+        <w:rPr>
+          <w:rFonts w:ascii="Times New Roman" w:hAnsi="Times New Roman" w:cs="Times New Roman"/>
+        </w:rPr>
+      </w:pPr>
+      <w:r>
+        <w:rPr>
+          <w:rFonts w:ascii="Times New Roman" w:hAnsi="Times New Roman" w:cs="Times New Roman"/>
           <w:b/>
           <w:bCs/>
         </w:rPr>
         <w:t>Moduł e-commerce (handel towarami):</w:t>
       </w:r>
       <w:r>
+        <w:rPr>
+          <w:rFonts w:ascii="Times New Roman" w:hAnsi="Times New Roman" w:cs="Times New Roman"/>
+        </w:rPr>
         <w:t xml:space="preserve"> Katalog produktów (np. nawozy, nasiona, płody rolne) z możliwością ich zakupu oraz określenia opcji dostawy lub odbioru.</w:t>
       </w:r>
     </w:p>
@@ -683,59 +903,64 @@
           <w:numId w:val="2"/>
         </w:numPr>
         <w:jc w:val="both"/>
-      </w:pPr>
-      <w:r>
-        <w:rPr>
+        <w:rPr>
+          <w:rFonts w:ascii="Times New Roman" w:hAnsi="Times New Roman" w:cs="Times New Roman"/>
+        </w:rPr>
+      </w:pPr>
+      <w:r>
+        <w:rPr>
+          <w:rFonts w:ascii="Times New Roman" w:hAnsi="Times New Roman" w:cs="Times New Roman"/>
           <w:b/>
           <w:bCs/>
         </w:rPr>
-        <w:t>Moduł zarządzania</w:t>
-      </w:r>
-      <w:r>
-        <w:rPr>
+        <w:t xml:space="preserve">Moduł zarządzania: </w:t>
+      </w:r>
+      <w:r>
+        <w:rPr>
+          <w:rFonts w:ascii="Times New Roman" w:hAnsi="Times New Roman" w:cs="Times New Roman"/>
+        </w:rPr>
+        <w:t>Panel do zarządzania zgłoszeniami, przypisywania maszyn i operatorów do zleceń, zarządzania stanami magazynowymi towarów oraz weryfikacji płatności.</w:t>
+      </w:r>
+    </w:p>
+    <w:p>
+      <w:pPr>
+        <w:ind w:left="720"/>
+        <w:jc w:val="both"/>
+        <w:rPr>
+          <w:rFonts w:ascii="Times New Roman" w:hAnsi="Times New Roman" w:cs="Times New Roman"/>
+        </w:rPr>
+      </w:pPr>
+    </w:p>
+    <w:p>
+      <w:pPr>
+        <w:jc w:val="both"/>
+        <w:rPr>
+          <w:rFonts w:ascii="Times New Roman" w:hAnsi="Times New Roman" w:cs="Times New Roman"/>
           <w:b/>
           <w:bCs/>
         </w:rPr>
-        <w:t xml:space="preserve">: </w:t>
-      </w:r>
-      <w:r>
-        <w:t>Panel do zarządzania zgłoszeniami, przypisywania maszyn i operatorów do zleceń, zarządzania stanami magazynowymi towarów oraz weryfikacji płatności.</w:t>
-      </w:r>
-    </w:p>
-    <w:p>
-      <w:pPr>
-        <w:ind w:left="720"/>
-        <w:jc w:val="both"/>
-      </w:pPr>
-    </w:p>
-    <w:p>
-      <w:pPr>
-        <w:jc w:val="both"/>
-        <w:rPr>
+      </w:pPr>
+      <w:r>
+        <w:rPr>
+          <w:rFonts w:ascii="Times New Roman" w:hAnsi="Times New Roman" w:cs="Times New Roman"/>
           <w:b/>
           <w:bCs/>
         </w:rPr>
-      </w:pPr>
-      <w:r>
-        <w:rPr>
-          <w:b/>
-          <w:bCs/>
-        </w:rPr>
         <w:t>Kontekst systemu</w:t>
       </w:r>
     </w:p>
     <w:p>
       <w:pPr>
         <w:jc w:val="both"/>
-      </w:pPr>
-      <w:r>
-        <w:t>System funkcjonuje w branży rolniczej i stanowi platformę komunikacji pomiędzy firmą usługowo-handlową a jej klientami. Aplikacja docelowo musi współpracować z zewnętrznymi systemami i interfejsami</w:t>
-      </w:r>
-      <w:r>
-        <w:t xml:space="preserve"> </w:t>
-      </w:r>
-      <w:r>
-        <w:t>takimi jak:</w:t>
+        <w:rPr>
+          <w:rFonts w:ascii="Times New Roman" w:hAnsi="Times New Roman" w:cs="Times New Roman"/>
+        </w:rPr>
+      </w:pPr>
+      <w:r>
+        <w:rPr>
+          <w:rFonts w:ascii="Times New Roman" w:hAnsi="Times New Roman" w:cs="Times New Roman"/>
+        </w:rPr>
+        <w:t>System funkcjonuje w branży rolniczej i stanowi platformę komunikacji pomiędzy firmą usługowo-handlową a jej klientami. Aplikacja docelowo musi współpracować z zewnętrznymi systemami i interfejsami takimi jak:</w:t>
       </w:r>
     </w:p>
     <w:p>
@@ -745,8 +970,14 @@
           <w:numId w:val="1"/>
         </w:numPr>
         <w:jc w:val="both"/>
-      </w:pPr>
-      <w:r>
+        <w:rPr>
+          <w:rFonts w:ascii="Times New Roman" w:hAnsi="Times New Roman" w:cs="Times New Roman"/>
+        </w:rPr>
+      </w:pPr>
+      <w:r>
+        <w:rPr>
+          <w:rFonts w:ascii="Times New Roman" w:hAnsi="Times New Roman" w:cs="Times New Roman"/>
+        </w:rPr>
         <w:t>Systemy map do obsługi modułu lokalizacji.</w:t>
       </w:r>
     </w:p>
@@ -757,8 +988,14 @@
           <w:numId w:val="1"/>
         </w:numPr>
         <w:jc w:val="both"/>
-      </w:pPr>
-      <w:r>
+        <w:rPr>
+          <w:rFonts w:ascii="Times New Roman" w:hAnsi="Times New Roman" w:cs="Times New Roman"/>
+        </w:rPr>
+      </w:pPr>
+      <w:r>
+        <w:rPr>
+          <w:rFonts w:ascii="Times New Roman" w:hAnsi="Times New Roman" w:cs="Times New Roman"/>
+        </w:rPr>
         <w:t>Bramki płatności internetowych do obsługi płatności za towary i usługi.</w:t>
       </w:r>
     </w:p>
@@ -766,36 +1003,50 @@
       <w:pPr>
         <w:ind w:left="720"/>
         <w:jc w:val="both"/>
+        <w:rPr>
+          <w:rFonts w:ascii="Times New Roman" w:hAnsi="Times New Roman" w:cs="Times New Roman"/>
+        </w:rPr>
       </w:pPr>
     </w:p>
     <w:p>
       <w:pPr>
         <w:ind w:left="720"/>
         <w:jc w:val="both"/>
+        <w:rPr>
+          <w:rFonts w:ascii="Times New Roman" w:hAnsi="Times New Roman" w:cs="Times New Roman"/>
+        </w:rPr>
       </w:pPr>
     </w:p>
     <w:p>
       <w:pPr>
         <w:ind w:left="720"/>
         <w:jc w:val="both"/>
+        <w:rPr>
+          <w:rFonts w:ascii="Times New Roman" w:hAnsi="Times New Roman" w:cs="Times New Roman"/>
+        </w:rPr>
       </w:pPr>
     </w:p>
     <w:p>
       <w:pPr>
         <w:ind w:left="720"/>
         <w:jc w:val="both"/>
-      </w:pPr>
-    </w:p>
-    <w:p>
-      <w:pPr>
-        <w:jc w:val="both"/>
-        <w:rPr>
+        <w:rPr>
+          <w:rFonts w:ascii="Times New Roman" w:hAnsi="Times New Roman" w:cs="Times New Roman"/>
+        </w:rPr>
+      </w:pPr>
+    </w:p>
+    <w:p>
+      <w:pPr>
+        <w:jc w:val="both"/>
+        <w:rPr>
+          <w:rFonts w:ascii="Times New Roman" w:hAnsi="Times New Roman" w:cs="Times New Roman"/>
           <w:b/>
           <w:bCs/>
         </w:rPr>
       </w:pPr>
       <w:r>
         <w:rPr>
+          <w:rFonts w:ascii="Times New Roman" w:hAnsi="Times New Roman" w:cs="Times New Roman"/>
           <w:b/>
           <w:bCs/>
         </w:rPr>
@@ -809,15 +1060,22 @@
           <w:numId w:val="3"/>
         </w:numPr>
         <w:jc w:val="both"/>
-      </w:pPr>
-      <w:r>
-        <w:rPr>
+        <w:rPr>
+          <w:rFonts w:ascii="Times New Roman" w:hAnsi="Times New Roman" w:cs="Times New Roman"/>
+        </w:rPr>
+      </w:pPr>
+      <w:r>
+        <w:rPr>
+          <w:rFonts w:ascii="Times New Roman" w:hAnsi="Times New Roman" w:cs="Times New Roman"/>
           <w:b/>
           <w:bCs/>
         </w:rPr>
         <w:t>Skrócenie czasu obsługi pojedynczego zlecenia</w:t>
       </w:r>
       <w:r>
+        <w:rPr>
+          <w:rFonts w:ascii="Times New Roman" w:hAnsi="Times New Roman" w:cs="Times New Roman"/>
+        </w:rPr>
         <w:t xml:space="preserve"> dzięki wyeliminowaniu konieczności telefonicznego ustalania szczegółów i ręcznego wpisywania danych.</w:t>
       </w:r>
     </w:p>
@@ -828,15 +1086,22 @@
           <w:numId w:val="3"/>
         </w:numPr>
         <w:jc w:val="both"/>
-      </w:pPr>
-      <w:r>
-        <w:rPr>
+        <w:rPr>
+          <w:rFonts w:ascii="Times New Roman" w:hAnsi="Times New Roman" w:cs="Times New Roman"/>
+        </w:rPr>
+      </w:pPr>
+      <w:r>
+        <w:rPr>
+          <w:rFonts w:ascii="Times New Roman" w:hAnsi="Times New Roman" w:cs="Times New Roman"/>
           <w:b/>
           <w:bCs/>
         </w:rPr>
         <w:t>Wzrost przychodów</w:t>
       </w:r>
       <w:r>
+        <w:rPr>
+          <w:rFonts w:ascii="Times New Roman" w:hAnsi="Times New Roman" w:cs="Times New Roman"/>
+        </w:rPr>
         <w:t xml:space="preserve"> wynikający z łatwiejszego dostępu do oferty (handel towarami online, szybka rezerwacja maszyn).</w:t>
       </w:r>
     </w:p>
@@ -847,15 +1112,22 @@
           <w:numId w:val="3"/>
         </w:numPr>
         <w:jc w:val="both"/>
-      </w:pPr>
-      <w:r>
-        <w:rPr>
+        <w:rPr>
+          <w:rFonts w:ascii="Times New Roman" w:hAnsi="Times New Roman" w:cs="Times New Roman"/>
+        </w:rPr>
+      </w:pPr>
+      <w:r>
+        <w:rPr>
+          <w:rFonts w:ascii="Times New Roman" w:hAnsi="Times New Roman" w:cs="Times New Roman"/>
           <w:b/>
           <w:bCs/>
         </w:rPr>
         <w:t xml:space="preserve">Zmniejszenie liczby pomyłek lokalizacyjnych </w:t>
       </w:r>
       <w:r>
+        <w:rPr>
+          <w:rFonts w:ascii="Times New Roman" w:hAnsi="Times New Roman" w:cs="Times New Roman"/>
+        </w:rPr>
         <w:t>dzięki wprowadzeniu precyzyjnego zaznaczania pól na mapie przez klienta.</w:t>
       </w:r>
     </w:p>
@@ -866,15 +1138,22 @@
           <w:numId w:val="3"/>
         </w:numPr>
         <w:jc w:val="both"/>
-      </w:pPr>
-      <w:r>
-        <w:rPr>
+        <w:rPr>
+          <w:rFonts w:ascii="Times New Roman" w:hAnsi="Times New Roman" w:cs="Times New Roman"/>
+        </w:rPr>
+      </w:pPr>
+      <w:r>
+        <w:rPr>
+          <w:rFonts w:ascii="Times New Roman" w:hAnsi="Times New Roman" w:cs="Times New Roman"/>
           <w:b/>
           <w:bCs/>
         </w:rPr>
         <w:t>Zmniejszenie kosztów operacyjnych</w:t>
       </w:r>
       <w:r>
+        <w:rPr>
+          <w:rFonts w:ascii="Times New Roman" w:hAnsi="Times New Roman" w:cs="Times New Roman"/>
+        </w:rPr>
         <w:t xml:space="preserve"> związanych z obsługą biurową i administracyjną.</w:t>
       </w:r>
     </w:p>
@@ -882,12 +1161,14 @@
       <w:pPr>
         <w:jc w:val="both"/>
         <w:rPr>
+          <w:rFonts w:ascii="Times New Roman" w:hAnsi="Times New Roman" w:cs="Times New Roman"/>
           <w:b/>
           <w:bCs/>
         </w:rPr>
       </w:pPr>
       <w:r>
         <w:rPr>
+          <w:rFonts w:ascii="Times New Roman" w:hAnsi="Times New Roman" w:cs="Times New Roman"/>
           <w:b/>
           <w:bCs/>
         </w:rPr>
@@ -901,15 +1182,22 @@
           <w:numId w:val="4"/>
         </w:numPr>
         <w:jc w:val="both"/>
-      </w:pPr>
-      <w:r>
-        <w:rPr>
+        <w:rPr>
+          <w:rFonts w:ascii="Times New Roman" w:hAnsi="Times New Roman" w:cs="Times New Roman"/>
+        </w:rPr>
+      </w:pPr>
+      <w:r>
+        <w:rPr>
+          <w:rFonts w:ascii="Times New Roman" w:hAnsi="Times New Roman" w:cs="Times New Roman"/>
           <w:b/>
           <w:bCs/>
         </w:rPr>
         <w:t>Budowa nowoczesnego wizerunku firmy</w:t>
       </w:r>
       <w:r>
+        <w:rPr>
+          <w:rFonts w:ascii="Times New Roman" w:hAnsi="Times New Roman" w:cs="Times New Roman"/>
+        </w:rPr>
         <w:t xml:space="preserve"> na rynku jako innowacyjnego przedsiębiorstwa wykorzystującego nowoczesne technologie w rolnictwie.</w:t>
       </w:r>
     </w:p>
@@ -920,15 +1208,22 @@
           <w:numId w:val="4"/>
         </w:numPr>
         <w:jc w:val="both"/>
-      </w:pPr>
-      <w:r>
-        <w:rPr>
+        <w:rPr>
+          <w:rFonts w:ascii="Times New Roman" w:hAnsi="Times New Roman" w:cs="Times New Roman"/>
+        </w:rPr>
+      </w:pPr>
+      <w:r>
+        <w:rPr>
+          <w:rFonts w:ascii="Times New Roman" w:hAnsi="Times New Roman" w:cs="Times New Roman"/>
           <w:b/>
           <w:bCs/>
         </w:rPr>
         <w:t>Wzrost satysfakcji i lojalności klientów</w:t>
       </w:r>
       <w:r>
+        <w:rPr>
+          <w:rFonts w:ascii="Times New Roman" w:hAnsi="Times New Roman" w:cs="Times New Roman"/>
+        </w:rPr>
         <w:t>, którzy zyskują wygodne narzędzie do zamawiania usług i towarów 24 godziny na dobę, 7 dni w tygodniu.</w:t>
       </w:r>
     </w:p>
@@ -939,15 +1234,22 @@
           <w:numId w:val="4"/>
         </w:numPr>
         <w:jc w:val="both"/>
-      </w:pPr>
-      <w:r>
-        <w:rPr>
+        <w:rPr>
+          <w:rFonts w:ascii="Times New Roman" w:hAnsi="Times New Roman" w:cs="Times New Roman"/>
+        </w:rPr>
+      </w:pPr>
+      <w:r>
+        <w:rPr>
+          <w:rFonts w:ascii="Times New Roman" w:hAnsi="Times New Roman" w:cs="Times New Roman"/>
           <w:b/>
           <w:bCs/>
         </w:rPr>
         <w:t>Poprawa komfortu pracy pracowników</w:t>
       </w:r>
       <w:r>
+        <w:rPr>
+          <w:rFonts w:ascii="Times New Roman" w:hAnsi="Times New Roman" w:cs="Times New Roman"/>
+        </w:rPr>
         <w:t xml:space="preserve"> (operatorów maszyn i kierowców), którzy otrzymują czytelne zlecenia wraz z dokładnymi współrzędnymi nawigacyjnymi.</w:t>
       </w:r>
     </w:p>
@@ -958,25 +1260,1591 @@
           <w:numId w:val="4"/>
         </w:numPr>
         <w:jc w:val="both"/>
-      </w:pPr>
-      <w:r>
-        <w:rPr>
+        <w:rPr>
+          <w:rFonts w:ascii="Times New Roman" w:hAnsi="Times New Roman" w:cs="Times New Roman"/>
+        </w:rPr>
+      </w:pPr>
+      <w:r>
+        <w:rPr>
+          <w:rFonts w:ascii="Times New Roman" w:hAnsi="Times New Roman" w:cs="Times New Roman"/>
           <w:b/>
           <w:bCs/>
         </w:rPr>
         <w:t>Zwiększenie przejrzystości procesów</w:t>
       </w:r>
       <w:r>
+        <w:rPr>
+          <w:rFonts w:ascii="Times New Roman" w:hAnsi="Times New Roman" w:cs="Times New Roman"/>
+        </w:rPr>
         <w:t xml:space="preserve"> wewnątrz firmy oraz ułatwienie procesów decyzyjnych dla zarządu na podstawie generowanych przez system statystyk i raportów.</w:t>
       </w:r>
     </w:p>
     <w:p>
       <w:pPr>
         <w:jc w:val="both"/>
-      </w:pPr>
+        <w:rPr>
+          <w:rFonts w:ascii="Times New Roman" w:hAnsi="Times New Roman" w:cs="Times New Roman"/>
+        </w:rPr>
+      </w:pPr>
+    </w:p>
+    <w:p>
+      <w:pPr>
+        <w:jc w:val="both"/>
+        <w:rPr>
+          <w:rFonts w:ascii="Times New Roman" w:hAnsi="Times New Roman" w:cs="Times New Roman"/>
+          <w:sz w:val="28"/>
+          <w:szCs w:val="28"/>
+        </w:rPr>
+      </w:pPr>
+    </w:p>
+    <w:p>
+      <w:pPr>
+        <w:jc w:val="both"/>
+        <w:rPr>
+          <w:rFonts w:ascii="Times New Roman" w:hAnsi="Times New Roman" w:cs="Times New Roman"/>
+          <w:sz w:val="28"/>
+          <w:szCs w:val="28"/>
+        </w:rPr>
+      </w:pPr>
+      <w:r>
+        <w:rPr>
+          <w:rFonts w:ascii="Times New Roman" w:hAnsi="Times New Roman" w:cs="Times New Roman"/>
+          <w:sz w:val="28"/>
+          <w:szCs w:val="28"/>
+        </w:rPr>
+        <w:t xml:space="preserve">    3. Słownik (definiujący ważne, specyficzne terminy związane z dziedziną problemu, wykorzystywane w projekcie)</w:t>
+      </w:r>
+    </w:p>
+    <w:p>
+      <w:pPr>
+        <w:jc w:val="both"/>
+        <w:rPr>
+          <w:rFonts w:ascii="Times New Roman" w:hAnsi="Times New Roman" w:cs="Times New Roman"/>
+          <w:sz w:val="28"/>
+          <w:szCs w:val="28"/>
+        </w:rPr>
+      </w:pPr>
+    </w:p>
+    <w:p>
+      <w:pPr>
+        <w:jc w:val="both"/>
+        <w:rPr>
+          <w:rFonts w:ascii="Times New Roman" w:hAnsi="Times New Roman" w:cs="Times New Roman"/>
+          <w:sz w:val="28"/>
+          <w:szCs w:val="28"/>
+        </w:rPr>
+      </w:pPr>
+    </w:p>
+    <w:p>
+      <w:pPr>
+        <w:jc w:val="both"/>
+        <w:rPr>
+          <w:rFonts w:ascii="Times New Roman" w:hAnsi="Times New Roman" w:cs="Times New Roman"/>
+        </w:rPr>
+      </w:pPr>
+    </w:p>
+    <w:p>
+      <w:pPr>
+        <w:jc w:val="both"/>
+        <w:rPr>
+          <w:rFonts w:ascii="Times New Roman" w:hAnsi="Times New Roman" w:cs="Times New Roman"/>
+        </w:rPr>
+      </w:pPr>
+    </w:p>
+    <w:p>
+      <w:pPr>
+        <w:jc w:val="both"/>
+        <w:rPr>
+          <w:rFonts w:ascii="Times New Roman" w:hAnsi="Times New Roman" w:cs="Times New Roman"/>
+        </w:rPr>
+      </w:pPr>
+    </w:p>
+    <w:p>
+      <w:pPr>
+        <w:jc w:val="both"/>
+        <w:rPr>
+          <w:rFonts w:ascii="Times New Roman" w:hAnsi="Times New Roman" w:cs="Times New Roman"/>
+        </w:rPr>
+      </w:pPr>
+    </w:p>
+    <w:p>
+      <w:pPr>
+        <w:jc w:val="both"/>
+        <w:rPr>
+          <w:rFonts w:ascii="Times New Roman" w:hAnsi="Times New Roman" w:cs="Times New Roman"/>
+          <w:b/>
+          <w:bCs/>
+          <w:sz w:val="36"/>
+          <w:szCs w:val="36"/>
+        </w:rPr>
+      </w:pPr>
+      <w:r>
+        <w:rPr>
+          <w:rFonts w:ascii="Times New Roman" w:hAnsi="Times New Roman" w:cs="Times New Roman"/>
+          <w:b/>
+          <w:bCs/>
+          <w:sz w:val="36"/>
+          <w:szCs w:val="36"/>
+        </w:rPr>
+        <w:lastRenderedPageBreak/>
+        <w:t xml:space="preserve">Piotr </w:t>
+      </w:r>
+      <w:proofErr w:type="spellStart"/>
+      <w:r>
+        <w:rPr>
+          <w:rFonts w:ascii="Times New Roman" w:hAnsi="Times New Roman" w:cs="Times New Roman"/>
+          <w:b/>
+          <w:bCs/>
+          <w:sz w:val="36"/>
+          <w:szCs w:val="36"/>
+        </w:rPr>
+        <w:t>Poletyło</w:t>
+      </w:r>
+      <w:proofErr w:type="spellEnd"/>
+      <w:r>
+        <w:rPr>
+          <w:rFonts w:ascii="Times New Roman" w:hAnsi="Times New Roman" w:cs="Times New Roman"/>
+          <w:b/>
+          <w:bCs/>
+          <w:sz w:val="36"/>
+          <w:szCs w:val="36"/>
+        </w:rPr>
+        <w:t xml:space="preserve">, </w:t>
+      </w:r>
+      <w:r>
+        <w:rPr>
+          <w:rFonts w:ascii="Times New Roman" w:hAnsi="Times New Roman" w:cs="Times New Roman"/>
+          <w:b/>
+          <w:bCs/>
+          <w:sz w:val="36"/>
+          <w:szCs w:val="36"/>
+        </w:rPr>
+        <w:t>Tymoteusz Sosnowski</w:t>
+      </w:r>
+      <w:r>
+        <w:rPr>
+          <w:rFonts w:ascii="Times New Roman" w:hAnsi="Times New Roman" w:cs="Times New Roman"/>
+          <w:b/>
+          <w:bCs/>
+          <w:sz w:val="36"/>
+          <w:szCs w:val="36"/>
+        </w:rPr>
+        <w:t>, Jeremi Miroń</w:t>
+      </w:r>
+    </w:p>
+    <w:p>
+      <w:pPr>
+        <w:jc w:val="both"/>
+        <w:rPr>
+          <w:rFonts w:ascii="Times New Roman" w:hAnsi="Times New Roman" w:cs="Times New Roman"/>
+        </w:rPr>
+      </w:pPr>
+      <w:r>
+        <w:rPr>
+          <w:rFonts w:ascii="Times New Roman" w:hAnsi="Times New Roman" w:cs="Times New Roman"/>
+          <w:noProof/>
+        </w:rPr>
+        <w:drawing>
+          <wp:inline distT="0" distB="0" distL="0" distR="0" wp14:anchorId="4719E6CC" wp14:editId="5DC18081">
+            <wp:extent cx="5760720" cy="3930015"/>
+            <wp:effectExtent l="0" t="0" r="0" b="0"/>
+            <wp:docPr id="1162085419" name="Obraz 1"/>
+            <wp:cNvGraphicFramePr>
+              <a:graphicFrameLocks xmlns:a="http://schemas.openxmlformats.org/drawingml/2006/main" noChangeAspect="1"/>
+            </wp:cNvGraphicFramePr>
+            <a:graphic xmlns:a="http://schemas.openxmlformats.org/drawingml/2006/main">
+              <a:graphicData uri="http://schemas.openxmlformats.org/drawingml/2006/picture">
+                <pic:pic xmlns:pic="http://schemas.openxmlformats.org/drawingml/2006/picture">
+                  <pic:nvPicPr>
+                    <pic:cNvPr id="1162085419" name="Obraz 1162085419"/>
+                    <pic:cNvPicPr/>
+                  </pic:nvPicPr>
+                  <pic:blipFill>
+                    <a:blip r:embed="rId11">
+                      <a:extLst>
+                        <a:ext uri="{28A0092B-C50C-407E-A947-70E740481C1C}">
+                          <a14:useLocalDpi xmlns:a14="http://schemas.microsoft.com/office/drawing/2010/main" val="0"/>
+                        </a:ext>
+                      </a:extLst>
+                    </a:blip>
+                    <a:stretch>
+                      <a:fillRect/>
+                    </a:stretch>
+                  </pic:blipFill>
+                  <pic:spPr>
+                    <a:xfrm>
+                      <a:off x="0" y="0"/>
+                      <a:ext cx="5760720" cy="3930015"/>
+                    </a:xfrm>
+                    <a:prstGeom prst="rect">
+                      <a:avLst/>
+                    </a:prstGeom>
+                  </pic:spPr>
+                </pic:pic>
+              </a:graphicData>
+            </a:graphic>
+          </wp:inline>
+        </w:drawing>
+      </w:r>
+    </w:p>
+    <w:p>
+      <w:pPr>
+        <w:jc w:val="both"/>
+        <w:rPr>
+          <w:rFonts w:ascii="Times New Roman" w:hAnsi="Times New Roman" w:cs="Times New Roman"/>
+          <w:sz w:val="28"/>
+          <w:szCs w:val="28"/>
+        </w:rPr>
+      </w:pPr>
+      <w:r>
+        <w:rPr>
+          <w:rFonts w:ascii="Times New Roman" w:hAnsi="Times New Roman" w:cs="Times New Roman"/>
+          <w:b/>
+          <w:bCs/>
+          <w:sz w:val="36"/>
+          <w:szCs w:val="36"/>
+        </w:rPr>
+        <w:t>Jeremi Miroń</w:t>
+      </w:r>
+    </w:p>
+    <w:p>
+      <w:pPr>
+        <w:jc w:val="both"/>
+        <w:rPr>
+          <w:rFonts w:ascii="Times New Roman" w:hAnsi="Times New Roman" w:cs="Times New Roman"/>
+          <w:sz w:val="28"/>
+          <w:szCs w:val="28"/>
+        </w:rPr>
+      </w:pPr>
+      <w:r>
+        <w:rPr>
+          <w:rFonts w:ascii="Times New Roman" w:hAnsi="Times New Roman" w:cs="Times New Roman"/>
+          <w:sz w:val="28"/>
+          <w:szCs w:val="28"/>
+        </w:rPr>
+        <w:t>Użytkownik - J</w:t>
+      </w:r>
+      <w:r>
+        <w:rPr>
+          <w:rFonts w:ascii="Times New Roman" w:hAnsi="Times New Roman" w:cs="Times New Roman"/>
+          <w:sz w:val="28"/>
+          <w:szCs w:val="28"/>
+        </w:rPr>
+        <w:t>est to główny aktor biznesowy</w:t>
+      </w:r>
+      <w:r>
+        <w:rPr>
+          <w:rFonts w:ascii="Times New Roman" w:hAnsi="Times New Roman" w:cs="Times New Roman"/>
+          <w:sz w:val="28"/>
+          <w:szCs w:val="28"/>
+        </w:rPr>
+        <w:t xml:space="preserve">, </w:t>
+      </w:r>
+      <w:r>
+        <w:rPr>
+          <w:rFonts w:ascii="Times New Roman" w:hAnsi="Times New Roman" w:cs="Times New Roman"/>
+          <w:sz w:val="28"/>
+          <w:szCs w:val="28"/>
+        </w:rPr>
+        <w:t>dla którego system został stworzony. Reprezentuje klienta (osobę fizyczną lub firmę) korzystającego z oferty platformy w celu zakupu towarów, rezerwacji maszyn lub zamawiania usług.</w:t>
+      </w:r>
+    </w:p>
+    <w:p>
+      <w:pPr>
+        <w:jc w:val="both"/>
+        <w:rPr>
+          <w:rFonts w:ascii="Times New Roman" w:hAnsi="Times New Roman" w:cs="Times New Roman"/>
+          <w:sz w:val="28"/>
+          <w:szCs w:val="28"/>
+        </w:rPr>
+      </w:pPr>
+      <w:r>
+        <w:rPr>
+          <w:rFonts w:ascii="Times New Roman" w:hAnsi="Times New Roman" w:cs="Times New Roman"/>
+          <w:sz w:val="28"/>
+          <w:szCs w:val="28"/>
+        </w:rPr>
+        <w:t xml:space="preserve">Wynajęty pracownik  - </w:t>
+      </w:r>
+      <w:r>
+        <w:rPr>
+          <w:rFonts w:ascii="Times New Roman" w:hAnsi="Times New Roman" w:cs="Times New Roman"/>
+          <w:sz w:val="28"/>
+          <w:szCs w:val="28"/>
+        </w:rPr>
+        <w:t>Aktor biznesowy (wewnętrzny lub zewnętrzny podwykonawca),</w:t>
+      </w:r>
+      <w:r>
+        <w:rPr>
+          <w:rFonts w:ascii="Times New Roman" w:hAnsi="Times New Roman" w:cs="Times New Roman"/>
+          <w:sz w:val="28"/>
+          <w:szCs w:val="28"/>
+        </w:rPr>
+        <w:t xml:space="preserve"> </w:t>
+      </w:r>
+      <w:r>
+        <w:rPr>
+          <w:rFonts w:ascii="Times New Roman" w:hAnsi="Times New Roman" w:cs="Times New Roman"/>
+          <w:sz w:val="28"/>
+          <w:szCs w:val="28"/>
+        </w:rPr>
+        <w:t xml:space="preserve">który odpowiada za fizyczną realizację zleceń opłaconych przez Użytkownika. Może to być zarówno kurier dostarczający towary, jak i </w:t>
+      </w:r>
+      <w:proofErr w:type="spellStart"/>
+      <w:r>
+        <w:rPr>
+          <w:rFonts w:ascii="Times New Roman" w:hAnsi="Times New Roman" w:cs="Times New Roman"/>
+          <w:sz w:val="28"/>
+          <w:szCs w:val="28"/>
+        </w:rPr>
+        <w:t>serwisant</w:t>
+      </w:r>
+      <w:proofErr w:type="spellEnd"/>
+      <w:r>
+        <w:rPr>
+          <w:rFonts w:ascii="Times New Roman" w:hAnsi="Times New Roman" w:cs="Times New Roman"/>
+          <w:sz w:val="28"/>
+          <w:szCs w:val="28"/>
+        </w:rPr>
+        <w:t>/operator realizujący dedykowaną usługę.</w:t>
+      </w:r>
+    </w:p>
+    <w:p>
+      <w:pPr>
+        <w:jc w:val="both"/>
+        <w:rPr>
+          <w:rFonts w:ascii="Times New Roman" w:hAnsi="Times New Roman" w:cs="Times New Roman"/>
+          <w:sz w:val="28"/>
+          <w:szCs w:val="28"/>
+        </w:rPr>
+      </w:pPr>
+      <w:r>
+        <w:rPr>
+          <w:rFonts w:ascii="Times New Roman" w:hAnsi="Times New Roman" w:cs="Times New Roman"/>
+          <w:sz w:val="28"/>
+          <w:szCs w:val="28"/>
+        </w:rPr>
+        <w:t xml:space="preserve">Admin - </w:t>
+      </w:r>
+      <w:r>
+        <w:rPr>
+          <w:rFonts w:ascii="Times New Roman" w:hAnsi="Times New Roman" w:cs="Times New Roman"/>
+          <w:sz w:val="28"/>
+          <w:szCs w:val="28"/>
+        </w:rPr>
+        <w:t>Aktor systemowy (wewnętrzny) o podwyższonych uprawnieniach. Odpowiada za nadzór nad prawidłowym działaniem procesów biznesowych, weryfikację danych oraz zarządzanie zasobami ludzkimi w systemie.</w:t>
+      </w:r>
+    </w:p>
+    <w:p>
+      <w:pPr>
+        <w:jc w:val="both"/>
+        <w:rPr>
+          <w:rFonts w:ascii="Times New Roman" w:hAnsi="Times New Roman" w:cs="Times New Roman"/>
+          <w:sz w:val="28"/>
+          <w:szCs w:val="28"/>
+        </w:rPr>
+      </w:pPr>
+    </w:p>
+    <w:p>
+      <w:pPr>
+        <w:jc w:val="both"/>
+        <w:rPr>
+          <w:rFonts w:ascii="Times New Roman" w:hAnsi="Times New Roman" w:cs="Times New Roman"/>
+          <w:sz w:val="28"/>
+          <w:szCs w:val="28"/>
+        </w:rPr>
+      </w:pPr>
+    </w:p>
+    <w:p>
+      <w:pPr>
+        <w:jc w:val="both"/>
+        <w:rPr>
+          <w:rFonts w:ascii="Times New Roman" w:hAnsi="Times New Roman" w:cs="Times New Roman"/>
+          <w:sz w:val="28"/>
+          <w:szCs w:val="28"/>
+        </w:rPr>
+      </w:pPr>
+    </w:p>
+    <w:p>
+      <w:pPr>
+        <w:jc w:val="both"/>
+        <w:rPr>
+          <w:rFonts w:ascii="Times New Roman" w:hAnsi="Times New Roman" w:cs="Times New Roman"/>
+          <w:sz w:val="28"/>
+          <w:szCs w:val="28"/>
+        </w:rPr>
+      </w:pPr>
+      <w:r>
+        <w:rPr>
+          <w:rFonts w:ascii="Times New Roman" w:hAnsi="Times New Roman" w:cs="Times New Roman"/>
+          <w:sz w:val="28"/>
+          <w:szCs w:val="28"/>
+        </w:rPr>
+        <w:lastRenderedPageBreak/>
+        <w:t>Opis przypadku użycia „Kupno towarów”:</w:t>
+      </w:r>
+    </w:p>
+    <w:p>
+      <w:pPr>
+        <w:jc w:val="both"/>
+        <w:rPr>
+          <w:rFonts w:ascii="Times New Roman" w:hAnsi="Times New Roman" w:cs="Times New Roman"/>
+          <w:sz w:val="28"/>
+          <w:szCs w:val="28"/>
+        </w:rPr>
+      </w:pPr>
+      <w:r>
+        <w:rPr>
+          <w:rFonts w:ascii="Times New Roman" w:hAnsi="Times New Roman" w:cs="Times New Roman"/>
+          <w:sz w:val="28"/>
+          <w:szCs w:val="28"/>
+        </w:rPr>
+        <w:t>1. Uczestniczący aktorzy</w:t>
+      </w:r>
+    </w:p>
+    <w:p>
+      <w:pPr>
+        <w:numPr>
+          <w:ilvl w:val="0"/>
+          <w:numId w:val="5"/>
+        </w:numPr>
+        <w:jc w:val="both"/>
+        <w:rPr>
+          <w:rFonts w:ascii="Times New Roman" w:hAnsi="Times New Roman" w:cs="Times New Roman"/>
+          <w:sz w:val="28"/>
+          <w:szCs w:val="28"/>
+        </w:rPr>
+      </w:pPr>
+      <w:r>
+        <w:rPr>
+          <w:rFonts w:ascii="Times New Roman" w:hAnsi="Times New Roman" w:cs="Times New Roman"/>
+          <w:sz w:val="28"/>
+          <w:szCs w:val="28"/>
+        </w:rPr>
+        <w:t>Użytkownik</w:t>
+      </w:r>
+    </w:p>
+    <w:p>
+      <w:pPr>
+        <w:jc w:val="both"/>
+        <w:rPr>
+          <w:rFonts w:ascii="Times New Roman" w:hAnsi="Times New Roman" w:cs="Times New Roman"/>
+          <w:sz w:val="28"/>
+          <w:szCs w:val="28"/>
+        </w:rPr>
+      </w:pPr>
+      <w:r>
+        <w:rPr>
+          <w:rFonts w:ascii="Times New Roman" w:hAnsi="Times New Roman" w:cs="Times New Roman"/>
+          <w:sz w:val="28"/>
+          <w:szCs w:val="28"/>
+        </w:rPr>
+        <w:t>2. Podstawowy ciąg zdarzeń</w:t>
+      </w:r>
+    </w:p>
+    <w:p>
+      <w:pPr>
+        <w:pStyle w:val="Akapitzlist"/>
+        <w:numPr>
+          <w:ilvl w:val="0"/>
+          <w:numId w:val="11"/>
+        </w:numPr>
+        <w:jc w:val="both"/>
+        <w:rPr>
+          <w:rFonts w:ascii="Times New Roman" w:hAnsi="Times New Roman" w:cs="Times New Roman"/>
+          <w:sz w:val="28"/>
+          <w:szCs w:val="28"/>
+        </w:rPr>
+      </w:pPr>
+      <w:r>
+        <w:rPr>
+          <w:rFonts w:ascii="Times New Roman" w:hAnsi="Times New Roman" w:cs="Times New Roman"/>
+          <w:sz w:val="28"/>
+          <w:szCs w:val="28"/>
+        </w:rPr>
+        <w:t>System wyświetla podsumowanie koszyka z wybranymi przez Użytkownika towarami oraz formularz danych do wysyłki i wyboru metody dostawy.</w:t>
+      </w:r>
+    </w:p>
+    <w:p>
+      <w:pPr>
+        <w:pStyle w:val="Akapitzlist"/>
+        <w:numPr>
+          <w:ilvl w:val="0"/>
+          <w:numId w:val="11"/>
+        </w:numPr>
+        <w:jc w:val="both"/>
+        <w:rPr>
+          <w:rFonts w:ascii="Times New Roman" w:hAnsi="Times New Roman" w:cs="Times New Roman"/>
+          <w:sz w:val="28"/>
+          <w:szCs w:val="28"/>
+        </w:rPr>
+      </w:pPr>
+      <w:r>
+        <w:rPr>
+          <w:rFonts w:ascii="Times New Roman" w:hAnsi="Times New Roman" w:cs="Times New Roman"/>
+          <w:sz w:val="28"/>
+          <w:szCs w:val="28"/>
+        </w:rPr>
+        <w:t>Użytkownik wprowadza dane adresowe, wybiera preferowany sposób dostawy i klika przycisk zatwierdzający zakup.</w:t>
+      </w:r>
+    </w:p>
+    <w:p>
+      <w:pPr>
+        <w:pStyle w:val="Akapitzlist"/>
+        <w:numPr>
+          <w:ilvl w:val="0"/>
+          <w:numId w:val="11"/>
+        </w:numPr>
+        <w:jc w:val="both"/>
+        <w:rPr>
+          <w:rFonts w:ascii="Times New Roman" w:hAnsi="Times New Roman" w:cs="Times New Roman"/>
+          <w:sz w:val="28"/>
+          <w:szCs w:val="28"/>
+        </w:rPr>
+      </w:pPr>
+      <w:r>
+        <w:rPr>
+          <w:rFonts w:ascii="Times New Roman" w:hAnsi="Times New Roman" w:cs="Times New Roman"/>
+          <w:sz w:val="28"/>
+          <w:szCs w:val="28"/>
+        </w:rPr>
+        <w:t xml:space="preserve">System tworzy nowe zlecenie w bazie danych i automatycznie uruchamia </w:t>
+      </w:r>
+      <w:r>
+        <w:rPr>
+          <w:rFonts w:ascii="Times New Roman" w:hAnsi="Times New Roman" w:cs="Times New Roman"/>
+          <w:sz w:val="28"/>
+          <w:szCs w:val="28"/>
+        </w:rPr>
+        <w:t>opcje płatności (przypadek użycia Opłacenie zlecenia)</w:t>
+      </w:r>
+    </w:p>
+    <w:p>
+      <w:pPr>
+        <w:pStyle w:val="Akapitzlist"/>
+        <w:numPr>
+          <w:ilvl w:val="0"/>
+          <w:numId w:val="11"/>
+        </w:numPr>
+        <w:jc w:val="both"/>
+        <w:rPr>
+          <w:rFonts w:ascii="Times New Roman" w:hAnsi="Times New Roman" w:cs="Times New Roman"/>
+          <w:sz w:val="28"/>
+          <w:szCs w:val="28"/>
+        </w:rPr>
+      </w:pPr>
+      <w:r>
+        <w:rPr>
+          <w:rFonts w:ascii="Times New Roman" w:hAnsi="Times New Roman" w:cs="Times New Roman"/>
+          <w:sz w:val="28"/>
+          <w:szCs w:val="28"/>
+        </w:rPr>
+        <w:t>Użytkownik przechodzi do bramki płatności i pomyślnie opłaca zamówienie.</w:t>
+      </w:r>
+    </w:p>
+    <w:p>
+      <w:pPr>
+        <w:pStyle w:val="Akapitzlist"/>
+        <w:numPr>
+          <w:ilvl w:val="0"/>
+          <w:numId w:val="11"/>
+        </w:numPr>
+        <w:jc w:val="both"/>
+        <w:rPr>
+          <w:rFonts w:ascii="Times New Roman" w:hAnsi="Times New Roman" w:cs="Times New Roman"/>
+          <w:sz w:val="28"/>
+          <w:szCs w:val="28"/>
+        </w:rPr>
+      </w:pPr>
+      <w:r>
+        <w:rPr>
+          <w:rFonts w:ascii="Times New Roman" w:hAnsi="Times New Roman" w:cs="Times New Roman"/>
+          <w:sz w:val="28"/>
+          <w:szCs w:val="28"/>
+        </w:rPr>
+        <w:t>System rejestruje wpłatę, zmienia status zlecenia na „Opłacone / Do realizacji” i rezerwuje towary w magazynie.</w:t>
+      </w:r>
+    </w:p>
+    <w:p>
+      <w:pPr>
+        <w:pStyle w:val="Akapitzlist"/>
+        <w:numPr>
+          <w:ilvl w:val="0"/>
+          <w:numId w:val="11"/>
+        </w:numPr>
+        <w:jc w:val="both"/>
+        <w:rPr>
+          <w:rFonts w:ascii="Times New Roman" w:hAnsi="Times New Roman" w:cs="Times New Roman"/>
+          <w:sz w:val="28"/>
+          <w:szCs w:val="28"/>
+        </w:rPr>
+      </w:pPr>
+      <w:r>
+        <w:rPr>
+          <w:rFonts w:ascii="Times New Roman" w:hAnsi="Times New Roman" w:cs="Times New Roman"/>
+          <w:sz w:val="28"/>
+          <w:szCs w:val="28"/>
+        </w:rPr>
+        <w:t>System informuje o dokonaniu pomyślnego zakupu, wyświetlając odpowiedni komunikat na ekranie oraz wysyła potwierdzenie na adres e-mail Użytkownika.</w:t>
+      </w:r>
+    </w:p>
+    <w:p>
+      <w:pPr>
+        <w:jc w:val="both"/>
+        <w:rPr>
+          <w:rFonts w:ascii="Times New Roman" w:hAnsi="Times New Roman" w:cs="Times New Roman"/>
+          <w:sz w:val="28"/>
+          <w:szCs w:val="28"/>
+        </w:rPr>
+      </w:pPr>
+      <w:r>
+        <w:rPr>
+          <w:rFonts w:ascii="Times New Roman" w:hAnsi="Times New Roman" w:cs="Times New Roman"/>
+          <w:sz w:val="28"/>
+          <w:szCs w:val="28"/>
+        </w:rPr>
+        <w:t>3. Alternatywne ciągi zdarzeń</w:t>
+      </w:r>
+    </w:p>
+    <w:p>
+      <w:pPr>
+        <w:pStyle w:val="Akapitzlist"/>
+        <w:numPr>
+          <w:ilvl w:val="1"/>
+          <w:numId w:val="12"/>
+        </w:numPr>
+        <w:jc w:val="both"/>
+        <w:rPr>
+          <w:rFonts w:ascii="Times New Roman" w:hAnsi="Times New Roman" w:cs="Times New Roman"/>
+          <w:sz w:val="28"/>
+          <w:szCs w:val="28"/>
+        </w:rPr>
+      </w:pPr>
+      <w:r>
+        <w:rPr>
+          <w:rFonts w:ascii="Times New Roman" w:hAnsi="Times New Roman" w:cs="Times New Roman"/>
+          <w:sz w:val="28"/>
+          <w:szCs w:val="28"/>
+        </w:rPr>
+        <w:t>System stwierdza niekompletność danych lub brak towaru w magazynie</w:t>
+      </w:r>
+    </w:p>
+    <w:p>
+      <w:pPr>
+        <w:pStyle w:val="Akapitzlist"/>
+        <w:numPr>
+          <w:ilvl w:val="1"/>
+          <w:numId w:val="12"/>
+        </w:numPr>
+        <w:jc w:val="both"/>
+        <w:rPr>
+          <w:rFonts w:ascii="Times New Roman" w:hAnsi="Times New Roman" w:cs="Times New Roman"/>
+          <w:sz w:val="28"/>
+          <w:szCs w:val="28"/>
+        </w:rPr>
+      </w:pPr>
+      <w:r>
+        <w:rPr>
+          <w:rFonts w:ascii="Times New Roman" w:hAnsi="Times New Roman" w:cs="Times New Roman"/>
+          <w:sz w:val="28"/>
+          <w:szCs w:val="28"/>
+        </w:rPr>
+        <w:t>System przerywa proces i wyświetla formularz z zaznaczonymi polami, w których stwierdzono błędy (lub wyświetla informację o wyprzedaniu towaru w międzyczasie).</w:t>
+      </w:r>
+    </w:p>
+    <w:p>
+      <w:pPr>
+        <w:pStyle w:val="Akapitzlist"/>
+        <w:numPr>
+          <w:ilvl w:val="1"/>
+          <w:numId w:val="12"/>
+        </w:numPr>
+        <w:jc w:val="both"/>
+        <w:rPr>
+          <w:rFonts w:ascii="Times New Roman" w:hAnsi="Times New Roman" w:cs="Times New Roman"/>
+          <w:sz w:val="28"/>
+          <w:szCs w:val="28"/>
+        </w:rPr>
+      </w:pPr>
+      <w:r>
+        <w:rPr>
+          <w:rFonts w:ascii="Times New Roman" w:hAnsi="Times New Roman" w:cs="Times New Roman"/>
+          <w:sz w:val="28"/>
+          <w:szCs w:val="28"/>
+        </w:rPr>
+        <w:t>Użytkownik ma możliwość</w:t>
+      </w:r>
+      <w:r>
+        <w:rPr>
+          <w:rFonts w:ascii="Times New Roman" w:hAnsi="Times New Roman" w:cs="Times New Roman"/>
+          <w:sz w:val="28"/>
+          <w:szCs w:val="28"/>
+        </w:rPr>
+        <w:t xml:space="preserve"> poprawienia danych lub modyfikacji zawartości koszyka.</w:t>
+      </w:r>
+    </w:p>
+    <w:p>
+      <w:pPr>
+        <w:jc w:val="both"/>
+        <w:rPr>
+          <w:rFonts w:ascii="Times New Roman" w:hAnsi="Times New Roman" w:cs="Times New Roman"/>
+          <w:sz w:val="28"/>
+          <w:szCs w:val="28"/>
+        </w:rPr>
+      </w:pPr>
+      <w:r>
+        <w:rPr>
+          <w:rFonts w:ascii="Times New Roman" w:hAnsi="Times New Roman" w:cs="Times New Roman"/>
+          <w:sz w:val="28"/>
+          <w:szCs w:val="28"/>
+        </w:rPr>
+        <w:t>4. Zależności czasowe</w:t>
+      </w:r>
+    </w:p>
+    <w:p>
+      <w:pPr>
+        <w:numPr>
+          <w:ilvl w:val="0"/>
+          <w:numId w:val="16"/>
+        </w:numPr>
+        <w:jc w:val="both"/>
+        <w:rPr>
+          <w:rFonts w:ascii="Times New Roman" w:hAnsi="Times New Roman" w:cs="Times New Roman"/>
+          <w:sz w:val="28"/>
+          <w:szCs w:val="28"/>
+        </w:rPr>
+      </w:pPr>
+      <w:r>
+        <w:rPr>
+          <w:rFonts w:ascii="Times New Roman" w:hAnsi="Times New Roman" w:cs="Times New Roman"/>
+          <w:sz w:val="28"/>
+          <w:szCs w:val="28"/>
+        </w:rPr>
+        <w:t>a) częstotliwość wykonania: ~15–40 razy dziennie (w zależności od ruchu na platformie)</w:t>
+      </w:r>
+    </w:p>
+    <w:p>
+      <w:pPr>
+        <w:numPr>
+          <w:ilvl w:val="0"/>
+          <w:numId w:val="16"/>
+        </w:numPr>
+        <w:jc w:val="both"/>
+        <w:rPr>
+          <w:rFonts w:ascii="Times New Roman" w:hAnsi="Times New Roman" w:cs="Times New Roman"/>
+          <w:sz w:val="28"/>
+          <w:szCs w:val="28"/>
+        </w:rPr>
+      </w:pPr>
+      <w:r>
+        <w:rPr>
+          <w:rFonts w:ascii="Times New Roman" w:hAnsi="Times New Roman" w:cs="Times New Roman"/>
+          <w:sz w:val="28"/>
+          <w:szCs w:val="28"/>
+        </w:rPr>
+        <w:t xml:space="preserve">b) przewidywane spiętrzenia: okres przedświąteczny, godziny wieczorne (18:00–22:00), akcje promocyjne (np. Black </w:t>
+      </w:r>
+      <w:proofErr w:type="spellStart"/>
+      <w:r>
+        <w:rPr>
+          <w:rFonts w:ascii="Times New Roman" w:hAnsi="Times New Roman" w:cs="Times New Roman"/>
+          <w:sz w:val="28"/>
+          <w:szCs w:val="28"/>
+        </w:rPr>
+        <w:t>Friday</w:t>
+      </w:r>
+      <w:proofErr w:type="spellEnd"/>
+      <w:r>
+        <w:rPr>
+          <w:rFonts w:ascii="Times New Roman" w:hAnsi="Times New Roman" w:cs="Times New Roman"/>
+          <w:sz w:val="28"/>
+          <w:szCs w:val="28"/>
+        </w:rPr>
+        <w:t>)</w:t>
+      </w:r>
+    </w:p>
+    <w:p>
+      <w:pPr>
+        <w:numPr>
+          <w:ilvl w:val="0"/>
+          <w:numId w:val="16"/>
+        </w:numPr>
+        <w:jc w:val="both"/>
+        <w:rPr>
+          <w:rFonts w:ascii="Times New Roman" w:hAnsi="Times New Roman" w:cs="Times New Roman"/>
+          <w:sz w:val="28"/>
+          <w:szCs w:val="28"/>
+        </w:rPr>
+      </w:pPr>
+      <w:r>
+        <w:rPr>
+          <w:rFonts w:ascii="Times New Roman" w:hAnsi="Times New Roman" w:cs="Times New Roman"/>
+          <w:sz w:val="28"/>
+          <w:szCs w:val="28"/>
+        </w:rPr>
+        <w:t>c) typowy czas realizacji: ~2–3 minuty</w:t>
+      </w:r>
+    </w:p>
+    <w:p>
+      <w:pPr>
+        <w:numPr>
+          <w:ilvl w:val="0"/>
+          <w:numId w:val="16"/>
+        </w:numPr>
+        <w:jc w:val="both"/>
+        <w:rPr>
+          <w:rFonts w:ascii="Times New Roman" w:hAnsi="Times New Roman" w:cs="Times New Roman"/>
+          <w:sz w:val="28"/>
+          <w:szCs w:val="28"/>
+        </w:rPr>
+      </w:pPr>
+      <w:r>
+        <w:rPr>
+          <w:rFonts w:ascii="Times New Roman" w:hAnsi="Times New Roman" w:cs="Times New Roman"/>
+          <w:sz w:val="28"/>
+          <w:szCs w:val="28"/>
+        </w:rPr>
+        <w:lastRenderedPageBreak/>
+        <w:t>d) maksymalny czas realizacji: 15 minut (</w:t>
+      </w:r>
+      <w:r>
+        <w:rPr>
+          <w:rFonts w:ascii="Times New Roman" w:hAnsi="Times New Roman" w:cs="Times New Roman"/>
+          <w:sz w:val="28"/>
+          <w:szCs w:val="28"/>
+        </w:rPr>
+        <w:t>odgórny limit przy bramce płatności</w:t>
+      </w:r>
+      <w:r>
+        <w:rPr>
+          <w:rFonts w:ascii="Times New Roman" w:hAnsi="Times New Roman" w:cs="Times New Roman"/>
+          <w:sz w:val="28"/>
+          <w:szCs w:val="28"/>
+        </w:rPr>
+        <w:t>)</w:t>
+      </w:r>
+    </w:p>
+    <w:p>
+      <w:pPr>
+        <w:spacing w:before="100" w:beforeAutospacing="1" w:after="100" w:afterAutospacing="1" w:line="240" w:lineRule="auto"/>
+        <w:outlineLvl w:val="3"/>
+        <w:rPr>
+          <w:rFonts w:ascii="Times New Roman" w:eastAsia="Times New Roman" w:hAnsi="Times New Roman" w:cs="Times New Roman"/>
+          <w:kern w:val="0"/>
+          <w:sz w:val="28"/>
+          <w:szCs w:val="28"/>
+          <w:lang w:eastAsia="pl-PL"/>
+          <w14:ligatures w14:val="none"/>
+        </w:rPr>
+      </w:pPr>
+      <w:r>
+        <w:rPr>
+          <w:rFonts w:ascii="Times New Roman" w:eastAsia="Times New Roman" w:hAnsi="Times New Roman" w:cs="Times New Roman"/>
+          <w:kern w:val="0"/>
+          <w:sz w:val="28"/>
+          <w:szCs w:val="28"/>
+          <w:lang w:eastAsia="pl-PL"/>
+          <w14:ligatures w14:val="none"/>
+        </w:rPr>
+        <w:t>5. Wartości uzyskiwane przez aktorów po zakończeniu przypadku użycia</w:t>
+      </w:r>
+    </w:p>
+    <w:p>
+      <w:pPr>
+        <w:numPr>
+          <w:ilvl w:val="0"/>
+          <w:numId w:val="17"/>
+        </w:numPr>
+        <w:spacing w:before="100" w:beforeAutospacing="1" w:after="100" w:afterAutospacing="1" w:line="240" w:lineRule="auto"/>
+        <w:rPr>
+          <w:rFonts w:ascii="Times New Roman" w:eastAsia="Times New Roman" w:hAnsi="Times New Roman" w:cs="Times New Roman"/>
+          <w:kern w:val="0"/>
+          <w:sz w:val="28"/>
+          <w:szCs w:val="28"/>
+          <w:lang w:eastAsia="pl-PL"/>
+          <w14:ligatures w14:val="none"/>
+        </w:rPr>
+      </w:pPr>
+      <w:r>
+        <w:rPr>
+          <w:rFonts w:ascii="Times New Roman" w:eastAsia="Times New Roman" w:hAnsi="Times New Roman" w:cs="Times New Roman"/>
+          <w:kern w:val="0"/>
+          <w:sz w:val="28"/>
+          <w:szCs w:val="28"/>
+          <w:lang w:eastAsia="pl-PL"/>
+          <w14:ligatures w14:val="none"/>
+        </w:rPr>
+        <w:t>Komunikat na ekranie oraz e-mailowe potwierdzenie zakupu wraz z numerem zamówienia.</w:t>
+      </w:r>
+    </w:p>
+    <w:p>
+      <w:pPr>
+        <w:numPr>
+          <w:ilvl w:val="0"/>
+          <w:numId w:val="17"/>
+        </w:numPr>
+        <w:spacing w:before="100" w:beforeAutospacing="1" w:after="100" w:afterAutospacing="1" w:line="240" w:lineRule="auto"/>
+        <w:rPr>
+          <w:rFonts w:ascii="Times New Roman" w:eastAsia="Times New Roman" w:hAnsi="Times New Roman" w:cs="Times New Roman"/>
+          <w:kern w:val="0"/>
+          <w:sz w:val="28"/>
+          <w:szCs w:val="28"/>
+          <w:lang w:eastAsia="pl-PL"/>
+          <w14:ligatures w14:val="none"/>
+        </w:rPr>
+      </w:pPr>
+      <w:r>
+        <w:rPr>
+          <w:rFonts w:ascii="Times New Roman" w:eastAsia="Times New Roman" w:hAnsi="Times New Roman" w:cs="Times New Roman"/>
+          <w:kern w:val="0"/>
+          <w:sz w:val="28"/>
+          <w:szCs w:val="28"/>
+          <w:lang w:eastAsia="pl-PL"/>
+          <w14:ligatures w14:val="none"/>
+        </w:rPr>
+        <w:t>Nowy wpis w rejestrze zleceń ze statusem „Opłacone”, który staje się widoczny dla Admina oraz Wynajętego pracownika w celu dalszej realizacji.</w:t>
+      </w:r>
+    </w:p>
+    <w:p>
+      <w:pPr>
+        <w:jc w:val="both"/>
+        <w:rPr>
+          <w:rFonts w:ascii="Times New Roman" w:hAnsi="Times New Roman" w:cs="Times New Roman"/>
+          <w:sz w:val="28"/>
+          <w:szCs w:val="28"/>
+        </w:rPr>
+      </w:pPr>
+    </w:p>
+    <w:p>
+      <w:pPr>
+        <w:jc w:val="both"/>
+        <w:rPr>
+          <w:rFonts w:ascii="Times New Roman" w:hAnsi="Times New Roman" w:cs="Times New Roman"/>
+          <w:sz w:val="28"/>
+          <w:szCs w:val="28"/>
+        </w:rPr>
+      </w:pPr>
+      <w:r>
+        <w:rPr>
+          <w:rFonts w:ascii="Times New Roman" w:hAnsi="Times New Roman" w:cs="Times New Roman"/>
+          <w:sz w:val="28"/>
+          <w:szCs w:val="28"/>
+        </w:rPr>
+        <w:t xml:space="preserve">        4.2. Diagramy czynności (3 przykładowe diagramy)</w:t>
+      </w:r>
+    </w:p>
+    <w:p>
+      <w:pPr>
+        <w:jc w:val="both"/>
+        <w:rPr>
+          <w:rFonts w:ascii="Times New Roman" w:hAnsi="Times New Roman" w:cs="Times New Roman"/>
+          <w:sz w:val="28"/>
+          <w:szCs w:val="28"/>
+        </w:rPr>
+      </w:pPr>
+      <w:r>
+        <w:rPr>
+          <w:rFonts w:ascii="Times New Roman" w:hAnsi="Times New Roman" w:cs="Times New Roman"/>
+          <w:sz w:val="28"/>
+          <w:szCs w:val="28"/>
+        </w:rPr>
+        <w:t xml:space="preserve">        4.3. Diagramy interakcji (przebiegu) z opisem tekstowym komunikatów (3 przykładowe diagramy)</w:t>
+      </w:r>
+    </w:p>
+    <w:p>
+      <w:pPr>
+        <w:jc w:val="both"/>
+        <w:rPr>
+          <w:rFonts w:ascii="Times New Roman" w:hAnsi="Times New Roman" w:cs="Times New Roman"/>
+          <w:sz w:val="28"/>
+          <w:szCs w:val="28"/>
+        </w:rPr>
+      </w:pPr>
+      <w:r>
+        <w:rPr>
+          <w:rFonts w:ascii="Times New Roman" w:hAnsi="Times New Roman" w:cs="Times New Roman"/>
+          <w:sz w:val="28"/>
+          <w:szCs w:val="28"/>
+        </w:rPr>
+        <w:t xml:space="preserve">    5. Perspektywa projektowa:</w:t>
+      </w:r>
+    </w:p>
+    <w:p>
+      <w:pPr>
+        <w:jc w:val="both"/>
+        <w:rPr>
+          <w:rFonts w:ascii="Times New Roman" w:hAnsi="Times New Roman" w:cs="Times New Roman"/>
+          <w:sz w:val="28"/>
+          <w:szCs w:val="28"/>
+        </w:rPr>
+      </w:pPr>
+      <w:r>
+        <w:rPr>
+          <w:rFonts w:ascii="Times New Roman" w:hAnsi="Times New Roman" w:cs="Times New Roman"/>
+          <w:sz w:val="28"/>
+          <w:szCs w:val="28"/>
+        </w:rPr>
+        <w:t xml:space="preserve">        5.0. Proponowana architektura systemu (np. w postaci diagramu pakietów/komponentów) wraz z opisem</w:t>
+      </w:r>
+    </w:p>
+    <w:p>
+      <w:pPr>
+        <w:jc w:val="both"/>
+        <w:rPr>
+          <w:rFonts w:ascii="Times New Roman" w:hAnsi="Times New Roman" w:cs="Times New Roman"/>
+          <w:sz w:val="28"/>
+          <w:szCs w:val="28"/>
+          <w:highlight w:val="green"/>
+        </w:rPr>
+      </w:pPr>
+      <w:r>
+        <w:rPr>
+          <w:rFonts w:ascii="Times New Roman" w:hAnsi="Times New Roman" w:cs="Times New Roman"/>
+          <w:sz w:val="28"/>
+          <w:szCs w:val="28"/>
+        </w:rPr>
+        <w:t xml:space="preserve">        </w:t>
+      </w:r>
+      <w:r>
+        <w:rPr>
+          <w:rFonts w:ascii="Times New Roman" w:hAnsi="Times New Roman" w:cs="Times New Roman"/>
+          <w:sz w:val="28"/>
+          <w:szCs w:val="28"/>
+          <w:highlight w:val="green"/>
+        </w:rPr>
+        <w:t>5.1. Diagram(-y) klas</w:t>
+      </w:r>
+    </w:p>
+    <w:p>
+      <w:pPr>
+        <w:jc w:val="both"/>
+        <w:rPr>
+          <w:rFonts w:ascii="Times New Roman" w:hAnsi="Times New Roman" w:cs="Times New Roman"/>
+          <w:sz w:val="28"/>
+          <w:szCs w:val="28"/>
+          <w:highlight w:val="green"/>
+        </w:rPr>
+      </w:pPr>
+      <w:r>
+        <w:rPr>
+          <w:rFonts w:ascii="Times New Roman" w:hAnsi="Times New Roman" w:cs="Times New Roman"/>
+          <w:sz w:val="28"/>
+          <w:szCs w:val="28"/>
+          <w:highlight w:val="green"/>
+        </w:rPr>
+        <w:t xml:space="preserve">        5.2. Uporządkowany alfabetycznie wykaz wszystkich klas, zawierający:</w:t>
+      </w:r>
+    </w:p>
+    <w:p>
+      <w:pPr>
+        <w:jc w:val="both"/>
+        <w:rPr>
+          <w:rFonts w:ascii="Times New Roman" w:hAnsi="Times New Roman" w:cs="Times New Roman"/>
+          <w:sz w:val="28"/>
+          <w:szCs w:val="28"/>
+          <w:highlight w:val="green"/>
+        </w:rPr>
+      </w:pPr>
+      <w:r>
+        <w:rPr>
+          <w:rFonts w:ascii="Times New Roman" w:hAnsi="Times New Roman" w:cs="Times New Roman"/>
+          <w:sz w:val="28"/>
+          <w:szCs w:val="28"/>
+          <w:highlight w:val="green"/>
+        </w:rPr>
+        <w:t xml:space="preserve">                - krótki opis tekstowy</w:t>
+      </w:r>
+    </w:p>
+    <w:p>
+      <w:pPr>
+        <w:jc w:val="both"/>
+        <w:rPr>
+          <w:rFonts w:ascii="Times New Roman" w:hAnsi="Times New Roman" w:cs="Times New Roman"/>
+          <w:sz w:val="28"/>
+          <w:szCs w:val="28"/>
+        </w:rPr>
+      </w:pPr>
+      <w:r>
+        <w:rPr>
+          <w:rFonts w:ascii="Times New Roman" w:hAnsi="Times New Roman" w:cs="Times New Roman"/>
+          <w:sz w:val="28"/>
+          <w:szCs w:val="28"/>
+          <w:highlight w:val="green"/>
+        </w:rPr>
+        <w:t xml:space="preserve">                - wykaz wszystkich zidentyfikowanych atrybutów i metod (z krótkim opisem tekstowym w przypadku mniej czytelnych nazw)</w:t>
+      </w:r>
+    </w:p>
+    <w:p>
+      <w:pPr>
+        <w:jc w:val="both"/>
+        <w:rPr>
+          <w:rFonts w:ascii="Times New Roman" w:hAnsi="Times New Roman" w:cs="Times New Roman"/>
+          <w:sz w:val="28"/>
+          <w:szCs w:val="28"/>
+        </w:rPr>
+      </w:pPr>
+      <w:r>
+        <w:rPr>
+          <w:rFonts w:ascii="Times New Roman" w:hAnsi="Times New Roman" w:cs="Times New Roman"/>
+          <w:sz w:val="28"/>
+          <w:szCs w:val="28"/>
+        </w:rPr>
+        <w:t xml:space="preserve">        5.3. Diagramy stanów (3 diagramy dla wybranych klas) wraz z opisem tekstowym występującym na nich elementów</w:t>
+      </w:r>
+    </w:p>
+    <w:p>
+      <w:pPr>
+        <w:jc w:val="both"/>
+        <w:rPr>
+          <w:rFonts w:ascii="Times New Roman" w:hAnsi="Times New Roman" w:cs="Times New Roman"/>
+          <w:sz w:val="28"/>
+          <w:szCs w:val="28"/>
+        </w:rPr>
+      </w:pPr>
+      <w:r>
+        <w:rPr>
+          <w:rFonts w:ascii="Times New Roman" w:hAnsi="Times New Roman" w:cs="Times New Roman"/>
+          <w:sz w:val="28"/>
+          <w:szCs w:val="28"/>
+        </w:rPr>
+        <w:t xml:space="preserve">        5.4. Propozycje interfejsu użytkownika (okno główne, menu główne i podręczne, kluczowe formatki dialogowe, itp...)</w:t>
+      </w:r>
+    </w:p>
+    <w:p>
+      <w:pPr>
+        <w:jc w:val="both"/>
+        <w:rPr>
+          <w:rFonts w:ascii="Times New Roman" w:hAnsi="Times New Roman" w:cs="Times New Roman"/>
+          <w:sz w:val="28"/>
+          <w:szCs w:val="28"/>
+        </w:rPr>
+      </w:pPr>
+      <w:r>
+        <w:rPr>
+          <w:rFonts w:ascii="Times New Roman" w:hAnsi="Times New Roman" w:cs="Times New Roman"/>
+          <w:sz w:val="28"/>
+          <w:szCs w:val="28"/>
+        </w:rPr>
+        <w:t xml:space="preserve">    6. Wymagania niefunkcjonalne dla system, w tym m.in.:</w:t>
+      </w:r>
+    </w:p>
+    <w:p>
+      <w:pPr>
+        <w:jc w:val="both"/>
+        <w:rPr>
+          <w:rFonts w:ascii="Times New Roman" w:hAnsi="Times New Roman" w:cs="Times New Roman"/>
+          <w:sz w:val="28"/>
+          <w:szCs w:val="28"/>
+        </w:rPr>
+      </w:pPr>
+      <w:r>
+        <w:rPr>
+          <w:rFonts w:ascii="Times New Roman" w:hAnsi="Times New Roman" w:cs="Times New Roman"/>
+          <w:sz w:val="28"/>
+          <w:szCs w:val="28"/>
+        </w:rPr>
+        <w:t xml:space="preserve">        6.1. Oszacowanie wielkości bazy danych</w:t>
+      </w:r>
+    </w:p>
+    <w:p>
+      <w:pPr>
+        <w:jc w:val="both"/>
+        <w:rPr>
+          <w:rFonts w:ascii="Times New Roman" w:hAnsi="Times New Roman" w:cs="Times New Roman"/>
+          <w:sz w:val="28"/>
+          <w:szCs w:val="28"/>
+        </w:rPr>
+      </w:pPr>
+      <w:r>
+        <w:rPr>
+          <w:rFonts w:ascii="Times New Roman" w:hAnsi="Times New Roman" w:cs="Times New Roman"/>
+          <w:sz w:val="28"/>
+          <w:szCs w:val="28"/>
+        </w:rPr>
+        <w:t xml:space="preserve">        6.2. Propozycja wymaganych czasów odpowiedzi</w:t>
+      </w:r>
+    </w:p>
+    <w:p>
+      <w:pPr>
+        <w:jc w:val="both"/>
+        <w:rPr>
+          <w:rFonts w:ascii="Times New Roman" w:hAnsi="Times New Roman" w:cs="Times New Roman"/>
+          <w:sz w:val="28"/>
+          <w:szCs w:val="28"/>
+        </w:rPr>
+      </w:pPr>
+      <w:r>
+        <w:rPr>
+          <w:rFonts w:ascii="Times New Roman" w:hAnsi="Times New Roman" w:cs="Times New Roman"/>
+          <w:sz w:val="28"/>
+          <w:szCs w:val="28"/>
+        </w:rPr>
+        <w:t xml:space="preserve">        6.3. Oszacowanie liczby i typów potrzebnych stanowisk pracy użytkowników systemu </w:t>
+      </w:r>
+    </w:p>
+    <w:p>
+      <w:pPr>
+        <w:jc w:val="both"/>
+        <w:rPr>
+          <w:rFonts w:ascii="Times New Roman" w:hAnsi="Times New Roman" w:cs="Times New Roman"/>
+          <w:sz w:val="28"/>
+          <w:szCs w:val="28"/>
+        </w:rPr>
+      </w:pPr>
+      <w:r>
+        <w:rPr>
+          <w:rFonts w:ascii="Times New Roman" w:hAnsi="Times New Roman" w:cs="Times New Roman"/>
+          <w:sz w:val="28"/>
+          <w:szCs w:val="28"/>
+        </w:rPr>
+        <w:lastRenderedPageBreak/>
+        <w:t xml:space="preserve">    7. Propozycja technologii informatycznych, które mogą zostać wykorzystane do realizacji systemu (sprzęt, oprogramowanie)</w:t>
+      </w:r>
+    </w:p>
+    <w:p>
+      <w:pPr>
+        <w:jc w:val="both"/>
+        <w:rPr>
+          <w:rFonts w:ascii="Times New Roman" w:hAnsi="Times New Roman" w:cs="Times New Roman"/>
+          <w:sz w:val="28"/>
+          <w:szCs w:val="28"/>
+        </w:rPr>
+      </w:pPr>
+      <w:r>
+        <w:rPr>
+          <w:rFonts w:ascii="Times New Roman" w:hAnsi="Times New Roman" w:cs="Times New Roman"/>
+          <w:sz w:val="28"/>
+          <w:szCs w:val="28"/>
+        </w:rPr>
+        <w:t xml:space="preserve">        - diagram(-y) wdrożenia</w:t>
+      </w:r>
+    </w:p>
+    <w:p>
+      <w:pPr>
+        <w:jc w:val="both"/>
+        <w:rPr>
+          <w:rFonts w:ascii="Times New Roman" w:hAnsi="Times New Roman" w:cs="Times New Roman"/>
+          <w:sz w:val="28"/>
+          <w:szCs w:val="28"/>
+        </w:rPr>
+      </w:pPr>
+      <w:r>
+        <w:rPr>
+          <w:rFonts w:ascii="Times New Roman" w:hAnsi="Times New Roman" w:cs="Times New Roman"/>
+          <w:sz w:val="28"/>
+          <w:szCs w:val="28"/>
+        </w:rPr>
+        <w:t xml:space="preserve">    8. Propozycja planu pracy zawierająca, przynajmniej:</w:t>
+      </w:r>
+    </w:p>
+    <w:p>
+      <w:pPr>
+        <w:jc w:val="both"/>
+        <w:rPr>
+          <w:rFonts w:ascii="Times New Roman" w:hAnsi="Times New Roman" w:cs="Times New Roman"/>
+          <w:sz w:val="28"/>
+          <w:szCs w:val="28"/>
+        </w:rPr>
+      </w:pPr>
+      <w:r>
+        <w:rPr>
+          <w:rFonts w:ascii="Times New Roman" w:hAnsi="Times New Roman" w:cs="Times New Roman"/>
+          <w:sz w:val="28"/>
+          <w:szCs w:val="28"/>
+        </w:rPr>
+        <w:t xml:space="preserve">        - wyróżnione etapy (powiązane z konkretnymi częściami systemu, realizowanymi komponentami, ...)</w:t>
+      </w:r>
+    </w:p>
+    <w:p>
+      <w:pPr>
+        <w:jc w:val="both"/>
+        <w:rPr>
+          <w:rFonts w:ascii="Times New Roman" w:hAnsi="Times New Roman" w:cs="Times New Roman"/>
+          <w:sz w:val="28"/>
+          <w:szCs w:val="28"/>
+        </w:rPr>
+      </w:pPr>
+      <w:r>
+        <w:rPr>
+          <w:rFonts w:ascii="Times New Roman" w:hAnsi="Times New Roman" w:cs="Times New Roman"/>
+          <w:sz w:val="28"/>
+          <w:szCs w:val="28"/>
+        </w:rPr>
+        <w:t xml:space="preserve">          z podanym czasem trwania każdego etapu (dni robocze)</w:t>
+      </w:r>
+    </w:p>
+    <w:p>
+      <w:pPr>
+        <w:jc w:val="both"/>
+        <w:rPr>
+          <w:rFonts w:ascii="Times New Roman" w:hAnsi="Times New Roman" w:cs="Times New Roman"/>
+          <w:sz w:val="28"/>
+          <w:szCs w:val="28"/>
+        </w:rPr>
+      </w:pPr>
+      <w:r>
+        <w:rPr>
+          <w:rFonts w:ascii="Times New Roman" w:hAnsi="Times New Roman" w:cs="Times New Roman"/>
+          <w:sz w:val="28"/>
+          <w:szCs w:val="28"/>
+        </w:rPr>
+        <w:t xml:space="preserve">        - zależności pomiędzy etapami (np. co musi być zakończone przed rozpoczęciem kolejnego etapu)</w:t>
+      </w:r>
+    </w:p>
+    <w:p>
+      <w:pPr>
+        <w:jc w:val="both"/>
+        <w:rPr>
+          <w:rFonts w:ascii="Times New Roman" w:hAnsi="Times New Roman" w:cs="Times New Roman"/>
+          <w:sz w:val="28"/>
+          <w:szCs w:val="28"/>
+        </w:rPr>
+      </w:pPr>
+      <w:r>
+        <w:rPr>
+          <w:rFonts w:ascii="Times New Roman" w:hAnsi="Times New Roman" w:cs="Times New Roman"/>
+          <w:sz w:val="28"/>
+          <w:szCs w:val="28"/>
+        </w:rPr>
+        <w:t xml:space="preserve">        - alokacja zasobów ludzkich do realizacji poszczególnych etapów</w:t>
+      </w:r>
+    </w:p>
+    <w:p>
+      <w:pPr>
+        <w:jc w:val="both"/>
+        <w:rPr>
+          <w:rFonts w:ascii="Times New Roman" w:hAnsi="Times New Roman" w:cs="Times New Roman"/>
+          <w:sz w:val="28"/>
+          <w:szCs w:val="28"/>
+        </w:rPr>
+      </w:pPr>
+      <w:r>
+        <w:rPr>
+          <w:rFonts w:ascii="Times New Roman" w:hAnsi="Times New Roman" w:cs="Times New Roman"/>
+          <w:sz w:val="28"/>
+          <w:szCs w:val="28"/>
+        </w:rPr>
+        <w:t xml:space="preserve">    9. Analiza ryzyka projektu zawierająca wykaz przewidywanych zagrożeń (tylko zagrożenia specyficzne dla projektu):</w:t>
+      </w:r>
+    </w:p>
+    <w:p>
+      <w:pPr>
+        <w:jc w:val="both"/>
+        <w:rPr>
+          <w:rFonts w:ascii="Times New Roman" w:hAnsi="Times New Roman" w:cs="Times New Roman"/>
+          <w:sz w:val="28"/>
+          <w:szCs w:val="28"/>
+        </w:rPr>
+      </w:pPr>
+      <w:r>
+        <w:rPr>
+          <w:rFonts w:ascii="Times New Roman" w:hAnsi="Times New Roman" w:cs="Times New Roman"/>
+          <w:sz w:val="28"/>
+          <w:szCs w:val="28"/>
+        </w:rPr>
+        <w:t xml:space="preserve">        - prawdopodobieństwo/szansa wystąpienia (np.: znikome, średnie, duże, bardzo duże)</w:t>
+      </w:r>
+    </w:p>
+    <w:p>
+      <w:pPr>
+        <w:jc w:val="both"/>
+        <w:rPr>
+          <w:rFonts w:ascii="Times New Roman" w:hAnsi="Times New Roman" w:cs="Times New Roman"/>
+          <w:sz w:val="28"/>
+          <w:szCs w:val="28"/>
+        </w:rPr>
+      </w:pPr>
+      <w:r>
+        <w:rPr>
+          <w:rFonts w:ascii="Times New Roman" w:hAnsi="Times New Roman" w:cs="Times New Roman"/>
+          <w:sz w:val="28"/>
+          <w:szCs w:val="28"/>
+        </w:rPr>
+        <w:t xml:space="preserve">        - stopień szkodliwości w przypadku wystąpienia (np.: duży, średni, mały)</w:t>
+      </w:r>
+    </w:p>
+    <w:p>
+      <w:pPr>
+        <w:jc w:val="both"/>
+        <w:rPr>
+          <w:rFonts w:ascii="Times New Roman" w:hAnsi="Times New Roman" w:cs="Times New Roman"/>
+          <w:sz w:val="28"/>
+          <w:szCs w:val="28"/>
+        </w:rPr>
+      </w:pPr>
+      <w:r>
+        <w:rPr>
+          <w:rFonts w:ascii="Times New Roman" w:hAnsi="Times New Roman" w:cs="Times New Roman"/>
+          <w:sz w:val="28"/>
+          <w:szCs w:val="28"/>
+        </w:rPr>
+        <w:t xml:space="preserve">        - propozycje metod zapobiegania danemu zagrożeniu</w:t>
+      </w:r>
+    </w:p>
+    <w:p>
+      <w:pPr>
+        <w:jc w:val="both"/>
+        <w:rPr>
+          <w:rFonts w:ascii="Times New Roman" w:hAnsi="Times New Roman" w:cs="Times New Roman"/>
+          <w:sz w:val="28"/>
+          <w:szCs w:val="28"/>
+        </w:rPr>
+      </w:pPr>
+      <w:r>
+        <w:rPr>
+          <w:rFonts w:ascii="Times New Roman" w:hAnsi="Times New Roman" w:cs="Times New Roman"/>
+          <w:sz w:val="28"/>
+          <w:szCs w:val="28"/>
+        </w:rPr>
+        <w:t xml:space="preserve">        - plan awaryjny (sposób postępowania) w przypadku wystąpienia zagrożenia</w:t>
+      </w:r>
+    </w:p>
+    <w:p>
+      <w:pPr>
+        <w:jc w:val="both"/>
+        <w:rPr>
+          <w:rFonts w:ascii="Times New Roman" w:hAnsi="Times New Roman" w:cs="Times New Roman"/>
+          <w:sz w:val="28"/>
+          <w:szCs w:val="28"/>
+        </w:rPr>
+      </w:pPr>
+      <w:r>
+        <w:rPr>
+          <w:rFonts w:ascii="Times New Roman" w:hAnsi="Times New Roman" w:cs="Times New Roman"/>
+          <w:sz w:val="28"/>
+          <w:szCs w:val="28"/>
+        </w:rPr>
+        <w:t xml:space="preserve">  10. Kosztorys realizacji przedsięwzięcia (koszty projektu, oprogramowania, systemu, szkoleń, wdrożenia oraz konsultacji)</w:t>
+      </w:r>
+    </w:p>
+    <w:p>
+      <w:pPr>
+        <w:jc w:val="both"/>
+        <w:rPr>
+          <w:rFonts w:ascii="Times New Roman" w:hAnsi="Times New Roman" w:cs="Times New Roman"/>
+          <w:sz w:val="28"/>
+          <w:szCs w:val="28"/>
+        </w:rPr>
+      </w:pPr>
+      <w:r>
+        <w:rPr>
+          <w:rFonts w:ascii="Times New Roman" w:hAnsi="Times New Roman" w:cs="Times New Roman"/>
+          <w:sz w:val="28"/>
+          <w:szCs w:val="28"/>
+        </w:rPr>
+        <w:t xml:space="preserve">        - w rozbiciu na mniejsze jednostki (etapy, podsystemy, moduły,...)</w:t>
+      </w:r>
+    </w:p>
+    <w:p>
+      <w:pPr>
+        <w:jc w:val="both"/>
+        <w:rPr>
+          <w:rFonts w:ascii="Times New Roman" w:hAnsi="Times New Roman" w:cs="Times New Roman"/>
+          <w:sz w:val="28"/>
+          <w:szCs w:val="28"/>
+        </w:rPr>
+      </w:pPr>
+      <w:r>
+        <w:rPr>
+          <w:rFonts w:ascii="Times New Roman" w:hAnsi="Times New Roman" w:cs="Times New Roman"/>
+          <w:sz w:val="28"/>
+          <w:szCs w:val="28"/>
+        </w:rPr>
+        <w:t xml:space="preserve">        - warunki płatności, sposób odbioru</w:t>
+      </w:r>
+    </w:p>
+    <w:p>
+      <w:pPr>
+        <w:jc w:val="both"/>
+        <w:rPr>
+          <w:rFonts w:ascii="Times New Roman" w:hAnsi="Times New Roman" w:cs="Times New Roman"/>
+          <w:sz w:val="28"/>
+          <w:szCs w:val="28"/>
+        </w:rPr>
+      </w:pPr>
+      <w:r>
+        <w:rPr>
+          <w:rFonts w:ascii="Times New Roman" w:hAnsi="Times New Roman" w:cs="Times New Roman"/>
+          <w:sz w:val="28"/>
+          <w:szCs w:val="28"/>
+        </w:rPr>
+        <w:t xml:space="preserve">        - może być wariantowy </w:t>
+      </w:r>
+    </w:p>
+    <w:p>
+      <w:pPr>
+        <w:jc w:val="both"/>
+        <w:rPr>
+          <w:rFonts w:ascii="Times New Roman" w:hAnsi="Times New Roman" w:cs="Times New Roman"/>
+          <w:sz w:val="28"/>
+          <w:szCs w:val="28"/>
+        </w:rPr>
+      </w:pPr>
+      <w:r>
+        <w:rPr>
+          <w:rFonts w:ascii="Times New Roman" w:hAnsi="Times New Roman" w:cs="Times New Roman"/>
+          <w:sz w:val="28"/>
+          <w:szCs w:val="28"/>
+        </w:rPr>
+        <w:t xml:space="preserve">  Dodatek A. Przebieg (terminowość) prac zespołu</w:t>
+      </w:r>
+    </w:p>
+    <w:p>
+      <w:pPr>
+        <w:jc w:val="both"/>
+        <w:rPr>
+          <w:rFonts w:ascii="Times New Roman" w:hAnsi="Times New Roman" w:cs="Times New Roman"/>
+          <w:sz w:val="28"/>
+          <w:szCs w:val="28"/>
+        </w:rPr>
+      </w:pPr>
+      <w:r>
+        <w:rPr>
+          <w:rFonts w:ascii="Times New Roman" w:hAnsi="Times New Roman" w:cs="Times New Roman"/>
+          <w:sz w:val="28"/>
+          <w:szCs w:val="28"/>
+        </w:rPr>
+        <w:t xml:space="preserve">        - wygenerowany wykres przedstawiający historię </w:t>
+      </w:r>
+      <w:proofErr w:type="spellStart"/>
+      <w:r>
+        <w:rPr>
+          <w:rFonts w:ascii="Times New Roman" w:hAnsi="Times New Roman" w:cs="Times New Roman"/>
+          <w:sz w:val="28"/>
+          <w:szCs w:val="28"/>
+        </w:rPr>
+        <w:t>commit</w:t>
+      </w:r>
+      <w:proofErr w:type="spellEnd"/>
+      <w:r>
+        <w:rPr>
+          <w:rFonts w:ascii="Times New Roman" w:hAnsi="Times New Roman" w:cs="Times New Roman"/>
+          <w:sz w:val="28"/>
+          <w:szCs w:val="28"/>
+        </w:rPr>
+        <w:t>-ów do repozytorium autorów projektu.</w:t>
+      </w:r>
+    </w:p>
+    <w:p>
+      <w:pPr>
+        <w:jc w:val="both"/>
+        <w:rPr>
+          <w:rFonts w:ascii="Times New Roman" w:hAnsi="Times New Roman" w:cs="Times New Roman"/>
+          <w:sz w:val="28"/>
+          <w:szCs w:val="28"/>
+        </w:rPr>
+      </w:pPr>
+      <w:r>
+        <w:rPr>
+          <w:rFonts w:ascii="Times New Roman" w:hAnsi="Times New Roman" w:cs="Times New Roman"/>
+          <w:sz w:val="28"/>
+          <w:szCs w:val="28"/>
+        </w:rPr>
+        <w:t xml:space="preserve">        - struktura podkatalogów w repozytorium powinna być zgodna z terminami cząstkowymi oraz powinien istnieć oddzielny podkatalog z wersją edytowalną sprawozdania.</w:t>
+      </w:r>
     </w:p>
     <w:sectPr>
-      <w:footerReference w:type="default" r:id="rId11"/>
+      <w:footerReference w:type="default" r:id="rId12"/>
       <w:pgSz w:w="11906" w:h="16838"/>
       <w:pgMar w:top="1417" w:right="1417" w:bottom="1417" w:left="1417" w:header="708" w:footer="708" w:gutter="0"/>
       <w:cols w:space="708"/>
@@ -1049,6 +2917,155 @@
 <file path=word/numbering.xml><?xml version="1.0" encoding="utf-8"?>
 <w:numbering xmlns:wpc="http://schemas.microsoft.com/office/word/2010/wordprocessingCanvas" xmlns:cx="http://schemas.microsoft.com/office/drawing/2014/chartex" xmlns:cx1="http://schemas.microsoft.com/office/drawing/2015/9/8/chartex" xmlns:cx2="http://schemas.microsoft.com/office/drawing/2015/10/21/chartex" xmlns:cx3="http://schemas.microsoft.com/office/drawing/2016/5/9/chartex" xmlns:cx4="http://schemas.microsoft.com/office/drawing/2016/5/10/chartex" xmlns:cx5="http://schemas.microsoft.com/office/drawing/2016/5/11/chartex" xmlns:cx6="http://schemas.microsoft.com/office/drawing/2016/5/12/chartex" xmlns:cx7="http://schemas.microsoft.com/office/drawing/2016/5/13/chartex" xmlns:cx8="http://schemas.microsoft.com/office/drawing/2016/5/14/chartex" xmlns:mc="http://schemas.openxmlformats.org/markup-compatibility/2006" xmlns:aink="http://schemas.microsoft.com/office/drawing/2016/ink" xmlns:am3d="http://schemas.microsoft.com/office/drawing/2017/model3d" xmlns:o="urn:schemas-microsoft-com:office:office" xmlns:oel="http://schemas.microsoft.com/office/2019/extlst" xmlns:r="http://schemas.openxmlformats.org/officeDocument/2006/relationships" xmlns:m="http://schemas.openxmlformats.org/officeDocument/2006/math" xmlns:v="urn:schemas-microsoft-com:vml" xmlns:wp14="http://schemas.microsoft.com/office/word/2010/wordprocessingDrawing" xmlns:wp="http://schemas.openxmlformats.org/drawingml/2006/wordprocessingDrawing" xmlns:w10="urn:schemas-microsoft-com:office:word" xmlns:w="http://schemas.openxmlformats.org/wordprocessingml/2006/main" xmlns:w14="http://schemas.microsoft.com/office/word/2010/wordml" xmlns:w15="http://schemas.microsoft.com/office/word/2012/wordml" xmlns:w16cex="http://schemas.microsoft.com/office/word/2018/wordml/cex" xmlns:w16cid="http://schemas.microsoft.com/office/word/2016/wordml/cid" xmlns:w16="http://schemas.microsoft.com/office/word/2018/wordml" xmlns:w16du="http://schemas.microsoft.com/office/word/2023/wordml/word16du" xmlns:w16sdtdh="http://schemas.microsoft.com/office/word/2020/wordml/sdtdatahash" xmlns:w16sdtfl="http://schemas.microsoft.com/office/word/2024/wordml/sdtformatlock" xmlns:w16se="http://schemas.microsoft.com/office/word/2015/wordml/symex" xmlns:wpg="http://schemas.microsoft.com/office/word/2010/wordprocessingGroup" xmlns:wpi="http://schemas.microsoft.com/office/word/2010/wordprocessingInk" xmlns:wne="http://schemas.microsoft.com/office/word/2006/wordml" xmlns:wps="http://schemas.microsoft.com/office/word/2010/wordprocessingShape" mc:Ignorable="w14 w15 w16se w16cid w16 w16cex w16sdtdh w16sdtfl w16du wp14">
   <w:abstractNum w:abstractNumId="0" w15:restartNumberingAfterBreak="0">
+    <w:nsid w:val="0E963A41"/>
+    <w:multiLevelType w:val="multilevel"/>
+    <w:tmpl w:val="077C9A20"/>
+    <w:lvl w:ilvl="0">
+      <w:start w:val="1"/>
+      <w:numFmt w:val="bullet"/>
+      <w:lvlText w:val=""/>
+      <w:lvlJc w:val="left"/>
+      <w:pPr>
+        <w:tabs>
+          <w:tab w:val="num" w:pos="720"/>
+        </w:tabs>
+        <w:ind w:left="720" w:hanging="360"/>
+      </w:pPr>
+      <w:rPr>
+        <w:rFonts w:ascii="Symbol" w:hAnsi="Symbol" w:hint="default"/>
+        <w:sz w:val="20"/>
+      </w:rPr>
+    </w:lvl>
+    <w:lvl w:ilvl="1" w:tentative="1">
+      <w:start w:val="1"/>
+      <w:numFmt w:val="bullet"/>
+      <w:lvlText w:val="o"/>
+      <w:lvlJc w:val="left"/>
+      <w:pPr>
+        <w:tabs>
+          <w:tab w:val="num" w:pos="1440"/>
+        </w:tabs>
+        <w:ind w:left="1440" w:hanging="360"/>
+      </w:pPr>
+      <w:rPr>
+        <w:rFonts w:ascii="Courier New" w:hAnsi="Courier New" w:hint="default"/>
+        <w:sz w:val="20"/>
+      </w:rPr>
+    </w:lvl>
+    <w:lvl w:ilvl="2" w:tentative="1">
+      <w:start w:val="1"/>
+      <w:numFmt w:val="bullet"/>
+      <w:lvlText w:val=""/>
+      <w:lvlJc w:val="left"/>
+      <w:pPr>
+        <w:tabs>
+          <w:tab w:val="num" w:pos="2160"/>
+        </w:tabs>
+        <w:ind w:left="2160" w:hanging="360"/>
+      </w:pPr>
+      <w:rPr>
+        <w:rFonts w:ascii="Wingdings" w:hAnsi="Wingdings" w:hint="default"/>
+        <w:sz w:val="20"/>
+      </w:rPr>
+    </w:lvl>
+    <w:lvl w:ilvl="3" w:tentative="1">
+      <w:start w:val="1"/>
+      <w:numFmt w:val="bullet"/>
+      <w:lvlText w:val=""/>
+      <w:lvlJc w:val="left"/>
+      <w:pPr>
+        <w:tabs>
+          <w:tab w:val="num" w:pos="2880"/>
+        </w:tabs>
+        <w:ind w:left="2880" w:hanging="360"/>
+      </w:pPr>
+      <w:rPr>
+        <w:rFonts w:ascii="Wingdings" w:hAnsi="Wingdings" w:hint="default"/>
+        <w:sz w:val="20"/>
+      </w:rPr>
+    </w:lvl>
+    <w:lvl w:ilvl="4" w:tentative="1">
+      <w:start w:val="1"/>
+      <w:numFmt w:val="bullet"/>
+      <w:lvlText w:val=""/>
+      <w:lvlJc w:val="left"/>
+      <w:pPr>
+        <w:tabs>
+          <w:tab w:val="num" w:pos="3600"/>
+        </w:tabs>
+        <w:ind w:left="3600" w:hanging="360"/>
+      </w:pPr>
+      <w:rPr>
+        <w:rFonts w:ascii="Wingdings" w:hAnsi="Wingdings" w:hint="default"/>
+        <w:sz w:val="20"/>
+      </w:rPr>
+    </w:lvl>
+    <w:lvl w:ilvl="5" w:tentative="1">
+      <w:start w:val="1"/>
+      <w:numFmt w:val="bullet"/>
+      <w:lvlText w:val=""/>
+      <w:lvlJc w:val="left"/>
+      <w:pPr>
+        <w:tabs>
+          <w:tab w:val="num" w:pos="4320"/>
+        </w:tabs>
+        <w:ind w:left="4320" w:hanging="360"/>
+      </w:pPr>
+      <w:rPr>
+        <w:rFonts w:ascii="Wingdings" w:hAnsi="Wingdings" w:hint="default"/>
+        <w:sz w:val="20"/>
+      </w:rPr>
+    </w:lvl>
+    <w:lvl w:ilvl="6" w:tentative="1">
+      <w:start w:val="1"/>
+      <w:numFmt w:val="bullet"/>
+      <w:lvlText w:val=""/>
+      <w:lvlJc w:val="left"/>
+      <w:pPr>
+        <w:tabs>
+          <w:tab w:val="num" w:pos="5040"/>
+        </w:tabs>
+        <w:ind w:left="5040" w:hanging="360"/>
+      </w:pPr>
+      <w:rPr>
+        <w:rFonts w:ascii="Wingdings" w:hAnsi="Wingdings" w:hint="default"/>
+        <w:sz w:val="20"/>
+      </w:rPr>
+    </w:lvl>
+    <w:lvl w:ilvl="7" w:tentative="1">
+      <w:start w:val="1"/>
+      <w:numFmt w:val="bullet"/>
+      <w:lvlText w:val=""/>
+      <w:lvlJc w:val="left"/>
+      <w:pPr>
+        <w:tabs>
+          <w:tab w:val="num" w:pos="5760"/>
+        </w:tabs>
+        <w:ind w:left="5760" w:hanging="360"/>
+      </w:pPr>
+      <w:rPr>
+        <w:rFonts w:ascii="Wingdings" w:hAnsi="Wingdings" w:hint="default"/>
+        <w:sz w:val="20"/>
+      </w:rPr>
+    </w:lvl>
+    <w:lvl w:ilvl="8" w:tentative="1">
+      <w:start w:val="1"/>
+      <w:numFmt w:val="bullet"/>
+      <w:lvlText w:val=""/>
+      <w:lvlJc w:val="left"/>
+      <w:pPr>
+        <w:tabs>
+          <w:tab w:val="num" w:pos="6480"/>
+        </w:tabs>
+        <w:ind w:left="6480" w:hanging="360"/>
+      </w:pPr>
+      <w:rPr>
+        <w:rFonts w:ascii="Wingdings" w:hAnsi="Wingdings" w:hint="default"/>
+        <w:sz w:val="20"/>
+      </w:rPr>
+    </w:lvl>
+  </w:abstractNum>
+  <w:abstractNum w:abstractNumId="1" w15:restartNumberingAfterBreak="0">
     <w:nsid w:val="2A071785"/>
     <w:multiLevelType w:val="multilevel"/>
     <w:tmpl w:val="E9B8F1CE"/>
@@ -1197,7 +3214,7 @@
       </w:rPr>
     </w:lvl>
   </w:abstractNum>
-  <w:abstractNum w:abstractNumId="1" w15:restartNumberingAfterBreak="0">
+  <w:abstractNum w:abstractNumId="2" w15:restartNumberingAfterBreak="0">
     <w:nsid w:val="2F353AA2"/>
     <w:multiLevelType w:val="multilevel"/>
     <w:tmpl w:val="3954DEE0"/>
@@ -1346,7 +3363,495 @@
       </w:rPr>
     </w:lvl>
   </w:abstractNum>
-  <w:abstractNum w:abstractNumId="2" w15:restartNumberingAfterBreak="0">
+  <w:abstractNum w:abstractNumId="3" w15:restartNumberingAfterBreak="0">
+    <w:nsid w:val="33F45946"/>
+    <w:multiLevelType w:val="multilevel"/>
+    <w:tmpl w:val="3968B026"/>
+    <w:lvl w:ilvl="0">
+      <w:start w:val="1"/>
+      <w:numFmt w:val="bullet"/>
+      <w:lvlText w:val=""/>
+      <w:lvlJc w:val="left"/>
+      <w:pPr>
+        <w:tabs>
+          <w:tab w:val="num" w:pos="1068"/>
+        </w:tabs>
+        <w:ind w:left="1068" w:hanging="360"/>
+      </w:pPr>
+      <w:rPr>
+        <w:rFonts w:ascii="Symbol" w:hAnsi="Symbol" w:hint="default"/>
+        <w:sz w:val="20"/>
+      </w:rPr>
+    </w:lvl>
+    <w:lvl w:ilvl="1" w:tentative="1">
+      <w:start w:val="1"/>
+      <w:numFmt w:val="bullet"/>
+      <w:lvlText w:val="o"/>
+      <w:lvlJc w:val="left"/>
+      <w:pPr>
+        <w:tabs>
+          <w:tab w:val="num" w:pos="1788"/>
+        </w:tabs>
+        <w:ind w:left="1788" w:hanging="360"/>
+      </w:pPr>
+      <w:rPr>
+        <w:rFonts w:ascii="Courier New" w:hAnsi="Courier New" w:hint="default"/>
+        <w:sz w:val="20"/>
+      </w:rPr>
+    </w:lvl>
+    <w:lvl w:ilvl="2" w:tentative="1">
+      <w:start w:val="1"/>
+      <w:numFmt w:val="bullet"/>
+      <w:lvlText w:val=""/>
+      <w:lvlJc w:val="left"/>
+      <w:pPr>
+        <w:tabs>
+          <w:tab w:val="num" w:pos="2508"/>
+        </w:tabs>
+        <w:ind w:left="2508" w:hanging="360"/>
+      </w:pPr>
+      <w:rPr>
+        <w:rFonts w:ascii="Wingdings" w:hAnsi="Wingdings" w:hint="default"/>
+        <w:sz w:val="20"/>
+      </w:rPr>
+    </w:lvl>
+    <w:lvl w:ilvl="3" w:tentative="1">
+      <w:start w:val="1"/>
+      <w:numFmt w:val="bullet"/>
+      <w:lvlText w:val=""/>
+      <w:lvlJc w:val="left"/>
+      <w:pPr>
+        <w:tabs>
+          <w:tab w:val="num" w:pos="3228"/>
+        </w:tabs>
+        <w:ind w:left="3228" w:hanging="360"/>
+      </w:pPr>
+      <w:rPr>
+        <w:rFonts w:ascii="Wingdings" w:hAnsi="Wingdings" w:hint="default"/>
+        <w:sz w:val="20"/>
+      </w:rPr>
+    </w:lvl>
+    <w:lvl w:ilvl="4" w:tentative="1">
+      <w:start w:val="1"/>
+      <w:numFmt w:val="bullet"/>
+      <w:lvlText w:val=""/>
+      <w:lvlJc w:val="left"/>
+      <w:pPr>
+        <w:tabs>
+          <w:tab w:val="num" w:pos="3948"/>
+        </w:tabs>
+        <w:ind w:left="3948" w:hanging="360"/>
+      </w:pPr>
+      <w:rPr>
+        <w:rFonts w:ascii="Wingdings" w:hAnsi="Wingdings" w:hint="default"/>
+        <w:sz w:val="20"/>
+      </w:rPr>
+    </w:lvl>
+    <w:lvl w:ilvl="5" w:tentative="1">
+      <w:start w:val="1"/>
+      <w:numFmt w:val="bullet"/>
+      <w:lvlText w:val=""/>
+      <w:lvlJc w:val="left"/>
+      <w:pPr>
+        <w:tabs>
+          <w:tab w:val="num" w:pos="4668"/>
+        </w:tabs>
+        <w:ind w:left="4668" w:hanging="360"/>
+      </w:pPr>
+      <w:rPr>
+        <w:rFonts w:ascii="Wingdings" w:hAnsi="Wingdings" w:hint="default"/>
+        <w:sz w:val="20"/>
+      </w:rPr>
+    </w:lvl>
+    <w:lvl w:ilvl="6" w:tentative="1">
+      <w:start w:val="1"/>
+      <w:numFmt w:val="bullet"/>
+      <w:lvlText w:val=""/>
+      <w:lvlJc w:val="left"/>
+      <w:pPr>
+        <w:tabs>
+          <w:tab w:val="num" w:pos="5388"/>
+        </w:tabs>
+        <w:ind w:left="5388" w:hanging="360"/>
+      </w:pPr>
+      <w:rPr>
+        <w:rFonts w:ascii="Wingdings" w:hAnsi="Wingdings" w:hint="default"/>
+        <w:sz w:val="20"/>
+      </w:rPr>
+    </w:lvl>
+    <w:lvl w:ilvl="7" w:tentative="1">
+      <w:start w:val="1"/>
+      <w:numFmt w:val="bullet"/>
+      <w:lvlText w:val=""/>
+      <w:lvlJc w:val="left"/>
+      <w:pPr>
+        <w:tabs>
+          <w:tab w:val="num" w:pos="6108"/>
+        </w:tabs>
+        <w:ind w:left="6108" w:hanging="360"/>
+      </w:pPr>
+      <w:rPr>
+        <w:rFonts w:ascii="Wingdings" w:hAnsi="Wingdings" w:hint="default"/>
+        <w:sz w:val="20"/>
+      </w:rPr>
+    </w:lvl>
+    <w:lvl w:ilvl="8" w:tentative="1">
+      <w:start w:val="1"/>
+      <w:numFmt w:val="bullet"/>
+      <w:lvlText w:val=""/>
+      <w:lvlJc w:val="left"/>
+      <w:pPr>
+        <w:tabs>
+          <w:tab w:val="num" w:pos="6828"/>
+        </w:tabs>
+        <w:ind w:left="6828" w:hanging="360"/>
+      </w:pPr>
+      <w:rPr>
+        <w:rFonts w:ascii="Wingdings" w:hAnsi="Wingdings" w:hint="default"/>
+        <w:sz w:val="20"/>
+      </w:rPr>
+    </w:lvl>
+  </w:abstractNum>
+  <w:abstractNum w:abstractNumId="4" w15:restartNumberingAfterBreak="0">
+    <w:nsid w:val="3BE92347"/>
+    <w:multiLevelType w:val="hybridMultilevel"/>
+    <w:tmpl w:val="04A68ECA"/>
+    <w:lvl w:ilvl="0" w:tplc="04150001">
+      <w:start w:val="1"/>
+      <w:numFmt w:val="bullet"/>
+      <w:lvlText w:val=""/>
+      <w:lvlJc w:val="left"/>
+      <w:pPr>
+        <w:ind w:left="720" w:hanging="360"/>
+      </w:pPr>
+      <w:rPr>
+        <w:rFonts w:ascii="Symbol" w:hAnsi="Symbol" w:hint="default"/>
+      </w:rPr>
+    </w:lvl>
+    <w:lvl w:ilvl="1" w:tplc="04150003">
+      <w:start w:val="1"/>
+      <w:numFmt w:val="bullet"/>
+      <w:lvlText w:val="o"/>
+      <w:lvlJc w:val="left"/>
+      <w:pPr>
+        <w:ind w:left="1440" w:hanging="360"/>
+      </w:pPr>
+      <w:rPr>
+        <w:rFonts w:ascii="Courier New" w:hAnsi="Courier New" w:cs="Courier New" w:hint="default"/>
+      </w:rPr>
+    </w:lvl>
+    <w:lvl w:ilvl="2" w:tplc="04150005">
+      <w:start w:val="1"/>
+      <w:numFmt w:val="bullet"/>
+      <w:lvlText w:val=""/>
+      <w:lvlJc w:val="left"/>
+      <w:pPr>
+        <w:ind w:left="2160" w:hanging="360"/>
+      </w:pPr>
+      <w:rPr>
+        <w:rFonts w:ascii="Wingdings" w:hAnsi="Wingdings" w:hint="default"/>
+      </w:rPr>
+    </w:lvl>
+    <w:lvl w:ilvl="3" w:tplc="04150001" w:tentative="1">
+      <w:start w:val="1"/>
+      <w:numFmt w:val="bullet"/>
+      <w:lvlText w:val=""/>
+      <w:lvlJc w:val="left"/>
+      <w:pPr>
+        <w:ind w:left="2880" w:hanging="360"/>
+      </w:pPr>
+      <w:rPr>
+        <w:rFonts w:ascii="Symbol" w:hAnsi="Symbol" w:hint="default"/>
+      </w:rPr>
+    </w:lvl>
+    <w:lvl w:ilvl="4" w:tplc="04150003" w:tentative="1">
+      <w:start w:val="1"/>
+      <w:numFmt w:val="bullet"/>
+      <w:lvlText w:val="o"/>
+      <w:lvlJc w:val="left"/>
+      <w:pPr>
+        <w:ind w:left="3600" w:hanging="360"/>
+      </w:pPr>
+      <w:rPr>
+        <w:rFonts w:ascii="Courier New" w:hAnsi="Courier New" w:cs="Courier New" w:hint="default"/>
+      </w:rPr>
+    </w:lvl>
+    <w:lvl w:ilvl="5" w:tplc="04150005" w:tentative="1">
+      <w:start w:val="1"/>
+      <w:numFmt w:val="bullet"/>
+      <w:lvlText w:val=""/>
+      <w:lvlJc w:val="left"/>
+      <w:pPr>
+        <w:ind w:left="4320" w:hanging="360"/>
+      </w:pPr>
+      <w:rPr>
+        <w:rFonts w:ascii="Wingdings" w:hAnsi="Wingdings" w:hint="default"/>
+      </w:rPr>
+    </w:lvl>
+    <w:lvl w:ilvl="6" w:tplc="04150001" w:tentative="1">
+      <w:start w:val="1"/>
+      <w:numFmt w:val="bullet"/>
+      <w:lvlText w:val=""/>
+      <w:lvlJc w:val="left"/>
+      <w:pPr>
+        <w:ind w:left="5040" w:hanging="360"/>
+      </w:pPr>
+      <w:rPr>
+        <w:rFonts w:ascii="Symbol" w:hAnsi="Symbol" w:hint="default"/>
+      </w:rPr>
+    </w:lvl>
+    <w:lvl w:ilvl="7" w:tplc="04150003" w:tentative="1">
+      <w:start w:val="1"/>
+      <w:numFmt w:val="bullet"/>
+      <w:lvlText w:val="o"/>
+      <w:lvlJc w:val="left"/>
+      <w:pPr>
+        <w:ind w:left="5760" w:hanging="360"/>
+      </w:pPr>
+      <w:rPr>
+        <w:rFonts w:ascii="Courier New" w:hAnsi="Courier New" w:cs="Courier New" w:hint="default"/>
+      </w:rPr>
+    </w:lvl>
+    <w:lvl w:ilvl="8" w:tplc="04150005" w:tentative="1">
+      <w:start w:val="1"/>
+      <w:numFmt w:val="bullet"/>
+      <w:lvlText w:val=""/>
+      <w:lvlJc w:val="left"/>
+      <w:pPr>
+        <w:ind w:left="6480" w:hanging="360"/>
+      </w:pPr>
+      <w:rPr>
+        <w:rFonts w:ascii="Wingdings" w:hAnsi="Wingdings" w:hint="default"/>
+      </w:rPr>
+    </w:lvl>
+  </w:abstractNum>
+  <w:abstractNum w:abstractNumId="5" w15:restartNumberingAfterBreak="0">
+    <w:nsid w:val="3C0A78F2"/>
+    <w:multiLevelType w:val="hybridMultilevel"/>
+    <w:tmpl w:val="37F871C2"/>
+    <w:lvl w:ilvl="0" w:tplc="04150001">
+      <w:start w:val="1"/>
+      <w:numFmt w:val="bullet"/>
+      <w:lvlText w:val=""/>
+      <w:lvlJc w:val="left"/>
+      <w:pPr>
+        <w:ind w:left="720" w:hanging="360"/>
+      </w:pPr>
+      <w:rPr>
+        <w:rFonts w:ascii="Symbol" w:hAnsi="Symbol" w:hint="default"/>
+      </w:rPr>
+    </w:lvl>
+    <w:lvl w:ilvl="1" w:tplc="04150003">
+      <w:start w:val="1"/>
+      <w:numFmt w:val="bullet"/>
+      <w:lvlText w:val="o"/>
+      <w:lvlJc w:val="left"/>
+      <w:pPr>
+        <w:ind w:left="1440" w:hanging="360"/>
+      </w:pPr>
+      <w:rPr>
+        <w:rFonts w:ascii="Courier New" w:hAnsi="Courier New" w:cs="Courier New" w:hint="default"/>
+      </w:rPr>
+    </w:lvl>
+    <w:lvl w:ilvl="2" w:tplc="04150005">
+      <w:start w:val="1"/>
+      <w:numFmt w:val="bullet"/>
+      <w:lvlText w:val=""/>
+      <w:lvlJc w:val="left"/>
+      <w:pPr>
+        <w:ind w:left="2160" w:hanging="360"/>
+      </w:pPr>
+      <w:rPr>
+        <w:rFonts w:ascii="Wingdings" w:hAnsi="Wingdings" w:hint="default"/>
+      </w:rPr>
+    </w:lvl>
+    <w:lvl w:ilvl="3" w:tplc="04150001" w:tentative="1">
+      <w:start w:val="1"/>
+      <w:numFmt w:val="bullet"/>
+      <w:lvlText w:val=""/>
+      <w:lvlJc w:val="left"/>
+      <w:pPr>
+        <w:ind w:left="2880" w:hanging="360"/>
+      </w:pPr>
+      <w:rPr>
+        <w:rFonts w:ascii="Symbol" w:hAnsi="Symbol" w:hint="default"/>
+      </w:rPr>
+    </w:lvl>
+    <w:lvl w:ilvl="4" w:tplc="04150003" w:tentative="1">
+      <w:start w:val="1"/>
+      <w:numFmt w:val="bullet"/>
+      <w:lvlText w:val="o"/>
+      <w:lvlJc w:val="left"/>
+      <w:pPr>
+        <w:ind w:left="3600" w:hanging="360"/>
+      </w:pPr>
+      <w:rPr>
+        <w:rFonts w:ascii="Courier New" w:hAnsi="Courier New" w:cs="Courier New" w:hint="default"/>
+      </w:rPr>
+    </w:lvl>
+    <w:lvl w:ilvl="5" w:tplc="04150005" w:tentative="1">
+      <w:start w:val="1"/>
+      <w:numFmt w:val="bullet"/>
+      <w:lvlText w:val=""/>
+      <w:lvlJc w:val="left"/>
+      <w:pPr>
+        <w:ind w:left="4320" w:hanging="360"/>
+      </w:pPr>
+      <w:rPr>
+        <w:rFonts w:ascii="Wingdings" w:hAnsi="Wingdings" w:hint="default"/>
+      </w:rPr>
+    </w:lvl>
+    <w:lvl w:ilvl="6" w:tplc="04150001" w:tentative="1">
+      <w:start w:val="1"/>
+      <w:numFmt w:val="bullet"/>
+      <w:lvlText w:val=""/>
+      <w:lvlJc w:val="left"/>
+      <w:pPr>
+        <w:ind w:left="5040" w:hanging="360"/>
+      </w:pPr>
+      <w:rPr>
+        <w:rFonts w:ascii="Symbol" w:hAnsi="Symbol" w:hint="default"/>
+      </w:rPr>
+    </w:lvl>
+    <w:lvl w:ilvl="7" w:tplc="04150003" w:tentative="1">
+      <w:start w:val="1"/>
+      <w:numFmt w:val="bullet"/>
+      <w:lvlText w:val="o"/>
+      <w:lvlJc w:val="left"/>
+      <w:pPr>
+        <w:ind w:left="5760" w:hanging="360"/>
+      </w:pPr>
+      <w:rPr>
+        <w:rFonts w:ascii="Courier New" w:hAnsi="Courier New" w:cs="Courier New" w:hint="default"/>
+      </w:rPr>
+    </w:lvl>
+    <w:lvl w:ilvl="8" w:tplc="04150005" w:tentative="1">
+      <w:start w:val="1"/>
+      <w:numFmt w:val="bullet"/>
+      <w:lvlText w:val=""/>
+      <w:lvlJc w:val="left"/>
+      <w:pPr>
+        <w:ind w:left="6480" w:hanging="360"/>
+      </w:pPr>
+      <w:rPr>
+        <w:rFonts w:ascii="Wingdings" w:hAnsi="Wingdings" w:hint="default"/>
+      </w:rPr>
+    </w:lvl>
+  </w:abstractNum>
+  <w:abstractNum w:abstractNumId="6" w15:restartNumberingAfterBreak="0">
+    <w:nsid w:val="41837E30"/>
+    <w:multiLevelType w:val="hybridMultilevel"/>
+    <w:tmpl w:val="929A8C66"/>
+    <w:lvl w:ilvl="0" w:tplc="04150001">
+      <w:start w:val="1"/>
+      <w:numFmt w:val="bullet"/>
+      <w:lvlText w:val=""/>
+      <w:lvlJc w:val="left"/>
+      <w:pPr>
+        <w:ind w:left="720" w:hanging="360"/>
+      </w:pPr>
+      <w:rPr>
+        <w:rFonts w:ascii="Symbol" w:hAnsi="Symbol" w:hint="default"/>
+      </w:rPr>
+    </w:lvl>
+    <w:lvl w:ilvl="1" w:tplc="04150003">
+      <w:start w:val="1"/>
+      <w:numFmt w:val="bullet"/>
+      <w:lvlText w:val="o"/>
+      <w:lvlJc w:val="left"/>
+      <w:pPr>
+        <w:ind w:left="1440" w:hanging="360"/>
+      </w:pPr>
+      <w:rPr>
+        <w:rFonts w:ascii="Courier New" w:hAnsi="Courier New" w:cs="Courier New" w:hint="default"/>
+      </w:rPr>
+    </w:lvl>
+    <w:lvl w:ilvl="2" w:tplc="04150005">
+      <w:start w:val="1"/>
+      <w:numFmt w:val="bullet"/>
+      <w:lvlText w:val=""/>
+      <w:lvlJc w:val="left"/>
+      <w:pPr>
+        <w:ind w:left="2160" w:hanging="360"/>
+      </w:pPr>
+      <w:rPr>
+        <w:rFonts w:ascii="Wingdings" w:hAnsi="Wingdings" w:hint="default"/>
+      </w:rPr>
+    </w:lvl>
+    <w:lvl w:ilvl="3" w:tplc="04150001" w:tentative="1">
+      <w:start w:val="1"/>
+      <w:numFmt w:val="bullet"/>
+      <w:lvlText w:val=""/>
+      <w:lvlJc w:val="left"/>
+      <w:pPr>
+        <w:ind w:left="2880" w:hanging="360"/>
+      </w:pPr>
+      <w:rPr>
+        <w:rFonts w:ascii="Symbol" w:hAnsi="Symbol" w:hint="default"/>
+      </w:rPr>
+    </w:lvl>
+    <w:lvl w:ilvl="4" w:tplc="04150003" w:tentative="1">
+      <w:start w:val="1"/>
+      <w:numFmt w:val="bullet"/>
+      <w:lvlText w:val="o"/>
+      <w:lvlJc w:val="left"/>
+      <w:pPr>
+        <w:ind w:left="3600" w:hanging="360"/>
+      </w:pPr>
+      <w:rPr>
+        <w:rFonts w:ascii="Courier New" w:hAnsi="Courier New" w:cs="Courier New" w:hint="default"/>
+      </w:rPr>
+    </w:lvl>
+    <w:lvl w:ilvl="5" w:tplc="04150005" w:tentative="1">
+      <w:start w:val="1"/>
+      <w:numFmt w:val="bullet"/>
+      <w:lvlText w:val=""/>
+      <w:lvlJc w:val="left"/>
+      <w:pPr>
+        <w:ind w:left="4320" w:hanging="360"/>
+      </w:pPr>
+      <w:rPr>
+        <w:rFonts w:ascii="Wingdings" w:hAnsi="Wingdings" w:hint="default"/>
+      </w:rPr>
+    </w:lvl>
+    <w:lvl w:ilvl="6" w:tplc="04150001" w:tentative="1">
+      <w:start w:val="1"/>
+      <w:numFmt w:val="bullet"/>
+      <w:lvlText w:val=""/>
+      <w:lvlJc w:val="left"/>
+      <w:pPr>
+        <w:ind w:left="5040" w:hanging="360"/>
+      </w:pPr>
+      <w:rPr>
+        <w:rFonts w:ascii="Symbol" w:hAnsi="Symbol" w:hint="default"/>
+      </w:rPr>
+    </w:lvl>
+    <w:lvl w:ilvl="7" w:tplc="04150003" w:tentative="1">
+      <w:start w:val="1"/>
+      <w:numFmt w:val="bullet"/>
+      <w:lvlText w:val="o"/>
+      <w:lvlJc w:val="left"/>
+      <w:pPr>
+        <w:ind w:left="5760" w:hanging="360"/>
+      </w:pPr>
+      <w:rPr>
+        <w:rFonts w:ascii="Courier New" w:hAnsi="Courier New" w:cs="Courier New" w:hint="default"/>
+      </w:rPr>
+    </w:lvl>
+    <w:lvl w:ilvl="8" w:tplc="04150005" w:tentative="1">
+      <w:start w:val="1"/>
+      <w:numFmt w:val="bullet"/>
+      <w:lvlText w:val=""/>
+      <w:lvlJc w:val="left"/>
+      <w:pPr>
+        <w:ind w:left="6480" w:hanging="360"/>
+      </w:pPr>
+      <w:rPr>
+        <w:rFonts w:ascii="Wingdings" w:hAnsi="Wingdings" w:hint="default"/>
+      </w:rPr>
+    </w:lvl>
+  </w:abstractNum>
+  <w:abstractNum w:abstractNumId="7" w15:restartNumberingAfterBreak="0">
     <w:nsid w:val="4D474FB2"/>
     <w:multiLevelType w:val="multilevel"/>
     <w:tmpl w:val="4D400FFC"/>
@@ -1495,7 +4000,713 @@
       </w:rPr>
     </w:lvl>
   </w:abstractNum>
-  <w:abstractNum w:abstractNumId="3" w15:restartNumberingAfterBreak="0">
+  <w:abstractNum w:abstractNumId="8" w15:restartNumberingAfterBreak="0">
+    <w:nsid w:val="4EF56365"/>
+    <w:multiLevelType w:val="multilevel"/>
+    <w:tmpl w:val="C922D908"/>
+    <w:lvl w:ilvl="0">
+      <w:start w:val="1"/>
+      <w:numFmt w:val="bullet"/>
+      <w:lvlText w:val=""/>
+      <w:lvlJc w:val="left"/>
+      <w:pPr>
+        <w:tabs>
+          <w:tab w:val="num" w:pos="720"/>
+        </w:tabs>
+        <w:ind w:left="720" w:hanging="360"/>
+      </w:pPr>
+      <w:rPr>
+        <w:rFonts w:ascii="Symbol" w:hAnsi="Symbol" w:hint="default"/>
+        <w:sz w:val="20"/>
+      </w:rPr>
+    </w:lvl>
+    <w:lvl w:ilvl="1" w:tentative="1">
+      <w:start w:val="1"/>
+      <w:numFmt w:val="bullet"/>
+      <w:lvlText w:val="o"/>
+      <w:lvlJc w:val="left"/>
+      <w:pPr>
+        <w:tabs>
+          <w:tab w:val="num" w:pos="1440"/>
+        </w:tabs>
+        <w:ind w:left="1440" w:hanging="360"/>
+      </w:pPr>
+      <w:rPr>
+        <w:rFonts w:ascii="Courier New" w:hAnsi="Courier New" w:hint="default"/>
+        <w:sz w:val="20"/>
+      </w:rPr>
+    </w:lvl>
+    <w:lvl w:ilvl="2" w:tentative="1">
+      <w:start w:val="1"/>
+      <w:numFmt w:val="bullet"/>
+      <w:lvlText w:val=""/>
+      <w:lvlJc w:val="left"/>
+      <w:pPr>
+        <w:tabs>
+          <w:tab w:val="num" w:pos="2160"/>
+        </w:tabs>
+        <w:ind w:left="2160" w:hanging="360"/>
+      </w:pPr>
+      <w:rPr>
+        <w:rFonts w:ascii="Wingdings" w:hAnsi="Wingdings" w:hint="default"/>
+        <w:sz w:val="20"/>
+      </w:rPr>
+    </w:lvl>
+    <w:lvl w:ilvl="3" w:tentative="1">
+      <w:start w:val="1"/>
+      <w:numFmt w:val="bullet"/>
+      <w:lvlText w:val=""/>
+      <w:lvlJc w:val="left"/>
+      <w:pPr>
+        <w:tabs>
+          <w:tab w:val="num" w:pos="2880"/>
+        </w:tabs>
+        <w:ind w:left="2880" w:hanging="360"/>
+      </w:pPr>
+      <w:rPr>
+        <w:rFonts w:ascii="Wingdings" w:hAnsi="Wingdings" w:hint="default"/>
+        <w:sz w:val="20"/>
+      </w:rPr>
+    </w:lvl>
+    <w:lvl w:ilvl="4" w:tentative="1">
+      <w:start w:val="1"/>
+      <w:numFmt w:val="bullet"/>
+      <w:lvlText w:val=""/>
+      <w:lvlJc w:val="left"/>
+      <w:pPr>
+        <w:tabs>
+          <w:tab w:val="num" w:pos="3600"/>
+        </w:tabs>
+        <w:ind w:left="3600" w:hanging="360"/>
+      </w:pPr>
+      <w:rPr>
+        <w:rFonts w:ascii="Wingdings" w:hAnsi="Wingdings" w:hint="default"/>
+        <w:sz w:val="20"/>
+      </w:rPr>
+    </w:lvl>
+    <w:lvl w:ilvl="5" w:tentative="1">
+      <w:start w:val="1"/>
+      <w:numFmt w:val="bullet"/>
+      <w:lvlText w:val=""/>
+      <w:lvlJc w:val="left"/>
+      <w:pPr>
+        <w:tabs>
+          <w:tab w:val="num" w:pos="4320"/>
+        </w:tabs>
+        <w:ind w:left="4320" w:hanging="360"/>
+      </w:pPr>
+      <w:rPr>
+        <w:rFonts w:ascii="Wingdings" w:hAnsi="Wingdings" w:hint="default"/>
+        <w:sz w:val="20"/>
+      </w:rPr>
+    </w:lvl>
+    <w:lvl w:ilvl="6" w:tentative="1">
+      <w:start w:val="1"/>
+      <w:numFmt w:val="bullet"/>
+      <w:lvlText w:val=""/>
+      <w:lvlJc w:val="left"/>
+      <w:pPr>
+        <w:tabs>
+          <w:tab w:val="num" w:pos="5040"/>
+        </w:tabs>
+        <w:ind w:left="5040" w:hanging="360"/>
+      </w:pPr>
+      <w:rPr>
+        <w:rFonts w:ascii="Wingdings" w:hAnsi="Wingdings" w:hint="default"/>
+        <w:sz w:val="20"/>
+      </w:rPr>
+    </w:lvl>
+    <w:lvl w:ilvl="7" w:tentative="1">
+      <w:start w:val="1"/>
+      <w:numFmt w:val="bullet"/>
+      <w:lvlText w:val=""/>
+      <w:lvlJc w:val="left"/>
+      <w:pPr>
+        <w:tabs>
+          <w:tab w:val="num" w:pos="5760"/>
+        </w:tabs>
+        <w:ind w:left="5760" w:hanging="360"/>
+      </w:pPr>
+      <w:rPr>
+        <w:rFonts w:ascii="Wingdings" w:hAnsi="Wingdings" w:hint="default"/>
+        <w:sz w:val="20"/>
+      </w:rPr>
+    </w:lvl>
+    <w:lvl w:ilvl="8" w:tentative="1">
+      <w:start w:val="1"/>
+      <w:numFmt w:val="bullet"/>
+      <w:lvlText w:val=""/>
+      <w:lvlJc w:val="left"/>
+      <w:pPr>
+        <w:tabs>
+          <w:tab w:val="num" w:pos="6480"/>
+        </w:tabs>
+        <w:ind w:left="6480" w:hanging="360"/>
+      </w:pPr>
+      <w:rPr>
+        <w:rFonts w:ascii="Wingdings" w:hAnsi="Wingdings" w:hint="default"/>
+        <w:sz w:val="20"/>
+      </w:rPr>
+    </w:lvl>
+  </w:abstractNum>
+  <w:abstractNum w:abstractNumId="9" w15:restartNumberingAfterBreak="0">
+    <w:nsid w:val="5B2E3146"/>
+    <w:multiLevelType w:val="multilevel"/>
+    <w:tmpl w:val="34DA0D30"/>
+    <w:lvl w:ilvl="0">
+      <w:start w:val="1"/>
+      <w:numFmt w:val="bullet"/>
+      <w:lvlText w:val=""/>
+      <w:lvlJc w:val="left"/>
+      <w:pPr>
+        <w:tabs>
+          <w:tab w:val="num" w:pos="720"/>
+        </w:tabs>
+        <w:ind w:left="720" w:hanging="360"/>
+      </w:pPr>
+      <w:rPr>
+        <w:rFonts w:ascii="Symbol" w:hAnsi="Symbol" w:hint="default"/>
+        <w:sz w:val="20"/>
+      </w:rPr>
+    </w:lvl>
+    <w:lvl w:ilvl="1">
+      <w:start w:val="1"/>
+      <w:numFmt w:val="bullet"/>
+      <w:lvlText w:val="o"/>
+      <w:lvlJc w:val="left"/>
+      <w:pPr>
+        <w:tabs>
+          <w:tab w:val="num" w:pos="1440"/>
+        </w:tabs>
+        <w:ind w:left="1440" w:hanging="360"/>
+      </w:pPr>
+      <w:rPr>
+        <w:rFonts w:ascii="Courier New" w:hAnsi="Courier New" w:hint="default"/>
+        <w:sz w:val="20"/>
+      </w:rPr>
+    </w:lvl>
+    <w:lvl w:ilvl="2" w:tentative="1">
+      <w:start w:val="1"/>
+      <w:numFmt w:val="bullet"/>
+      <w:lvlText w:val=""/>
+      <w:lvlJc w:val="left"/>
+      <w:pPr>
+        <w:tabs>
+          <w:tab w:val="num" w:pos="2160"/>
+        </w:tabs>
+        <w:ind w:left="2160" w:hanging="360"/>
+      </w:pPr>
+      <w:rPr>
+        <w:rFonts w:ascii="Wingdings" w:hAnsi="Wingdings" w:hint="default"/>
+        <w:sz w:val="20"/>
+      </w:rPr>
+    </w:lvl>
+    <w:lvl w:ilvl="3" w:tentative="1">
+      <w:start w:val="1"/>
+      <w:numFmt w:val="bullet"/>
+      <w:lvlText w:val=""/>
+      <w:lvlJc w:val="left"/>
+      <w:pPr>
+        <w:tabs>
+          <w:tab w:val="num" w:pos="2880"/>
+        </w:tabs>
+        <w:ind w:left="2880" w:hanging="360"/>
+      </w:pPr>
+      <w:rPr>
+        <w:rFonts w:ascii="Wingdings" w:hAnsi="Wingdings" w:hint="default"/>
+        <w:sz w:val="20"/>
+      </w:rPr>
+    </w:lvl>
+    <w:lvl w:ilvl="4" w:tentative="1">
+      <w:start w:val="1"/>
+      <w:numFmt w:val="bullet"/>
+      <w:lvlText w:val=""/>
+      <w:lvlJc w:val="left"/>
+      <w:pPr>
+        <w:tabs>
+          <w:tab w:val="num" w:pos="3600"/>
+        </w:tabs>
+        <w:ind w:left="3600" w:hanging="360"/>
+      </w:pPr>
+      <w:rPr>
+        <w:rFonts w:ascii="Wingdings" w:hAnsi="Wingdings" w:hint="default"/>
+        <w:sz w:val="20"/>
+      </w:rPr>
+    </w:lvl>
+    <w:lvl w:ilvl="5" w:tentative="1">
+      <w:start w:val="1"/>
+      <w:numFmt w:val="bullet"/>
+      <w:lvlText w:val=""/>
+      <w:lvlJc w:val="left"/>
+      <w:pPr>
+        <w:tabs>
+          <w:tab w:val="num" w:pos="4320"/>
+        </w:tabs>
+        <w:ind w:left="4320" w:hanging="360"/>
+      </w:pPr>
+      <w:rPr>
+        <w:rFonts w:ascii="Wingdings" w:hAnsi="Wingdings" w:hint="default"/>
+        <w:sz w:val="20"/>
+      </w:rPr>
+    </w:lvl>
+    <w:lvl w:ilvl="6" w:tentative="1">
+      <w:start w:val="1"/>
+      <w:numFmt w:val="bullet"/>
+      <w:lvlText w:val=""/>
+      <w:lvlJc w:val="left"/>
+      <w:pPr>
+        <w:tabs>
+          <w:tab w:val="num" w:pos="5040"/>
+        </w:tabs>
+        <w:ind w:left="5040" w:hanging="360"/>
+      </w:pPr>
+      <w:rPr>
+        <w:rFonts w:ascii="Wingdings" w:hAnsi="Wingdings" w:hint="default"/>
+        <w:sz w:val="20"/>
+      </w:rPr>
+    </w:lvl>
+    <w:lvl w:ilvl="7" w:tentative="1">
+      <w:start w:val="1"/>
+      <w:numFmt w:val="bullet"/>
+      <w:lvlText w:val=""/>
+      <w:lvlJc w:val="left"/>
+      <w:pPr>
+        <w:tabs>
+          <w:tab w:val="num" w:pos="5760"/>
+        </w:tabs>
+        <w:ind w:left="5760" w:hanging="360"/>
+      </w:pPr>
+      <w:rPr>
+        <w:rFonts w:ascii="Wingdings" w:hAnsi="Wingdings" w:hint="default"/>
+        <w:sz w:val="20"/>
+      </w:rPr>
+    </w:lvl>
+    <w:lvl w:ilvl="8" w:tentative="1">
+      <w:start w:val="1"/>
+      <w:numFmt w:val="bullet"/>
+      <w:lvlText w:val=""/>
+      <w:lvlJc w:val="left"/>
+      <w:pPr>
+        <w:tabs>
+          <w:tab w:val="num" w:pos="6480"/>
+        </w:tabs>
+        <w:ind w:left="6480" w:hanging="360"/>
+      </w:pPr>
+      <w:rPr>
+        <w:rFonts w:ascii="Wingdings" w:hAnsi="Wingdings" w:hint="default"/>
+        <w:sz w:val="20"/>
+      </w:rPr>
+    </w:lvl>
+  </w:abstractNum>
+  <w:abstractNum w:abstractNumId="10" w15:restartNumberingAfterBreak="0">
+    <w:nsid w:val="5BF47262"/>
+    <w:multiLevelType w:val="hybridMultilevel"/>
+    <w:tmpl w:val="B7CC8306"/>
+    <w:lvl w:ilvl="0" w:tplc="04150001">
+      <w:start w:val="1"/>
+      <w:numFmt w:val="bullet"/>
+      <w:lvlText w:val=""/>
+      <w:lvlJc w:val="left"/>
+      <w:pPr>
+        <w:ind w:left="1080" w:hanging="360"/>
+      </w:pPr>
+      <w:rPr>
+        <w:rFonts w:ascii="Symbol" w:hAnsi="Symbol" w:hint="default"/>
+      </w:rPr>
+    </w:lvl>
+    <w:lvl w:ilvl="1" w:tplc="04150003" w:tentative="1">
+      <w:start w:val="1"/>
+      <w:numFmt w:val="bullet"/>
+      <w:lvlText w:val="o"/>
+      <w:lvlJc w:val="left"/>
+      <w:pPr>
+        <w:ind w:left="1800" w:hanging="360"/>
+      </w:pPr>
+      <w:rPr>
+        <w:rFonts w:ascii="Courier New" w:hAnsi="Courier New" w:cs="Courier New" w:hint="default"/>
+      </w:rPr>
+    </w:lvl>
+    <w:lvl w:ilvl="2" w:tplc="04150005" w:tentative="1">
+      <w:start w:val="1"/>
+      <w:numFmt w:val="bullet"/>
+      <w:lvlText w:val=""/>
+      <w:lvlJc w:val="left"/>
+      <w:pPr>
+        <w:ind w:left="2520" w:hanging="360"/>
+      </w:pPr>
+      <w:rPr>
+        <w:rFonts w:ascii="Wingdings" w:hAnsi="Wingdings" w:hint="default"/>
+      </w:rPr>
+    </w:lvl>
+    <w:lvl w:ilvl="3" w:tplc="04150001" w:tentative="1">
+      <w:start w:val="1"/>
+      <w:numFmt w:val="bullet"/>
+      <w:lvlText w:val=""/>
+      <w:lvlJc w:val="left"/>
+      <w:pPr>
+        <w:ind w:left="3240" w:hanging="360"/>
+      </w:pPr>
+      <w:rPr>
+        <w:rFonts w:ascii="Symbol" w:hAnsi="Symbol" w:hint="default"/>
+      </w:rPr>
+    </w:lvl>
+    <w:lvl w:ilvl="4" w:tplc="04150003" w:tentative="1">
+      <w:start w:val="1"/>
+      <w:numFmt w:val="bullet"/>
+      <w:lvlText w:val="o"/>
+      <w:lvlJc w:val="left"/>
+      <w:pPr>
+        <w:ind w:left="3960" w:hanging="360"/>
+      </w:pPr>
+      <w:rPr>
+        <w:rFonts w:ascii="Courier New" w:hAnsi="Courier New" w:cs="Courier New" w:hint="default"/>
+      </w:rPr>
+    </w:lvl>
+    <w:lvl w:ilvl="5" w:tplc="04150005" w:tentative="1">
+      <w:start w:val="1"/>
+      <w:numFmt w:val="bullet"/>
+      <w:lvlText w:val=""/>
+      <w:lvlJc w:val="left"/>
+      <w:pPr>
+        <w:ind w:left="4680" w:hanging="360"/>
+      </w:pPr>
+      <w:rPr>
+        <w:rFonts w:ascii="Wingdings" w:hAnsi="Wingdings" w:hint="default"/>
+      </w:rPr>
+    </w:lvl>
+    <w:lvl w:ilvl="6" w:tplc="04150001" w:tentative="1">
+      <w:start w:val="1"/>
+      <w:numFmt w:val="bullet"/>
+      <w:lvlText w:val=""/>
+      <w:lvlJc w:val="left"/>
+      <w:pPr>
+        <w:ind w:left="5400" w:hanging="360"/>
+      </w:pPr>
+      <w:rPr>
+        <w:rFonts w:ascii="Symbol" w:hAnsi="Symbol" w:hint="default"/>
+      </w:rPr>
+    </w:lvl>
+    <w:lvl w:ilvl="7" w:tplc="04150003" w:tentative="1">
+      <w:start w:val="1"/>
+      <w:numFmt w:val="bullet"/>
+      <w:lvlText w:val="o"/>
+      <w:lvlJc w:val="left"/>
+      <w:pPr>
+        <w:ind w:left="6120" w:hanging="360"/>
+      </w:pPr>
+      <w:rPr>
+        <w:rFonts w:ascii="Courier New" w:hAnsi="Courier New" w:cs="Courier New" w:hint="default"/>
+      </w:rPr>
+    </w:lvl>
+    <w:lvl w:ilvl="8" w:tplc="04150005" w:tentative="1">
+      <w:start w:val="1"/>
+      <w:numFmt w:val="bullet"/>
+      <w:lvlText w:val=""/>
+      <w:lvlJc w:val="left"/>
+      <w:pPr>
+        <w:ind w:left="6840" w:hanging="360"/>
+      </w:pPr>
+      <w:rPr>
+        <w:rFonts w:ascii="Wingdings" w:hAnsi="Wingdings" w:hint="default"/>
+      </w:rPr>
+    </w:lvl>
+  </w:abstractNum>
+  <w:abstractNum w:abstractNumId="11" w15:restartNumberingAfterBreak="0">
+    <w:nsid w:val="65B6487A"/>
+    <w:multiLevelType w:val="multilevel"/>
+    <w:tmpl w:val="DED4018A"/>
+    <w:lvl w:ilvl="0">
+      <w:start w:val="1"/>
+      <w:numFmt w:val="bullet"/>
+      <w:lvlText w:val=""/>
+      <w:lvlJc w:val="left"/>
+      <w:pPr>
+        <w:tabs>
+          <w:tab w:val="num" w:pos="720"/>
+        </w:tabs>
+        <w:ind w:left="720" w:hanging="360"/>
+      </w:pPr>
+      <w:rPr>
+        <w:rFonts w:ascii="Symbol" w:hAnsi="Symbol" w:hint="default"/>
+        <w:sz w:val="20"/>
+      </w:rPr>
+    </w:lvl>
+    <w:lvl w:ilvl="1">
+      <w:start w:val="1"/>
+      <w:numFmt w:val="lowerLetter"/>
+      <w:lvlText w:val="%2)"/>
+      <w:lvlJc w:val="left"/>
+      <w:pPr>
+        <w:ind w:left="1536" w:hanging="456"/>
+      </w:pPr>
+      <w:rPr>
+        <w:rFonts w:hint="default"/>
+        <w:b/>
+      </w:rPr>
+    </w:lvl>
+    <w:lvl w:ilvl="2" w:tentative="1">
+      <w:start w:val="1"/>
+      <w:numFmt w:val="bullet"/>
+      <w:lvlText w:val=""/>
+      <w:lvlJc w:val="left"/>
+      <w:pPr>
+        <w:tabs>
+          <w:tab w:val="num" w:pos="2160"/>
+        </w:tabs>
+        <w:ind w:left="2160" w:hanging="360"/>
+      </w:pPr>
+      <w:rPr>
+        <w:rFonts w:ascii="Wingdings" w:hAnsi="Wingdings" w:hint="default"/>
+        <w:sz w:val="20"/>
+      </w:rPr>
+    </w:lvl>
+    <w:lvl w:ilvl="3" w:tentative="1">
+      <w:start w:val="1"/>
+      <w:numFmt w:val="bullet"/>
+      <w:lvlText w:val=""/>
+      <w:lvlJc w:val="left"/>
+      <w:pPr>
+        <w:tabs>
+          <w:tab w:val="num" w:pos="2880"/>
+        </w:tabs>
+        <w:ind w:left="2880" w:hanging="360"/>
+      </w:pPr>
+      <w:rPr>
+        <w:rFonts w:ascii="Wingdings" w:hAnsi="Wingdings" w:hint="default"/>
+        <w:sz w:val="20"/>
+      </w:rPr>
+    </w:lvl>
+    <w:lvl w:ilvl="4" w:tentative="1">
+      <w:start w:val="1"/>
+      <w:numFmt w:val="bullet"/>
+      <w:lvlText w:val=""/>
+      <w:lvlJc w:val="left"/>
+      <w:pPr>
+        <w:tabs>
+          <w:tab w:val="num" w:pos="3600"/>
+        </w:tabs>
+        <w:ind w:left="3600" w:hanging="360"/>
+      </w:pPr>
+      <w:rPr>
+        <w:rFonts w:ascii="Wingdings" w:hAnsi="Wingdings" w:hint="default"/>
+        <w:sz w:val="20"/>
+      </w:rPr>
+    </w:lvl>
+    <w:lvl w:ilvl="5" w:tentative="1">
+      <w:start w:val="1"/>
+      <w:numFmt w:val="bullet"/>
+      <w:lvlText w:val=""/>
+      <w:lvlJc w:val="left"/>
+      <w:pPr>
+        <w:tabs>
+          <w:tab w:val="num" w:pos="4320"/>
+        </w:tabs>
+        <w:ind w:left="4320" w:hanging="360"/>
+      </w:pPr>
+      <w:rPr>
+        <w:rFonts w:ascii="Wingdings" w:hAnsi="Wingdings" w:hint="default"/>
+        <w:sz w:val="20"/>
+      </w:rPr>
+    </w:lvl>
+    <w:lvl w:ilvl="6" w:tentative="1">
+      <w:start w:val="1"/>
+      <w:numFmt w:val="bullet"/>
+      <w:lvlText w:val=""/>
+      <w:lvlJc w:val="left"/>
+      <w:pPr>
+        <w:tabs>
+          <w:tab w:val="num" w:pos="5040"/>
+        </w:tabs>
+        <w:ind w:left="5040" w:hanging="360"/>
+      </w:pPr>
+      <w:rPr>
+        <w:rFonts w:ascii="Wingdings" w:hAnsi="Wingdings" w:hint="default"/>
+        <w:sz w:val="20"/>
+      </w:rPr>
+    </w:lvl>
+    <w:lvl w:ilvl="7" w:tentative="1">
+      <w:start w:val="1"/>
+      <w:numFmt w:val="bullet"/>
+      <w:lvlText w:val=""/>
+      <w:lvlJc w:val="left"/>
+      <w:pPr>
+        <w:tabs>
+          <w:tab w:val="num" w:pos="5760"/>
+        </w:tabs>
+        <w:ind w:left="5760" w:hanging="360"/>
+      </w:pPr>
+      <w:rPr>
+        <w:rFonts w:ascii="Wingdings" w:hAnsi="Wingdings" w:hint="default"/>
+        <w:sz w:val="20"/>
+      </w:rPr>
+    </w:lvl>
+    <w:lvl w:ilvl="8" w:tentative="1">
+      <w:start w:val="1"/>
+      <w:numFmt w:val="bullet"/>
+      <w:lvlText w:val=""/>
+      <w:lvlJc w:val="left"/>
+      <w:pPr>
+        <w:tabs>
+          <w:tab w:val="num" w:pos="6480"/>
+        </w:tabs>
+        <w:ind w:left="6480" w:hanging="360"/>
+      </w:pPr>
+      <w:rPr>
+        <w:rFonts w:ascii="Wingdings" w:hAnsi="Wingdings" w:hint="default"/>
+        <w:sz w:val="20"/>
+      </w:rPr>
+    </w:lvl>
+  </w:abstractNum>
+  <w:abstractNum w:abstractNumId="12" w15:restartNumberingAfterBreak="0">
+    <w:nsid w:val="65D26B1C"/>
+    <w:multiLevelType w:val="multilevel"/>
+    <w:tmpl w:val="CB5881F4"/>
+    <w:lvl w:ilvl="0">
+      <w:start w:val="1"/>
+      <w:numFmt w:val="bullet"/>
+      <w:lvlText w:val=""/>
+      <w:lvlJc w:val="left"/>
+      <w:pPr>
+        <w:tabs>
+          <w:tab w:val="num" w:pos="1068"/>
+        </w:tabs>
+        <w:ind w:left="1068" w:hanging="360"/>
+      </w:pPr>
+      <w:rPr>
+        <w:rFonts w:ascii="Symbol" w:hAnsi="Symbol" w:hint="default"/>
+        <w:sz w:val="20"/>
+      </w:rPr>
+    </w:lvl>
+    <w:lvl w:ilvl="1" w:tentative="1">
+      <w:start w:val="1"/>
+      <w:numFmt w:val="bullet"/>
+      <w:lvlText w:val="o"/>
+      <w:lvlJc w:val="left"/>
+      <w:pPr>
+        <w:tabs>
+          <w:tab w:val="num" w:pos="1788"/>
+        </w:tabs>
+        <w:ind w:left="1788" w:hanging="360"/>
+      </w:pPr>
+      <w:rPr>
+        <w:rFonts w:ascii="Courier New" w:hAnsi="Courier New" w:hint="default"/>
+        <w:sz w:val="20"/>
+      </w:rPr>
+    </w:lvl>
+    <w:lvl w:ilvl="2" w:tentative="1">
+      <w:start w:val="1"/>
+      <w:numFmt w:val="bullet"/>
+      <w:lvlText w:val=""/>
+      <w:lvlJc w:val="left"/>
+      <w:pPr>
+        <w:tabs>
+          <w:tab w:val="num" w:pos="2508"/>
+        </w:tabs>
+        <w:ind w:left="2508" w:hanging="360"/>
+      </w:pPr>
+      <w:rPr>
+        <w:rFonts w:ascii="Wingdings" w:hAnsi="Wingdings" w:hint="default"/>
+        <w:sz w:val="20"/>
+      </w:rPr>
+    </w:lvl>
+    <w:lvl w:ilvl="3" w:tentative="1">
+      <w:start w:val="1"/>
+      <w:numFmt w:val="bullet"/>
+      <w:lvlText w:val=""/>
+      <w:lvlJc w:val="left"/>
+      <w:pPr>
+        <w:tabs>
+          <w:tab w:val="num" w:pos="3228"/>
+        </w:tabs>
+        <w:ind w:left="3228" w:hanging="360"/>
+      </w:pPr>
+      <w:rPr>
+        <w:rFonts w:ascii="Wingdings" w:hAnsi="Wingdings" w:hint="default"/>
+        <w:sz w:val="20"/>
+      </w:rPr>
+    </w:lvl>
+    <w:lvl w:ilvl="4" w:tentative="1">
+      <w:start w:val="1"/>
+      <w:numFmt w:val="bullet"/>
+      <w:lvlText w:val=""/>
+      <w:lvlJc w:val="left"/>
+      <w:pPr>
+        <w:tabs>
+          <w:tab w:val="num" w:pos="3948"/>
+        </w:tabs>
+        <w:ind w:left="3948" w:hanging="360"/>
+      </w:pPr>
+      <w:rPr>
+        <w:rFonts w:ascii="Wingdings" w:hAnsi="Wingdings" w:hint="default"/>
+        <w:sz w:val="20"/>
+      </w:rPr>
+    </w:lvl>
+    <w:lvl w:ilvl="5" w:tentative="1">
+      <w:start w:val="1"/>
+      <w:numFmt w:val="bullet"/>
+      <w:lvlText w:val=""/>
+      <w:lvlJc w:val="left"/>
+      <w:pPr>
+        <w:tabs>
+          <w:tab w:val="num" w:pos="4668"/>
+        </w:tabs>
+        <w:ind w:left="4668" w:hanging="360"/>
+      </w:pPr>
+      <w:rPr>
+        <w:rFonts w:ascii="Wingdings" w:hAnsi="Wingdings" w:hint="default"/>
+        <w:sz w:val="20"/>
+      </w:rPr>
+    </w:lvl>
+    <w:lvl w:ilvl="6" w:tentative="1">
+      <w:start w:val="1"/>
+      <w:numFmt w:val="bullet"/>
+      <w:lvlText w:val=""/>
+      <w:lvlJc w:val="left"/>
+      <w:pPr>
+        <w:tabs>
+          <w:tab w:val="num" w:pos="5388"/>
+        </w:tabs>
+        <w:ind w:left="5388" w:hanging="360"/>
+      </w:pPr>
+      <w:rPr>
+        <w:rFonts w:ascii="Wingdings" w:hAnsi="Wingdings" w:hint="default"/>
+        <w:sz w:val="20"/>
+      </w:rPr>
+    </w:lvl>
+    <w:lvl w:ilvl="7" w:tentative="1">
+      <w:start w:val="1"/>
+      <w:numFmt w:val="bullet"/>
+      <w:lvlText w:val=""/>
+      <w:lvlJc w:val="left"/>
+      <w:pPr>
+        <w:tabs>
+          <w:tab w:val="num" w:pos="6108"/>
+        </w:tabs>
+        <w:ind w:left="6108" w:hanging="360"/>
+      </w:pPr>
+      <w:rPr>
+        <w:rFonts w:ascii="Wingdings" w:hAnsi="Wingdings" w:hint="default"/>
+        <w:sz w:val="20"/>
+      </w:rPr>
+    </w:lvl>
+    <w:lvl w:ilvl="8" w:tentative="1">
+      <w:start w:val="1"/>
+      <w:numFmt w:val="bullet"/>
+      <w:lvlText w:val=""/>
+      <w:lvlJc w:val="left"/>
+      <w:pPr>
+        <w:tabs>
+          <w:tab w:val="num" w:pos="6828"/>
+        </w:tabs>
+        <w:ind w:left="6828" w:hanging="360"/>
+      </w:pPr>
+      <w:rPr>
+        <w:rFonts w:ascii="Wingdings" w:hAnsi="Wingdings" w:hint="default"/>
+        <w:sz w:val="20"/>
+      </w:rPr>
+    </w:lvl>
+  </w:abstractNum>
+  <w:abstractNum w:abstractNumId="13" w15:restartNumberingAfterBreak="0">
     <w:nsid w:val="665A449D"/>
     <w:multiLevelType w:val="multilevel"/>
     <w:tmpl w:val="FBDA96F4"/>
@@ -1644,17 +4855,467 @@
       </w:rPr>
     </w:lvl>
   </w:abstractNum>
+  <w:abstractNum w:abstractNumId="14" w15:restartNumberingAfterBreak="0">
+    <w:nsid w:val="6A0643F4"/>
+    <w:multiLevelType w:val="multilevel"/>
+    <w:tmpl w:val="C71E8472"/>
+    <w:lvl w:ilvl="0">
+      <w:start w:val="1"/>
+      <w:numFmt w:val="bullet"/>
+      <w:lvlText w:val=""/>
+      <w:lvlJc w:val="left"/>
+      <w:pPr>
+        <w:tabs>
+          <w:tab w:val="num" w:pos="1068"/>
+        </w:tabs>
+        <w:ind w:left="1068" w:hanging="360"/>
+      </w:pPr>
+      <w:rPr>
+        <w:rFonts w:ascii="Symbol" w:hAnsi="Symbol" w:hint="default"/>
+        <w:sz w:val="20"/>
+      </w:rPr>
+    </w:lvl>
+    <w:lvl w:ilvl="1" w:tentative="1">
+      <w:start w:val="1"/>
+      <w:numFmt w:val="bullet"/>
+      <w:lvlText w:val="o"/>
+      <w:lvlJc w:val="left"/>
+      <w:pPr>
+        <w:tabs>
+          <w:tab w:val="num" w:pos="1788"/>
+        </w:tabs>
+        <w:ind w:left="1788" w:hanging="360"/>
+      </w:pPr>
+      <w:rPr>
+        <w:rFonts w:ascii="Courier New" w:hAnsi="Courier New" w:hint="default"/>
+        <w:sz w:val="20"/>
+      </w:rPr>
+    </w:lvl>
+    <w:lvl w:ilvl="2" w:tentative="1">
+      <w:start w:val="1"/>
+      <w:numFmt w:val="bullet"/>
+      <w:lvlText w:val=""/>
+      <w:lvlJc w:val="left"/>
+      <w:pPr>
+        <w:tabs>
+          <w:tab w:val="num" w:pos="2508"/>
+        </w:tabs>
+        <w:ind w:left="2508" w:hanging="360"/>
+      </w:pPr>
+      <w:rPr>
+        <w:rFonts w:ascii="Wingdings" w:hAnsi="Wingdings" w:hint="default"/>
+        <w:sz w:val="20"/>
+      </w:rPr>
+    </w:lvl>
+    <w:lvl w:ilvl="3" w:tentative="1">
+      <w:start w:val="1"/>
+      <w:numFmt w:val="bullet"/>
+      <w:lvlText w:val=""/>
+      <w:lvlJc w:val="left"/>
+      <w:pPr>
+        <w:tabs>
+          <w:tab w:val="num" w:pos="3228"/>
+        </w:tabs>
+        <w:ind w:left="3228" w:hanging="360"/>
+      </w:pPr>
+      <w:rPr>
+        <w:rFonts w:ascii="Wingdings" w:hAnsi="Wingdings" w:hint="default"/>
+        <w:sz w:val="20"/>
+      </w:rPr>
+    </w:lvl>
+    <w:lvl w:ilvl="4" w:tentative="1">
+      <w:start w:val="1"/>
+      <w:numFmt w:val="bullet"/>
+      <w:lvlText w:val=""/>
+      <w:lvlJc w:val="left"/>
+      <w:pPr>
+        <w:tabs>
+          <w:tab w:val="num" w:pos="3948"/>
+        </w:tabs>
+        <w:ind w:left="3948" w:hanging="360"/>
+      </w:pPr>
+      <w:rPr>
+        <w:rFonts w:ascii="Wingdings" w:hAnsi="Wingdings" w:hint="default"/>
+        <w:sz w:val="20"/>
+      </w:rPr>
+    </w:lvl>
+    <w:lvl w:ilvl="5" w:tentative="1">
+      <w:start w:val="1"/>
+      <w:numFmt w:val="bullet"/>
+      <w:lvlText w:val=""/>
+      <w:lvlJc w:val="left"/>
+      <w:pPr>
+        <w:tabs>
+          <w:tab w:val="num" w:pos="4668"/>
+        </w:tabs>
+        <w:ind w:left="4668" w:hanging="360"/>
+      </w:pPr>
+      <w:rPr>
+        <w:rFonts w:ascii="Wingdings" w:hAnsi="Wingdings" w:hint="default"/>
+        <w:sz w:val="20"/>
+      </w:rPr>
+    </w:lvl>
+    <w:lvl w:ilvl="6" w:tentative="1">
+      <w:start w:val="1"/>
+      <w:numFmt w:val="bullet"/>
+      <w:lvlText w:val=""/>
+      <w:lvlJc w:val="left"/>
+      <w:pPr>
+        <w:tabs>
+          <w:tab w:val="num" w:pos="5388"/>
+        </w:tabs>
+        <w:ind w:left="5388" w:hanging="360"/>
+      </w:pPr>
+      <w:rPr>
+        <w:rFonts w:ascii="Wingdings" w:hAnsi="Wingdings" w:hint="default"/>
+        <w:sz w:val="20"/>
+      </w:rPr>
+    </w:lvl>
+    <w:lvl w:ilvl="7" w:tentative="1">
+      <w:start w:val="1"/>
+      <w:numFmt w:val="bullet"/>
+      <w:lvlText w:val=""/>
+      <w:lvlJc w:val="left"/>
+      <w:pPr>
+        <w:tabs>
+          <w:tab w:val="num" w:pos="6108"/>
+        </w:tabs>
+        <w:ind w:left="6108" w:hanging="360"/>
+      </w:pPr>
+      <w:rPr>
+        <w:rFonts w:ascii="Wingdings" w:hAnsi="Wingdings" w:hint="default"/>
+        <w:sz w:val="20"/>
+      </w:rPr>
+    </w:lvl>
+    <w:lvl w:ilvl="8" w:tentative="1">
+      <w:start w:val="1"/>
+      <w:numFmt w:val="bullet"/>
+      <w:lvlText w:val=""/>
+      <w:lvlJc w:val="left"/>
+      <w:pPr>
+        <w:tabs>
+          <w:tab w:val="num" w:pos="6828"/>
+        </w:tabs>
+        <w:ind w:left="6828" w:hanging="360"/>
+      </w:pPr>
+      <w:rPr>
+        <w:rFonts w:ascii="Wingdings" w:hAnsi="Wingdings" w:hint="default"/>
+        <w:sz w:val="20"/>
+      </w:rPr>
+    </w:lvl>
+  </w:abstractNum>
+  <w:abstractNum w:abstractNumId="15" w15:restartNumberingAfterBreak="0">
+    <w:nsid w:val="79335EBC"/>
+    <w:multiLevelType w:val="multilevel"/>
+    <w:tmpl w:val="42E82A3E"/>
+    <w:lvl w:ilvl="0">
+      <w:start w:val="1"/>
+      <w:numFmt w:val="bullet"/>
+      <w:lvlText w:val=""/>
+      <w:lvlJc w:val="left"/>
+      <w:pPr>
+        <w:tabs>
+          <w:tab w:val="num" w:pos="720"/>
+        </w:tabs>
+        <w:ind w:left="720" w:hanging="360"/>
+      </w:pPr>
+      <w:rPr>
+        <w:rFonts w:ascii="Symbol" w:hAnsi="Symbol" w:hint="default"/>
+        <w:sz w:val="20"/>
+      </w:rPr>
+    </w:lvl>
+    <w:lvl w:ilvl="1" w:tentative="1">
+      <w:start w:val="1"/>
+      <w:numFmt w:val="bullet"/>
+      <w:lvlText w:val="o"/>
+      <w:lvlJc w:val="left"/>
+      <w:pPr>
+        <w:tabs>
+          <w:tab w:val="num" w:pos="1440"/>
+        </w:tabs>
+        <w:ind w:left="1440" w:hanging="360"/>
+      </w:pPr>
+      <w:rPr>
+        <w:rFonts w:ascii="Courier New" w:hAnsi="Courier New" w:hint="default"/>
+        <w:sz w:val="20"/>
+      </w:rPr>
+    </w:lvl>
+    <w:lvl w:ilvl="2" w:tentative="1">
+      <w:start w:val="1"/>
+      <w:numFmt w:val="bullet"/>
+      <w:lvlText w:val=""/>
+      <w:lvlJc w:val="left"/>
+      <w:pPr>
+        <w:tabs>
+          <w:tab w:val="num" w:pos="2160"/>
+        </w:tabs>
+        <w:ind w:left="2160" w:hanging="360"/>
+      </w:pPr>
+      <w:rPr>
+        <w:rFonts w:ascii="Wingdings" w:hAnsi="Wingdings" w:hint="default"/>
+        <w:sz w:val="20"/>
+      </w:rPr>
+    </w:lvl>
+    <w:lvl w:ilvl="3" w:tentative="1">
+      <w:start w:val="1"/>
+      <w:numFmt w:val="bullet"/>
+      <w:lvlText w:val=""/>
+      <w:lvlJc w:val="left"/>
+      <w:pPr>
+        <w:tabs>
+          <w:tab w:val="num" w:pos="2880"/>
+        </w:tabs>
+        <w:ind w:left="2880" w:hanging="360"/>
+      </w:pPr>
+      <w:rPr>
+        <w:rFonts w:ascii="Wingdings" w:hAnsi="Wingdings" w:hint="default"/>
+        <w:sz w:val="20"/>
+      </w:rPr>
+    </w:lvl>
+    <w:lvl w:ilvl="4" w:tentative="1">
+      <w:start w:val="1"/>
+      <w:numFmt w:val="bullet"/>
+      <w:lvlText w:val=""/>
+      <w:lvlJc w:val="left"/>
+      <w:pPr>
+        <w:tabs>
+          <w:tab w:val="num" w:pos="3600"/>
+        </w:tabs>
+        <w:ind w:left="3600" w:hanging="360"/>
+      </w:pPr>
+      <w:rPr>
+        <w:rFonts w:ascii="Wingdings" w:hAnsi="Wingdings" w:hint="default"/>
+        <w:sz w:val="20"/>
+      </w:rPr>
+    </w:lvl>
+    <w:lvl w:ilvl="5" w:tentative="1">
+      <w:start w:val="1"/>
+      <w:numFmt w:val="bullet"/>
+      <w:lvlText w:val=""/>
+      <w:lvlJc w:val="left"/>
+      <w:pPr>
+        <w:tabs>
+          <w:tab w:val="num" w:pos="4320"/>
+        </w:tabs>
+        <w:ind w:left="4320" w:hanging="360"/>
+      </w:pPr>
+      <w:rPr>
+        <w:rFonts w:ascii="Wingdings" w:hAnsi="Wingdings" w:hint="default"/>
+        <w:sz w:val="20"/>
+      </w:rPr>
+    </w:lvl>
+    <w:lvl w:ilvl="6" w:tentative="1">
+      <w:start w:val="1"/>
+      <w:numFmt w:val="bullet"/>
+      <w:lvlText w:val=""/>
+      <w:lvlJc w:val="left"/>
+      <w:pPr>
+        <w:tabs>
+          <w:tab w:val="num" w:pos="5040"/>
+        </w:tabs>
+        <w:ind w:left="5040" w:hanging="360"/>
+      </w:pPr>
+      <w:rPr>
+        <w:rFonts w:ascii="Wingdings" w:hAnsi="Wingdings" w:hint="default"/>
+        <w:sz w:val="20"/>
+      </w:rPr>
+    </w:lvl>
+    <w:lvl w:ilvl="7" w:tentative="1">
+      <w:start w:val="1"/>
+      <w:numFmt w:val="bullet"/>
+      <w:lvlText w:val=""/>
+      <w:lvlJc w:val="left"/>
+      <w:pPr>
+        <w:tabs>
+          <w:tab w:val="num" w:pos="5760"/>
+        </w:tabs>
+        <w:ind w:left="5760" w:hanging="360"/>
+      </w:pPr>
+      <w:rPr>
+        <w:rFonts w:ascii="Wingdings" w:hAnsi="Wingdings" w:hint="default"/>
+        <w:sz w:val="20"/>
+      </w:rPr>
+    </w:lvl>
+    <w:lvl w:ilvl="8" w:tentative="1">
+      <w:start w:val="1"/>
+      <w:numFmt w:val="bullet"/>
+      <w:lvlText w:val=""/>
+      <w:lvlJc w:val="left"/>
+      <w:pPr>
+        <w:tabs>
+          <w:tab w:val="num" w:pos="6480"/>
+        </w:tabs>
+        <w:ind w:left="6480" w:hanging="360"/>
+      </w:pPr>
+      <w:rPr>
+        <w:rFonts w:ascii="Wingdings" w:hAnsi="Wingdings" w:hint="default"/>
+        <w:sz w:val="20"/>
+      </w:rPr>
+    </w:lvl>
+  </w:abstractNum>
+  <w:abstractNum w:abstractNumId="16" w15:restartNumberingAfterBreak="0">
+    <w:nsid w:val="7AA429A4"/>
+    <w:multiLevelType w:val="hybridMultilevel"/>
+    <w:tmpl w:val="D96C8F36"/>
+    <w:lvl w:ilvl="0" w:tplc="FFFFFFFF">
+      <w:start w:val="1"/>
+      <w:numFmt w:val="bullet"/>
+      <w:lvlText w:val=""/>
+      <w:lvlJc w:val="left"/>
+      <w:pPr>
+        <w:ind w:left="720" w:hanging="360"/>
+      </w:pPr>
+      <w:rPr>
+        <w:rFonts w:ascii="Symbol" w:hAnsi="Symbol" w:hint="default"/>
+      </w:rPr>
+    </w:lvl>
+    <w:lvl w:ilvl="1" w:tplc="04150001">
+      <w:start w:val="1"/>
+      <w:numFmt w:val="bullet"/>
+      <w:lvlText w:val=""/>
+      <w:lvlJc w:val="left"/>
+      <w:pPr>
+        <w:ind w:left="1080" w:hanging="360"/>
+      </w:pPr>
+      <w:rPr>
+        <w:rFonts w:ascii="Symbol" w:hAnsi="Symbol" w:hint="default"/>
+      </w:rPr>
+    </w:lvl>
+    <w:lvl w:ilvl="2" w:tplc="FFFFFFFF">
+      <w:start w:val="1"/>
+      <w:numFmt w:val="bullet"/>
+      <w:lvlText w:val=""/>
+      <w:lvlJc w:val="left"/>
+      <w:pPr>
+        <w:ind w:left="2160" w:hanging="360"/>
+      </w:pPr>
+      <w:rPr>
+        <w:rFonts w:ascii="Wingdings" w:hAnsi="Wingdings" w:hint="default"/>
+      </w:rPr>
+    </w:lvl>
+    <w:lvl w:ilvl="3" w:tplc="FFFFFFFF" w:tentative="1">
+      <w:start w:val="1"/>
+      <w:numFmt w:val="bullet"/>
+      <w:lvlText w:val=""/>
+      <w:lvlJc w:val="left"/>
+      <w:pPr>
+        <w:ind w:left="2880" w:hanging="360"/>
+      </w:pPr>
+      <w:rPr>
+        <w:rFonts w:ascii="Symbol" w:hAnsi="Symbol" w:hint="default"/>
+      </w:rPr>
+    </w:lvl>
+    <w:lvl w:ilvl="4" w:tplc="FFFFFFFF" w:tentative="1">
+      <w:start w:val="1"/>
+      <w:numFmt w:val="bullet"/>
+      <w:lvlText w:val="o"/>
+      <w:lvlJc w:val="left"/>
+      <w:pPr>
+        <w:ind w:left="3600" w:hanging="360"/>
+      </w:pPr>
+      <w:rPr>
+        <w:rFonts w:ascii="Courier New" w:hAnsi="Courier New" w:cs="Courier New" w:hint="default"/>
+      </w:rPr>
+    </w:lvl>
+    <w:lvl w:ilvl="5" w:tplc="FFFFFFFF" w:tentative="1">
+      <w:start w:val="1"/>
+      <w:numFmt w:val="bullet"/>
+      <w:lvlText w:val=""/>
+      <w:lvlJc w:val="left"/>
+      <w:pPr>
+        <w:ind w:left="4320" w:hanging="360"/>
+      </w:pPr>
+      <w:rPr>
+        <w:rFonts w:ascii="Wingdings" w:hAnsi="Wingdings" w:hint="default"/>
+      </w:rPr>
+    </w:lvl>
+    <w:lvl w:ilvl="6" w:tplc="FFFFFFFF" w:tentative="1">
+      <w:start w:val="1"/>
+      <w:numFmt w:val="bullet"/>
+      <w:lvlText w:val=""/>
+      <w:lvlJc w:val="left"/>
+      <w:pPr>
+        <w:ind w:left="5040" w:hanging="360"/>
+      </w:pPr>
+      <w:rPr>
+        <w:rFonts w:ascii="Symbol" w:hAnsi="Symbol" w:hint="default"/>
+      </w:rPr>
+    </w:lvl>
+    <w:lvl w:ilvl="7" w:tplc="FFFFFFFF" w:tentative="1">
+      <w:start w:val="1"/>
+      <w:numFmt w:val="bullet"/>
+      <w:lvlText w:val="o"/>
+      <w:lvlJc w:val="left"/>
+      <w:pPr>
+        <w:ind w:left="5760" w:hanging="360"/>
+      </w:pPr>
+      <w:rPr>
+        <w:rFonts w:ascii="Courier New" w:hAnsi="Courier New" w:cs="Courier New" w:hint="default"/>
+      </w:rPr>
+    </w:lvl>
+    <w:lvl w:ilvl="8" w:tplc="FFFFFFFF" w:tentative="1">
+      <w:start w:val="1"/>
+      <w:numFmt w:val="bullet"/>
+      <w:lvlText w:val=""/>
+      <w:lvlJc w:val="left"/>
+      <w:pPr>
+        <w:ind w:left="6480" w:hanging="360"/>
+      </w:pPr>
+      <w:rPr>
+        <w:rFonts w:ascii="Wingdings" w:hAnsi="Wingdings" w:hint="default"/>
+      </w:rPr>
+    </w:lvl>
+  </w:abstractNum>
   <w:num w:numId="1" w16cid:durableId="1483887667">
+    <w:abstractNumId w:val="2"/>
+  </w:num>
+  <w:num w:numId="2" w16cid:durableId="1502163515">
+    <w:abstractNumId w:val="7"/>
+  </w:num>
+  <w:num w:numId="3" w16cid:durableId="1562788965">
+    <w:abstractNumId w:val="13"/>
+  </w:num>
+  <w:num w:numId="4" w16cid:durableId="1998266894">
     <w:abstractNumId w:val="1"/>
   </w:num>
-  <w:num w:numId="2" w16cid:durableId="1502163515">
-    <w:abstractNumId w:val="2"/>
+  <w:num w:numId="5" w16cid:durableId="1322808972">
+    <w:abstractNumId w:val="8"/>
   </w:num>
-  <w:num w:numId="3" w16cid:durableId="1562788965">
+  <w:num w:numId="6" w16cid:durableId="837694082">
+    <w:abstractNumId w:val="11"/>
+  </w:num>
+  <w:num w:numId="7" w16cid:durableId="823206007">
+    <w:abstractNumId w:val="9"/>
+  </w:num>
+  <w:num w:numId="8" w16cid:durableId="1363743005">
+    <w:abstractNumId w:val="6"/>
+  </w:num>
+  <w:num w:numId="9" w16cid:durableId="588124785">
+    <w:abstractNumId w:val="5"/>
+  </w:num>
+  <w:num w:numId="10" w16cid:durableId="1078095313">
+    <w:abstractNumId w:val="4"/>
+  </w:num>
+  <w:num w:numId="11" w16cid:durableId="1849127762">
+    <w:abstractNumId w:val="10"/>
+  </w:num>
+  <w:num w:numId="12" w16cid:durableId="1148668001">
+    <w:abstractNumId w:val="16"/>
+  </w:num>
+  <w:num w:numId="13" w16cid:durableId="31999563">
+    <w:abstractNumId w:val="15"/>
+  </w:num>
+  <w:num w:numId="14" w16cid:durableId="304706171">
     <w:abstractNumId w:val="3"/>
   </w:num>
-  <w:num w:numId="4" w16cid:durableId="1998266894">
+  <w:num w:numId="15" w16cid:durableId="745686882">
     <w:abstractNumId w:val="0"/>
+  </w:num>
+  <w:num w:numId="16" w16cid:durableId="1583219076">
+    <w:abstractNumId w:val="12"/>
+  </w:num>
+  <w:num w:numId="17" w16cid:durableId="585498789">
+    <w:abstractNumId w:val="14"/>
   </w:num>
 </w:numbering>
 </file>
@@ -2129,7 +5790,6 @@
     <w:basedOn w:val="Normalny"/>
     <w:next w:val="Normalny"/>
     <w:uiPriority w:val="9"/>
-    <w:semiHidden/>
     <w:unhideWhenUsed/>
     <w:qFormat/>
     <w:rsid w:val="007901B5"/>
@@ -2433,7 +6093,6 @@
     <w:name w:val="Nagłówek 4 Znak"/>
     <w:basedOn w:val="Domylnaczcionkaakapitu"/>
     <w:uiPriority w:val="9"/>
-    <w:semiHidden/>
     <w:rsid w:val="003206D7"/>
     <w:rPr>
       <w:rFonts w:eastAsiaTheme="majorEastAsia" w:cstheme="majorBidi"/>
@@ -2547,6 +6206,23 @@
       <w:i/>
       <w:iCs/>
       <w:color w:val="0F4761" w:themeColor="accent1" w:themeShade="BF"/>
+    </w:rPr>
+  </w:style>
+  <w:style w:type="paragraph" w:styleId="NormalnyWeb">
+    <w:name w:val="Normal (Web)"/>
+    <w:basedOn w:val="Normalny"/>
+    <w:uiPriority w:val="99"/>
+    <w:semiHidden/>
+    <w:unhideWhenUsed/>
+    <w:rsid w:val="00E667D2"/>
+    <w:pPr>
+      <w:spacing w:before="100" w:beforeAutospacing="1" w:after="100" w:afterAutospacing="1" w:line="240" w:lineRule="auto"/>
+    </w:pPr>
+    <w:rPr>
+      <w:rFonts w:ascii="Times New Roman" w:eastAsia="Times New Roman" w:hAnsi="Times New Roman" w:cs="Times New Roman"/>
+      <w:kern w:val="0"/>
+      <w:lang w:eastAsia="pl-PL"/>
+      <w14:ligatures w14:val="none"/>
     </w:rPr>
   </w:style>
 </w:styles>
@@ -2868,23 +6544,6 @@
 </file>
 
 <file path=customXml/item1.xml><?xml version="1.0" encoding="utf-8"?>
-<p:properties xmlns:p="http://schemas.microsoft.com/office/2006/metadata/properties" xmlns:xsi="http://www.w3.org/2001/XMLSchema-instance" xmlns:pc="http://schemas.microsoft.com/office/infopath/2007/PartnerControls">
-  <documentManagement>
-    <_activity xmlns="01a094b0-08a8-443b-bd9d-7d2701d1cf8a" xsi:nil="true"/>
-  </documentManagement>
-</p:properties>
-</file>
-
-<file path=customXml/item2.xml><?xml version="1.0" encoding="utf-8"?>
-<?mso-contentType ?>
-<FormTemplates xmlns="http://schemas.microsoft.com/sharepoint/v3/contenttype/forms">
-  <Display>DocumentLibraryForm</Display>
-  <Edit>DocumentLibraryForm</Edit>
-  <New>DocumentLibraryForm</New>
-</FormTemplates>
-</file>
-
-<file path=customXml/item3.xml><?xml version="1.0" encoding="utf-8"?>
 <ct:contentTypeSchema xmlns:ct="http://schemas.microsoft.com/office/2006/metadata/contentType" xmlns:ma="http://schemas.microsoft.com/office/2006/metadata/properties/metaAttributes" ct:_="" ma:_="" ma:contentTypeName="Dokument" ma:contentTypeID="0x010100CCB42EE1A2101A46A529E33B73FA5B9E" ma:contentTypeVersion="10" ma:contentTypeDescription="Utwórz nowy dokument." ma:contentTypeScope="" ma:versionID="fb28c9b49a9d7ee7992a0068d83f7825">
   <xsd:schema xmlns:xsd="http://www.w3.org/2001/XMLSchema" xmlns:xs="http://www.w3.org/2001/XMLSchema" xmlns:p="http://schemas.microsoft.com/office/2006/metadata/properties" xmlns:ns3="01a094b0-08a8-443b-bd9d-7d2701d1cf8a" targetNamespace="http://schemas.microsoft.com/office/2006/metadata/properties" ma:root="true" ma:fieldsID="4d7bfa7a1f1f07c1257d0e29d16acf8e" ns3:_="">
     <xsd:import namespace="01a094b0-08a8-443b-bd9d-7d2701d1cf8a"/>
@@ -3066,29 +6725,28 @@
 </ct:contentTypeSchema>
 </file>
 
+<file path=customXml/item2.xml><?xml version="1.0" encoding="utf-8"?>
+<?mso-contentType ?>
+<FormTemplates xmlns="http://schemas.microsoft.com/sharepoint/v3/contenttype/forms">
+  <Display>DocumentLibraryForm</Display>
+  <Edit>DocumentLibraryForm</Edit>
+  <New>DocumentLibraryForm</New>
+</FormTemplates>
+</file>
+
+<file path=customXml/item3.xml><?xml version="1.0" encoding="utf-8"?>
+<p:properties xmlns:p="http://schemas.microsoft.com/office/2006/metadata/properties" xmlns:xsi="http://www.w3.org/2001/XMLSchema-instance" xmlns:pc="http://schemas.microsoft.com/office/infopath/2007/PartnerControls">
+  <documentManagement>
+    <_activity xmlns="01a094b0-08a8-443b-bd9d-7d2701d1cf8a" xsi:nil="true"/>
+  </documentManagement>
+</p:properties>
+</file>
+
 <file path=customXml/item4.xml><?xml version="1.0" encoding="utf-8"?>
 <b:Sources xmlns:b="http://schemas.openxmlformats.org/officeDocument/2006/bibliography" xmlns="http://schemas.openxmlformats.org/officeDocument/2006/bibliography" SelectedStyle="\APASixthEditionOfficeOnline.xsl" StyleName="APA" Version="6"/>
 </file>
 
 <file path=customXml/itemProps1.xml><?xml version="1.0" encoding="utf-8"?>
-<ds:datastoreItem xmlns:ds="http://schemas.openxmlformats.org/officeDocument/2006/customXml" ds:itemID="{11275EE7-436D-44BB-874B-06A9C0948B83}">
-  <ds:schemaRefs>
-    <ds:schemaRef ds:uri="http://schemas.microsoft.com/office/2006/metadata/properties"/>
-    <ds:schemaRef ds:uri="http://schemas.microsoft.com/office/infopath/2007/PartnerControls"/>
-    <ds:schemaRef ds:uri="01a094b0-08a8-443b-bd9d-7d2701d1cf8a"/>
-  </ds:schemaRefs>
-</ds:datastoreItem>
-</file>
-
-<file path=customXml/itemProps2.xml><?xml version="1.0" encoding="utf-8"?>
-<ds:datastoreItem xmlns:ds="http://schemas.openxmlformats.org/officeDocument/2006/customXml" ds:itemID="{846F3F10-2E3D-4091-84D7-32B19F5B918C}">
-  <ds:schemaRefs>
-    <ds:schemaRef ds:uri="http://schemas.microsoft.com/sharepoint/v3/contenttype/forms"/>
-  </ds:schemaRefs>
-</ds:datastoreItem>
-</file>
-
-<file path=customXml/itemProps3.xml><?xml version="1.0" encoding="utf-8"?>
 <ds:datastoreItem xmlns:ds="http://schemas.openxmlformats.org/officeDocument/2006/customXml" ds:itemID="{7456FE10-DABE-41A2-B0AD-3BA76596A10A}">
   <ds:schemaRefs>
     <ds:schemaRef ds:uri="http://schemas.microsoft.com/office/2006/metadata/contentType"/>
@@ -3106,6 +6764,24 @@
 </ds:datastoreItem>
 </file>
 
+<file path=customXml/itemProps2.xml><?xml version="1.0" encoding="utf-8"?>
+<ds:datastoreItem xmlns:ds="http://schemas.openxmlformats.org/officeDocument/2006/customXml" ds:itemID="{846F3F10-2E3D-4091-84D7-32B19F5B918C}">
+  <ds:schemaRefs>
+    <ds:schemaRef ds:uri="http://schemas.microsoft.com/sharepoint/v3/contenttype/forms"/>
+  </ds:schemaRefs>
+</ds:datastoreItem>
+</file>
+
+<file path=customXml/itemProps3.xml><?xml version="1.0" encoding="utf-8"?>
+<ds:datastoreItem xmlns:ds="http://schemas.openxmlformats.org/officeDocument/2006/customXml" ds:itemID="{11275EE7-436D-44BB-874B-06A9C0948B83}">
+  <ds:schemaRefs>
+    <ds:schemaRef ds:uri="http://schemas.microsoft.com/office/2006/metadata/properties"/>
+    <ds:schemaRef ds:uri="http://schemas.microsoft.com/office/infopath/2007/PartnerControls"/>
+    <ds:schemaRef ds:uri="01a094b0-08a8-443b-bd9d-7d2701d1cf8a"/>
+  </ds:schemaRefs>
+</ds:datastoreItem>
+</file>
+
 <file path=customXml/itemProps4.xml><?xml version="1.0" encoding="utf-8"?>
 <ds:datastoreItem xmlns:ds="http://schemas.openxmlformats.org/officeDocument/2006/customXml" ds:itemID="{211C353F-6200-4B5E-8492-7D72958BB88A}">
   <ds:schemaRefs>

</xml_diff>

<commit_message>
poprawiony diagram i opis
</commit_message>
<xml_diff>
--- a/projektFirmaRolnicza.docx
+++ b/projektFirmaRolnicza.docx
@@ -6,12 +6,14 @@
       <w:pPr>
         <w:jc w:val="both"/>
         <w:rPr>
+          <w:rFonts w:ascii="Times New Roman" w:hAnsi="Times New Roman" w:cs="Times New Roman"/>
           <w:b/>
           <w:bCs/>
         </w:rPr>
       </w:pPr>
       <w:r>
         <w:rPr>
+          <w:rFonts w:ascii="Times New Roman" w:hAnsi="Times New Roman" w:cs="Times New Roman"/>
           <w:b/>
           <w:bCs/>
         </w:rPr>
@@ -19,6 +21,7 @@
       </w:r>
       <w:r>
         <w:rPr>
+          <w:rFonts w:ascii="Times New Roman" w:hAnsi="Times New Roman" w:cs="Times New Roman"/>
           <w:b/>
           <w:bCs/>
         </w:rPr>
@@ -26,6 +29,7 @@
       </w:r>
       <w:r>
         <w:rPr>
+          <w:rFonts w:ascii="Times New Roman" w:hAnsi="Times New Roman" w:cs="Times New Roman"/>
           <w:b/>
           <w:bCs/>
         </w:rPr>
@@ -35,59 +39,80 @@
     <w:p>
       <w:pPr>
         <w:jc w:val="both"/>
-      </w:pPr>
-      <w:r>
-        <w:rPr>
+        <w:rPr>
+          <w:rFonts w:ascii="Times New Roman" w:hAnsi="Times New Roman" w:cs="Times New Roman"/>
+        </w:rPr>
+      </w:pPr>
+      <w:r>
+        <w:rPr>
+          <w:rFonts w:ascii="Times New Roman" w:hAnsi="Times New Roman" w:cs="Times New Roman"/>
           <w:b/>
           <w:bCs/>
         </w:rPr>
         <w:t>Przedmiot:</w:t>
       </w:r>
       <w:r>
-        <w:t xml:space="preserve"> </w:t>
-      </w:r>
-      <w:r>
-        <w:t xml:space="preserve">Inżynieria Oprogramowania </w:t>
-      </w:r>
-    </w:p>
-    <w:p>
-      <w:pPr>
-        <w:jc w:val="both"/>
-      </w:pPr>
-      <w:r>
-        <w:rPr>
+        <w:rPr>
+          <w:rFonts w:ascii="Times New Roman" w:hAnsi="Times New Roman" w:cs="Times New Roman"/>
+        </w:rPr>
+        <w:t xml:space="preserve"> Inżynieria Oprogramowania </w:t>
+      </w:r>
+    </w:p>
+    <w:p>
+      <w:pPr>
+        <w:jc w:val="both"/>
+        <w:rPr>
+          <w:rFonts w:ascii="Times New Roman" w:hAnsi="Times New Roman" w:cs="Times New Roman"/>
+        </w:rPr>
+      </w:pPr>
+      <w:r>
+        <w:rPr>
+          <w:rFonts w:ascii="Times New Roman" w:hAnsi="Times New Roman" w:cs="Times New Roman"/>
           <w:b/>
           <w:bCs/>
         </w:rPr>
         <w:t>Prowadzący:</w:t>
       </w:r>
       <w:r>
-        <w:t xml:space="preserve"> </w:t>
-      </w:r>
-      <w:r>
-        <w:t>Marcin Czajkowski</w:t>
-      </w:r>
-    </w:p>
-    <w:p>
-      <w:pPr>
-        <w:jc w:val="both"/>
-      </w:pPr>
-      <w:r>
-        <w:rPr>
+        <w:rPr>
+          <w:rFonts w:ascii="Times New Roman" w:hAnsi="Times New Roman" w:cs="Times New Roman"/>
+        </w:rPr>
+        <w:t xml:space="preserve"> Marcin Czajkowski</w:t>
+      </w:r>
+    </w:p>
+    <w:p>
+      <w:pPr>
+        <w:jc w:val="both"/>
+        <w:rPr>
+          <w:rFonts w:ascii="Times New Roman" w:hAnsi="Times New Roman" w:cs="Times New Roman"/>
+        </w:rPr>
+      </w:pPr>
+      <w:r>
+        <w:rPr>
+          <w:rFonts w:ascii="Times New Roman" w:hAnsi="Times New Roman" w:cs="Times New Roman"/>
           <w:b/>
           <w:bCs/>
         </w:rPr>
         <w:t>Data:</w:t>
       </w:r>
       <w:r>
+        <w:rPr>
+          <w:rFonts w:ascii="Times New Roman" w:hAnsi="Times New Roman" w:cs="Times New Roman"/>
+        </w:rPr>
         <w:t xml:space="preserve"> </w:t>
       </w:r>
     </w:p>
     <w:p>
       <w:pPr>
         <w:jc w:val="both"/>
-      </w:pPr>
-      <w:r>
+        <w:rPr>
+          <w:rFonts w:ascii="Times New Roman" w:hAnsi="Times New Roman" w:cs="Times New Roman"/>
+        </w:rPr>
+      </w:pPr>
+      <w:r>
+        <w:rPr>
+          <w:rFonts w:ascii="Times New Roman" w:hAnsi="Times New Roman" w:cs="Times New Roman"/>
+        </w:rPr>
         <w:pict w14:anchorId="25E70BDD">
           <v:rect id="_x0000_i1025" style="width:0;height:1.5pt" o:hralign="center" o:hrstd="t" o:hr="t" fillcolor="#a0a0a0" stroked="f"/>
         </w:pict>
@@ -97,12 +122,14 @@
       <w:pPr>
         <w:jc w:val="both"/>
         <w:rPr>
+          <w:rFonts w:ascii="Times New Roman" w:hAnsi="Times New Roman" w:cs="Times New Roman"/>
           <w:b/>
           <w:bCs/>
         </w:rPr>
       </w:pPr>
       <w:r>
         <w:rPr>
+          <w:rFonts w:ascii="Times New Roman" w:hAnsi="Times New Roman" w:cs="Times New Roman"/>
           <w:b/>
           <w:bCs/>
         </w:rPr>
@@ -116,9 +143,9 @@
         <w:tblLook w:val="04A0" w:firstRow="1" w:lastRow="0" w:firstColumn="1" w:lastColumn="0" w:noHBand="0" w:noVBand="1"/>
       </w:tblPr>
       <w:tblGrid>
-        <w:gridCol w:w="2614"/>
-        <w:gridCol w:w="1865"/>
-        <w:gridCol w:w="2498"/>
+        <w:gridCol w:w="2446"/>
+        <w:gridCol w:w="1819"/>
+        <w:gridCol w:w="2396"/>
       </w:tblGrid>
       <w:tr>
         <w:tc>
@@ -130,9 +157,13 @@
             <w:pPr>
               <w:spacing w:after="160" w:line="278" w:lineRule="auto"/>
               <w:jc w:val="both"/>
+              <w:rPr>
+                <w:rFonts w:ascii="Times New Roman" w:hAnsi="Times New Roman" w:cs="Times New Roman"/>
+              </w:rPr>
             </w:pPr>
             <w:r>
               <w:rPr>
+                <w:rFonts w:ascii="Times New Roman" w:hAnsi="Times New Roman" w:cs="Times New Roman"/>
                 <w:b/>
                 <w:bCs/>
               </w:rPr>
@@ -149,9 +180,13 @@
             <w:pPr>
               <w:spacing w:after="160" w:line="278" w:lineRule="auto"/>
               <w:jc w:val="both"/>
+              <w:rPr>
+                <w:rFonts w:ascii="Times New Roman" w:hAnsi="Times New Roman" w:cs="Times New Roman"/>
+              </w:rPr>
             </w:pPr>
             <w:r>
               <w:rPr>
+                <w:rFonts w:ascii="Times New Roman" w:hAnsi="Times New Roman" w:cs="Times New Roman"/>
                 <w:b/>
                 <w:bCs/>
               </w:rPr>
@@ -169,12 +204,14 @@
               <w:spacing w:after="160" w:line="278" w:lineRule="auto"/>
               <w:jc w:val="both"/>
               <w:rPr>
+                <w:rFonts w:ascii="Times New Roman" w:hAnsi="Times New Roman" w:cs="Times New Roman"/>
                 <w:b/>
                 <w:bCs/>
               </w:rPr>
             </w:pPr>
             <w:r>
               <w:rPr>
+                <w:rFonts w:ascii="Times New Roman" w:hAnsi="Times New Roman" w:cs="Times New Roman"/>
                 <w:b/>
                 <w:bCs/>
               </w:rPr>
@@ -193,9 +230,13 @@
             <w:pPr>
               <w:spacing w:after="160" w:line="278" w:lineRule="auto"/>
               <w:jc w:val="both"/>
+              <w:rPr>
+                <w:rFonts w:ascii="Times New Roman" w:hAnsi="Times New Roman" w:cs="Times New Roman"/>
+              </w:rPr>
             </w:pPr>
             <w:r>
               <w:rPr>
+                <w:rFonts w:ascii="Times New Roman" w:hAnsi="Times New Roman" w:cs="Times New Roman"/>
                 <w:b/>
                 <w:bCs/>
               </w:rPr>
@@ -204,6 +245,7 @@
             <w:proofErr w:type="spellStart"/>
             <w:r>
               <w:rPr>
+                <w:rFonts w:ascii="Times New Roman" w:hAnsi="Times New Roman" w:cs="Times New Roman"/>
                 <w:b/>
                 <w:bCs/>
               </w:rPr>
@@ -211,6 +253,7 @@
             </w:r>
             <w:r>
               <w:rPr>
+                <w:rFonts w:ascii="Times New Roman" w:hAnsi="Times New Roman" w:cs="Times New Roman"/>
                 <w:b/>
                 <w:bCs/>
               </w:rPr>
@@ -218,6 +261,7 @@
             </w:r>
             <w:r>
               <w:rPr>
+                <w:rFonts w:ascii="Times New Roman" w:hAnsi="Times New Roman" w:cs="Times New Roman"/>
                 <w:b/>
                 <w:bCs/>
               </w:rPr>
@@ -225,6 +269,7 @@
             </w:r>
             <w:r>
               <w:rPr>
+                <w:rFonts w:ascii="Times New Roman" w:hAnsi="Times New Roman" w:cs="Times New Roman"/>
                 <w:b/>
                 <w:bCs/>
               </w:rPr>
@@ -232,6 +277,7 @@
             </w:r>
             <w:r>
               <w:rPr>
+                <w:rFonts w:ascii="Times New Roman" w:hAnsi="Times New Roman" w:cs="Times New Roman"/>
                 <w:b/>
                 <w:bCs/>
               </w:rPr>
@@ -248,14 +294,26 @@
           <w:p>
             <w:pPr>
               <w:jc w:val="both"/>
+              <w:rPr>
+                <w:rFonts w:ascii="Times New Roman" w:hAnsi="Times New Roman" w:cs="Times New Roman"/>
+              </w:rPr>
             </w:pPr>
             <w:r>
+              <w:rPr>
+                <w:rFonts w:ascii="Times New Roman" w:hAnsi="Times New Roman" w:cs="Times New Roman"/>
+              </w:rPr>
               <w:t>[</w:t>
             </w:r>
             <w:r>
+              <w:rPr>
+                <w:rFonts w:ascii="Times New Roman" w:hAnsi="Times New Roman" w:cs="Times New Roman"/>
+              </w:rPr>
               <w:t>117325</w:t>
             </w:r>
             <w:r>
+              <w:rPr>
+                <w:rFonts w:ascii="Times New Roman" w:hAnsi="Times New Roman" w:cs="Times New Roman"/>
+              </w:rPr>
               <w:t>]</w:t>
             </w:r>
           </w:p>
@@ -269,6 +327,9 @@
             <w:pPr>
               <w:spacing w:after="160" w:line="278" w:lineRule="auto"/>
               <w:jc w:val="both"/>
+              <w:rPr>
+                <w:rFonts w:ascii="Times New Roman" w:hAnsi="Times New Roman" w:cs="Times New Roman"/>
+              </w:rPr>
             </w:pPr>
           </w:p>
         </w:tc>
@@ -284,12 +345,14 @@
               <w:spacing w:after="160" w:line="278" w:lineRule="auto"/>
               <w:jc w:val="both"/>
               <w:rPr>
+                <w:rFonts w:ascii="Times New Roman" w:hAnsi="Times New Roman" w:cs="Times New Roman"/>
                 <w:b/>
                 <w:bCs/>
               </w:rPr>
             </w:pPr>
             <w:r>
               <w:rPr>
+                <w:rFonts w:ascii="Times New Roman" w:hAnsi="Times New Roman" w:cs="Times New Roman"/>
                 <w:b/>
                 <w:bCs/>
               </w:rPr>
@@ -306,8 +369,14 @@
             <w:pPr>
               <w:spacing w:after="160" w:line="278" w:lineRule="auto"/>
               <w:jc w:val="both"/>
+              <w:rPr>
+                <w:rFonts w:ascii="Times New Roman" w:hAnsi="Times New Roman" w:cs="Times New Roman"/>
+              </w:rPr>
             </w:pPr>
             <w:r>
+              <w:rPr>
+                <w:rFonts w:ascii="Times New Roman" w:hAnsi="Times New Roman" w:cs="Times New Roman"/>
+              </w:rPr>
               <w:t>[117279]</w:t>
             </w:r>
           </w:p>
@@ -321,6 +390,9 @@
             <w:pPr>
               <w:spacing w:after="160" w:line="278" w:lineRule="auto"/>
               <w:jc w:val="both"/>
+              <w:rPr>
+                <w:rFonts w:ascii="Times New Roman" w:hAnsi="Times New Roman" w:cs="Times New Roman"/>
+              </w:rPr>
             </w:pPr>
           </w:p>
         </w:tc>
@@ -335,9 +407,13 @@
             <w:pPr>
               <w:spacing w:after="160" w:line="278" w:lineRule="auto"/>
               <w:jc w:val="both"/>
+              <w:rPr>
+                <w:rFonts w:ascii="Times New Roman" w:hAnsi="Times New Roman" w:cs="Times New Roman"/>
+              </w:rPr>
             </w:pPr>
             <w:r>
               <w:rPr>
+                <w:rFonts w:ascii="Times New Roman" w:hAnsi="Times New Roman" w:cs="Times New Roman"/>
                 <w:b/>
                 <w:bCs/>
               </w:rPr>
@@ -354,14 +430,26 @@
             <w:pPr>
               <w:spacing w:after="160" w:line="278" w:lineRule="auto"/>
               <w:jc w:val="both"/>
+              <w:rPr>
+                <w:rFonts w:ascii="Times New Roman" w:hAnsi="Times New Roman" w:cs="Times New Roman"/>
+              </w:rPr>
             </w:pPr>
             <w:r>
+              <w:rPr>
+                <w:rFonts w:ascii="Times New Roman" w:hAnsi="Times New Roman" w:cs="Times New Roman"/>
+              </w:rPr>
               <w:t>[</w:t>
             </w:r>
             <w:r>
+              <w:rPr>
+                <w:rFonts w:ascii="Times New Roman" w:hAnsi="Times New Roman" w:cs="Times New Roman"/>
+              </w:rPr>
               <w:t>117316</w:t>
             </w:r>
             <w:r>
+              <w:rPr>
+                <w:rFonts w:ascii="Times New Roman" w:hAnsi="Times New Roman" w:cs="Times New Roman"/>
+              </w:rPr>
               <w:t>]</w:t>
             </w:r>
           </w:p>
@@ -375,6 +463,9 @@
             <w:pPr>
               <w:spacing w:after="160" w:line="278" w:lineRule="auto"/>
               <w:jc w:val="both"/>
+              <w:rPr>
+                <w:rFonts w:ascii="Times New Roman" w:hAnsi="Times New Roman" w:cs="Times New Roman"/>
+              </w:rPr>
             </w:pPr>
           </w:p>
         </w:tc>
@@ -383,6 +474,7 @@
     <w:p>
       <w:pPr>
         <w:rPr>
+          <w:rFonts w:ascii="Times New Roman" w:hAnsi="Times New Roman" w:cs="Times New Roman"/>
           <w:b/>
           <w:bCs/>
         </w:rPr>
@@ -391,6 +483,7 @@
     <w:p>
       <w:pPr>
         <w:rPr>
+          <w:rFonts w:ascii="Times New Roman" w:hAnsi="Times New Roman" w:cs="Times New Roman"/>
           <w:b/>
           <w:bCs/>
         </w:rPr>
@@ -399,6 +492,7 @@
     <w:p>
       <w:pPr>
         <w:rPr>
+          <w:rFonts w:ascii="Times New Roman" w:hAnsi="Times New Roman" w:cs="Times New Roman"/>
           <w:b/>
           <w:bCs/>
         </w:rPr>
@@ -407,6 +501,7 @@
     <w:p>
       <w:pPr>
         <w:rPr>
+          <w:rFonts w:ascii="Times New Roman" w:hAnsi="Times New Roman" w:cs="Times New Roman"/>
           <w:b/>
           <w:bCs/>
         </w:rPr>
@@ -415,6 +510,7 @@
     <w:p>
       <w:pPr>
         <w:rPr>
+          <w:rFonts w:ascii="Times New Roman" w:hAnsi="Times New Roman" w:cs="Times New Roman"/>
           <w:b/>
           <w:bCs/>
         </w:rPr>
@@ -423,6 +519,7 @@
     <w:p>
       <w:pPr>
         <w:rPr>
+          <w:rFonts w:ascii="Times New Roman" w:hAnsi="Times New Roman" w:cs="Times New Roman"/>
           <w:b/>
           <w:bCs/>
         </w:rPr>
@@ -431,6 +528,7 @@
     <w:p>
       <w:pPr>
         <w:rPr>
+          <w:rFonts w:ascii="Times New Roman" w:hAnsi="Times New Roman" w:cs="Times New Roman"/>
           <w:b/>
           <w:bCs/>
         </w:rPr>
@@ -439,6 +537,7 @@
     <w:p>
       <w:pPr>
         <w:rPr>
+          <w:rFonts w:ascii="Times New Roman" w:hAnsi="Times New Roman" w:cs="Times New Roman"/>
           <w:b/>
           <w:bCs/>
         </w:rPr>
@@ -447,6 +546,7 @@
     <w:p>
       <w:pPr>
         <w:rPr>
+          <w:rFonts w:ascii="Times New Roman" w:hAnsi="Times New Roman" w:cs="Times New Roman"/>
           <w:b/>
           <w:bCs/>
         </w:rPr>
@@ -455,6 +555,7 @@
     <w:p>
       <w:pPr>
         <w:rPr>
+          <w:rFonts w:ascii="Times New Roman" w:hAnsi="Times New Roman" w:cs="Times New Roman"/>
           <w:b/>
           <w:bCs/>
         </w:rPr>
@@ -463,6 +564,7 @@
     <w:p>
       <w:pPr>
         <w:rPr>
+          <w:rFonts w:ascii="Times New Roman" w:hAnsi="Times New Roman" w:cs="Times New Roman"/>
           <w:b/>
           <w:bCs/>
         </w:rPr>
@@ -471,6 +573,7 @@
     <w:p>
       <w:pPr>
         <w:rPr>
+          <w:rFonts w:ascii="Times New Roman" w:hAnsi="Times New Roman" w:cs="Times New Roman"/>
           <w:b/>
           <w:bCs/>
         </w:rPr>
@@ -479,6 +582,7 @@
     <w:p>
       <w:pPr>
         <w:rPr>
+          <w:rFonts w:ascii="Times New Roman" w:hAnsi="Times New Roman" w:cs="Times New Roman"/>
           <w:b/>
           <w:bCs/>
         </w:rPr>
@@ -487,6 +591,7 @@
     <w:p>
       <w:pPr>
         <w:rPr>
+          <w:rFonts w:ascii="Times New Roman" w:hAnsi="Times New Roman" w:cs="Times New Roman"/>
           <w:b/>
           <w:bCs/>
         </w:rPr>
@@ -495,6 +600,7 @@
     <w:p>
       <w:pPr>
         <w:rPr>
+          <w:rFonts w:ascii="Times New Roman" w:hAnsi="Times New Roman" w:cs="Times New Roman"/>
           <w:b/>
           <w:bCs/>
         </w:rPr>
@@ -503,6 +609,7 @@
     <w:p>
       <w:pPr>
         <w:rPr>
+          <w:rFonts w:ascii="Times New Roman" w:hAnsi="Times New Roman" w:cs="Times New Roman"/>
           <w:b/>
           <w:bCs/>
         </w:rPr>
@@ -511,6 +618,7 @@
     <w:p>
       <w:pPr>
         <w:rPr>
+          <w:rFonts w:ascii="Times New Roman" w:hAnsi="Times New Roman" w:cs="Times New Roman"/>
           <w:b/>
           <w:bCs/>
         </w:rPr>
@@ -519,6 +627,7 @@
     <w:p>
       <w:pPr>
         <w:rPr>
+          <w:rFonts w:ascii="Times New Roman" w:hAnsi="Times New Roman" w:cs="Times New Roman"/>
           <w:b/>
           <w:bCs/>
         </w:rPr>
@@ -527,60 +636,141 @@
     <w:p>
       <w:pPr>
         <w:rPr>
+          <w:rFonts w:ascii="Times New Roman" w:hAnsi="Times New Roman" w:cs="Times New Roman"/>
           <w:b/>
           <w:bCs/>
         </w:rPr>
       </w:pPr>
-      <w:r>
-        <w:rPr>
+    </w:p>
+    <w:p>
+      <w:pPr>
+        <w:jc w:val="both"/>
+        <w:rPr>
+          <w:rFonts w:ascii="Times New Roman" w:hAnsi="Times New Roman" w:cs="Times New Roman"/>
+          <w:sz w:val="28"/>
+          <w:szCs w:val="28"/>
+        </w:rPr>
+      </w:pPr>
+      <w:r>
+        <w:rPr>
+          <w:rFonts w:ascii="Times New Roman" w:hAnsi="Times New Roman" w:cs="Times New Roman"/>
+          <w:sz w:val="28"/>
+          <w:szCs w:val="28"/>
+        </w:rPr>
+        <w:lastRenderedPageBreak/>
+        <w:t xml:space="preserve">    1. Treść zadania projektowego</w:t>
+      </w:r>
+    </w:p>
+    <w:p>
+      <w:pPr>
+        <w:jc w:val="both"/>
+        <w:rPr>
+          <w:rFonts w:ascii="Times New Roman" w:hAnsi="Times New Roman" w:cs="Times New Roman"/>
+          <w:sz w:val="28"/>
+          <w:szCs w:val="28"/>
+        </w:rPr>
+      </w:pPr>
+      <w:r>
+        <w:rPr>
+          <w:rFonts w:ascii="Times New Roman" w:hAnsi="Times New Roman" w:cs="Times New Roman"/>
+          <w:sz w:val="28"/>
+          <w:szCs w:val="28"/>
+        </w:rPr>
+        <w:t xml:space="preserve">    2. Cel budowania systemu, jego zakres oraz kontekst, przewidywalne mierzalne (z podaniem konkretnych wartości i sposobów ich wyliczenia) i niemierzalne korzyści z jego wdrożenia</w:t>
+      </w:r>
+    </w:p>
+    <w:p>
+      <w:pPr>
+        <w:jc w:val="both"/>
+        <w:rPr>
+          <w:rFonts w:ascii="Times New Roman" w:hAnsi="Times New Roman" w:cs="Times New Roman"/>
+          <w:sz w:val="36"/>
+          <w:szCs w:val="36"/>
+        </w:rPr>
+      </w:pPr>
+      <w:r>
+        <w:rPr>
+          <w:rFonts w:ascii="Times New Roman" w:hAnsi="Times New Roman" w:cs="Times New Roman"/>
           <w:b/>
           <w:bCs/>
-        </w:rPr>
-        <w:lastRenderedPageBreak/>
-        <w:t>Cel budowania systemu</w:t>
-      </w:r>
-    </w:p>
-    <w:p>
-      <w:pPr>
-        <w:jc w:val="both"/>
-      </w:pPr>
-      <w:r>
-        <w:t xml:space="preserve">Głównym celem stworzenia systemu jest cyfryzacja oraz usprawnienie procesów związanych z ofertą </w:t>
-      </w:r>
-      <w:r>
-        <w:t xml:space="preserve">dużej </w:t>
-      </w:r>
-      <w:r>
-        <w:t>firmy rolniczej. Aplikacja ma za zadanie ułatwić klientom szybki dostęp do usług i maszyn, a firmie rolniczej umożliwić efektywne zarządzanie zasobami, harmonogramami pracowników oraz sprzedażą towarów rolniczych. System ma</w:t>
-      </w:r>
-      <w:r>
-        <w:t xml:space="preserve"> zminimalizować</w:t>
-      </w:r>
-      <w:r>
-        <w:t xml:space="preserve"> ryzyko błędów komunikacyjnych, zwłaszcza w zakresie dokładnej lokalizacji miejsca wykonania usługi.</w:t>
-      </w:r>
-    </w:p>
-    <w:p>
-      <w:pPr>
-        <w:jc w:val="both"/>
-        <w:rPr>
+          <w:sz w:val="36"/>
+          <w:szCs w:val="36"/>
+        </w:rPr>
+        <w:t xml:space="preserve">Piotr </w:t>
+      </w:r>
+      <w:proofErr w:type="spellStart"/>
+      <w:r>
+        <w:rPr>
+          <w:rFonts w:ascii="Times New Roman" w:hAnsi="Times New Roman" w:cs="Times New Roman"/>
           <w:b/>
           <w:bCs/>
-        </w:rPr>
-      </w:pPr>
-      <w:r>
-        <w:rPr>
+          <w:sz w:val="36"/>
+          <w:szCs w:val="36"/>
+        </w:rPr>
+        <w:t>Poletyło</w:t>
+      </w:r>
+      <w:proofErr w:type="spellEnd"/>
+    </w:p>
+    <w:p>
+      <w:pPr>
+        <w:rPr>
+          <w:rFonts w:ascii="Times New Roman" w:hAnsi="Times New Roman" w:cs="Times New Roman"/>
           <w:b/>
           <w:bCs/>
         </w:rPr>
+      </w:pPr>
+      <w:r>
+        <w:rPr>
+          <w:rFonts w:ascii="Times New Roman" w:hAnsi="Times New Roman" w:cs="Times New Roman"/>
+          <w:b/>
+          <w:bCs/>
+        </w:rPr>
+        <w:t>Cel budowania systemu</w:t>
+      </w:r>
+    </w:p>
+    <w:p>
+      <w:pPr>
+        <w:jc w:val="both"/>
+        <w:rPr>
+          <w:rFonts w:ascii="Times New Roman" w:hAnsi="Times New Roman" w:cs="Times New Roman"/>
+        </w:rPr>
+      </w:pPr>
+      <w:r>
+        <w:rPr>
+          <w:rFonts w:ascii="Times New Roman" w:hAnsi="Times New Roman" w:cs="Times New Roman"/>
+        </w:rPr>
+        <w:t>Głównym celem stworzenia systemu jest cyfryzacja oraz usprawnienie procesów związanych z ofertą dużej firmy rolniczej. Aplikacja ma za zadanie ułatwić klientom szybki dostęp do usług i maszyn, a firmie rolniczej umożliwić efektywne zarządzanie zasobami, harmonogramami pracowników oraz sprzedażą towarów rolniczych. System ma zminimalizować ryzyko błędów komunikacyjnych, zwłaszcza w zakresie dokładnej lokalizacji miejsca wykonania usługi.</w:t>
+      </w:r>
+    </w:p>
+    <w:p>
+      <w:pPr>
+        <w:jc w:val="both"/>
+        <w:rPr>
+          <w:rFonts w:ascii="Times New Roman" w:hAnsi="Times New Roman" w:cs="Times New Roman"/>
+          <w:b/>
+          <w:bCs/>
+        </w:rPr>
+      </w:pPr>
+      <w:r>
+        <w:rPr>
+          <w:rFonts w:ascii="Times New Roman" w:hAnsi="Times New Roman" w:cs="Times New Roman"/>
+          <w:b/>
+          <w:bCs/>
+        </w:rPr>
         <w:t>Zakres systemu</w:t>
       </w:r>
     </w:p>
     <w:p>
       <w:pPr>
         <w:jc w:val="both"/>
-      </w:pPr>
-      <w:r>
+        <w:rPr>
+          <w:rFonts w:ascii="Times New Roman" w:hAnsi="Times New Roman" w:cs="Times New Roman"/>
+        </w:rPr>
+      </w:pPr>
+      <w:r>
+        <w:rPr>
+          <w:rFonts w:ascii="Times New Roman" w:hAnsi="Times New Roman" w:cs="Times New Roman"/>
+        </w:rPr>
         <w:t>System obejmuje następujące główne moduły funkcjonalne:</w:t>
       </w:r>
     </w:p>
@@ -591,15 +781,22 @@
           <w:numId w:val="2"/>
         </w:numPr>
         <w:jc w:val="both"/>
-      </w:pPr>
-      <w:r>
-        <w:rPr>
+        <w:rPr>
+          <w:rFonts w:ascii="Times New Roman" w:hAnsi="Times New Roman" w:cs="Times New Roman"/>
+        </w:rPr>
+      </w:pPr>
+      <w:r>
+        <w:rPr>
+          <w:rFonts w:ascii="Times New Roman" w:hAnsi="Times New Roman" w:cs="Times New Roman"/>
           <w:b/>
           <w:bCs/>
         </w:rPr>
         <w:t>Moduł wypożyczalni maszyn rolniczych:</w:t>
       </w:r>
       <w:r>
+        <w:rPr>
+          <w:rFonts w:ascii="Times New Roman" w:hAnsi="Times New Roman" w:cs="Times New Roman"/>
+        </w:rPr>
         <w:t xml:space="preserve"> Przeglądanie katalogu dostępnych maszyn (np. ciągniki, kombajny, siewniki), sprawdzanie ich dostępności w kalendarzu oraz proces rezerwacji.</w:t>
       </w:r>
     </w:p>
@@ -610,15 +807,22 @@
           <w:numId w:val="2"/>
         </w:numPr>
         <w:jc w:val="both"/>
-      </w:pPr>
-      <w:r>
-        <w:rPr>
+        <w:rPr>
+          <w:rFonts w:ascii="Times New Roman" w:hAnsi="Times New Roman" w:cs="Times New Roman"/>
+        </w:rPr>
+      </w:pPr>
+      <w:r>
+        <w:rPr>
+          <w:rFonts w:ascii="Times New Roman" w:hAnsi="Times New Roman" w:cs="Times New Roman"/>
           <w:b/>
           <w:bCs/>
         </w:rPr>
         <w:t>Moduł zamawiania usług:</w:t>
       </w:r>
       <w:r>
+        <w:rPr>
+          <w:rFonts w:ascii="Times New Roman" w:hAnsi="Times New Roman" w:cs="Times New Roman"/>
+        </w:rPr>
         <w:t xml:space="preserve"> Możliwość zlecenia konkretnych prac polowych (np. orka, siew, zbiór).</w:t>
       </w:r>
     </w:p>
@@ -629,9 +833,13 @@
           <w:numId w:val="2"/>
         </w:numPr>
         <w:jc w:val="both"/>
-      </w:pPr>
-      <w:r>
-        <w:rPr>
+        <w:rPr>
+          <w:rFonts w:ascii="Times New Roman" w:hAnsi="Times New Roman" w:cs="Times New Roman"/>
+        </w:rPr>
+      </w:pPr>
+      <w:r>
+        <w:rPr>
+          <w:rFonts w:ascii="Times New Roman" w:hAnsi="Times New Roman" w:cs="Times New Roman"/>
           <w:b/>
           <w:bCs/>
         </w:rPr>
@@ -640,6 +848,7 @@
       <w:proofErr w:type="spellStart"/>
       <w:r>
         <w:rPr>
+          <w:rFonts w:ascii="Times New Roman" w:hAnsi="Times New Roman" w:cs="Times New Roman"/>
           <w:b/>
           <w:bCs/>
         </w:rPr>
@@ -648,12 +857,16 @@
       <w:proofErr w:type="spellEnd"/>
       <w:r>
         <w:rPr>
+          <w:rFonts w:ascii="Times New Roman" w:hAnsi="Times New Roman" w:cs="Times New Roman"/>
           <w:b/>
           <w:bCs/>
         </w:rPr>
         <w:t xml:space="preserve"> (mapy):</w:t>
       </w:r>
       <w:r>
+        <w:rPr>
+          <w:rFonts w:ascii="Times New Roman" w:hAnsi="Times New Roman" w:cs="Times New Roman"/>
+        </w:rPr>
         <w:t xml:space="preserve"> Funkcjonalność pozwalająca klientowi na precyzyjne zaznaczenie na mapie (pinezka/obszar) lokalizacji pola lub działki, na której ma zostać wykonana usługa.</w:t>
       </w:r>
     </w:p>
@@ -664,15 +877,22 @@
           <w:numId w:val="2"/>
         </w:numPr>
         <w:jc w:val="both"/>
-      </w:pPr>
-      <w:r>
-        <w:rPr>
+        <w:rPr>
+          <w:rFonts w:ascii="Times New Roman" w:hAnsi="Times New Roman" w:cs="Times New Roman"/>
+        </w:rPr>
+      </w:pPr>
+      <w:r>
+        <w:rPr>
+          <w:rFonts w:ascii="Times New Roman" w:hAnsi="Times New Roman" w:cs="Times New Roman"/>
           <w:b/>
           <w:bCs/>
         </w:rPr>
         <w:t>Moduł e-commerce (handel towarami):</w:t>
       </w:r>
       <w:r>
+        <w:rPr>
+          <w:rFonts w:ascii="Times New Roman" w:hAnsi="Times New Roman" w:cs="Times New Roman"/>
+        </w:rPr>
         <w:t xml:space="preserve"> Katalog produktów (np. nawozy, nasiona, płody rolne) z możliwością ich zakupu oraz określenia opcji dostawy lub odbioru.</w:t>
       </w:r>
     </w:p>
@@ -683,59 +903,64 @@
           <w:numId w:val="2"/>
         </w:numPr>
         <w:jc w:val="both"/>
-      </w:pPr>
-      <w:r>
-        <w:rPr>
+        <w:rPr>
+          <w:rFonts w:ascii="Times New Roman" w:hAnsi="Times New Roman" w:cs="Times New Roman"/>
+        </w:rPr>
+      </w:pPr>
+      <w:r>
+        <w:rPr>
+          <w:rFonts w:ascii="Times New Roman" w:hAnsi="Times New Roman" w:cs="Times New Roman"/>
           <w:b/>
           <w:bCs/>
         </w:rPr>
-        <w:t>Moduł zarządzania</w:t>
-      </w:r>
-      <w:r>
-        <w:rPr>
+        <w:t xml:space="preserve">Moduł zarządzania: </w:t>
+      </w:r>
+      <w:r>
+        <w:rPr>
+          <w:rFonts w:ascii="Times New Roman" w:hAnsi="Times New Roman" w:cs="Times New Roman"/>
+        </w:rPr>
+        <w:t>Panel do zarządzania zgłoszeniami, przypisywania maszyn i operatorów do zleceń, zarządzania stanami magazynowymi towarów oraz weryfikacji płatności.</w:t>
+      </w:r>
+    </w:p>
+    <w:p>
+      <w:pPr>
+        <w:ind w:left="720"/>
+        <w:jc w:val="both"/>
+        <w:rPr>
+          <w:rFonts w:ascii="Times New Roman" w:hAnsi="Times New Roman" w:cs="Times New Roman"/>
+        </w:rPr>
+      </w:pPr>
+    </w:p>
+    <w:p>
+      <w:pPr>
+        <w:jc w:val="both"/>
+        <w:rPr>
+          <w:rFonts w:ascii="Times New Roman" w:hAnsi="Times New Roman" w:cs="Times New Roman"/>
           <w:b/>
           <w:bCs/>
         </w:rPr>
-        <w:t xml:space="preserve">: </w:t>
-      </w:r>
-      <w:r>
-        <w:t>Panel do zarządzania zgłoszeniami, przypisywania maszyn i operatorów do zleceń, zarządzania stanami magazynowymi towarów oraz weryfikacji płatności.</w:t>
-      </w:r>
-    </w:p>
-    <w:p>
-      <w:pPr>
-        <w:ind w:left="720"/>
-        <w:jc w:val="both"/>
-      </w:pPr>
-    </w:p>
-    <w:p>
-      <w:pPr>
-        <w:jc w:val="both"/>
-        <w:rPr>
+      </w:pPr>
+      <w:r>
+        <w:rPr>
+          <w:rFonts w:ascii="Times New Roman" w:hAnsi="Times New Roman" w:cs="Times New Roman"/>
           <w:b/>
           <w:bCs/>
         </w:rPr>
-      </w:pPr>
-      <w:r>
-        <w:rPr>
-          <w:b/>
-          <w:bCs/>
-        </w:rPr>
         <w:t>Kontekst systemu</w:t>
       </w:r>
     </w:p>
     <w:p>
       <w:pPr>
         <w:jc w:val="both"/>
-      </w:pPr>
-      <w:r>
-        <w:t>System funkcjonuje w branży rolniczej i stanowi platformę komunikacji pomiędzy firmą usługowo-handlową a jej klientami. Aplikacja docelowo musi współpracować z zewnętrznymi systemami i interfejsami</w:t>
-      </w:r>
-      <w:r>
-        <w:t xml:space="preserve"> </w:t>
-      </w:r>
-      <w:r>
-        <w:t>takimi jak:</w:t>
+        <w:rPr>
+          <w:rFonts w:ascii="Times New Roman" w:hAnsi="Times New Roman" w:cs="Times New Roman"/>
+        </w:rPr>
+      </w:pPr>
+      <w:r>
+        <w:rPr>
+          <w:rFonts w:ascii="Times New Roman" w:hAnsi="Times New Roman" w:cs="Times New Roman"/>
+        </w:rPr>
+        <w:t>System funkcjonuje w branży rolniczej i stanowi platformę komunikacji pomiędzy firmą usługowo-handlową a jej klientami. Aplikacja docelowo musi współpracować z zewnętrznymi systemami i interfejsami takimi jak:</w:t>
       </w:r>
     </w:p>
     <w:p>
@@ -745,8 +970,14 @@
           <w:numId w:val="1"/>
         </w:numPr>
         <w:jc w:val="both"/>
-      </w:pPr>
-      <w:r>
+        <w:rPr>
+          <w:rFonts w:ascii="Times New Roman" w:hAnsi="Times New Roman" w:cs="Times New Roman"/>
+        </w:rPr>
+      </w:pPr>
+      <w:r>
+        <w:rPr>
+          <w:rFonts w:ascii="Times New Roman" w:hAnsi="Times New Roman" w:cs="Times New Roman"/>
+        </w:rPr>
         <w:t>Systemy map do obsługi modułu lokalizacji.</w:t>
       </w:r>
     </w:p>
@@ -757,8 +988,14 @@
           <w:numId w:val="1"/>
         </w:numPr>
         <w:jc w:val="both"/>
-      </w:pPr>
-      <w:r>
+        <w:rPr>
+          <w:rFonts w:ascii="Times New Roman" w:hAnsi="Times New Roman" w:cs="Times New Roman"/>
+        </w:rPr>
+      </w:pPr>
+      <w:r>
+        <w:rPr>
+          <w:rFonts w:ascii="Times New Roman" w:hAnsi="Times New Roman" w:cs="Times New Roman"/>
+        </w:rPr>
         <w:t>Bramki płatności internetowych do obsługi płatności za towary i usługi.</w:t>
       </w:r>
     </w:p>
@@ -766,36 +1003,50 @@
       <w:pPr>
         <w:ind w:left="720"/>
         <w:jc w:val="both"/>
+        <w:rPr>
+          <w:rFonts w:ascii="Times New Roman" w:hAnsi="Times New Roman" w:cs="Times New Roman"/>
+        </w:rPr>
       </w:pPr>
     </w:p>
     <w:p>
       <w:pPr>
         <w:ind w:left="720"/>
         <w:jc w:val="both"/>
+        <w:rPr>
+          <w:rFonts w:ascii="Times New Roman" w:hAnsi="Times New Roman" w:cs="Times New Roman"/>
+        </w:rPr>
       </w:pPr>
     </w:p>
     <w:p>
       <w:pPr>
         <w:ind w:left="720"/>
         <w:jc w:val="both"/>
+        <w:rPr>
+          <w:rFonts w:ascii="Times New Roman" w:hAnsi="Times New Roman" w:cs="Times New Roman"/>
+        </w:rPr>
       </w:pPr>
     </w:p>
     <w:p>
       <w:pPr>
         <w:ind w:left="720"/>
         <w:jc w:val="both"/>
-      </w:pPr>
-    </w:p>
-    <w:p>
-      <w:pPr>
-        <w:jc w:val="both"/>
-        <w:rPr>
+        <w:rPr>
+          <w:rFonts w:ascii="Times New Roman" w:hAnsi="Times New Roman" w:cs="Times New Roman"/>
+        </w:rPr>
+      </w:pPr>
+    </w:p>
+    <w:p>
+      <w:pPr>
+        <w:jc w:val="both"/>
+        <w:rPr>
+          <w:rFonts w:ascii="Times New Roman" w:hAnsi="Times New Roman" w:cs="Times New Roman"/>
           <w:b/>
           <w:bCs/>
         </w:rPr>
       </w:pPr>
       <w:r>
         <w:rPr>
+          <w:rFonts w:ascii="Times New Roman" w:hAnsi="Times New Roman" w:cs="Times New Roman"/>
           <w:b/>
           <w:bCs/>
         </w:rPr>
@@ -809,15 +1060,22 @@
           <w:numId w:val="3"/>
         </w:numPr>
         <w:jc w:val="both"/>
-      </w:pPr>
-      <w:r>
-        <w:rPr>
+        <w:rPr>
+          <w:rFonts w:ascii="Times New Roman" w:hAnsi="Times New Roman" w:cs="Times New Roman"/>
+        </w:rPr>
+      </w:pPr>
+      <w:r>
+        <w:rPr>
+          <w:rFonts w:ascii="Times New Roman" w:hAnsi="Times New Roman" w:cs="Times New Roman"/>
           <w:b/>
           <w:bCs/>
         </w:rPr>
         <w:t>Skrócenie czasu obsługi pojedynczego zlecenia</w:t>
       </w:r>
       <w:r>
+        <w:rPr>
+          <w:rFonts w:ascii="Times New Roman" w:hAnsi="Times New Roman" w:cs="Times New Roman"/>
+        </w:rPr>
         <w:t xml:space="preserve"> dzięki wyeliminowaniu konieczności telefonicznego ustalania szczegółów i ręcznego wpisywania danych.</w:t>
       </w:r>
     </w:p>
@@ -828,15 +1086,22 @@
           <w:numId w:val="3"/>
         </w:numPr>
         <w:jc w:val="both"/>
-      </w:pPr>
-      <w:r>
-        <w:rPr>
+        <w:rPr>
+          <w:rFonts w:ascii="Times New Roman" w:hAnsi="Times New Roman" w:cs="Times New Roman"/>
+        </w:rPr>
+      </w:pPr>
+      <w:r>
+        <w:rPr>
+          <w:rFonts w:ascii="Times New Roman" w:hAnsi="Times New Roman" w:cs="Times New Roman"/>
           <w:b/>
           <w:bCs/>
         </w:rPr>
         <w:t>Wzrost przychodów</w:t>
       </w:r>
       <w:r>
+        <w:rPr>
+          <w:rFonts w:ascii="Times New Roman" w:hAnsi="Times New Roman" w:cs="Times New Roman"/>
+        </w:rPr>
         <w:t xml:space="preserve"> wynikający z łatwiejszego dostępu do oferty (handel towarami online, szybka rezerwacja maszyn).</w:t>
       </w:r>
     </w:p>
@@ -847,15 +1112,22 @@
           <w:numId w:val="3"/>
         </w:numPr>
         <w:jc w:val="both"/>
-      </w:pPr>
-      <w:r>
-        <w:rPr>
+        <w:rPr>
+          <w:rFonts w:ascii="Times New Roman" w:hAnsi="Times New Roman" w:cs="Times New Roman"/>
+        </w:rPr>
+      </w:pPr>
+      <w:r>
+        <w:rPr>
+          <w:rFonts w:ascii="Times New Roman" w:hAnsi="Times New Roman" w:cs="Times New Roman"/>
           <w:b/>
           <w:bCs/>
         </w:rPr>
         <w:t xml:space="preserve">Zmniejszenie liczby pomyłek lokalizacyjnych </w:t>
       </w:r>
       <w:r>
+        <w:rPr>
+          <w:rFonts w:ascii="Times New Roman" w:hAnsi="Times New Roman" w:cs="Times New Roman"/>
+        </w:rPr>
         <w:t>dzięki wprowadzeniu precyzyjnego zaznaczania pól na mapie przez klienta.</w:t>
       </w:r>
     </w:p>
@@ -866,15 +1138,22 @@
           <w:numId w:val="3"/>
         </w:numPr>
         <w:jc w:val="both"/>
-      </w:pPr>
-      <w:r>
-        <w:rPr>
+        <w:rPr>
+          <w:rFonts w:ascii="Times New Roman" w:hAnsi="Times New Roman" w:cs="Times New Roman"/>
+        </w:rPr>
+      </w:pPr>
+      <w:r>
+        <w:rPr>
+          <w:rFonts w:ascii="Times New Roman" w:hAnsi="Times New Roman" w:cs="Times New Roman"/>
           <w:b/>
           <w:bCs/>
         </w:rPr>
         <w:t>Zmniejszenie kosztów operacyjnych</w:t>
       </w:r>
       <w:r>
+        <w:rPr>
+          <w:rFonts w:ascii="Times New Roman" w:hAnsi="Times New Roman" w:cs="Times New Roman"/>
+        </w:rPr>
         <w:t xml:space="preserve"> związanych z obsługą biurową i administracyjną.</w:t>
       </w:r>
     </w:p>
@@ -882,12 +1161,14 @@
       <w:pPr>
         <w:jc w:val="both"/>
         <w:rPr>
+          <w:rFonts w:ascii="Times New Roman" w:hAnsi="Times New Roman" w:cs="Times New Roman"/>
           <w:b/>
           <w:bCs/>
         </w:rPr>
       </w:pPr>
       <w:r>
         <w:rPr>
+          <w:rFonts w:ascii="Times New Roman" w:hAnsi="Times New Roman" w:cs="Times New Roman"/>
           <w:b/>
           <w:bCs/>
         </w:rPr>
@@ -901,15 +1182,22 @@
           <w:numId w:val="4"/>
         </w:numPr>
         <w:jc w:val="both"/>
-      </w:pPr>
-      <w:r>
-        <w:rPr>
+        <w:rPr>
+          <w:rFonts w:ascii="Times New Roman" w:hAnsi="Times New Roman" w:cs="Times New Roman"/>
+        </w:rPr>
+      </w:pPr>
+      <w:r>
+        <w:rPr>
+          <w:rFonts w:ascii="Times New Roman" w:hAnsi="Times New Roman" w:cs="Times New Roman"/>
           <w:b/>
           <w:bCs/>
         </w:rPr>
         <w:t>Budowa nowoczesnego wizerunku firmy</w:t>
       </w:r>
       <w:r>
+        <w:rPr>
+          <w:rFonts w:ascii="Times New Roman" w:hAnsi="Times New Roman" w:cs="Times New Roman"/>
+        </w:rPr>
         <w:t xml:space="preserve"> na rynku jako innowacyjnego przedsiębiorstwa wykorzystującego nowoczesne technologie w rolnictwie.</w:t>
       </w:r>
     </w:p>
@@ -920,15 +1208,22 @@
           <w:numId w:val="4"/>
         </w:numPr>
         <w:jc w:val="both"/>
-      </w:pPr>
-      <w:r>
-        <w:rPr>
+        <w:rPr>
+          <w:rFonts w:ascii="Times New Roman" w:hAnsi="Times New Roman" w:cs="Times New Roman"/>
+        </w:rPr>
+      </w:pPr>
+      <w:r>
+        <w:rPr>
+          <w:rFonts w:ascii="Times New Roman" w:hAnsi="Times New Roman" w:cs="Times New Roman"/>
           <w:b/>
           <w:bCs/>
         </w:rPr>
         <w:t>Wzrost satysfakcji i lojalności klientów</w:t>
       </w:r>
       <w:r>
+        <w:rPr>
+          <w:rFonts w:ascii="Times New Roman" w:hAnsi="Times New Roman" w:cs="Times New Roman"/>
+        </w:rPr>
         <w:t>, którzy zyskują wygodne narzędzie do zamawiania usług i towarów 24 godziny na dobę, 7 dni w tygodniu.</w:t>
       </w:r>
     </w:p>
@@ -939,15 +1234,22 @@
           <w:numId w:val="4"/>
         </w:numPr>
         <w:jc w:val="both"/>
-      </w:pPr>
-      <w:r>
-        <w:rPr>
+        <w:rPr>
+          <w:rFonts w:ascii="Times New Roman" w:hAnsi="Times New Roman" w:cs="Times New Roman"/>
+        </w:rPr>
+      </w:pPr>
+      <w:r>
+        <w:rPr>
+          <w:rFonts w:ascii="Times New Roman" w:hAnsi="Times New Roman" w:cs="Times New Roman"/>
           <w:b/>
           <w:bCs/>
         </w:rPr>
         <w:t>Poprawa komfortu pracy pracowników</w:t>
       </w:r>
       <w:r>
+        <w:rPr>
+          <w:rFonts w:ascii="Times New Roman" w:hAnsi="Times New Roman" w:cs="Times New Roman"/>
+        </w:rPr>
         <w:t xml:space="preserve"> (operatorów maszyn i kierowców), którzy otrzymują czytelne zlecenia wraz z dokładnymi współrzędnymi nawigacyjnymi.</w:t>
       </w:r>
     </w:p>
@@ -958,25 +1260,1591 @@
           <w:numId w:val="4"/>
         </w:numPr>
         <w:jc w:val="both"/>
-      </w:pPr>
-      <w:r>
-        <w:rPr>
+        <w:rPr>
+          <w:rFonts w:ascii="Times New Roman" w:hAnsi="Times New Roman" w:cs="Times New Roman"/>
+        </w:rPr>
+      </w:pPr>
+      <w:r>
+        <w:rPr>
+          <w:rFonts w:ascii="Times New Roman" w:hAnsi="Times New Roman" w:cs="Times New Roman"/>
           <w:b/>
           <w:bCs/>
         </w:rPr>
         <w:t>Zwiększenie przejrzystości procesów</w:t>
       </w:r>
       <w:r>
+        <w:rPr>
+          <w:rFonts w:ascii="Times New Roman" w:hAnsi="Times New Roman" w:cs="Times New Roman"/>
+        </w:rPr>
         <w:t xml:space="preserve"> wewnątrz firmy oraz ułatwienie procesów decyzyjnych dla zarządu na podstawie generowanych przez system statystyk i raportów.</w:t>
       </w:r>
     </w:p>
     <w:p>
       <w:pPr>
         <w:jc w:val="both"/>
-      </w:pPr>
+        <w:rPr>
+          <w:rFonts w:ascii="Times New Roman" w:hAnsi="Times New Roman" w:cs="Times New Roman"/>
+        </w:rPr>
+      </w:pPr>
+    </w:p>
+    <w:p>
+      <w:pPr>
+        <w:jc w:val="both"/>
+        <w:rPr>
+          <w:rFonts w:ascii="Times New Roman" w:hAnsi="Times New Roman" w:cs="Times New Roman"/>
+          <w:sz w:val="28"/>
+          <w:szCs w:val="28"/>
+        </w:rPr>
+      </w:pPr>
+    </w:p>
+    <w:p>
+      <w:pPr>
+        <w:jc w:val="both"/>
+        <w:rPr>
+          <w:rFonts w:ascii="Times New Roman" w:hAnsi="Times New Roman" w:cs="Times New Roman"/>
+          <w:sz w:val="28"/>
+          <w:szCs w:val="28"/>
+        </w:rPr>
+      </w:pPr>
+      <w:r>
+        <w:rPr>
+          <w:rFonts w:ascii="Times New Roman" w:hAnsi="Times New Roman" w:cs="Times New Roman"/>
+          <w:sz w:val="28"/>
+          <w:szCs w:val="28"/>
+        </w:rPr>
+        <w:t xml:space="preserve">    3. Słownik (definiujący ważne, specyficzne terminy związane z dziedziną problemu, wykorzystywane w projekcie)</w:t>
+      </w:r>
+    </w:p>
+    <w:p>
+      <w:pPr>
+        <w:jc w:val="both"/>
+        <w:rPr>
+          <w:rFonts w:ascii="Times New Roman" w:hAnsi="Times New Roman" w:cs="Times New Roman"/>
+          <w:sz w:val="28"/>
+          <w:szCs w:val="28"/>
+        </w:rPr>
+      </w:pPr>
+    </w:p>
+    <w:p>
+      <w:pPr>
+        <w:jc w:val="both"/>
+        <w:rPr>
+          <w:rFonts w:ascii="Times New Roman" w:hAnsi="Times New Roman" w:cs="Times New Roman"/>
+          <w:sz w:val="28"/>
+          <w:szCs w:val="28"/>
+        </w:rPr>
+      </w:pPr>
+    </w:p>
+    <w:p>
+      <w:pPr>
+        <w:jc w:val="both"/>
+        <w:rPr>
+          <w:rFonts w:ascii="Times New Roman" w:hAnsi="Times New Roman" w:cs="Times New Roman"/>
+        </w:rPr>
+      </w:pPr>
+    </w:p>
+    <w:p>
+      <w:pPr>
+        <w:jc w:val="both"/>
+        <w:rPr>
+          <w:rFonts w:ascii="Times New Roman" w:hAnsi="Times New Roman" w:cs="Times New Roman"/>
+        </w:rPr>
+      </w:pPr>
+    </w:p>
+    <w:p>
+      <w:pPr>
+        <w:jc w:val="both"/>
+        <w:rPr>
+          <w:rFonts w:ascii="Times New Roman" w:hAnsi="Times New Roman" w:cs="Times New Roman"/>
+        </w:rPr>
+      </w:pPr>
+    </w:p>
+    <w:p>
+      <w:pPr>
+        <w:jc w:val="both"/>
+        <w:rPr>
+          <w:rFonts w:ascii="Times New Roman" w:hAnsi="Times New Roman" w:cs="Times New Roman"/>
+        </w:rPr>
+      </w:pPr>
+    </w:p>
+    <w:p>
+      <w:pPr>
+        <w:jc w:val="both"/>
+        <w:rPr>
+          <w:rFonts w:ascii="Times New Roman" w:hAnsi="Times New Roman" w:cs="Times New Roman"/>
+          <w:b/>
+          <w:bCs/>
+          <w:sz w:val="36"/>
+          <w:szCs w:val="36"/>
+        </w:rPr>
+      </w:pPr>
+      <w:r>
+        <w:rPr>
+          <w:rFonts w:ascii="Times New Roman" w:hAnsi="Times New Roman" w:cs="Times New Roman"/>
+          <w:b/>
+          <w:bCs/>
+          <w:sz w:val="36"/>
+          <w:szCs w:val="36"/>
+        </w:rPr>
+        <w:lastRenderedPageBreak/>
+        <w:t xml:space="preserve">Piotr </w:t>
+      </w:r>
+      <w:proofErr w:type="spellStart"/>
+      <w:r>
+        <w:rPr>
+          <w:rFonts w:ascii="Times New Roman" w:hAnsi="Times New Roman" w:cs="Times New Roman"/>
+          <w:b/>
+          <w:bCs/>
+          <w:sz w:val="36"/>
+          <w:szCs w:val="36"/>
+        </w:rPr>
+        <w:t>Poletyło</w:t>
+      </w:r>
+      <w:proofErr w:type="spellEnd"/>
+      <w:r>
+        <w:rPr>
+          <w:rFonts w:ascii="Times New Roman" w:hAnsi="Times New Roman" w:cs="Times New Roman"/>
+          <w:b/>
+          <w:bCs/>
+          <w:sz w:val="36"/>
+          <w:szCs w:val="36"/>
+        </w:rPr>
+        <w:t xml:space="preserve">, </w:t>
+      </w:r>
+      <w:r>
+        <w:rPr>
+          <w:rFonts w:ascii="Times New Roman" w:hAnsi="Times New Roman" w:cs="Times New Roman"/>
+          <w:b/>
+          <w:bCs/>
+          <w:sz w:val="36"/>
+          <w:szCs w:val="36"/>
+        </w:rPr>
+        <w:t>Tymoteusz Sosnowski</w:t>
+      </w:r>
+      <w:r>
+        <w:rPr>
+          <w:rFonts w:ascii="Times New Roman" w:hAnsi="Times New Roman" w:cs="Times New Roman"/>
+          <w:b/>
+          <w:bCs/>
+          <w:sz w:val="36"/>
+          <w:szCs w:val="36"/>
+        </w:rPr>
+        <w:t>, Jeremi Miroń</w:t>
+      </w:r>
+    </w:p>
+    <w:p>
+      <w:pPr>
+        <w:jc w:val="both"/>
+        <w:rPr>
+          <w:rFonts w:ascii="Times New Roman" w:hAnsi="Times New Roman" w:cs="Times New Roman"/>
+        </w:rPr>
+      </w:pPr>
+      <w:r>
+        <w:rPr>
+          <w:rFonts w:ascii="Times New Roman" w:hAnsi="Times New Roman" w:cs="Times New Roman"/>
+          <w:noProof/>
+        </w:rPr>
+        <w:drawing>
+          <wp:inline distT="0" distB="0" distL="0" distR="0" wp14:anchorId="4719E6CC" wp14:editId="5DC18081">
+            <wp:extent cx="5760720" cy="3930015"/>
+            <wp:effectExtent l="0" t="0" r="0" b="0"/>
+            <wp:docPr id="1162085419" name="Obraz 1"/>
+            <wp:cNvGraphicFramePr>
+              <a:graphicFrameLocks xmlns:a="http://schemas.openxmlformats.org/drawingml/2006/main" noChangeAspect="1"/>
+            </wp:cNvGraphicFramePr>
+            <a:graphic xmlns:a="http://schemas.openxmlformats.org/drawingml/2006/main">
+              <a:graphicData uri="http://schemas.openxmlformats.org/drawingml/2006/picture">
+                <pic:pic xmlns:pic="http://schemas.openxmlformats.org/drawingml/2006/picture">
+                  <pic:nvPicPr>
+                    <pic:cNvPr id="1162085419" name="Obraz 1162085419"/>
+                    <pic:cNvPicPr/>
+                  </pic:nvPicPr>
+                  <pic:blipFill>
+                    <a:blip r:embed="rId11">
+                      <a:extLst>
+                        <a:ext uri="{28A0092B-C50C-407E-A947-70E740481C1C}">
+                          <a14:useLocalDpi xmlns:a14="http://schemas.microsoft.com/office/drawing/2010/main" val="0"/>
+                        </a:ext>
+                      </a:extLst>
+                    </a:blip>
+                    <a:stretch>
+                      <a:fillRect/>
+                    </a:stretch>
+                  </pic:blipFill>
+                  <pic:spPr>
+                    <a:xfrm>
+                      <a:off x="0" y="0"/>
+                      <a:ext cx="5760720" cy="3930015"/>
+                    </a:xfrm>
+                    <a:prstGeom prst="rect">
+                      <a:avLst/>
+                    </a:prstGeom>
+                  </pic:spPr>
+                </pic:pic>
+              </a:graphicData>
+            </a:graphic>
+          </wp:inline>
+        </w:drawing>
+      </w:r>
+    </w:p>
+    <w:p>
+      <w:pPr>
+        <w:jc w:val="both"/>
+        <w:rPr>
+          <w:rFonts w:ascii="Times New Roman" w:hAnsi="Times New Roman" w:cs="Times New Roman"/>
+          <w:sz w:val="28"/>
+          <w:szCs w:val="28"/>
+        </w:rPr>
+      </w:pPr>
+      <w:r>
+        <w:rPr>
+          <w:rFonts w:ascii="Times New Roman" w:hAnsi="Times New Roman" w:cs="Times New Roman"/>
+          <w:b/>
+          <w:bCs/>
+          <w:sz w:val="36"/>
+          <w:szCs w:val="36"/>
+        </w:rPr>
+        <w:t>Jeremi Miroń</w:t>
+      </w:r>
+    </w:p>
+    <w:p>
+      <w:pPr>
+        <w:jc w:val="both"/>
+        <w:rPr>
+          <w:rFonts w:ascii="Times New Roman" w:hAnsi="Times New Roman" w:cs="Times New Roman"/>
+          <w:sz w:val="28"/>
+          <w:szCs w:val="28"/>
+        </w:rPr>
+      </w:pPr>
+      <w:r>
+        <w:rPr>
+          <w:rFonts w:ascii="Times New Roman" w:hAnsi="Times New Roman" w:cs="Times New Roman"/>
+          <w:sz w:val="28"/>
+          <w:szCs w:val="28"/>
+        </w:rPr>
+        <w:t>Użytkownik - J</w:t>
+      </w:r>
+      <w:r>
+        <w:rPr>
+          <w:rFonts w:ascii="Times New Roman" w:hAnsi="Times New Roman" w:cs="Times New Roman"/>
+          <w:sz w:val="28"/>
+          <w:szCs w:val="28"/>
+        </w:rPr>
+        <w:t>est to główny aktor biznesowy</w:t>
+      </w:r>
+      <w:r>
+        <w:rPr>
+          <w:rFonts w:ascii="Times New Roman" w:hAnsi="Times New Roman" w:cs="Times New Roman"/>
+          <w:sz w:val="28"/>
+          <w:szCs w:val="28"/>
+        </w:rPr>
+        <w:t xml:space="preserve">, </w:t>
+      </w:r>
+      <w:r>
+        <w:rPr>
+          <w:rFonts w:ascii="Times New Roman" w:hAnsi="Times New Roman" w:cs="Times New Roman"/>
+          <w:sz w:val="28"/>
+          <w:szCs w:val="28"/>
+        </w:rPr>
+        <w:t>dla którego system został stworzony. Reprezentuje klienta (osobę fizyczną lub firmę) korzystającego z oferty platformy w celu zakupu towarów, rezerwacji maszyn lub zamawiania usług.</w:t>
+      </w:r>
+    </w:p>
+    <w:p>
+      <w:pPr>
+        <w:jc w:val="both"/>
+        <w:rPr>
+          <w:rFonts w:ascii="Times New Roman" w:hAnsi="Times New Roman" w:cs="Times New Roman"/>
+          <w:sz w:val="28"/>
+          <w:szCs w:val="28"/>
+        </w:rPr>
+      </w:pPr>
+      <w:r>
+        <w:rPr>
+          <w:rFonts w:ascii="Times New Roman" w:hAnsi="Times New Roman" w:cs="Times New Roman"/>
+          <w:sz w:val="28"/>
+          <w:szCs w:val="28"/>
+        </w:rPr>
+        <w:t xml:space="preserve">Wynajęty pracownik  - </w:t>
+      </w:r>
+      <w:r>
+        <w:rPr>
+          <w:rFonts w:ascii="Times New Roman" w:hAnsi="Times New Roman" w:cs="Times New Roman"/>
+          <w:sz w:val="28"/>
+          <w:szCs w:val="28"/>
+        </w:rPr>
+        <w:t>Aktor biznesowy (wewnętrzny lub zewnętrzny podwykonawca),</w:t>
+      </w:r>
+      <w:r>
+        <w:rPr>
+          <w:rFonts w:ascii="Times New Roman" w:hAnsi="Times New Roman" w:cs="Times New Roman"/>
+          <w:sz w:val="28"/>
+          <w:szCs w:val="28"/>
+        </w:rPr>
+        <w:t xml:space="preserve"> </w:t>
+      </w:r>
+      <w:r>
+        <w:rPr>
+          <w:rFonts w:ascii="Times New Roman" w:hAnsi="Times New Roman" w:cs="Times New Roman"/>
+          <w:sz w:val="28"/>
+          <w:szCs w:val="28"/>
+        </w:rPr>
+        <w:t xml:space="preserve">który odpowiada za fizyczną realizację zleceń opłaconych przez Użytkownika. Może to być zarówno kurier dostarczający towary, jak i </w:t>
+      </w:r>
+      <w:proofErr w:type="spellStart"/>
+      <w:r>
+        <w:rPr>
+          <w:rFonts w:ascii="Times New Roman" w:hAnsi="Times New Roman" w:cs="Times New Roman"/>
+          <w:sz w:val="28"/>
+          <w:szCs w:val="28"/>
+        </w:rPr>
+        <w:t>serwisant</w:t>
+      </w:r>
+      <w:proofErr w:type="spellEnd"/>
+      <w:r>
+        <w:rPr>
+          <w:rFonts w:ascii="Times New Roman" w:hAnsi="Times New Roman" w:cs="Times New Roman"/>
+          <w:sz w:val="28"/>
+          <w:szCs w:val="28"/>
+        </w:rPr>
+        <w:t>/operator realizujący dedykowaną usługę.</w:t>
+      </w:r>
+    </w:p>
+    <w:p>
+      <w:pPr>
+        <w:jc w:val="both"/>
+        <w:rPr>
+          <w:rFonts w:ascii="Times New Roman" w:hAnsi="Times New Roman" w:cs="Times New Roman"/>
+          <w:sz w:val="28"/>
+          <w:szCs w:val="28"/>
+        </w:rPr>
+      </w:pPr>
+      <w:r>
+        <w:rPr>
+          <w:rFonts w:ascii="Times New Roman" w:hAnsi="Times New Roman" w:cs="Times New Roman"/>
+          <w:sz w:val="28"/>
+          <w:szCs w:val="28"/>
+        </w:rPr>
+        <w:t xml:space="preserve">Admin - </w:t>
+      </w:r>
+      <w:r>
+        <w:rPr>
+          <w:rFonts w:ascii="Times New Roman" w:hAnsi="Times New Roman" w:cs="Times New Roman"/>
+          <w:sz w:val="28"/>
+          <w:szCs w:val="28"/>
+        </w:rPr>
+        <w:t>Aktor systemowy (wewnętrzny) o podwyższonych uprawnieniach. Odpowiada za nadzór nad prawidłowym działaniem procesów biznesowych, weryfikację danych oraz zarządzanie zasobami ludzkimi w systemie.</w:t>
+      </w:r>
+    </w:p>
+    <w:p>
+      <w:pPr>
+        <w:jc w:val="both"/>
+        <w:rPr>
+          <w:rFonts w:ascii="Times New Roman" w:hAnsi="Times New Roman" w:cs="Times New Roman"/>
+          <w:sz w:val="28"/>
+          <w:szCs w:val="28"/>
+        </w:rPr>
+      </w:pPr>
+    </w:p>
+    <w:p>
+      <w:pPr>
+        <w:jc w:val="both"/>
+        <w:rPr>
+          <w:rFonts w:ascii="Times New Roman" w:hAnsi="Times New Roman" w:cs="Times New Roman"/>
+          <w:sz w:val="28"/>
+          <w:szCs w:val="28"/>
+        </w:rPr>
+      </w:pPr>
+    </w:p>
+    <w:p>
+      <w:pPr>
+        <w:jc w:val="both"/>
+        <w:rPr>
+          <w:rFonts w:ascii="Times New Roman" w:hAnsi="Times New Roman" w:cs="Times New Roman"/>
+          <w:sz w:val="28"/>
+          <w:szCs w:val="28"/>
+        </w:rPr>
+      </w:pPr>
+    </w:p>
+    <w:p>
+      <w:pPr>
+        <w:jc w:val="both"/>
+        <w:rPr>
+          <w:rFonts w:ascii="Times New Roman" w:hAnsi="Times New Roman" w:cs="Times New Roman"/>
+          <w:sz w:val="28"/>
+          <w:szCs w:val="28"/>
+        </w:rPr>
+      </w:pPr>
+      <w:r>
+        <w:rPr>
+          <w:rFonts w:ascii="Times New Roman" w:hAnsi="Times New Roman" w:cs="Times New Roman"/>
+          <w:sz w:val="28"/>
+          <w:szCs w:val="28"/>
+        </w:rPr>
+        <w:lastRenderedPageBreak/>
+        <w:t>Opis przypadku użycia „Kupno towarów”:</w:t>
+      </w:r>
+    </w:p>
+    <w:p>
+      <w:pPr>
+        <w:jc w:val="both"/>
+        <w:rPr>
+          <w:rFonts w:ascii="Times New Roman" w:hAnsi="Times New Roman" w:cs="Times New Roman"/>
+          <w:sz w:val="28"/>
+          <w:szCs w:val="28"/>
+        </w:rPr>
+      </w:pPr>
+      <w:r>
+        <w:rPr>
+          <w:rFonts w:ascii="Times New Roman" w:hAnsi="Times New Roman" w:cs="Times New Roman"/>
+          <w:sz w:val="28"/>
+          <w:szCs w:val="28"/>
+        </w:rPr>
+        <w:t>1. Uczestniczący aktorzy</w:t>
+      </w:r>
+    </w:p>
+    <w:p>
+      <w:pPr>
+        <w:numPr>
+          <w:ilvl w:val="0"/>
+          <w:numId w:val="5"/>
+        </w:numPr>
+        <w:jc w:val="both"/>
+        <w:rPr>
+          <w:rFonts w:ascii="Times New Roman" w:hAnsi="Times New Roman" w:cs="Times New Roman"/>
+          <w:sz w:val="28"/>
+          <w:szCs w:val="28"/>
+        </w:rPr>
+      </w:pPr>
+      <w:r>
+        <w:rPr>
+          <w:rFonts w:ascii="Times New Roman" w:hAnsi="Times New Roman" w:cs="Times New Roman"/>
+          <w:sz w:val="28"/>
+          <w:szCs w:val="28"/>
+        </w:rPr>
+        <w:t>Użytkownik</w:t>
+      </w:r>
+    </w:p>
+    <w:p>
+      <w:pPr>
+        <w:jc w:val="both"/>
+        <w:rPr>
+          <w:rFonts w:ascii="Times New Roman" w:hAnsi="Times New Roman" w:cs="Times New Roman"/>
+          <w:sz w:val="28"/>
+          <w:szCs w:val="28"/>
+        </w:rPr>
+      </w:pPr>
+      <w:r>
+        <w:rPr>
+          <w:rFonts w:ascii="Times New Roman" w:hAnsi="Times New Roman" w:cs="Times New Roman"/>
+          <w:sz w:val="28"/>
+          <w:szCs w:val="28"/>
+        </w:rPr>
+        <w:t>2. Podstawowy ciąg zdarzeń</w:t>
+      </w:r>
+    </w:p>
+    <w:p>
+      <w:pPr>
+        <w:pStyle w:val="Akapitzlist"/>
+        <w:numPr>
+          <w:ilvl w:val="0"/>
+          <w:numId w:val="11"/>
+        </w:numPr>
+        <w:jc w:val="both"/>
+        <w:rPr>
+          <w:rFonts w:ascii="Times New Roman" w:hAnsi="Times New Roman" w:cs="Times New Roman"/>
+          <w:sz w:val="28"/>
+          <w:szCs w:val="28"/>
+        </w:rPr>
+      </w:pPr>
+      <w:r>
+        <w:rPr>
+          <w:rFonts w:ascii="Times New Roman" w:hAnsi="Times New Roman" w:cs="Times New Roman"/>
+          <w:sz w:val="28"/>
+          <w:szCs w:val="28"/>
+        </w:rPr>
+        <w:t>System wyświetla podsumowanie koszyka z wybranymi przez Użytkownika towarami oraz formularz danych do wysyłki i wyboru metody dostawy.</w:t>
+      </w:r>
+    </w:p>
+    <w:p>
+      <w:pPr>
+        <w:pStyle w:val="Akapitzlist"/>
+        <w:numPr>
+          <w:ilvl w:val="0"/>
+          <w:numId w:val="11"/>
+        </w:numPr>
+        <w:jc w:val="both"/>
+        <w:rPr>
+          <w:rFonts w:ascii="Times New Roman" w:hAnsi="Times New Roman" w:cs="Times New Roman"/>
+          <w:sz w:val="28"/>
+          <w:szCs w:val="28"/>
+        </w:rPr>
+      </w:pPr>
+      <w:r>
+        <w:rPr>
+          <w:rFonts w:ascii="Times New Roman" w:hAnsi="Times New Roman" w:cs="Times New Roman"/>
+          <w:sz w:val="28"/>
+          <w:szCs w:val="28"/>
+        </w:rPr>
+        <w:t>Użytkownik wprowadza dane adresowe, wybiera preferowany sposób dostawy i klika przycisk zatwierdzający zakup.</w:t>
+      </w:r>
+    </w:p>
+    <w:p>
+      <w:pPr>
+        <w:pStyle w:val="Akapitzlist"/>
+        <w:numPr>
+          <w:ilvl w:val="0"/>
+          <w:numId w:val="11"/>
+        </w:numPr>
+        <w:jc w:val="both"/>
+        <w:rPr>
+          <w:rFonts w:ascii="Times New Roman" w:hAnsi="Times New Roman" w:cs="Times New Roman"/>
+          <w:sz w:val="28"/>
+          <w:szCs w:val="28"/>
+        </w:rPr>
+      </w:pPr>
+      <w:r>
+        <w:rPr>
+          <w:rFonts w:ascii="Times New Roman" w:hAnsi="Times New Roman" w:cs="Times New Roman"/>
+          <w:sz w:val="28"/>
+          <w:szCs w:val="28"/>
+        </w:rPr>
+        <w:t xml:space="preserve">System tworzy nowe zlecenie w bazie danych i automatycznie uruchamia </w:t>
+      </w:r>
+      <w:r>
+        <w:rPr>
+          <w:rFonts w:ascii="Times New Roman" w:hAnsi="Times New Roman" w:cs="Times New Roman"/>
+          <w:sz w:val="28"/>
+          <w:szCs w:val="28"/>
+        </w:rPr>
+        <w:t>opcje płatności (przypadek użycia Opłacenie zlecenia)</w:t>
+      </w:r>
+    </w:p>
+    <w:p>
+      <w:pPr>
+        <w:pStyle w:val="Akapitzlist"/>
+        <w:numPr>
+          <w:ilvl w:val="0"/>
+          <w:numId w:val="11"/>
+        </w:numPr>
+        <w:jc w:val="both"/>
+        <w:rPr>
+          <w:rFonts w:ascii="Times New Roman" w:hAnsi="Times New Roman" w:cs="Times New Roman"/>
+          <w:sz w:val="28"/>
+          <w:szCs w:val="28"/>
+        </w:rPr>
+      </w:pPr>
+      <w:r>
+        <w:rPr>
+          <w:rFonts w:ascii="Times New Roman" w:hAnsi="Times New Roman" w:cs="Times New Roman"/>
+          <w:sz w:val="28"/>
+          <w:szCs w:val="28"/>
+        </w:rPr>
+        <w:t>Użytkownik przechodzi do bramki płatności i pomyślnie opłaca zamówienie.</w:t>
+      </w:r>
+    </w:p>
+    <w:p>
+      <w:pPr>
+        <w:pStyle w:val="Akapitzlist"/>
+        <w:numPr>
+          <w:ilvl w:val="0"/>
+          <w:numId w:val="11"/>
+        </w:numPr>
+        <w:jc w:val="both"/>
+        <w:rPr>
+          <w:rFonts w:ascii="Times New Roman" w:hAnsi="Times New Roman" w:cs="Times New Roman"/>
+          <w:sz w:val="28"/>
+          <w:szCs w:val="28"/>
+        </w:rPr>
+      </w:pPr>
+      <w:r>
+        <w:rPr>
+          <w:rFonts w:ascii="Times New Roman" w:hAnsi="Times New Roman" w:cs="Times New Roman"/>
+          <w:sz w:val="28"/>
+          <w:szCs w:val="28"/>
+        </w:rPr>
+        <w:t>System rejestruje wpłatę, zmienia status zlecenia na „Opłacone / Do realizacji” i rezerwuje towary w magazynie.</w:t>
+      </w:r>
+    </w:p>
+    <w:p>
+      <w:pPr>
+        <w:pStyle w:val="Akapitzlist"/>
+        <w:numPr>
+          <w:ilvl w:val="0"/>
+          <w:numId w:val="11"/>
+        </w:numPr>
+        <w:jc w:val="both"/>
+        <w:rPr>
+          <w:rFonts w:ascii="Times New Roman" w:hAnsi="Times New Roman" w:cs="Times New Roman"/>
+          <w:sz w:val="28"/>
+          <w:szCs w:val="28"/>
+        </w:rPr>
+      </w:pPr>
+      <w:r>
+        <w:rPr>
+          <w:rFonts w:ascii="Times New Roman" w:hAnsi="Times New Roman" w:cs="Times New Roman"/>
+          <w:sz w:val="28"/>
+          <w:szCs w:val="28"/>
+        </w:rPr>
+        <w:t>System informuje o dokonaniu pomyślnego zakupu, wyświetlając odpowiedni komunikat na ekranie oraz wysyła potwierdzenie na adres e-mail Użytkownika.</w:t>
+      </w:r>
+    </w:p>
+    <w:p>
+      <w:pPr>
+        <w:jc w:val="both"/>
+        <w:rPr>
+          <w:rFonts w:ascii="Times New Roman" w:hAnsi="Times New Roman" w:cs="Times New Roman"/>
+          <w:sz w:val="28"/>
+          <w:szCs w:val="28"/>
+        </w:rPr>
+      </w:pPr>
+      <w:r>
+        <w:rPr>
+          <w:rFonts w:ascii="Times New Roman" w:hAnsi="Times New Roman" w:cs="Times New Roman"/>
+          <w:sz w:val="28"/>
+          <w:szCs w:val="28"/>
+        </w:rPr>
+        <w:t>3. Alternatywne ciągi zdarzeń</w:t>
+      </w:r>
+    </w:p>
+    <w:p>
+      <w:pPr>
+        <w:pStyle w:val="Akapitzlist"/>
+        <w:numPr>
+          <w:ilvl w:val="1"/>
+          <w:numId w:val="12"/>
+        </w:numPr>
+        <w:jc w:val="both"/>
+        <w:rPr>
+          <w:rFonts w:ascii="Times New Roman" w:hAnsi="Times New Roman" w:cs="Times New Roman"/>
+          <w:sz w:val="28"/>
+          <w:szCs w:val="28"/>
+        </w:rPr>
+      </w:pPr>
+      <w:r>
+        <w:rPr>
+          <w:rFonts w:ascii="Times New Roman" w:hAnsi="Times New Roman" w:cs="Times New Roman"/>
+          <w:sz w:val="28"/>
+          <w:szCs w:val="28"/>
+        </w:rPr>
+        <w:t>System stwierdza niekompletność danych lub brak towaru w magazynie</w:t>
+      </w:r>
+    </w:p>
+    <w:p>
+      <w:pPr>
+        <w:pStyle w:val="Akapitzlist"/>
+        <w:numPr>
+          <w:ilvl w:val="1"/>
+          <w:numId w:val="12"/>
+        </w:numPr>
+        <w:jc w:val="both"/>
+        <w:rPr>
+          <w:rFonts w:ascii="Times New Roman" w:hAnsi="Times New Roman" w:cs="Times New Roman"/>
+          <w:sz w:val="28"/>
+          <w:szCs w:val="28"/>
+        </w:rPr>
+      </w:pPr>
+      <w:r>
+        <w:rPr>
+          <w:rFonts w:ascii="Times New Roman" w:hAnsi="Times New Roman" w:cs="Times New Roman"/>
+          <w:sz w:val="28"/>
+          <w:szCs w:val="28"/>
+        </w:rPr>
+        <w:t>System przerywa proces i wyświetla formularz z zaznaczonymi polami, w których stwierdzono błędy (lub wyświetla informację o wyprzedaniu towaru w międzyczasie).</w:t>
+      </w:r>
+    </w:p>
+    <w:p>
+      <w:pPr>
+        <w:pStyle w:val="Akapitzlist"/>
+        <w:numPr>
+          <w:ilvl w:val="1"/>
+          <w:numId w:val="12"/>
+        </w:numPr>
+        <w:jc w:val="both"/>
+        <w:rPr>
+          <w:rFonts w:ascii="Times New Roman" w:hAnsi="Times New Roman" w:cs="Times New Roman"/>
+          <w:sz w:val="28"/>
+          <w:szCs w:val="28"/>
+        </w:rPr>
+      </w:pPr>
+      <w:r>
+        <w:rPr>
+          <w:rFonts w:ascii="Times New Roman" w:hAnsi="Times New Roman" w:cs="Times New Roman"/>
+          <w:sz w:val="28"/>
+          <w:szCs w:val="28"/>
+        </w:rPr>
+        <w:t>Użytkownik ma możliwość</w:t>
+      </w:r>
+      <w:r>
+        <w:rPr>
+          <w:rFonts w:ascii="Times New Roman" w:hAnsi="Times New Roman" w:cs="Times New Roman"/>
+          <w:sz w:val="28"/>
+          <w:szCs w:val="28"/>
+        </w:rPr>
+        <w:t xml:space="preserve"> poprawienia danych lub modyfikacji zawartości koszyka.</w:t>
+      </w:r>
+    </w:p>
+    <w:p>
+      <w:pPr>
+        <w:jc w:val="both"/>
+        <w:rPr>
+          <w:rFonts w:ascii="Times New Roman" w:hAnsi="Times New Roman" w:cs="Times New Roman"/>
+          <w:sz w:val="28"/>
+          <w:szCs w:val="28"/>
+        </w:rPr>
+      </w:pPr>
+      <w:r>
+        <w:rPr>
+          <w:rFonts w:ascii="Times New Roman" w:hAnsi="Times New Roman" w:cs="Times New Roman"/>
+          <w:sz w:val="28"/>
+          <w:szCs w:val="28"/>
+        </w:rPr>
+        <w:t>4. Zależności czasowe</w:t>
+      </w:r>
+    </w:p>
+    <w:p>
+      <w:pPr>
+        <w:numPr>
+          <w:ilvl w:val="0"/>
+          <w:numId w:val="16"/>
+        </w:numPr>
+        <w:jc w:val="both"/>
+        <w:rPr>
+          <w:rFonts w:ascii="Times New Roman" w:hAnsi="Times New Roman" w:cs="Times New Roman"/>
+          <w:sz w:val="28"/>
+          <w:szCs w:val="28"/>
+        </w:rPr>
+      </w:pPr>
+      <w:r>
+        <w:rPr>
+          <w:rFonts w:ascii="Times New Roman" w:hAnsi="Times New Roman" w:cs="Times New Roman"/>
+          <w:sz w:val="28"/>
+          <w:szCs w:val="28"/>
+        </w:rPr>
+        <w:t>a) częstotliwość wykonania: ~15–40 razy dziennie (w zależności od ruchu na platformie)</w:t>
+      </w:r>
+    </w:p>
+    <w:p>
+      <w:pPr>
+        <w:numPr>
+          <w:ilvl w:val="0"/>
+          <w:numId w:val="16"/>
+        </w:numPr>
+        <w:jc w:val="both"/>
+        <w:rPr>
+          <w:rFonts w:ascii="Times New Roman" w:hAnsi="Times New Roman" w:cs="Times New Roman"/>
+          <w:sz w:val="28"/>
+          <w:szCs w:val="28"/>
+        </w:rPr>
+      </w:pPr>
+      <w:r>
+        <w:rPr>
+          <w:rFonts w:ascii="Times New Roman" w:hAnsi="Times New Roman" w:cs="Times New Roman"/>
+          <w:sz w:val="28"/>
+          <w:szCs w:val="28"/>
+        </w:rPr>
+        <w:t xml:space="preserve">b) przewidywane spiętrzenia: okres przedświąteczny, godziny wieczorne (18:00–22:00), akcje promocyjne (np. Black </w:t>
+      </w:r>
+      <w:proofErr w:type="spellStart"/>
+      <w:r>
+        <w:rPr>
+          <w:rFonts w:ascii="Times New Roman" w:hAnsi="Times New Roman" w:cs="Times New Roman"/>
+          <w:sz w:val="28"/>
+          <w:szCs w:val="28"/>
+        </w:rPr>
+        <w:t>Friday</w:t>
+      </w:r>
+      <w:proofErr w:type="spellEnd"/>
+      <w:r>
+        <w:rPr>
+          <w:rFonts w:ascii="Times New Roman" w:hAnsi="Times New Roman" w:cs="Times New Roman"/>
+          <w:sz w:val="28"/>
+          <w:szCs w:val="28"/>
+        </w:rPr>
+        <w:t>)</w:t>
+      </w:r>
+    </w:p>
+    <w:p>
+      <w:pPr>
+        <w:numPr>
+          <w:ilvl w:val="0"/>
+          <w:numId w:val="16"/>
+        </w:numPr>
+        <w:jc w:val="both"/>
+        <w:rPr>
+          <w:rFonts w:ascii="Times New Roman" w:hAnsi="Times New Roman" w:cs="Times New Roman"/>
+          <w:sz w:val="28"/>
+          <w:szCs w:val="28"/>
+        </w:rPr>
+      </w:pPr>
+      <w:r>
+        <w:rPr>
+          <w:rFonts w:ascii="Times New Roman" w:hAnsi="Times New Roman" w:cs="Times New Roman"/>
+          <w:sz w:val="28"/>
+          <w:szCs w:val="28"/>
+        </w:rPr>
+        <w:t>c) typowy czas realizacji: ~2–3 minuty</w:t>
+      </w:r>
+    </w:p>
+    <w:p>
+      <w:pPr>
+        <w:numPr>
+          <w:ilvl w:val="0"/>
+          <w:numId w:val="16"/>
+        </w:numPr>
+        <w:jc w:val="both"/>
+        <w:rPr>
+          <w:rFonts w:ascii="Times New Roman" w:hAnsi="Times New Roman" w:cs="Times New Roman"/>
+          <w:sz w:val="28"/>
+          <w:szCs w:val="28"/>
+        </w:rPr>
+      </w:pPr>
+      <w:r>
+        <w:rPr>
+          <w:rFonts w:ascii="Times New Roman" w:hAnsi="Times New Roman" w:cs="Times New Roman"/>
+          <w:sz w:val="28"/>
+          <w:szCs w:val="28"/>
+        </w:rPr>
+        <w:lastRenderedPageBreak/>
+        <w:t>d) maksymalny czas realizacji: 15 minut (</w:t>
+      </w:r>
+      <w:r>
+        <w:rPr>
+          <w:rFonts w:ascii="Times New Roman" w:hAnsi="Times New Roman" w:cs="Times New Roman"/>
+          <w:sz w:val="28"/>
+          <w:szCs w:val="28"/>
+        </w:rPr>
+        <w:t>odgórny limit przy bramce płatności</w:t>
+      </w:r>
+      <w:r>
+        <w:rPr>
+          <w:rFonts w:ascii="Times New Roman" w:hAnsi="Times New Roman" w:cs="Times New Roman"/>
+          <w:sz w:val="28"/>
+          <w:szCs w:val="28"/>
+        </w:rPr>
+        <w:t>)</w:t>
+      </w:r>
+    </w:p>
+    <w:p>
+      <w:pPr>
+        <w:spacing w:before="100" w:beforeAutospacing="1" w:after="100" w:afterAutospacing="1" w:line="240" w:lineRule="auto"/>
+        <w:outlineLvl w:val="3"/>
+        <w:rPr>
+          <w:rFonts w:ascii="Times New Roman" w:eastAsia="Times New Roman" w:hAnsi="Times New Roman" w:cs="Times New Roman"/>
+          <w:kern w:val="0"/>
+          <w:sz w:val="28"/>
+          <w:szCs w:val="28"/>
+          <w:lang w:eastAsia="pl-PL"/>
+          <w14:ligatures w14:val="none"/>
+        </w:rPr>
+      </w:pPr>
+      <w:r>
+        <w:rPr>
+          <w:rFonts w:ascii="Times New Roman" w:eastAsia="Times New Roman" w:hAnsi="Times New Roman" w:cs="Times New Roman"/>
+          <w:kern w:val="0"/>
+          <w:sz w:val="28"/>
+          <w:szCs w:val="28"/>
+          <w:lang w:eastAsia="pl-PL"/>
+          <w14:ligatures w14:val="none"/>
+        </w:rPr>
+        <w:t>5. Wartości uzyskiwane przez aktorów po zakończeniu przypadku użycia</w:t>
+      </w:r>
+    </w:p>
+    <w:p>
+      <w:pPr>
+        <w:numPr>
+          <w:ilvl w:val="0"/>
+          <w:numId w:val="17"/>
+        </w:numPr>
+        <w:spacing w:before="100" w:beforeAutospacing="1" w:after="100" w:afterAutospacing="1" w:line="240" w:lineRule="auto"/>
+        <w:rPr>
+          <w:rFonts w:ascii="Times New Roman" w:eastAsia="Times New Roman" w:hAnsi="Times New Roman" w:cs="Times New Roman"/>
+          <w:kern w:val="0"/>
+          <w:sz w:val="28"/>
+          <w:szCs w:val="28"/>
+          <w:lang w:eastAsia="pl-PL"/>
+          <w14:ligatures w14:val="none"/>
+        </w:rPr>
+      </w:pPr>
+      <w:r>
+        <w:rPr>
+          <w:rFonts w:ascii="Times New Roman" w:eastAsia="Times New Roman" w:hAnsi="Times New Roman" w:cs="Times New Roman"/>
+          <w:kern w:val="0"/>
+          <w:sz w:val="28"/>
+          <w:szCs w:val="28"/>
+          <w:lang w:eastAsia="pl-PL"/>
+          <w14:ligatures w14:val="none"/>
+        </w:rPr>
+        <w:t>Komunikat na ekranie oraz e-mailowe potwierdzenie zakupu wraz z numerem zamówienia.</w:t>
+      </w:r>
+    </w:p>
+    <w:p>
+      <w:pPr>
+        <w:numPr>
+          <w:ilvl w:val="0"/>
+          <w:numId w:val="17"/>
+        </w:numPr>
+        <w:spacing w:before="100" w:beforeAutospacing="1" w:after="100" w:afterAutospacing="1" w:line="240" w:lineRule="auto"/>
+        <w:rPr>
+          <w:rFonts w:ascii="Times New Roman" w:eastAsia="Times New Roman" w:hAnsi="Times New Roman" w:cs="Times New Roman"/>
+          <w:kern w:val="0"/>
+          <w:sz w:val="28"/>
+          <w:szCs w:val="28"/>
+          <w:lang w:eastAsia="pl-PL"/>
+          <w14:ligatures w14:val="none"/>
+        </w:rPr>
+      </w:pPr>
+      <w:r>
+        <w:rPr>
+          <w:rFonts w:ascii="Times New Roman" w:eastAsia="Times New Roman" w:hAnsi="Times New Roman" w:cs="Times New Roman"/>
+          <w:kern w:val="0"/>
+          <w:sz w:val="28"/>
+          <w:szCs w:val="28"/>
+          <w:lang w:eastAsia="pl-PL"/>
+          <w14:ligatures w14:val="none"/>
+        </w:rPr>
+        <w:t>Nowy wpis w rejestrze zleceń ze statusem „Opłacone”, który staje się widoczny dla Admina oraz Wynajętego pracownika w celu dalszej realizacji.</w:t>
+      </w:r>
+    </w:p>
+    <w:p>
+      <w:pPr>
+        <w:jc w:val="both"/>
+        <w:rPr>
+          <w:rFonts w:ascii="Times New Roman" w:hAnsi="Times New Roman" w:cs="Times New Roman"/>
+          <w:sz w:val="28"/>
+          <w:szCs w:val="28"/>
+        </w:rPr>
+      </w:pPr>
+    </w:p>
+    <w:p>
+      <w:pPr>
+        <w:jc w:val="both"/>
+        <w:rPr>
+          <w:rFonts w:ascii="Times New Roman" w:hAnsi="Times New Roman" w:cs="Times New Roman"/>
+          <w:sz w:val="28"/>
+          <w:szCs w:val="28"/>
+        </w:rPr>
+      </w:pPr>
+      <w:r>
+        <w:rPr>
+          <w:rFonts w:ascii="Times New Roman" w:hAnsi="Times New Roman" w:cs="Times New Roman"/>
+          <w:sz w:val="28"/>
+          <w:szCs w:val="28"/>
+        </w:rPr>
+        <w:t xml:space="preserve">        4.2. Diagramy czynności (3 przykładowe diagramy)</w:t>
+      </w:r>
+    </w:p>
+    <w:p>
+      <w:pPr>
+        <w:jc w:val="both"/>
+        <w:rPr>
+          <w:rFonts w:ascii="Times New Roman" w:hAnsi="Times New Roman" w:cs="Times New Roman"/>
+          <w:sz w:val="28"/>
+          <w:szCs w:val="28"/>
+        </w:rPr>
+      </w:pPr>
+      <w:r>
+        <w:rPr>
+          <w:rFonts w:ascii="Times New Roman" w:hAnsi="Times New Roman" w:cs="Times New Roman"/>
+          <w:sz w:val="28"/>
+          <w:szCs w:val="28"/>
+        </w:rPr>
+        <w:t xml:space="preserve">        4.3. Diagramy interakcji (przebiegu) z opisem tekstowym komunikatów (3 przykładowe diagramy)</w:t>
+      </w:r>
+    </w:p>
+    <w:p>
+      <w:pPr>
+        <w:jc w:val="both"/>
+        <w:rPr>
+          <w:rFonts w:ascii="Times New Roman" w:hAnsi="Times New Roman" w:cs="Times New Roman"/>
+          <w:sz w:val="28"/>
+          <w:szCs w:val="28"/>
+        </w:rPr>
+      </w:pPr>
+      <w:r>
+        <w:rPr>
+          <w:rFonts w:ascii="Times New Roman" w:hAnsi="Times New Roman" w:cs="Times New Roman"/>
+          <w:sz w:val="28"/>
+          <w:szCs w:val="28"/>
+        </w:rPr>
+        <w:t xml:space="preserve">    5. Perspektywa projektowa:</w:t>
+      </w:r>
+    </w:p>
+    <w:p>
+      <w:pPr>
+        <w:jc w:val="both"/>
+        <w:rPr>
+          <w:rFonts w:ascii="Times New Roman" w:hAnsi="Times New Roman" w:cs="Times New Roman"/>
+          <w:sz w:val="28"/>
+          <w:szCs w:val="28"/>
+        </w:rPr>
+      </w:pPr>
+      <w:r>
+        <w:rPr>
+          <w:rFonts w:ascii="Times New Roman" w:hAnsi="Times New Roman" w:cs="Times New Roman"/>
+          <w:sz w:val="28"/>
+          <w:szCs w:val="28"/>
+        </w:rPr>
+        <w:t xml:space="preserve">        5.0. Proponowana architektura systemu (np. w postaci diagramu pakietów/komponentów) wraz z opisem</w:t>
+      </w:r>
+    </w:p>
+    <w:p>
+      <w:pPr>
+        <w:jc w:val="both"/>
+        <w:rPr>
+          <w:rFonts w:ascii="Times New Roman" w:hAnsi="Times New Roman" w:cs="Times New Roman"/>
+          <w:sz w:val="28"/>
+          <w:szCs w:val="28"/>
+          <w:highlight w:val="green"/>
+        </w:rPr>
+      </w:pPr>
+      <w:r>
+        <w:rPr>
+          <w:rFonts w:ascii="Times New Roman" w:hAnsi="Times New Roman" w:cs="Times New Roman"/>
+          <w:sz w:val="28"/>
+          <w:szCs w:val="28"/>
+        </w:rPr>
+        <w:t xml:space="preserve">        </w:t>
+      </w:r>
+      <w:r>
+        <w:rPr>
+          <w:rFonts w:ascii="Times New Roman" w:hAnsi="Times New Roman" w:cs="Times New Roman"/>
+          <w:sz w:val="28"/>
+          <w:szCs w:val="28"/>
+          <w:highlight w:val="green"/>
+        </w:rPr>
+        <w:t>5.1. Diagram(-y) klas</w:t>
+      </w:r>
+    </w:p>
+    <w:p>
+      <w:pPr>
+        <w:jc w:val="both"/>
+        <w:rPr>
+          <w:rFonts w:ascii="Times New Roman" w:hAnsi="Times New Roman" w:cs="Times New Roman"/>
+          <w:sz w:val="28"/>
+          <w:szCs w:val="28"/>
+          <w:highlight w:val="green"/>
+        </w:rPr>
+      </w:pPr>
+      <w:r>
+        <w:rPr>
+          <w:rFonts w:ascii="Times New Roman" w:hAnsi="Times New Roman" w:cs="Times New Roman"/>
+          <w:sz w:val="28"/>
+          <w:szCs w:val="28"/>
+          <w:highlight w:val="green"/>
+        </w:rPr>
+        <w:t xml:space="preserve">        5.2. Uporządkowany alfabetycznie wykaz wszystkich klas, zawierający:</w:t>
+      </w:r>
+    </w:p>
+    <w:p>
+      <w:pPr>
+        <w:jc w:val="both"/>
+        <w:rPr>
+          <w:rFonts w:ascii="Times New Roman" w:hAnsi="Times New Roman" w:cs="Times New Roman"/>
+          <w:sz w:val="28"/>
+          <w:szCs w:val="28"/>
+          <w:highlight w:val="green"/>
+        </w:rPr>
+      </w:pPr>
+      <w:r>
+        <w:rPr>
+          <w:rFonts w:ascii="Times New Roman" w:hAnsi="Times New Roman" w:cs="Times New Roman"/>
+          <w:sz w:val="28"/>
+          <w:szCs w:val="28"/>
+          <w:highlight w:val="green"/>
+        </w:rPr>
+        <w:t xml:space="preserve">                - krótki opis tekstowy</w:t>
+      </w:r>
+    </w:p>
+    <w:p>
+      <w:pPr>
+        <w:jc w:val="both"/>
+        <w:rPr>
+          <w:rFonts w:ascii="Times New Roman" w:hAnsi="Times New Roman" w:cs="Times New Roman"/>
+          <w:sz w:val="28"/>
+          <w:szCs w:val="28"/>
+        </w:rPr>
+      </w:pPr>
+      <w:r>
+        <w:rPr>
+          <w:rFonts w:ascii="Times New Roman" w:hAnsi="Times New Roman" w:cs="Times New Roman"/>
+          <w:sz w:val="28"/>
+          <w:szCs w:val="28"/>
+          <w:highlight w:val="green"/>
+        </w:rPr>
+        <w:t xml:space="preserve">                - wykaz wszystkich zidentyfikowanych atrybutów i metod (z krótkim opisem tekstowym w przypadku mniej czytelnych nazw)</w:t>
+      </w:r>
+    </w:p>
+    <w:p>
+      <w:pPr>
+        <w:jc w:val="both"/>
+        <w:rPr>
+          <w:rFonts w:ascii="Times New Roman" w:hAnsi="Times New Roman" w:cs="Times New Roman"/>
+          <w:sz w:val="28"/>
+          <w:szCs w:val="28"/>
+        </w:rPr>
+      </w:pPr>
+      <w:r>
+        <w:rPr>
+          <w:rFonts w:ascii="Times New Roman" w:hAnsi="Times New Roman" w:cs="Times New Roman"/>
+          <w:sz w:val="28"/>
+          <w:szCs w:val="28"/>
+        </w:rPr>
+        <w:t xml:space="preserve">        5.3. Diagramy stanów (3 diagramy dla wybranych klas) wraz z opisem tekstowym występującym na nich elementów</w:t>
+      </w:r>
+    </w:p>
+    <w:p>
+      <w:pPr>
+        <w:jc w:val="both"/>
+        <w:rPr>
+          <w:rFonts w:ascii="Times New Roman" w:hAnsi="Times New Roman" w:cs="Times New Roman"/>
+          <w:sz w:val="28"/>
+          <w:szCs w:val="28"/>
+        </w:rPr>
+      </w:pPr>
+      <w:r>
+        <w:rPr>
+          <w:rFonts w:ascii="Times New Roman" w:hAnsi="Times New Roman" w:cs="Times New Roman"/>
+          <w:sz w:val="28"/>
+          <w:szCs w:val="28"/>
+        </w:rPr>
+        <w:t xml:space="preserve">        5.4. Propozycje interfejsu użytkownika (okno główne, menu główne i podręczne, kluczowe formatki dialogowe, itp...)</w:t>
+      </w:r>
+    </w:p>
+    <w:p>
+      <w:pPr>
+        <w:jc w:val="both"/>
+        <w:rPr>
+          <w:rFonts w:ascii="Times New Roman" w:hAnsi="Times New Roman" w:cs="Times New Roman"/>
+          <w:sz w:val="28"/>
+          <w:szCs w:val="28"/>
+        </w:rPr>
+      </w:pPr>
+      <w:r>
+        <w:rPr>
+          <w:rFonts w:ascii="Times New Roman" w:hAnsi="Times New Roman" w:cs="Times New Roman"/>
+          <w:sz w:val="28"/>
+          <w:szCs w:val="28"/>
+        </w:rPr>
+        <w:t xml:space="preserve">    6. Wymagania niefunkcjonalne dla system, w tym m.in.:</w:t>
+      </w:r>
+    </w:p>
+    <w:p>
+      <w:pPr>
+        <w:jc w:val="both"/>
+        <w:rPr>
+          <w:rFonts w:ascii="Times New Roman" w:hAnsi="Times New Roman" w:cs="Times New Roman"/>
+          <w:sz w:val="28"/>
+          <w:szCs w:val="28"/>
+        </w:rPr>
+      </w:pPr>
+      <w:r>
+        <w:rPr>
+          <w:rFonts w:ascii="Times New Roman" w:hAnsi="Times New Roman" w:cs="Times New Roman"/>
+          <w:sz w:val="28"/>
+          <w:szCs w:val="28"/>
+        </w:rPr>
+        <w:t xml:space="preserve">        6.1. Oszacowanie wielkości bazy danych</w:t>
+      </w:r>
+    </w:p>
+    <w:p>
+      <w:pPr>
+        <w:jc w:val="both"/>
+        <w:rPr>
+          <w:rFonts w:ascii="Times New Roman" w:hAnsi="Times New Roman" w:cs="Times New Roman"/>
+          <w:sz w:val="28"/>
+          <w:szCs w:val="28"/>
+        </w:rPr>
+      </w:pPr>
+      <w:r>
+        <w:rPr>
+          <w:rFonts w:ascii="Times New Roman" w:hAnsi="Times New Roman" w:cs="Times New Roman"/>
+          <w:sz w:val="28"/>
+          <w:szCs w:val="28"/>
+        </w:rPr>
+        <w:t xml:space="preserve">        6.2. Propozycja wymaganych czasów odpowiedzi</w:t>
+      </w:r>
+    </w:p>
+    <w:p>
+      <w:pPr>
+        <w:jc w:val="both"/>
+        <w:rPr>
+          <w:rFonts w:ascii="Times New Roman" w:hAnsi="Times New Roman" w:cs="Times New Roman"/>
+          <w:sz w:val="28"/>
+          <w:szCs w:val="28"/>
+        </w:rPr>
+      </w:pPr>
+      <w:r>
+        <w:rPr>
+          <w:rFonts w:ascii="Times New Roman" w:hAnsi="Times New Roman" w:cs="Times New Roman"/>
+          <w:sz w:val="28"/>
+          <w:szCs w:val="28"/>
+        </w:rPr>
+        <w:t xml:space="preserve">        6.3. Oszacowanie liczby i typów potrzebnych stanowisk pracy użytkowników systemu </w:t>
+      </w:r>
+    </w:p>
+    <w:p>
+      <w:pPr>
+        <w:jc w:val="both"/>
+        <w:rPr>
+          <w:rFonts w:ascii="Times New Roman" w:hAnsi="Times New Roman" w:cs="Times New Roman"/>
+          <w:sz w:val="28"/>
+          <w:szCs w:val="28"/>
+        </w:rPr>
+      </w:pPr>
+      <w:r>
+        <w:rPr>
+          <w:rFonts w:ascii="Times New Roman" w:hAnsi="Times New Roman" w:cs="Times New Roman"/>
+          <w:sz w:val="28"/>
+          <w:szCs w:val="28"/>
+        </w:rPr>
+        <w:lastRenderedPageBreak/>
+        <w:t xml:space="preserve">    7. Propozycja technologii informatycznych, które mogą zostać wykorzystane do realizacji systemu (sprzęt, oprogramowanie)</w:t>
+      </w:r>
+    </w:p>
+    <w:p>
+      <w:pPr>
+        <w:jc w:val="both"/>
+        <w:rPr>
+          <w:rFonts w:ascii="Times New Roman" w:hAnsi="Times New Roman" w:cs="Times New Roman"/>
+          <w:sz w:val="28"/>
+          <w:szCs w:val="28"/>
+        </w:rPr>
+      </w:pPr>
+      <w:r>
+        <w:rPr>
+          <w:rFonts w:ascii="Times New Roman" w:hAnsi="Times New Roman" w:cs="Times New Roman"/>
+          <w:sz w:val="28"/>
+          <w:szCs w:val="28"/>
+        </w:rPr>
+        <w:t xml:space="preserve">        - diagram(-y) wdrożenia</w:t>
+      </w:r>
+    </w:p>
+    <w:p>
+      <w:pPr>
+        <w:jc w:val="both"/>
+        <w:rPr>
+          <w:rFonts w:ascii="Times New Roman" w:hAnsi="Times New Roman" w:cs="Times New Roman"/>
+          <w:sz w:val="28"/>
+          <w:szCs w:val="28"/>
+        </w:rPr>
+      </w:pPr>
+      <w:r>
+        <w:rPr>
+          <w:rFonts w:ascii="Times New Roman" w:hAnsi="Times New Roman" w:cs="Times New Roman"/>
+          <w:sz w:val="28"/>
+          <w:szCs w:val="28"/>
+        </w:rPr>
+        <w:t xml:space="preserve">    8. Propozycja planu pracy zawierająca, przynajmniej:</w:t>
+      </w:r>
+    </w:p>
+    <w:p>
+      <w:pPr>
+        <w:jc w:val="both"/>
+        <w:rPr>
+          <w:rFonts w:ascii="Times New Roman" w:hAnsi="Times New Roman" w:cs="Times New Roman"/>
+          <w:sz w:val="28"/>
+          <w:szCs w:val="28"/>
+        </w:rPr>
+      </w:pPr>
+      <w:r>
+        <w:rPr>
+          <w:rFonts w:ascii="Times New Roman" w:hAnsi="Times New Roman" w:cs="Times New Roman"/>
+          <w:sz w:val="28"/>
+          <w:szCs w:val="28"/>
+        </w:rPr>
+        <w:t xml:space="preserve">        - wyróżnione etapy (powiązane z konkretnymi częściami systemu, realizowanymi komponentami, ...)</w:t>
+      </w:r>
+    </w:p>
+    <w:p>
+      <w:pPr>
+        <w:jc w:val="both"/>
+        <w:rPr>
+          <w:rFonts w:ascii="Times New Roman" w:hAnsi="Times New Roman" w:cs="Times New Roman"/>
+          <w:sz w:val="28"/>
+          <w:szCs w:val="28"/>
+        </w:rPr>
+      </w:pPr>
+      <w:r>
+        <w:rPr>
+          <w:rFonts w:ascii="Times New Roman" w:hAnsi="Times New Roman" w:cs="Times New Roman"/>
+          <w:sz w:val="28"/>
+          <w:szCs w:val="28"/>
+        </w:rPr>
+        <w:t xml:space="preserve">          z podanym czasem trwania każdego etapu (dni robocze)</w:t>
+      </w:r>
+    </w:p>
+    <w:p>
+      <w:pPr>
+        <w:jc w:val="both"/>
+        <w:rPr>
+          <w:rFonts w:ascii="Times New Roman" w:hAnsi="Times New Roman" w:cs="Times New Roman"/>
+          <w:sz w:val="28"/>
+          <w:szCs w:val="28"/>
+        </w:rPr>
+      </w:pPr>
+      <w:r>
+        <w:rPr>
+          <w:rFonts w:ascii="Times New Roman" w:hAnsi="Times New Roman" w:cs="Times New Roman"/>
+          <w:sz w:val="28"/>
+          <w:szCs w:val="28"/>
+        </w:rPr>
+        <w:t xml:space="preserve">        - zależności pomiędzy etapami (np. co musi być zakończone przed rozpoczęciem kolejnego etapu)</w:t>
+      </w:r>
+    </w:p>
+    <w:p>
+      <w:pPr>
+        <w:jc w:val="both"/>
+        <w:rPr>
+          <w:rFonts w:ascii="Times New Roman" w:hAnsi="Times New Roman" w:cs="Times New Roman"/>
+          <w:sz w:val="28"/>
+          <w:szCs w:val="28"/>
+        </w:rPr>
+      </w:pPr>
+      <w:r>
+        <w:rPr>
+          <w:rFonts w:ascii="Times New Roman" w:hAnsi="Times New Roman" w:cs="Times New Roman"/>
+          <w:sz w:val="28"/>
+          <w:szCs w:val="28"/>
+        </w:rPr>
+        <w:t xml:space="preserve">        - alokacja zasobów ludzkich do realizacji poszczególnych etapów</w:t>
+      </w:r>
+    </w:p>
+    <w:p>
+      <w:pPr>
+        <w:jc w:val="both"/>
+        <w:rPr>
+          <w:rFonts w:ascii="Times New Roman" w:hAnsi="Times New Roman" w:cs="Times New Roman"/>
+          <w:sz w:val="28"/>
+          <w:szCs w:val="28"/>
+        </w:rPr>
+      </w:pPr>
+      <w:r>
+        <w:rPr>
+          <w:rFonts w:ascii="Times New Roman" w:hAnsi="Times New Roman" w:cs="Times New Roman"/>
+          <w:sz w:val="28"/>
+          <w:szCs w:val="28"/>
+        </w:rPr>
+        <w:t xml:space="preserve">    9. Analiza ryzyka projektu zawierająca wykaz przewidywanych zagrożeń (tylko zagrożenia specyficzne dla projektu):</w:t>
+      </w:r>
+    </w:p>
+    <w:p>
+      <w:pPr>
+        <w:jc w:val="both"/>
+        <w:rPr>
+          <w:rFonts w:ascii="Times New Roman" w:hAnsi="Times New Roman" w:cs="Times New Roman"/>
+          <w:sz w:val="28"/>
+          <w:szCs w:val="28"/>
+        </w:rPr>
+      </w:pPr>
+      <w:r>
+        <w:rPr>
+          <w:rFonts w:ascii="Times New Roman" w:hAnsi="Times New Roman" w:cs="Times New Roman"/>
+          <w:sz w:val="28"/>
+          <w:szCs w:val="28"/>
+        </w:rPr>
+        <w:t xml:space="preserve">        - prawdopodobieństwo/szansa wystąpienia (np.: znikome, średnie, duże, bardzo duże)</w:t>
+      </w:r>
+    </w:p>
+    <w:p>
+      <w:pPr>
+        <w:jc w:val="both"/>
+        <w:rPr>
+          <w:rFonts w:ascii="Times New Roman" w:hAnsi="Times New Roman" w:cs="Times New Roman"/>
+          <w:sz w:val="28"/>
+          <w:szCs w:val="28"/>
+        </w:rPr>
+      </w:pPr>
+      <w:r>
+        <w:rPr>
+          <w:rFonts w:ascii="Times New Roman" w:hAnsi="Times New Roman" w:cs="Times New Roman"/>
+          <w:sz w:val="28"/>
+          <w:szCs w:val="28"/>
+        </w:rPr>
+        <w:t xml:space="preserve">        - stopień szkodliwości w przypadku wystąpienia (np.: duży, średni, mały)</w:t>
+      </w:r>
+    </w:p>
+    <w:p>
+      <w:pPr>
+        <w:jc w:val="both"/>
+        <w:rPr>
+          <w:rFonts w:ascii="Times New Roman" w:hAnsi="Times New Roman" w:cs="Times New Roman"/>
+          <w:sz w:val="28"/>
+          <w:szCs w:val="28"/>
+        </w:rPr>
+      </w:pPr>
+      <w:r>
+        <w:rPr>
+          <w:rFonts w:ascii="Times New Roman" w:hAnsi="Times New Roman" w:cs="Times New Roman"/>
+          <w:sz w:val="28"/>
+          <w:szCs w:val="28"/>
+        </w:rPr>
+        <w:t xml:space="preserve">        - propozycje metod zapobiegania danemu zagrożeniu</w:t>
+      </w:r>
+    </w:p>
+    <w:p>
+      <w:pPr>
+        <w:jc w:val="both"/>
+        <w:rPr>
+          <w:rFonts w:ascii="Times New Roman" w:hAnsi="Times New Roman" w:cs="Times New Roman"/>
+          <w:sz w:val="28"/>
+          <w:szCs w:val="28"/>
+        </w:rPr>
+      </w:pPr>
+      <w:r>
+        <w:rPr>
+          <w:rFonts w:ascii="Times New Roman" w:hAnsi="Times New Roman" w:cs="Times New Roman"/>
+          <w:sz w:val="28"/>
+          <w:szCs w:val="28"/>
+        </w:rPr>
+        <w:t xml:space="preserve">        - plan awaryjny (sposób postępowania) w przypadku wystąpienia zagrożenia</w:t>
+      </w:r>
+    </w:p>
+    <w:p>
+      <w:pPr>
+        <w:jc w:val="both"/>
+        <w:rPr>
+          <w:rFonts w:ascii="Times New Roman" w:hAnsi="Times New Roman" w:cs="Times New Roman"/>
+          <w:sz w:val="28"/>
+          <w:szCs w:val="28"/>
+        </w:rPr>
+      </w:pPr>
+      <w:r>
+        <w:rPr>
+          <w:rFonts w:ascii="Times New Roman" w:hAnsi="Times New Roman" w:cs="Times New Roman"/>
+          <w:sz w:val="28"/>
+          <w:szCs w:val="28"/>
+        </w:rPr>
+        <w:t xml:space="preserve">  10. Kosztorys realizacji przedsięwzięcia (koszty projektu, oprogramowania, systemu, szkoleń, wdrożenia oraz konsultacji)</w:t>
+      </w:r>
+    </w:p>
+    <w:p>
+      <w:pPr>
+        <w:jc w:val="both"/>
+        <w:rPr>
+          <w:rFonts w:ascii="Times New Roman" w:hAnsi="Times New Roman" w:cs="Times New Roman"/>
+          <w:sz w:val="28"/>
+          <w:szCs w:val="28"/>
+        </w:rPr>
+      </w:pPr>
+      <w:r>
+        <w:rPr>
+          <w:rFonts w:ascii="Times New Roman" w:hAnsi="Times New Roman" w:cs="Times New Roman"/>
+          <w:sz w:val="28"/>
+          <w:szCs w:val="28"/>
+        </w:rPr>
+        <w:t xml:space="preserve">        - w rozbiciu na mniejsze jednostki (etapy, podsystemy, moduły,...)</w:t>
+      </w:r>
+    </w:p>
+    <w:p>
+      <w:pPr>
+        <w:jc w:val="both"/>
+        <w:rPr>
+          <w:rFonts w:ascii="Times New Roman" w:hAnsi="Times New Roman" w:cs="Times New Roman"/>
+          <w:sz w:val="28"/>
+          <w:szCs w:val="28"/>
+        </w:rPr>
+      </w:pPr>
+      <w:r>
+        <w:rPr>
+          <w:rFonts w:ascii="Times New Roman" w:hAnsi="Times New Roman" w:cs="Times New Roman"/>
+          <w:sz w:val="28"/>
+          <w:szCs w:val="28"/>
+        </w:rPr>
+        <w:t xml:space="preserve">        - warunki płatności, sposób odbioru</w:t>
+      </w:r>
+    </w:p>
+    <w:p>
+      <w:pPr>
+        <w:jc w:val="both"/>
+        <w:rPr>
+          <w:rFonts w:ascii="Times New Roman" w:hAnsi="Times New Roman" w:cs="Times New Roman"/>
+          <w:sz w:val="28"/>
+          <w:szCs w:val="28"/>
+        </w:rPr>
+      </w:pPr>
+      <w:r>
+        <w:rPr>
+          <w:rFonts w:ascii="Times New Roman" w:hAnsi="Times New Roman" w:cs="Times New Roman"/>
+          <w:sz w:val="28"/>
+          <w:szCs w:val="28"/>
+        </w:rPr>
+        <w:t xml:space="preserve">        - może być wariantowy </w:t>
+      </w:r>
+    </w:p>
+    <w:p>
+      <w:pPr>
+        <w:jc w:val="both"/>
+        <w:rPr>
+          <w:rFonts w:ascii="Times New Roman" w:hAnsi="Times New Roman" w:cs="Times New Roman"/>
+          <w:sz w:val="28"/>
+          <w:szCs w:val="28"/>
+        </w:rPr>
+      </w:pPr>
+      <w:r>
+        <w:rPr>
+          <w:rFonts w:ascii="Times New Roman" w:hAnsi="Times New Roman" w:cs="Times New Roman"/>
+          <w:sz w:val="28"/>
+          <w:szCs w:val="28"/>
+        </w:rPr>
+        <w:t xml:space="preserve">  Dodatek A. Przebieg (terminowość) prac zespołu</w:t>
+      </w:r>
+    </w:p>
+    <w:p>
+      <w:pPr>
+        <w:jc w:val="both"/>
+        <w:rPr>
+          <w:rFonts w:ascii="Times New Roman" w:hAnsi="Times New Roman" w:cs="Times New Roman"/>
+          <w:sz w:val="28"/>
+          <w:szCs w:val="28"/>
+        </w:rPr>
+      </w:pPr>
+      <w:r>
+        <w:rPr>
+          <w:rFonts w:ascii="Times New Roman" w:hAnsi="Times New Roman" w:cs="Times New Roman"/>
+          <w:sz w:val="28"/>
+          <w:szCs w:val="28"/>
+        </w:rPr>
+        <w:t xml:space="preserve">        - wygenerowany wykres przedstawiający historię </w:t>
+      </w:r>
+      <w:proofErr w:type="spellStart"/>
+      <w:r>
+        <w:rPr>
+          <w:rFonts w:ascii="Times New Roman" w:hAnsi="Times New Roman" w:cs="Times New Roman"/>
+          <w:sz w:val="28"/>
+          <w:szCs w:val="28"/>
+        </w:rPr>
+        <w:t>commit</w:t>
+      </w:r>
+      <w:proofErr w:type="spellEnd"/>
+      <w:r>
+        <w:rPr>
+          <w:rFonts w:ascii="Times New Roman" w:hAnsi="Times New Roman" w:cs="Times New Roman"/>
+          <w:sz w:val="28"/>
+          <w:szCs w:val="28"/>
+        </w:rPr>
+        <w:t>-ów do repozytorium autorów projektu.</w:t>
+      </w:r>
+    </w:p>
+    <w:p>
+      <w:pPr>
+        <w:jc w:val="both"/>
+        <w:rPr>
+          <w:rFonts w:ascii="Times New Roman" w:hAnsi="Times New Roman" w:cs="Times New Roman"/>
+          <w:sz w:val="28"/>
+          <w:szCs w:val="28"/>
+        </w:rPr>
+      </w:pPr>
+      <w:r>
+        <w:rPr>
+          <w:rFonts w:ascii="Times New Roman" w:hAnsi="Times New Roman" w:cs="Times New Roman"/>
+          <w:sz w:val="28"/>
+          <w:szCs w:val="28"/>
+        </w:rPr>
+        <w:t xml:space="preserve">        - struktura podkatalogów w repozytorium powinna być zgodna z terminami cząstkowymi oraz powinien istnieć oddzielny podkatalog z wersją edytowalną sprawozdania.</w:t>
+      </w:r>
     </w:p>
     <w:sectPr>
-      <w:footerReference w:type="default" r:id="rId11"/>
+      <w:footerReference w:type="default" r:id="rId12"/>
       <w:pgSz w:w="11906" w:h="16838"/>
       <w:pgMar w:top="1417" w:right="1417" w:bottom="1417" w:left="1417" w:header="708" w:footer="708" w:gutter="0"/>
       <w:cols w:space="708"/>
@@ -1049,6 +2917,155 @@
 <file path=word/numbering.xml><?xml version="1.0" encoding="utf-8"?>
 <w:numbering xmlns:wpc="http://schemas.microsoft.com/office/word/2010/wordprocessingCanvas" xmlns:cx="http://schemas.microsoft.com/office/drawing/2014/chartex" xmlns:cx1="http://schemas.microsoft.com/office/drawing/2015/9/8/chartex" xmlns:cx2="http://schemas.microsoft.com/office/drawing/2015/10/21/chartex" xmlns:cx3="http://schemas.microsoft.com/office/drawing/2016/5/9/chartex" xmlns:cx4="http://schemas.microsoft.com/office/drawing/2016/5/10/chartex" xmlns:cx5="http://schemas.microsoft.com/office/drawing/2016/5/11/chartex" xmlns:cx6="http://schemas.microsoft.com/office/drawing/2016/5/12/chartex" xmlns:cx7="http://schemas.microsoft.com/office/drawing/2016/5/13/chartex" xmlns:cx8="http://schemas.microsoft.com/office/drawing/2016/5/14/chartex" xmlns:mc="http://schemas.openxmlformats.org/markup-compatibility/2006" xmlns:aink="http://schemas.microsoft.com/office/drawing/2016/ink" xmlns:am3d="http://schemas.microsoft.com/office/drawing/2017/model3d" xmlns:o="urn:schemas-microsoft-com:office:office" xmlns:oel="http://schemas.microsoft.com/office/2019/extlst" xmlns:r="http://schemas.openxmlformats.org/officeDocument/2006/relationships" xmlns:m="http://schemas.openxmlformats.org/officeDocument/2006/math" xmlns:v="urn:schemas-microsoft-com:vml" xmlns:wp14="http://schemas.microsoft.com/office/word/2010/wordprocessingDrawing" xmlns:wp="http://schemas.openxmlformats.org/drawingml/2006/wordprocessingDrawing" xmlns:w10="urn:schemas-microsoft-com:office:word" xmlns:w="http://schemas.openxmlformats.org/wordprocessingml/2006/main" xmlns:w14="http://schemas.microsoft.com/office/word/2010/wordml" xmlns:w15="http://schemas.microsoft.com/office/word/2012/wordml" xmlns:w16cex="http://schemas.microsoft.com/office/word/2018/wordml/cex" xmlns:w16cid="http://schemas.microsoft.com/office/word/2016/wordml/cid" xmlns:w16="http://schemas.microsoft.com/office/word/2018/wordml" xmlns:w16du="http://schemas.microsoft.com/office/word/2023/wordml/word16du" xmlns:w16sdtdh="http://schemas.microsoft.com/office/word/2020/wordml/sdtdatahash" xmlns:w16sdtfl="http://schemas.microsoft.com/office/word/2024/wordml/sdtformatlock" xmlns:w16se="http://schemas.microsoft.com/office/word/2015/wordml/symex" xmlns:wpg="http://schemas.microsoft.com/office/word/2010/wordprocessingGroup" xmlns:wpi="http://schemas.microsoft.com/office/word/2010/wordprocessingInk" xmlns:wne="http://schemas.microsoft.com/office/word/2006/wordml" xmlns:wps="http://schemas.microsoft.com/office/word/2010/wordprocessingShape" mc:Ignorable="w14 w15 w16se w16cid w16 w16cex w16sdtdh w16sdtfl w16du wp14">
   <w:abstractNum w:abstractNumId="0" w15:restartNumberingAfterBreak="0">
+    <w:nsid w:val="0E963A41"/>
+    <w:multiLevelType w:val="multilevel"/>
+    <w:tmpl w:val="077C9A20"/>
+    <w:lvl w:ilvl="0">
+      <w:start w:val="1"/>
+      <w:numFmt w:val="bullet"/>
+      <w:lvlText w:val=""/>
+      <w:lvlJc w:val="left"/>
+      <w:pPr>
+        <w:tabs>
+          <w:tab w:val="num" w:pos="720"/>
+        </w:tabs>
+        <w:ind w:left="720" w:hanging="360"/>
+      </w:pPr>
+      <w:rPr>
+        <w:rFonts w:ascii="Symbol" w:hAnsi="Symbol" w:hint="default"/>
+        <w:sz w:val="20"/>
+      </w:rPr>
+    </w:lvl>
+    <w:lvl w:ilvl="1" w:tentative="1">
+      <w:start w:val="1"/>
+      <w:numFmt w:val="bullet"/>
+      <w:lvlText w:val="o"/>
+      <w:lvlJc w:val="left"/>
+      <w:pPr>
+        <w:tabs>
+          <w:tab w:val="num" w:pos="1440"/>
+        </w:tabs>
+        <w:ind w:left="1440" w:hanging="360"/>
+      </w:pPr>
+      <w:rPr>
+        <w:rFonts w:ascii="Courier New" w:hAnsi="Courier New" w:hint="default"/>
+        <w:sz w:val="20"/>
+      </w:rPr>
+    </w:lvl>
+    <w:lvl w:ilvl="2" w:tentative="1">
+      <w:start w:val="1"/>
+      <w:numFmt w:val="bullet"/>
+      <w:lvlText w:val=""/>
+      <w:lvlJc w:val="left"/>
+      <w:pPr>
+        <w:tabs>
+          <w:tab w:val="num" w:pos="2160"/>
+        </w:tabs>
+        <w:ind w:left="2160" w:hanging="360"/>
+      </w:pPr>
+      <w:rPr>
+        <w:rFonts w:ascii="Wingdings" w:hAnsi="Wingdings" w:hint="default"/>
+        <w:sz w:val="20"/>
+      </w:rPr>
+    </w:lvl>
+    <w:lvl w:ilvl="3" w:tentative="1">
+      <w:start w:val="1"/>
+      <w:numFmt w:val="bullet"/>
+      <w:lvlText w:val=""/>
+      <w:lvlJc w:val="left"/>
+      <w:pPr>
+        <w:tabs>
+          <w:tab w:val="num" w:pos="2880"/>
+        </w:tabs>
+        <w:ind w:left="2880" w:hanging="360"/>
+      </w:pPr>
+      <w:rPr>
+        <w:rFonts w:ascii="Wingdings" w:hAnsi="Wingdings" w:hint="default"/>
+        <w:sz w:val="20"/>
+      </w:rPr>
+    </w:lvl>
+    <w:lvl w:ilvl="4" w:tentative="1">
+      <w:start w:val="1"/>
+      <w:numFmt w:val="bullet"/>
+      <w:lvlText w:val=""/>
+      <w:lvlJc w:val="left"/>
+      <w:pPr>
+        <w:tabs>
+          <w:tab w:val="num" w:pos="3600"/>
+        </w:tabs>
+        <w:ind w:left="3600" w:hanging="360"/>
+      </w:pPr>
+      <w:rPr>
+        <w:rFonts w:ascii="Wingdings" w:hAnsi="Wingdings" w:hint="default"/>
+        <w:sz w:val="20"/>
+      </w:rPr>
+    </w:lvl>
+    <w:lvl w:ilvl="5" w:tentative="1">
+      <w:start w:val="1"/>
+      <w:numFmt w:val="bullet"/>
+      <w:lvlText w:val=""/>
+      <w:lvlJc w:val="left"/>
+      <w:pPr>
+        <w:tabs>
+          <w:tab w:val="num" w:pos="4320"/>
+        </w:tabs>
+        <w:ind w:left="4320" w:hanging="360"/>
+      </w:pPr>
+      <w:rPr>
+        <w:rFonts w:ascii="Wingdings" w:hAnsi="Wingdings" w:hint="default"/>
+        <w:sz w:val="20"/>
+      </w:rPr>
+    </w:lvl>
+    <w:lvl w:ilvl="6" w:tentative="1">
+      <w:start w:val="1"/>
+      <w:numFmt w:val="bullet"/>
+      <w:lvlText w:val=""/>
+      <w:lvlJc w:val="left"/>
+      <w:pPr>
+        <w:tabs>
+          <w:tab w:val="num" w:pos="5040"/>
+        </w:tabs>
+        <w:ind w:left="5040" w:hanging="360"/>
+      </w:pPr>
+      <w:rPr>
+        <w:rFonts w:ascii="Wingdings" w:hAnsi="Wingdings" w:hint="default"/>
+        <w:sz w:val="20"/>
+      </w:rPr>
+    </w:lvl>
+    <w:lvl w:ilvl="7" w:tentative="1">
+      <w:start w:val="1"/>
+      <w:numFmt w:val="bullet"/>
+      <w:lvlText w:val=""/>
+      <w:lvlJc w:val="left"/>
+      <w:pPr>
+        <w:tabs>
+          <w:tab w:val="num" w:pos="5760"/>
+        </w:tabs>
+        <w:ind w:left="5760" w:hanging="360"/>
+      </w:pPr>
+      <w:rPr>
+        <w:rFonts w:ascii="Wingdings" w:hAnsi="Wingdings" w:hint="default"/>
+        <w:sz w:val="20"/>
+      </w:rPr>
+    </w:lvl>
+    <w:lvl w:ilvl="8" w:tentative="1">
+      <w:start w:val="1"/>
+      <w:numFmt w:val="bullet"/>
+      <w:lvlText w:val=""/>
+      <w:lvlJc w:val="left"/>
+      <w:pPr>
+        <w:tabs>
+          <w:tab w:val="num" w:pos="6480"/>
+        </w:tabs>
+        <w:ind w:left="6480" w:hanging="360"/>
+      </w:pPr>
+      <w:rPr>
+        <w:rFonts w:ascii="Wingdings" w:hAnsi="Wingdings" w:hint="default"/>
+        <w:sz w:val="20"/>
+      </w:rPr>
+    </w:lvl>
+  </w:abstractNum>
+  <w:abstractNum w:abstractNumId="1" w15:restartNumberingAfterBreak="0">
     <w:nsid w:val="2A071785"/>
     <w:multiLevelType w:val="multilevel"/>
     <w:tmpl w:val="E9B8F1CE"/>
@@ -1197,7 +3214,7 @@
       </w:rPr>
     </w:lvl>
   </w:abstractNum>
-  <w:abstractNum w:abstractNumId="1" w15:restartNumberingAfterBreak="0">
+  <w:abstractNum w:abstractNumId="2" w15:restartNumberingAfterBreak="0">
     <w:nsid w:val="2F353AA2"/>
     <w:multiLevelType w:val="multilevel"/>
     <w:tmpl w:val="3954DEE0"/>
@@ -1346,7 +3363,495 @@
       </w:rPr>
     </w:lvl>
   </w:abstractNum>
-  <w:abstractNum w:abstractNumId="2" w15:restartNumberingAfterBreak="0">
+  <w:abstractNum w:abstractNumId="3" w15:restartNumberingAfterBreak="0">
+    <w:nsid w:val="33F45946"/>
+    <w:multiLevelType w:val="multilevel"/>
+    <w:tmpl w:val="3968B026"/>
+    <w:lvl w:ilvl="0">
+      <w:start w:val="1"/>
+      <w:numFmt w:val="bullet"/>
+      <w:lvlText w:val=""/>
+      <w:lvlJc w:val="left"/>
+      <w:pPr>
+        <w:tabs>
+          <w:tab w:val="num" w:pos="1068"/>
+        </w:tabs>
+        <w:ind w:left="1068" w:hanging="360"/>
+      </w:pPr>
+      <w:rPr>
+        <w:rFonts w:ascii="Symbol" w:hAnsi="Symbol" w:hint="default"/>
+        <w:sz w:val="20"/>
+      </w:rPr>
+    </w:lvl>
+    <w:lvl w:ilvl="1" w:tentative="1">
+      <w:start w:val="1"/>
+      <w:numFmt w:val="bullet"/>
+      <w:lvlText w:val="o"/>
+      <w:lvlJc w:val="left"/>
+      <w:pPr>
+        <w:tabs>
+          <w:tab w:val="num" w:pos="1788"/>
+        </w:tabs>
+        <w:ind w:left="1788" w:hanging="360"/>
+      </w:pPr>
+      <w:rPr>
+        <w:rFonts w:ascii="Courier New" w:hAnsi="Courier New" w:hint="default"/>
+        <w:sz w:val="20"/>
+      </w:rPr>
+    </w:lvl>
+    <w:lvl w:ilvl="2" w:tentative="1">
+      <w:start w:val="1"/>
+      <w:numFmt w:val="bullet"/>
+      <w:lvlText w:val=""/>
+      <w:lvlJc w:val="left"/>
+      <w:pPr>
+        <w:tabs>
+          <w:tab w:val="num" w:pos="2508"/>
+        </w:tabs>
+        <w:ind w:left="2508" w:hanging="360"/>
+      </w:pPr>
+      <w:rPr>
+        <w:rFonts w:ascii="Wingdings" w:hAnsi="Wingdings" w:hint="default"/>
+        <w:sz w:val="20"/>
+      </w:rPr>
+    </w:lvl>
+    <w:lvl w:ilvl="3" w:tentative="1">
+      <w:start w:val="1"/>
+      <w:numFmt w:val="bullet"/>
+      <w:lvlText w:val=""/>
+      <w:lvlJc w:val="left"/>
+      <w:pPr>
+        <w:tabs>
+          <w:tab w:val="num" w:pos="3228"/>
+        </w:tabs>
+        <w:ind w:left="3228" w:hanging="360"/>
+      </w:pPr>
+      <w:rPr>
+        <w:rFonts w:ascii="Wingdings" w:hAnsi="Wingdings" w:hint="default"/>
+        <w:sz w:val="20"/>
+      </w:rPr>
+    </w:lvl>
+    <w:lvl w:ilvl="4" w:tentative="1">
+      <w:start w:val="1"/>
+      <w:numFmt w:val="bullet"/>
+      <w:lvlText w:val=""/>
+      <w:lvlJc w:val="left"/>
+      <w:pPr>
+        <w:tabs>
+          <w:tab w:val="num" w:pos="3948"/>
+        </w:tabs>
+        <w:ind w:left="3948" w:hanging="360"/>
+      </w:pPr>
+      <w:rPr>
+        <w:rFonts w:ascii="Wingdings" w:hAnsi="Wingdings" w:hint="default"/>
+        <w:sz w:val="20"/>
+      </w:rPr>
+    </w:lvl>
+    <w:lvl w:ilvl="5" w:tentative="1">
+      <w:start w:val="1"/>
+      <w:numFmt w:val="bullet"/>
+      <w:lvlText w:val=""/>
+      <w:lvlJc w:val="left"/>
+      <w:pPr>
+        <w:tabs>
+          <w:tab w:val="num" w:pos="4668"/>
+        </w:tabs>
+        <w:ind w:left="4668" w:hanging="360"/>
+      </w:pPr>
+      <w:rPr>
+        <w:rFonts w:ascii="Wingdings" w:hAnsi="Wingdings" w:hint="default"/>
+        <w:sz w:val="20"/>
+      </w:rPr>
+    </w:lvl>
+    <w:lvl w:ilvl="6" w:tentative="1">
+      <w:start w:val="1"/>
+      <w:numFmt w:val="bullet"/>
+      <w:lvlText w:val=""/>
+      <w:lvlJc w:val="left"/>
+      <w:pPr>
+        <w:tabs>
+          <w:tab w:val="num" w:pos="5388"/>
+        </w:tabs>
+        <w:ind w:left="5388" w:hanging="360"/>
+      </w:pPr>
+      <w:rPr>
+        <w:rFonts w:ascii="Wingdings" w:hAnsi="Wingdings" w:hint="default"/>
+        <w:sz w:val="20"/>
+      </w:rPr>
+    </w:lvl>
+    <w:lvl w:ilvl="7" w:tentative="1">
+      <w:start w:val="1"/>
+      <w:numFmt w:val="bullet"/>
+      <w:lvlText w:val=""/>
+      <w:lvlJc w:val="left"/>
+      <w:pPr>
+        <w:tabs>
+          <w:tab w:val="num" w:pos="6108"/>
+        </w:tabs>
+        <w:ind w:left="6108" w:hanging="360"/>
+      </w:pPr>
+      <w:rPr>
+        <w:rFonts w:ascii="Wingdings" w:hAnsi="Wingdings" w:hint="default"/>
+        <w:sz w:val="20"/>
+      </w:rPr>
+    </w:lvl>
+    <w:lvl w:ilvl="8" w:tentative="1">
+      <w:start w:val="1"/>
+      <w:numFmt w:val="bullet"/>
+      <w:lvlText w:val=""/>
+      <w:lvlJc w:val="left"/>
+      <w:pPr>
+        <w:tabs>
+          <w:tab w:val="num" w:pos="6828"/>
+        </w:tabs>
+        <w:ind w:left="6828" w:hanging="360"/>
+      </w:pPr>
+      <w:rPr>
+        <w:rFonts w:ascii="Wingdings" w:hAnsi="Wingdings" w:hint="default"/>
+        <w:sz w:val="20"/>
+      </w:rPr>
+    </w:lvl>
+  </w:abstractNum>
+  <w:abstractNum w:abstractNumId="4" w15:restartNumberingAfterBreak="0">
+    <w:nsid w:val="3BE92347"/>
+    <w:multiLevelType w:val="hybridMultilevel"/>
+    <w:tmpl w:val="04A68ECA"/>
+    <w:lvl w:ilvl="0" w:tplc="04150001">
+      <w:start w:val="1"/>
+      <w:numFmt w:val="bullet"/>
+      <w:lvlText w:val=""/>
+      <w:lvlJc w:val="left"/>
+      <w:pPr>
+        <w:ind w:left="720" w:hanging="360"/>
+      </w:pPr>
+      <w:rPr>
+        <w:rFonts w:ascii="Symbol" w:hAnsi="Symbol" w:hint="default"/>
+      </w:rPr>
+    </w:lvl>
+    <w:lvl w:ilvl="1" w:tplc="04150003">
+      <w:start w:val="1"/>
+      <w:numFmt w:val="bullet"/>
+      <w:lvlText w:val="o"/>
+      <w:lvlJc w:val="left"/>
+      <w:pPr>
+        <w:ind w:left="1440" w:hanging="360"/>
+      </w:pPr>
+      <w:rPr>
+        <w:rFonts w:ascii="Courier New" w:hAnsi="Courier New" w:cs="Courier New" w:hint="default"/>
+      </w:rPr>
+    </w:lvl>
+    <w:lvl w:ilvl="2" w:tplc="04150005">
+      <w:start w:val="1"/>
+      <w:numFmt w:val="bullet"/>
+      <w:lvlText w:val=""/>
+      <w:lvlJc w:val="left"/>
+      <w:pPr>
+        <w:ind w:left="2160" w:hanging="360"/>
+      </w:pPr>
+      <w:rPr>
+        <w:rFonts w:ascii="Wingdings" w:hAnsi="Wingdings" w:hint="default"/>
+      </w:rPr>
+    </w:lvl>
+    <w:lvl w:ilvl="3" w:tplc="04150001" w:tentative="1">
+      <w:start w:val="1"/>
+      <w:numFmt w:val="bullet"/>
+      <w:lvlText w:val=""/>
+      <w:lvlJc w:val="left"/>
+      <w:pPr>
+        <w:ind w:left="2880" w:hanging="360"/>
+      </w:pPr>
+      <w:rPr>
+        <w:rFonts w:ascii="Symbol" w:hAnsi="Symbol" w:hint="default"/>
+      </w:rPr>
+    </w:lvl>
+    <w:lvl w:ilvl="4" w:tplc="04150003" w:tentative="1">
+      <w:start w:val="1"/>
+      <w:numFmt w:val="bullet"/>
+      <w:lvlText w:val="o"/>
+      <w:lvlJc w:val="left"/>
+      <w:pPr>
+        <w:ind w:left="3600" w:hanging="360"/>
+      </w:pPr>
+      <w:rPr>
+        <w:rFonts w:ascii="Courier New" w:hAnsi="Courier New" w:cs="Courier New" w:hint="default"/>
+      </w:rPr>
+    </w:lvl>
+    <w:lvl w:ilvl="5" w:tplc="04150005" w:tentative="1">
+      <w:start w:val="1"/>
+      <w:numFmt w:val="bullet"/>
+      <w:lvlText w:val=""/>
+      <w:lvlJc w:val="left"/>
+      <w:pPr>
+        <w:ind w:left="4320" w:hanging="360"/>
+      </w:pPr>
+      <w:rPr>
+        <w:rFonts w:ascii="Wingdings" w:hAnsi="Wingdings" w:hint="default"/>
+      </w:rPr>
+    </w:lvl>
+    <w:lvl w:ilvl="6" w:tplc="04150001" w:tentative="1">
+      <w:start w:val="1"/>
+      <w:numFmt w:val="bullet"/>
+      <w:lvlText w:val=""/>
+      <w:lvlJc w:val="left"/>
+      <w:pPr>
+        <w:ind w:left="5040" w:hanging="360"/>
+      </w:pPr>
+      <w:rPr>
+        <w:rFonts w:ascii="Symbol" w:hAnsi="Symbol" w:hint="default"/>
+      </w:rPr>
+    </w:lvl>
+    <w:lvl w:ilvl="7" w:tplc="04150003" w:tentative="1">
+      <w:start w:val="1"/>
+      <w:numFmt w:val="bullet"/>
+      <w:lvlText w:val="o"/>
+      <w:lvlJc w:val="left"/>
+      <w:pPr>
+        <w:ind w:left="5760" w:hanging="360"/>
+      </w:pPr>
+      <w:rPr>
+        <w:rFonts w:ascii="Courier New" w:hAnsi="Courier New" w:cs="Courier New" w:hint="default"/>
+      </w:rPr>
+    </w:lvl>
+    <w:lvl w:ilvl="8" w:tplc="04150005" w:tentative="1">
+      <w:start w:val="1"/>
+      <w:numFmt w:val="bullet"/>
+      <w:lvlText w:val=""/>
+      <w:lvlJc w:val="left"/>
+      <w:pPr>
+        <w:ind w:left="6480" w:hanging="360"/>
+      </w:pPr>
+      <w:rPr>
+        <w:rFonts w:ascii="Wingdings" w:hAnsi="Wingdings" w:hint="default"/>
+      </w:rPr>
+    </w:lvl>
+  </w:abstractNum>
+  <w:abstractNum w:abstractNumId="5" w15:restartNumberingAfterBreak="0">
+    <w:nsid w:val="3C0A78F2"/>
+    <w:multiLevelType w:val="hybridMultilevel"/>
+    <w:tmpl w:val="37F871C2"/>
+    <w:lvl w:ilvl="0" w:tplc="04150001">
+      <w:start w:val="1"/>
+      <w:numFmt w:val="bullet"/>
+      <w:lvlText w:val=""/>
+      <w:lvlJc w:val="left"/>
+      <w:pPr>
+        <w:ind w:left="720" w:hanging="360"/>
+      </w:pPr>
+      <w:rPr>
+        <w:rFonts w:ascii="Symbol" w:hAnsi="Symbol" w:hint="default"/>
+      </w:rPr>
+    </w:lvl>
+    <w:lvl w:ilvl="1" w:tplc="04150003">
+      <w:start w:val="1"/>
+      <w:numFmt w:val="bullet"/>
+      <w:lvlText w:val="o"/>
+      <w:lvlJc w:val="left"/>
+      <w:pPr>
+        <w:ind w:left="1440" w:hanging="360"/>
+      </w:pPr>
+      <w:rPr>
+        <w:rFonts w:ascii="Courier New" w:hAnsi="Courier New" w:cs="Courier New" w:hint="default"/>
+      </w:rPr>
+    </w:lvl>
+    <w:lvl w:ilvl="2" w:tplc="04150005">
+      <w:start w:val="1"/>
+      <w:numFmt w:val="bullet"/>
+      <w:lvlText w:val=""/>
+      <w:lvlJc w:val="left"/>
+      <w:pPr>
+        <w:ind w:left="2160" w:hanging="360"/>
+      </w:pPr>
+      <w:rPr>
+        <w:rFonts w:ascii="Wingdings" w:hAnsi="Wingdings" w:hint="default"/>
+      </w:rPr>
+    </w:lvl>
+    <w:lvl w:ilvl="3" w:tplc="04150001" w:tentative="1">
+      <w:start w:val="1"/>
+      <w:numFmt w:val="bullet"/>
+      <w:lvlText w:val=""/>
+      <w:lvlJc w:val="left"/>
+      <w:pPr>
+        <w:ind w:left="2880" w:hanging="360"/>
+      </w:pPr>
+      <w:rPr>
+        <w:rFonts w:ascii="Symbol" w:hAnsi="Symbol" w:hint="default"/>
+      </w:rPr>
+    </w:lvl>
+    <w:lvl w:ilvl="4" w:tplc="04150003" w:tentative="1">
+      <w:start w:val="1"/>
+      <w:numFmt w:val="bullet"/>
+      <w:lvlText w:val="o"/>
+      <w:lvlJc w:val="left"/>
+      <w:pPr>
+        <w:ind w:left="3600" w:hanging="360"/>
+      </w:pPr>
+      <w:rPr>
+        <w:rFonts w:ascii="Courier New" w:hAnsi="Courier New" w:cs="Courier New" w:hint="default"/>
+      </w:rPr>
+    </w:lvl>
+    <w:lvl w:ilvl="5" w:tplc="04150005" w:tentative="1">
+      <w:start w:val="1"/>
+      <w:numFmt w:val="bullet"/>
+      <w:lvlText w:val=""/>
+      <w:lvlJc w:val="left"/>
+      <w:pPr>
+        <w:ind w:left="4320" w:hanging="360"/>
+      </w:pPr>
+      <w:rPr>
+        <w:rFonts w:ascii="Wingdings" w:hAnsi="Wingdings" w:hint="default"/>
+      </w:rPr>
+    </w:lvl>
+    <w:lvl w:ilvl="6" w:tplc="04150001" w:tentative="1">
+      <w:start w:val="1"/>
+      <w:numFmt w:val="bullet"/>
+      <w:lvlText w:val=""/>
+      <w:lvlJc w:val="left"/>
+      <w:pPr>
+        <w:ind w:left="5040" w:hanging="360"/>
+      </w:pPr>
+      <w:rPr>
+        <w:rFonts w:ascii="Symbol" w:hAnsi="Symbol" w:hint="default"/>
+      </w:rPr>
+    </w:lvl>
+    <w:lvl w:ilvl="7" w:tplc="04150003" w:tentative="1">
+      <w:start w:val="1"/>
+      <w:numFmt w:val="bullet"/>
+      <w:lvlText w:val="o"/>
+      <w:lvlJc w:val="left"/>
+      <w:pPr>
+        <w:ind w:left="5760" w:hanging="360"/>
+      </w:pPr>
+      <w:rPr>
+        <w:rFonts w:ascii="Courier New" w:hAnsi="Courier New" w:cs="Courier New" w:hint="default"/>
+      </w:rPr>
+    </w:lvl>
+    <w:lvl w:ilvl="8" w:tplc="04150005" w:tentative="1">
+      <w:start w:val="1"/>
+      <w:numFmt w:val="bullet"/>
+      <w:lvlText w:val=""/>
+      <w:lvlJc w:val="left"/>
+      <w:pPr>
+        <w:ind w:left="6480" w:hanging="360"/>
+      </w:pPr>
+      <w:rPr>
+        <w:rFonts w:ascii="Wingdings" w:hAnsi="Wingdings" w:hint="default"/>
+      </w:rPr>
+    </w:lvl>
+  </w:abstractNum>
+  <w:abstractNum w:abstractNumId="6" w15:restartNumberingAfterBreak="0">
+    <w:nsid w:val="41837E30"/>
+    <w:multiLevelType w:val="hybridMultilevel"/>
+    <w:tmpl w:val="929A8C66"/>
+    <w:lvl w:ilvl="0" w:tplc="04150001">
+      <w:start w:val="1"/>
+      <w:numFmt w:val="bullet"/>
+      <w:lvlText w:val=""/>
+      <w:lvlJc w:val="left"/>
+      <w:pPr>
+        <w:ind w:left="720" w:hanging="360"/>
+      </w:pPr>
+      <w:rPr>
+        <w:rFonts w:ascii="Symbol" w:hAnsi="Symbol" w:hint="default"/>
+      </w:rPr>
+    </w:lvl>
+    <w:lvl w:ilvl="1" w:tplc="04150003">
+      <w:start w:val="1"/>
+      <w:numFmt w:val="bullet"/>
+      <w:lvlText w:val="o"/>
+      <w:lvlJc w:val="left"/>
+      <w:pPr>
+        <w:ind w:left="1440" w:hanging="360"/>
+      </w:pPr>
+      <w:rPr>
+        <w:rFonts w:ascii="Courier New" w:hAnsi="Courier New" w:cs="Courier New" w:hint="default"/>
+      </w:rPr>
+    </w:lvl>
+    <w:lvl w:ilvl="2" w:tplc="04150005">
+      <w:start w:val="1"/>
+      <w:numFmt w:val="bullet"/>
+      <w:lvlText w:val=""/>
+      <w:lvlJc w:val="left"/>
+      <w:pPr>
+        <w:ind w:left="2160" w:hanging="360"/>
+      </w:pPr>
+      <w:rPr>
+        <w:rFonts w:ascii="Wingdings" w:hAnsi="Wingdings" w:hint="default"/>
+      </w:rPr>
+    </w:lvl>
+    <w:lvl w:ilvl="3" w:tplc="04150001" w:tentative="1">
+      <w:start w:val="1"/>
+      <w:numFmt w:val="bullet"/>
+      <w:lvlText w:val=""/>
+      <w:lvlJc w:val="left"/>
+      <w:pPr>
+        <w:ind w:left="2880" w:hanging="360"/>
+      </w:pPr>
+      <w:rPr>
+        <w:rFonts w:ascii="Symbol" w:hAnsi="Symbol" w:hint="default"/>
+      </w:rPr>
+    </w:lvl>
+    <w:lvl w:ilvl="4" w:tplc="04150003" w:tentative="1">
+      <w:start w:val="1"/>
+      <w:numFmt w:val="bullet"/>
+      <w:lvlText w:val="o"/>
+      <w:lvlJc w:val="left"/>
+      <w:pPr>
+        <w:ind w:left="3600" w:hanging="360"/>
+      </w:pPr>
+      <w:rPr>
+        <w:rFonts w:ascii="Courier New" w:hAnsi="Courier New" w:cs="Courier New" w:hint="default"/>
+      </w:rPr>
+    </w:lvl>
+    <w:lvl w:ilvl="5" w:tplc="04150005" w:tentative="1">
+      <w:start w:val="1"/>
+      <w:numFmt w:val="bullet"/>
+      <w:lvlText w:val=""/>
+      <w:lvlJc w:val="left"/>
+      <w:pPr>
+        <w:ind w:left="4320" w:hanging="360"/>
+      </w:pPr>
+      <w:rPr>
+        <w:rFonts w:ascii="Wingdings" w:hAnsi="Wingdings" w:hint="default"/>
+      </w:rPr>
+    </w:lvl>
+    <w:lvl w:ilvl="6" w:tplc="04150001" w:tentative="1">
+      <w:start w:val="1"/>
+      <w:numFmt w:val="bullet"/>
+      <w:lvlText w:val=""/>
+      <w:lvlJc w:val="left"/>
+      <w:pPr>
+        <w:ind w:left="5040" w:hanging="360"/>
+      </w:pPr>
+      <w:rPr>
+        <w:rFonts w:ascii="Symbol" w:hAnsi="Symbol" w:hint="default"/>
+      </w:rPr>
+    </w:lvl>
+    <w:lvl w:ilvl="7" w:tplc="04150003" w:tentative="1">
+      <w:start w:val="1"/>
+      <w:numFmt w:val="bullet"/>
+      <w:lvlText w:val="o"/>
+      <w:lvlJc w:val="left"/>
+      <w:pPr>
+        <w:ind w:left="5760" w:hanging="360"/>
+      </w:pPr>
+      <w:rPr>
+        <w:rFonts w:ascii="Courier New" w:hAnsi="Courier New" w:cs="Courier New" w:hint="default"/>
+      </w:rPr>
+    </w:lvl>
+    <w:lvl w:ilvl="8" w:tplc="04150005" w:tentative="1">
+      <w:start w:val="1"/>
+      <w:numFmt w:val="bullet"/>
+      <w:lvlText w:val=""/>
+      <w:lvlJc w:val="left"/>
+      <w:pPr>
+        <w:ind w:left="6480" w:hanging="360"/>
+      </w:pPr>
+      <w:rPr>
+        <w:rFonts w:ascii="Wingdings" w:hAnsi="Wingdings" w:hint="default"/>
+      </w:rPr>
+    </w:lvl>
+  </w:abstractNum>
+  <w:abstractNum w:abstractNumId="7" w15:restartNumberingAfterBreak="0">
     <w:nsid w:val="4D474FB2"/>
     <w:multiLevelType w:val="multilevel"/>
     <w:tmpl w:val="4D400FFC"/>
@@ -1495,7 +4000,713 @@
       </w:rPr>
     </w:lvl>
   </w:abstractNum>
-  <w:abstractNum w:abstractNumId="3" w15:restartNumberingAfterBreak="0">
+  <w:abstractNum w:abstractNumId="8" w15:restartNumberingAfterBreak="0">
+    <w:nsid w:val="4EF56365"/>
+    <w:multiLevelType w:val="multilevel"/>
+    <w:tmpl w:val="C922D908"/>
+    <w:lvl w:ilvl="0">
+      <w:start w:val="1"/>
+      <w:numFmt w:val="bullet"/>
+      <w:lvlText w:val=""/>
+      <w:lvlJc w:val="left"/>
+      <w:pPr>
+        <w:tabs>
+          <w:tab w:val="num" w:pos="720"/>
+        </w:tabs>
+        <w:ind w:left="720" w:hanging="360"/>
+      </w:pPr>
+      <w:rPr>
+        <w:rFonts w:ascii="Symbol" w:hAnsi="Symbol" w:hint="default"/>
+        <w:sz w:val="20"/>
+      </w:rPr>
+    </w:lvl>
+    <w:lvl w:ilvl="1" w:tentative="1">
+      <w:start w:val="1"/>
+      <w:numFmt w:val="bullet"/>
+      <w:lvlText w:val="o"/>
+      <w:lvlJc w:val="left"/>
+      <w:pPr>
+        <w:tabs>
+          <w:tab w:val="num" w:pos="1440"/>
+        </w:tabs>
+        <w:ind w:left="1440" w:hanging="360"/>
+      </w:pPr>
+      <w:rPr>
+        <w:rFonts w:ascii="Courier New" w:hAnsi="Courier New" w:hint="default"/>
+        <w:sz w:val="20"/>
+      </w:rPr>
+    </w:lvl>
+    <w:lvl w:ilvl="2" w:tentative="1">
+      <w:start w:val="1"/>
+      <w:numFmt w:val="bullet"/>
+      <w:lvlText w:val=""/>
+      <w:lvlJc w:val="left"/>
+      <w:pPr>
+        <w:tabs>
+          <w:tab w:val="num" w:pos="2160"/>
+        </w:tabs>
+        <w:ind w:left="2160" w:hanging="360"/>
+      </w:pPr>
+      <w:rPr>
+        <w:rFonts w:ascii="Wingdings" w:hAnsi="Wingdings" w:hint="default"/>
+        <w:sz w:val="20"/>
+      </w:rPr>
+    </w:lvl>
+    <w:lvl w:ilvl="3" w:tentative="1">
+      <w:start w:val="1"/>
+      <w:numFmt w:val="bullet"/>
+      <w:lvlText w:val=""/>
+      <w:lvlJc w:val="left"/>
+      <w:pPr>
+        <w:tabs>
+          <w:tab w:val="num" w:pos="2880"/>
+        </w:tabs>
+        <w:ind w:left="2880" w:hanging="360"/>
+      </w:pPr>
+      <w:rPr>
+        <w:rFonts w:ascii="Wingdings" w:hAnsi="Wingdings" w:hint="default"/>
+        <w:sz w:val="20"/>
+      </w:rPr>
+    </w:lvl>
+    <w:lvl w:ilvl="4" w:tentative="1">
+      <w:start w:val="1"/>
+      <w:numFmt w:val="bullet"/>
+      <w:lvlText w:val=""/>
+      <w:lvlJc w:val="left"/>
+      <w:pPr>
+        <w:tabs>
+          <w:tab w:val="num" w:pos="3600"/>
+        </w:tabs>
+        <w:ind w:left="3600" w:hanging="360"/>
+      </w:pPr>
+      <w:rPr>
+        <w:rFonts w:ascii="Wingdings" w:hAnsi="Wingdings" w:hint="default"/>
+        <w:sz w:val="20"/>
+      </w:rPr>
+    </w:lvl>
+    <w:lvl w:ilvl="5" w:tentative="1">
+      <w:start w:val="1"/>
+      <w:numFmt w:val="bullet"/>
+      <w:lvlText w:val=""/>
+      <w:lvlJc w:val="left"/>
+      <w:pPr>
+        <w:tabs>
+          <w:tab w:val="num" w:pos="4320"/>
+        </w:tabs>
+        <w:ind w:left="4320" w:hanging="360"/>
+      </w:pPr>
+      <w:rPr>
+        <w:rFonts w:ascii="Wingdings" w:hAnsi="Wingdings" w:hint="default"/>
+        <w:sz w:val="20"/>
+      </w:rPr>
+    </w:lvl>
+    <w:lvl w:ilvl="6" w:tentative="1">
+      <w:start w:val="1"/>
+      <w:numFmt w:val="bullet"/>
+      <w:lvlText w:val=""/>
+      <w:lvlJc w:val="left"/>
+      <w:pPr>
+        <w:tabs>
+          <w:tab w:val="num" w:pos="5040"/>
+        </w:tabs>
+        <w:ind w:left="5040" w:hanging="360"/>
+      </w:pPr>
+      <w:rPr>
+        <w:rFonts w:ascii="Wingdings" w:hAnsi="Wingdings" w:hint="default"/>
+        <w:sz w:val="20"/>
+      </w:rPr>
+    </w:lvl>
+    <w:lvl w:ilvl="7" w:tentative="1">
+      <w:start w:val="1"/>
+      <w:numFmt w:val="bullet"/>
+      <w:lvlText w:val=""/>
+      <w:lvlJc w:val="left"/>
+      <w:pPr>
+        <w:tabs>
+          <w:tab w:val="num" w:pos="5760"/>
+        </w:tabs>
+        <w:ind w:left="5760" w:hanging="360"/>
+      </w:pPr>
+      <w:rPr>
+        <w:rFonts w:ascii="Wingdings" w:hAnsi="Wingdings" w:hint="default"/>
+        <w:sz w:val="20"/>
+      </w:rPr>
+    </w:lvl>
+    <w:lvl w:ilvl="8" w:tentative="1">
+      <w:start w:val="1"/>
+      <w:numFmt w:val="bullet"/>
+      <w:lvlText w:val=""/>
+      <w:lvlJc w:val="left"/>
+      <w:pPr>
+        <w:tabs>
+          <w:tab w:val="num" w:pos="6480"/>
+        </w:tabs>
+        <w:ind w:left="6480" w:hanging="360"/>
+      </w:pPr>
+      <w:rPr>
+        <w:rFonts w:ascii="Wingdings" w:hAnsi="Wingdings" w:hint="default"/>
+        <w:sz w:val="20"/>
+      </w:rPr>
+    </w:lvl>
+  </w:abstractNum>
+  <w:abstractNum w:abstractNumId="9" w15:restartNumberingAfterBreak="0">
+    <w:nsid w:val="5B2E3146"/>
+    <w:multiLevelType w:val="multilevel"/>
+    <w:tmpl w:val="34DA0D30"/>
+    <w:lvl w:ilvl="0">
+      <w:start w:val="1"/>
+      <w:numFmt w:val="bullet"/>
+      <w:lvlText w:val=""/>
+      <w:lvlJc w:val="left"/>
+      <w:pPr>
+        <w:tabs>
+          <w:tab w:val="num" w:pos="720"/>
+        </w:tabs>
+        <w:ind w:left="720" w:hanging="360"/>
+      </w:pPr>
+      <w:rPr>
+        <w:rFonts w:ascii="Symbol" w:hAnsi="Symbol" w:hint="default"/>
+        <w:sz w:val="20"/>
+      </w:rPr>
+    </w:lvl>
+    <w:lvl w:ilvl="1">
+      <w:start w:val="1"/>
+      <w:numFmt w:val="bullet"/>
+      <w:lvlText w:val="o"/>
+      <w:lvlJc w:val="left"/>
+      <w:pPr>
+        <w:tabs>
+          <w:tab w:val="num" w:pos="1440"/>
+        </w:tabs>
+        <w:ind w:left="1440" w:hanging="360"/>
+      </w:pPr>
+      <w:rPr>
+        <w:rFonts w:ascii="Courier New" w:hAnsi="Courier New" w:hint="default"/>
+        <w:sz w:val="20"/>
+      </w:rPr>
+    </w:lvl>
+    <w:lvl w:ilvl="2" w:tentative="1">
+      <w:start w:val="1"/>
+      <w:numFmt w:val="bullet"/>
+      <w:lvlText w:val=""/>
+      <w:lvlJc w:val="left"/>
+      <w:pPr>
+        <w:tabs>
+          <w:tab w:val="num" w:pos="2160"/>
+        </w:tabs>
+        <w:ind w:left="2160" w:hanging="360"/>
+      </w:pPr>
+      <w:rPr>
+        <w:rFonts w:ascii="Wingdings" w:hAnsi="Wingdings" w:hint="default"/>
+        <w:sz w:val="20"/>
+      </w:rPr>
+    </w:lvl>
+    <w:lvl w:ilvl="3" w:tentative="1">
+      <w:start w:val="1"/>
+      <w:numFmt w:val="bullet"/>
+      <w:lvlText w:val=""/>
+      <w:lvlJc w:val="left"/>
+      <w:pPr>
+        <w:tabs>
+          <w:tab w:val="num" w:pos="2880"/>
+        </w:tabs>
+        <w:ind w:left="2880" w:hanging="360"/>
+      </w:pPr>
+      <w:rPr>
+        <w:rFonts w:ascii="Wingdings" w:hAnsi="Wingdings" w:hint="default"/>
+        <w:sz w:val="20"/>
+      </w:rPr>
+    </w:lvl>
+    <w:lvl w:ilvl="4" w:tentative="1">
+      <w:start w:val="1"/>
+      <w:numFmt w:val="bullet"/>
+      <w:lvlText w:val=""/>
+      <w:lvlJc w:val="left"/>
+      <w:pPr>
+        <w:tabs>
+          <w:tab w:val="num" w:pos="3600"/>
+        </w:tabs>
+        <w:ind w:left="3600" w:hanging="360"/>
+      </w:pPr>
+      <w:rPr>
+        <w:rFonts w:ascii="Wingdings" w:hAnsi="Wingdings" w:hint="default"/>
+        <w:sz w:val="20"/>
+      </w:rPr>
+    </w:lvl>
+    <w:lvl w:ilvl="5" w:tentative="1">
+      <w:start w:val="1"/>
+      <w:numFmt w:val="bullet"/>
+      <w:lvlText w:val=""/>
+      <w:lvlJc w:val="left"/>
+      <w:pPr>
+        <w:tabs>
+          <w:tab w:val="num" w:pos="4320"/>
+        </w:tabs>
+        <w:ind w:left="4320" w:hanging="360"/>
+      </w:pPr>
+      <w:rPr>
+        <w:rFonts w:ascii="Wingdings" w:hAnsi="Wingdings" w:hint="default"/>
+        <w:sz w:val="20"/>
+      </w:rPr>
+    </w:lvl>
+    <w:lvl w:ilvl="6" w:tentative="1">
+      <w:start w:val="1"/>
+      <w:numFmt w:val="bullet"/>
+      <w:lvlText w:val=""/>
+      <w:lvlJc w:val="left"/>
+      <w:pPr>
+        <w:tabs>
+          <w:tab w:val="num" w:pos="5040"/>
+        </w:tabs>
+        <w:ind w:left="5040" w:hanging="360"/>
+      </w:pPr>
+      <w:rPr>
+        <w:rFonts w:ascii="Wingdings" w:hAnsi="Wingdings" w:hint="default"/>
+        <w:sz w:val="20"/>
+      </w:rPr>
+    </w:lvl>
+    <w:lvl w:ilvl="7" w:tentative="1">
+      <w:start w:val="1"/>
+      <w:numFmt w:val="bullet"/>
+      <w:lvlText w:val=""/>
+      <w:lvlJc w:val="left"/>
+      <w:pPr>
+        <w:tabs>
+          <w:tab w:val="num" w:pos="5760"/>
+        </w:tabs>
+        <w:ind w:left="5760" w:hanging="360"/>
+      </w:pPr>
+      <w:rPr>
+        <w:rFonts w:ascii="Wingdings" w:hAnsi="Wingdings" w:hint="default"/>
+        <w:sz w:val="20"/>
+      </w:rPr>
+    </w:lvl>
+    <w:lvl w:ilvl="8" w:tentative="1">
+      <w:start w:val="1"/>
+      <w:numFmt w:val="bullet"/>
+      <w:lvlText w:val=""/>
+      <w:lvlJc w:val="left"/>
+      <w:pPr>
+        <w:tabs>
+          <w:tab w:val="num" w:pos="6480"/>
+        </w:tabs>
+        <w:ind w:left="6480" w:hanging="360"/>
+      </w:pPr>
+      <w:rPr>
+        <w:rFonts w:ascii="Wingdings" w:hAnsi="Wingdings" w:hint="default"/>
+        <w:sz w:val="20"/>
+      </w:rPr>
+    </w:lvl>
+  </w:abstractNum>
+  <w:abstractNum w:abstractNumId="10" w15:restartNumberingAfterBreak="0">
+    <w:nsid w:val="5BF47262"/>
+    <w:multiLevelType w:val="hybridMultilevel"/>
+    <w:tmpl w:val="B7CC8306"/>
+    <w:lvl w:ilvl="0" w:tplc="04150001">
+      <w:start w:val="1"/>
+      <w:numFmt w:val="bullet"/>
+      <w:lvlText w:val=""/>
+      <w:lvlJc w:val="left"/>
+      <w:pPr>
+        <w:ind w:left="1080" w:hanging="360"/>
+      </w:pPr>
+      <w:rPr>
+        <w:rFonts w:ascii="Symbol" w:hAnsi="Symbol" w:hint="default"/>
+      </w:rPr>
+    </w:lvl>
+    <w:lvl w:ilvl="1" w:tplc="04150003" w:tentative="1">
+      <w:start w:val="1"/>
+      <w:numFmt w:val="bullet"/>
+      <w:lvlText w:val="o"/>
+      <w:lvlJc w:val="left"/>
+      <w:pPr>
+        <w:ind w:left="1800" w:hanging="360"/>
+      </w:pPr>
+      <w:rPr>
+        <w:rFonts w:ascii="Courier New" w:hAnsi="Courier New" w:cs="Courier New" w:hint="default"/>
+      </w:rPr>
+    </w:lvl>
+    <w:lvl w:ilvl="2" w:tplc="04150005" w:tentative="1">
+      <w:start w:val="1"/>
+      <w:numFmt w:val="bullet"/>
+      <w:lvlText w:val=""/>
+      <w:lvlJc w:val="left"/>
+      <w:pPr>
+        <w:ind w:left="2520" w:hanging="360"/>
+      </w:pPr>
+      <w:rPr>
+        <w:rFonts w:ascii="Wingdings" w:hAnsi="Wingdings" w:hint="default"/>
+      </w:rPr>
+    </w:lvl>
+    <w:lvl w:ilvl="3" w:tplc="04150001" w:tentative="1">
+      <w:start w:val="1"/>
+      <w:numFmt w:val="bullet"/>
+      <w:lvlText w:val=""/>
+      <w:lvlJc w:val="left"/>
+      <w:pPr>
+        <w:ind w:left="3240" w:hanging="360"/>
+      </w:pPr>
+      <w:rPr>
+        <w:rFonts w:ascii="Symbol" w:hAnsi="Symbol" w:hint="default"/>
+      </w:rPr>
+    </w:lvl>
+    <w:lvl w:ilvl="4" w:tplc="04150003" w:tentative="1">
+      <w:start w:val="1"/>
+      <w:numFmt w:val="bullet"/>
+      <w:lvlText w:val="o"/>
+      <w:lvlJc w:val="left"/>
+      <w:pPr>
+        <w:ind w:left="3960" w:hanging="360"/>
+      </w:pPr>
+      <w:rPr>
+        <w:rFonts w:ascii="Courier New" w:hAnsi="Courier New" w:cs="Courier New" w:hint="default"/>
+      </w:rPr>
+    </w:lvl>
+    <w:lvl w:ilvl="5" w:tplc="04150005" w:tentative="1">
+      <w:start w:val="1"/>
+      <w:numFmt w:val="bullet"/>
+      <w:lvlText w:val=""/>
+      <w:lvlJc w:val="left"/>
+      <w:pPr>
+        <w:ind w:left="4680" w:hanging="360"/>
+      </w:pPr>
+      <w:rPr>
+        <w:rFonts w:ascii="Wingdings" w:hAnsi="Wingdings" w:hint="default"/>
+      </w:rPr>
+    </w:lvl>
+    <w:lvl w:ilvl="6" w:tplc="04150001" w:tentative="1">
+      <w:start w:val="1"/>
+      <w:numFmt w:val="bullet"/>
+      <w:lvlText w:val=""/>
+      <w:lvlJc w:val="left"/>
+      <w:pPr>
+        <w:ind w:left="5400" w:hanging="360"/>
+      </w:pPr>
+      <w:rPr>
+        <w:rFonts w:ascii="Symbol" w:hAnsi="Symbol" w:hint="default"/>
+      </w:rPr>
+    </w:lvl>
+    <w:lvl w:ilvl="7" w:tplc="04150003" w:tentative="1">
+      <w:start w:val="1"/>
+      <w:numFmt w:val="bullet"/>
+      <w:lvlText w:val="o"/>
+      <w:lvlJc w:val="left"/>
+      <w:pPr>
+        <w:ind w:left="6120" w:hanging="360"/>
+      </w:pPr>
+      <w:rPr>
+        <w:rFonts w:ascii="Courier New" w:hAnsi="Courier New" w:cs="Courier New" w:hint="default"/>
+      </w:rPr>
+    </w:lvl>
+    <w:lvl w:ilvl="8" w:tplc="04150005" w:tentative="1">
+      <w:start w:val="1"/>
+      <w:numFmt w:val="bullet"/>
+      <w:lvlText w:val=""/>
+      <w:lvlJc w:val="left"/>
+      <w:pPr>
+        <w:ind w:left="6840" w:hanging="360"/>
+      </w:pPr>
+      <w:rPr>
+        <w:rFonts w:ascii="Wingdings" w:hAnsi="Wingdings" w:hint="default"/>
+      </w:rPr>
+    </w:lvl>
+  </w:abstractNum>
+  <w:abstractNum w:abstractNumId="11" w15:restartNumberingAfterBreak="0">
+    <w:nsid w:val="65B6487A"/>
+    <w:multiLevelType w:val="multilevel"/>
+    <w:tmpl w:val="DED4018A"/>
+    <w:lvl w:ilvl="0">
+      <w:start w:val="1"/>
+      <w:numFmt w:val="bullet"/>
+      <w:lvlText w:val=""/>
+      <w:lvlJc w:val="left"/>
+      <w:pPr>
+        <w:tabs>
+          <w:tab w:val="num" w:pos="720"/>
+        </w:tabs>
+        <w:ind w:left="720" w:hanging="360"/>
+      </w:pPr>
+      <w:rPr>
+        <w:rFonts w:ascii="Symbol" w:hAnsi="Symbol" w:hint="default"/>
+        <w:sz w:val="20"/>
+      </w:rPr>
+    </w:lvl>
+    <w:lvl w:ilvl="1">
+      <w:start w:val="1"/>
+      <w:numFmt w:val="lowerLetter"/>
+      <w:lvlText w:val="%2)"/>
+      <w:lvlJc w:val="left"/>
+      <w:pPr>
+        <w:ind w:left="1536" w:hanging="456"/>
+      </w:pPr>
+      <w:rPr>
+        <w:rFonts w:hint="default"/>
+        <w:b/>
+      </w:rPr>
+    </w:lvl>
+    <w:lvl w:ilvl="2" w:tentative="1">
+      <w:start w:val="1"/>
+      <w:numFmt w:val="bullet"/>
+      <w:lvlText w:val=""/>
+      <w:lvlJc w:val="left"/>
+      <w:pPr>
+        <w:tabs>
+          <w:tab w:val="num" w:pos="2160"/>
+        </w:tabs>
+        <w:ind w:left="2160" w:hanging="360"/>
+      </w:pPr>
+      <w:rPr>
+        <w:rFonts w:ascii="Wingdings" w:hAnsi="Wingdings" w:hint="default"/>
+        <w:sz w:val="20"/>
+      </w:rPr>
+    </w:lvl>
+    <w:lvl w:ilvl="3" w:tentative="1">
+      <w:start w:val="1"/>
+      <w:numFmt w:val="bullet"/>
+      <w:lvlText w:val=""/>
+      <w:lvlJc w:val="left"/>
+      <w:pPr>
+        <w:tabs>
+          <w:tab w:val="num" w:pos="2880"/>
+        </w:tabs>
+        <w:ind w:left="2880" w:hanging="360"/>
+      </w:pPr>
+      <w:rPr>
+        <w:rFonts w:ascii="Wingdings" w:hAnsi="Wingdings" w:hint="default"/>
+        <w:sz w:val="20"/>
+      </w:rPr>
+    </w:lvl>
+    <w:lvl w:ilvl="4" w:tentative="1">
+      <w:start w:val="1"/>
+      <w:numFmt w:val="bullet"/>
+      <w:lvlText w:val=""/>
+      <w:lvlJc w:val="left"/>
+      <w:pPr>
+        <w:tabs>
+          <w:tab w:val="num" w:pos="3600"/>
+        </w:tabs>
+        <w:ind w:left="3600" w:hanging="360"/>
+      </w:pPr>
+      <w:rPr>
+        <w:rFonts w:ascii="Wingdings" w:hAnsi="Wingdings" w:hint="default"/>
+        <w:sz w:val="20"/>
+      </w:rPr>
+    </w:lvl>
+    <w:lvl w:ilvl="5" w:tentative="1">
+      <w:start w:val="1"/>
+      <w:numFmt w:val="bullet"/>
+      <w:lvlText w:val=""/>
+      <w:lvlJc w:val="left"/>
+      <w:pPr>
+        <w:tabs>
+          <w:tab w:val="num" w:pos="4320"/>
+        </w:tabs>
+        <w:ind w:left="4320" w:hanging="360"/>
+      </w:pPr>
+      <w:rPr>
+        <w:rFonts w:ascii="Wingdings" w:hAnsi="Wingdings" w:hint="default"/>
+        <w:sz w:val="20"/>
+      </w:rPr>
+    </w:lvl>
+    <w:lvl w:ilvl="6" w:tentative="1">
+      <w:start w:val="1"/>
+      <w:numFmt w:val="bullet"/>
+      <w:lvlText w:val=""/>
+      <w:lvlJc w:val="left"/>
+      <w:pPr>
+        <w:tabs>
+          <w:tab w:val="num" w:pos="5040"/>
+        </w:tabs>
+        <w:ind w:left="5040" w:hanging="360"/>
+      </w:pPr>
+      <w:rPr>
+        <w:rFonts w:ascii="Wingdings" w:hAnsi="Wingdings" w:hint="default"/>
+        <w:sz w:val="20"/>
+      </w:rPr>
+    </w:lvl>
+    <w:lvl w:ilvl="7" w:tentative="1">
+      <w:start w:val="1"/>
+      <w:numFmt w:val="bullet"/>
+      <w:lvlText w:val=""/>
+      <w:lvlJc w:val="left"/>
+      <w:pPr>
+        <w:tabs>
+          <w:tab w:val="num" w:pos="5760"/>
+        </w:tabs>
+        <w:ind w:left="5760" w:hanging="360"/>
+      </w:pPr>
+      <w:rPr>
+        <w:rFonts w:ascii="Wingdings" w:hAnsi="Wingdings" w:hint="default"/>
+        <w:sz w:val="20"/>
+      </w:rPr>
+    </w:lvl>
+    <w:lvl w:ilvl="8" w:tentative="1">
+      <w:start w:val="1"/>
+      <w:numFmt w:val="bullet"/>
+      <w:lvlText w:val=""/>
+      <w:lvlJc w:val="left"/>
+      <w:pPr>
+        <w:tabs>
+          <w:tab w:val="num" w:pos="6480"/>
+        </w:tabs>
+        <w:ind w:left="6480" w:hanging="360"/>
+      </w:pPr>
+      <w:rPr>
+        <w:rFonts w:ascii="Wingdings" w:hAnsi="Wingdings" w:hint="default"/>
+        <w:sz w:val="20"/>
+      </w:rPr>
+    </w:lvl>
+  </w:abstractNum>
+  <w:abstractNum w:abstractNumId="12" w15:restartNumberingAfterBreak="0">
+    <w:nsid w:val="65D26B1C"/>
+    <w:multiLevelType w:val="multilevel"/>
+    <w:tmpl w:val="CB5881F4"/>
+    <w:lvl w:ilvl="0">
+      <w:start w:val="1"/>
+      <w:numFmt w:val="bullet"/>
+      <w:lvlText w:val=""/>
+      <w:lvlJc w:val="left"/>
+      <w:pPr>
+        <w:tabs>
+          <w:tab w:val="num" w:pos="1068"/>
+        </w:tabs>
+        <w:ind w:left="1068" w:hanging="360"/>
+      </w:pPr>
+      <w:rPr>
+        <w:rFonts w:ascii="Symbol" w:hAnsi="Symbol" w:hint="default"/>
+        <w:sz w:val="20"/>
+      </w:rPr>
+    </w:lvl>
+    <w:lvl w:ilvl="1" w:tentative="1">
+      <w:start w:val="1"/>
+      <w:numFmt w:val="bullet"/>
+      <w:lvlText w:val="o"/>
+      <w:lvlJc w:val="left"/>
+      <w:pPr>
+        <w:tabs>
+          <w:tab w:val="num" w:pos="1788"/>
+        </w:tabs>
+        <w:ind w:left="1788" w:hanging="360"/>
+      </w:pPr>
+      <w:rPr>
+        <w:rFonts w:ascii="Courier New" w:hAnsi="Courier New" w:hint="default"/>
+        <w:sz w:val="20"/>
+      </w:rPr>
+    </w:lvl>
+    <w:lvl w:ilvl="2" w:tentative="1">
+      <w:start w:val="1"/>
+      <w:numFmt w:val="bullet"/>
+      <w:lvlText w:val=""/>
+      <w:lvlJc w:val="left"/>
+      <w:pPr>
+        <w:tabs>
+          <w:tab w:val="num" w:pos="2508"/>
+        </w:tabs>
+        <w:ind w:left="2508" w:hanging="360"/>
+      </w:pPr>
+      <w:rPr>
+        <w:rFonts w:ascii="Wingdings" w:hAnsi="Wingdings" w:hint="default"/>
+        <w:sz w:val="20"/>
+      </w:rPr>
+    </w:lvl>
+    <w:lvl w:ilvl="3" w:tentative="1">
+      <w:start w:val="1"/>
+      <w:numFmt w:val="bullet"/>
+      <w:lvlText w:val=""/>
+      <w:lvlJc w:val="left"/>
+      <w:pPr>
+        <w:tabs>
+          <w:tab w:val="num" w:pos="3228"/>
+        </w:tabs>
+        <w:ind w:left="3228" w:hanging="360"/>
+      </w:pPr>
+      <w:rPr>
+        <w:rFonts w:ascii="Wingdings" w:hAnsi="Wingdings" w:hint="default"/>
+        <w:sz w:val="20"/>
+      </w:rPr>
+    </w:lvl>
+    <w:lvl w:ilvl="4" w:tentative="1">
+      <w:start w:val="1"/>
+      <w:numFmt w:val="bullet"/>
+      <w:lvlText w:val=""/>
+      <w:lvlJc w:val="left"/>
+      <w:pPr>
+        <w:tabs>
+          <w:tab w:val="num" w:pos="3948"/>
+        </w:tabs>
+        <w:ind w:left="3948" w:hanging="360"/>
+      </w:pPr>
+      <w:rPr>
+        <w:rFonts w:ascii="Wingdings" w:hAnsi="Wingdings" w:hint="default"/>
+        <w:sz w:val="20"/>
+      </w:rPr>
+    </w:lvl>
+    <w:lvl w:ilvl="5" w:tentative="1">
+      <w:start w:val="1"/>
+      <w:numFmt w:val="bullet"/>
+      <w:lvlText w:val=""/>
+      <w:lvlJc w:val="left"/>
+      <w:pPr>
+        <w:tabs>
+          <w:tab w:val="num" w:pos="4668"/>
+        </w:tabs>
+        <w:ind w:left="4668" w:hanging="360"/>
+      </w:pPr>
+      <w:rPr>
+        <w:rFonts w:ascii="Wingdings" w:hAnsi="Wingdings" w:hint="default"/>
+        <w:sz w:val="20"/>
+      </w:rPr>
+    </w:lvl>
+    <w:lvl w:ilvl="6" w:tentative="1">
+      <w:start w:val="1"/>
+      <w:numFmt w:val="bullet"/>
+      <w:lvlText w:val=""/>
+      <w:lvlJc w:val="left"/>
+      <w:pPr>
+        <w:tabs>
+          <w:tab w:val="num" w:pos="5388"/>
+        </w:tabs>
+        <w:ind w:left="5388" w:hanging="360"/>
+      </w:pPr>
+      <w:rPr>
+        <w:rFonts w:ascii="Wingdings" w:hAnsi="Wingdings" w:hint="default"/>
+        <w:sz w:val="20"/>
+      </w:rPr>
+    </w:lvl>
+    <w:lvl w:ilvl="7" w:tentative="1">
+      <w:start w:val="1"/>
+      <w:numFmt w:val="bullet"/>
+      <w:lvlText w:val=""/>
+      <w:lvlJc w:val="left"/>
+      <w:pPr>
+        <w:tabs>
+          <w:tab w:val="num" w:pos="6108"/>
+        </w:tabs>
+        <w:ind w:left="6108" w:hanging="360"/>
+      </w:pPr>
+      <w:rPr>
+        <w:rFonts w:ascii="Wingdings" w:hAnsi="Wingdings" w:hint="default"/>
+        <w:sz w:val="20"/>
+      </w:rPr>
+    </w:lvl>
+    <w:lvl w:ilvl="8" w:tentative="1">
+      <w:start w:val="1"/>
+      <w:numFmt w:val="bullet"/>
+      <w:lvlText w:val=""/>
+      <w:lvlJc w:val="left"/>
+      <w:pPr>
+        <w:tabs>
+          <w:tab w:val="num" w:pos="6828"/>
+        </w:tabs>
+        <w:ind w:left="6828" w:hanging="360"/>
+      </w:pPr>
+      <w:rPr>
+        <w:rFonts w:ascii="Wingdings" w:hAnsi="Wingdings" w:hint="default"/>
+        <w:sz w:val="20"/>
+      </w:rPr>
+    </w:lvl>
+  </w:abstractNum>
+  <w:abstractNum w:abstractNumId="13" w15:restartNumberingAfterBreak="0">
     <w:nsid w:val="665A449D"/>
     <w:multiLevelType w:val="multilevel"/>
     <w:tmpl w:val="FBDA96F4"/>
@@ -1644,17 +4855,467 @@
       </w:rPr>
     </w:lvl>
   </w:abstractNum>
+  <w:abstractNum w:abstractNumId="14" w15:restartNumberingAfterBreak="0">
+    <w:nsid w:val="6A0643F4"/>
+    <w:multiLevelType w:val="multilevel"/>
+    <w:tmpl w:val="C71E8472"/>
+    <w:lvl w:ilvl="0">
+      <w:start w:val="1"/>
+      <w:numFmt w:val="bullet"/>
+      <w:lvlText w:val=""/>
+      <w:lvlJc w:val="left"/>
+      <w:pPr>
+        <w:tabs>
+          <w:tab w:val="num" w:pos="1068"/>
+        </w:tabs>
+        <w:ind w:left="1068" w:hanging="360"/>
+      </w:pPr>
+      <w:rPr>
+        <w:rFonts w:ascii="Symbol" w:hAnsi="Symbol" w:hint="default"/>
+        <w:sz w:val="20"/>
+      </w:rPr>
+    </w:lvl>
+    <w:lvl w:ilvl="1" w:tentative="1">
+      <w:start w:val="1"/>
+      <w:numFmt w:val="bullet"/>
+      <w:lvlText w:val="o"/>
+      <w:lvlJc w:val="left"/>
+      <w:pPr>
+        <w:tabs>
+          <w:tab w:val="num" w:pos="1788"/>
+        </w:tabs>
+        <w:ind w:left="1788" w:hanging="360"/>
+      </w:pPr>
+      <w:rPr>
+        <w:rFonts w:ascii="Courier New" w:hAnsi="Courier New" w:hint="default"/>
+        <w:sz w:val="20"/>
+      </w:rPr>
+    </w:lvl>
+    <w:lvl w:ilvl="2" w:tentative="1">
+      <w:start w:val="1"/>
+      <w:numFmt w:val="bullet"/>
+      <w:lvlText w:val=""/>
+      <w:lvlJc w:val="left"/>
+      <w:pPr>
+        <w:tabs>
+          <w:tab w:val="num" w:pos="2508"/>
+        </w:tabs>
+        <w:ind w:left="2508" w:hanging="360"/>
+      </w:pPr>
+      <w:rPr>
+        <w:rFonts w:ascii="Wingdings" w:hAnsi="Wingdings" w:hint="default"/>
+        <w:sz w:val="20"/>
+      </w:rPr>
+    </w:lvl>
+    <w:lvl w:ilvl="3" w:tentative="1">
+      <w:start w:val="1"/>
+      <w:numFmt w:val="bullet"/>
+      <w:lvlText w:val=""/>
+      <w:lvlJc w:val="left"/>
+      <w:pPr>
+        <w:tabs>
+          <w:tab w:val="num" w:pos="3228"/>
+        </w:tabs>
+        <w:ind w:left="3228" w:hanging="360"/>
+      </w:pPr>
+      <w:rPr>
+        <w:rFonts w:ascii="Wingdings" w:hAnsi="Wingdings" w:hint="default"/>
+        <w:sz w:val="20"/>
+      </w:rPr>
+    </w:lvl>
+    <w:lvl w:ilvl="4" w:tentative="1">
+      <w:start w:val="1"/>
+      <w:numFmt w:val="bullet"/>
+      <w:lvlText w:val=""/>
+      <w:lvlJc w:val="left"/>
+      <w:pPr>
+        <w:tabs>
+          <w:tab w:val="num" w:pos="3948"/>
+        </w:tabs>
+        <w:ind w:left="3948" w:hanging="360"/>
+      </w:pPr>
+      <w:rPr>
+        <w:rFonts w:ascii="Wingdings" w:hAnsi="Wingdings" w:hint="default"/>
+        <w:sz w:val="20"/>
+      </w:rPr>
+    </w:lvl>
+    <w:lvl w:ilvl="5" w:tentative="1">
+      <w:start w:val="1"/>
+      <w:numFmt w:val="bullet"/>
+      <w:lvlText w:val=""/>
+      <w:lvlJc w:val="left"/>
+      <w:pPr>
+        <w:tabs>
+          <w:tab w:val="num" w:pos="4668"/>
+        </w:tabs>
+        <w:ind w:left="4668" w:hanging="360"/>
+      </w:pPr>
+      <w:rPr>
+        <w:rFonts w:ascii="Wingdings" w:hAnsi="Wingdings" w:hint="default"/>
+        <w:sz w:val="20"/>
+      </w:rPr>
+    </w:lvl>
+    <w:lvl w:ilvl="6" w:tentative="1">
+      <w:start w:val="1"/>
+      <w:numFmt w:val="bullet"/>
+      <w:lvlText w:val=""/>
+      <w:lvlJc w:val="left"/>
+      <w:pPr>
+        <w:tabs>
+          <w:tab w:val="num" w:pos="5388"/>
+        </w:tabs>
+        <w:ind w:left="5388" w:hanging="360"/>
+      </w:pPr>
+      <w:rPr>
+        <w:rFonts w:ascii="Wingdings" w:hAnsi="Wingdings" w:hint="default"/>
+        <w:sz w:val="20"/>
+      </w:rPr>
+    </w:lvl>
+    <w:lvl w:ilvl="7" w:tentative="1">
+      <w:start w:val="1"/>
+      <w:numFmt w:val="bullet"/>
+      <w:lvlText w:val=""/>
+      <w:lvlJc w:val="left"/>
+      <w:pPr>
+        <w:tabs>
+          <w:tab w:val="num" w:pos="6108"/>
+        </w:tabs>
+        <w:ind w:left="6108" w:hanging="360"/>
+      </w:pPr>
+      <w:rPr>
+        <w:rFonts w:ascii="Wingdings" w:hAnsi="Wingdings" w:hint="default"/>
+        <w:sz w:val="20"/>
+      </w:rPr>
+    </w:lvl>
+    <w:lvl w:ilvl="8" w:tentative="1">
+      <w:start w:val="1"/>
+      <w:numFmt w:val="bullet"/>
+      <w:lvlText w:val=""/>
+      <w:lvlJc w:val="left"/>
+      <w:pPr>
+        <w:tabs>
+          <w:tab w:val="num" w:pos="6828"/>
+        </w:tabs>
+        <w:ind w:left="6828" w:hanging="360"/>
+      </w:pPr>
+      <w:rPr>
+        <w:rFonts w:ascii="Wingdings" w:hAnsi="Wingdings" w:hint="default"/>
+        <w:sz w:val="20"/>
+      </w:rPr>
+    </w:lvl>
+  </w:abstractNum>
+  <w:abstractNum w:abstractNumId="15" w15:restartNumberingAfterBreak="0">
+    <w:nsid w:val="79335EBC"/>
+    <w:multiLevelType w:val="multilevel"/>
+    <w:tmpl w:val="42E82A3E"/>
+    <w:lvl w:ilvl="0">
+      <w:start w:val="1"/>
+      <w:numFmt w:val="bullet"/>
+      <w:lvlText w:val=""/>
+      <w:lvlJc w:val="left"/>
+      <w:pPr>
+        <w:tabs>
+          <w:tab w:val="num" w:pos="720"/>
+        </w:tabs>
+        <w:ind w:left="720" w:hanging="360"/>
+      </w:pPr>
+      <w:rPr>
+        <w:rFonts w:ascii="Symbol" w:hAnsi="Symbol" w:hint="default"/>
+        <w:sz w:val="20"/>
+      </w:rPr>
+    </w:lvl>
+    <w:lvl w:ilvl="1" w:tentative="1">
+      <w:start w:val="1"/>
+      <w:numFmt w:val="bullet"/>
+      <w:lvlText w:val="o"/>
+      <w:lvlJc w:val="left"/>
+      <w:pPr>
+        <w:tabs>
+          <w:tab w:val="num" w:pos="1440"/>
+        </w:tabs>
+        <w:ind w:left="1440" w:hanging="360"/>
+      </w:pPr>
+      <w:rPr>
+        <w:rFonts w:ascii="Courier New" w:hAnsi="Courier New" w:hint="default"/>
+        <w:sz w:val="20"/>
+      </w:rPr>
+    </w:lvl>
+    <w:lvl w:ilvl="2" w:tentative="1">
+      <w:start w:val="1"/>
+      <w:numFmt w:val="bullet"/>
+      <w:lvlText w:val=""/>
+      <w:lvlJc w:val="left"/>
+      <w:pPr>
+        <w:tabs>
+          <w:tab w:val="num" w:pos="2160"/>
+        </w:tabs>
+        <w:ind w:left="2160" w:hanging="360"/>
+      </w:pPr>
+      <w:rPr>
+        <w:rFonts w:ascii="Wingdings" w:hAnsi="Wingdings" w:hint="default"/>
+        <w:sz w:val="20"/>
+      </w:rPr>
+    </w:lvl>
+    <w:lvl w:ilvl="3" w:tentative="1">
+      <w:start w:val="1"/>
+      <w:numFmt w:val="bullet"/>
+      <w:lvlText w:val=""/>
+      <w:lvlJc w:val="left"/>
+      <w:pPr>
+        <w:tabs>
+          <w:tab w:val="num" w:pos="2880"/>
+        </w:tabs>
+        <w:ind w:left="2880" w:hanging="360"/>
+      </w:pPr>
+      <w:rPr>
+        <w:rFonts w:ascii="Wingdings" w:hAnsi="Wingdings" w:hint="default"/>
+        <w:sz w:val="20"/>
+      </w:rPr>
+    </w:lvl>
+    <w:lvl w:ilvl="4" w:tentative="1">
+      <w:start w:val="1"/>
+      <w:numFmt w:val="bullet"/>
+      <w:lvlText w:val=""/>
+      <w:lvlJc w:val="left"/>
+      <w:pPr>
+        <w:tabs>
+          <w:tab w:val="num" w:pos="3600"/>
+        </w:tabs>
+        <w:ind w:left="3600" w:hanging="360"/>
+      </w:pPr>
+      <w:rPr>
+        <w:rFonts w:ascii="Wingdings" w:hAnsi="Wingdings" w:hint="default"/>
+        <w:sz w:val="20"/>
+      </w:rPr>
+    </w:lvl>
+    <w:lvl w:ilvl="5" w:tentative="1">
+      <w:start w:val="1"/>
+      <w:numFmt w:val="bullet"/>
+      <w:lvlText w:val=""/>
+      <w:lvlJc w:val="left"/>
+      <w:pPr>
+        <w:tabs>
+          <w:tab w:val="num" w:pos="4320"/>
+        </w:tabs>
+        <w:ind w:left="4320" w:hanging="360"/>
+      </w:pPr>
+      <w:rPr>
+        <w:rFonts w:ascii="Wingdings" w:hAnsi="Wingdings" w:hint="default"/>
+        <w:sz w:val="20"/>
+      </w:rPr>
+    </w:lvl>
+    <w:lvl w:ilvl="6" w:tentative="1">
+      <w:start w:val="1"/>
+      <w:numFmt w:val="bullet"/>
+      <w:lvlText w:val=""/>
+      <w:lvlJc w:val="left"/>
+      <w:pPr>
+        <w:tabs>
+          <w:tab w:val="num" w:pos="5040"/>
+        </w:tabs>
+        <w:ind w:left="5040" w:hanging="360"/>
+      </w:pPr>
+      <w:rPr>
+        <w:rFonts w:ascii="Wingdings" w:hAnsi="Wingdings" w:hint="default"/>
+        <w:sz w:val="20"/>
+      </w:rPr>
+    </w:lvl>
+    <w:lvl w:ilvl="7" w:tentative="1">
+      <w:start w:val="1"/>
+      <w:numFmt w:val="bullet"/>
+      <w:lvlText w:val=""/>
+      <w:lvlJc w:val="left"/>
+      <w:pPr>
+        <w:tabs>
+          <w:tab w:val="num" w:pos="5760"/>
+        </w:tabs>
+        <w:ind w:left="5760" w:hanging="360"/>
+      </w:pPr>
+      <w:rPr>
+        <w:rFonts w:ascii="Wingdings" w:hAnsi="Wingdings" w:hint="default"/>
+        <w:sz w:val="20"/>
+      </w:rPr>
+    </w:lvl>
+    <w:lvl w:ilvl="8" w:tentative="1">
+      <w:start w:val="1"/>
+      <w:numFmt w:val="bullet"/>
+      <w:lvlText w:val=""/>
+      <w:lvlJc w:val="left"/>
+      <w:pPr>
+        <w:tabs>
+          <w:tab w:val="num" w:pos="6480"/>
+        </w:tabs>
+        <w:ind w:left="6480" w:hanging="360"/>
+      </w:pPr>
+      <w:rPr>
+        <w:rFonts w:ascii="Wingdings" w:hAnsi="Wingdings" w:hint="default"/>
+        <w:sz w:val="20"/>
+      </w:rPr>
+    </w:lvl>
+  </w:abstractNum>
+  <w:abstractNum w:abstractNumId="16" w15:restartNumberingAfterBreak="0">
+    <w:nsid w:val="7AA429A4"/>
+    <w:multiLevelType w:val="hybridMultilevel"/>
+    <w:tmpl w:val="D96C8F36"/>
+    <w:lvl w:ilvl="0" w:tplc="FFFFFFFF">
+      <w:start w:val="1"/>
+      <w:numFmt w:val="bullet"/>
+      <w:lvlText w:val=""/>
+      <w:lvlJc w:val="left"/>
+      <w:pPr>
+        <w:ind w:left="720" w:hanging="360"/>
+      </w:pPr>
+      <w:rPr>
+        <w:rFonts w:ascii="Symbol" w:hAnsi="Symbol" w:hint="default"/>
+      </w:rPr>
+    </w:lvl>
+    <w:lvl w:ilvl="1" w:tplc="04150001">
+      <w:start w:val="1"/>
+      <w:numFmt w:val="bullet"/>
+      <w:lvlText w:val=""/>
+      <w:lvlJc w:val="left"/>
+      <w:pPr>
+        <w:ind w:left="1080" w:hanging="360"/>
+      </w:pPr>
+      <w:rPr>
+        <w:rFonts w:ascii="Symbol" w:hAnsi="Symbol" w:hint="default"/>
+      </w:rPr>
+    </w:lvl>
+    <w:lvl w:ilvl="2" w:tplc="FFFFFFFF">
+      <w:start w:val="1"/>
+      <w:numFmt w:val="bullet"/>
+      <w:lvlText w:val=""/>
+      <w:lvlJc w:val="left"/>
+      <w:pPr>
+        <w:ind w:left="2160" w:hanging="360"/>
+      </w:pPr>
+      <w:rPr>
+        <w:rFonts w:ascii="Wingdings" w:hAnsi="Wingdings" w:hint="default"/>
+      </w:rPr>
+    </w:lvl>
+    <w:lvl w:ilvl="3" w:tplc="FFFFFFFF" w:tentative="1">
+      <w:start w:val="1"/>
+      <w:numFmt w:val="bullet"/>
+      <w:lvlText w:val=""/>
+      <w:lvlJc w:val="left"/>
+      <w:pPr>
+        <w:ind w:left="2880" w:hanging="360"/>
+      </w:pPr>
+      <w:rPr>
+        <w:rFonts w:ascii="Symbol" w:hAnsi="Symbol" w:hint="default"/>
+      </w:rPr>
+    </w:lvl>
+    <w:lvl w:ilvl="4" w:tplc="FFFFFFFF" w:tentative="1">
+      <w:start w:val="1"/>
+      <w:numFmt w:val="bullet"/>
+      <w:lvlText w:val="o"/>
+      <w:lvlJc w:val="left"/>
+      <w:pPr>
+        <w:ind w:left="3600" w:hanging="360"/>
+      </w:pPr>
+      <w:rPr>
+        <w:rFonts w:ascii="Courier New" w:hAnsi="Courier New" w:cs="Courier New" w:hint="default"/>
+      </w:rPr>
+    </w:lvl>
+    <w:lvl w:ilvl="5" w:tplc="FFFFFFFF" w:tentative="1">
+      <w:start w:val="1"/>
+      <w:numFmt w:val="bullet"/>
+      <w:lvlText w:val=""/>
+      <w:lvlJc w:val="left"/>
+      <w:pPr>
+        <w:ind w:left="4320" w:hanging="360"/>
+      </w:pPr>
+      <w:rPr>
+        <w:rFonts w:ascii="Wingdings" w:hAnsi="Wingdings" w:hint="default"/>
+      </w:rPr>
+    </w:lvl>
+    <w:lvl w:ilvl="6" w:tplc="FFFFFFFF" w:tentative="1">
+      <w:start w:val="1"/>
+      <w:numFmt w:val="bullet"/>
+      <w:lvlText w:val=""/>
+      <w:lvlJc w:val="left"/>
+      <w:pPr>
+        <w:ind w:left="5040" w:hanging="360"/>
+      </w:pPr>
+      <w:rPr>
+        <w:rFonts w:ascii="Symbol" w:hAnsi="Symbol" w:hint="default"/>
+      </w:rPr>
+    </w:lvl>
+    <w:lvl w:ilvl="7" w:tplc="FFFFFFFF" w:tentative="1">
+      <w:start w:val="1"/>
+      <w:numFmt w:val="bullet"/>
+      <w:lvlText w:val="o"/>
+      <w:lvlJc w:val="left"/>
+      <w:pPr>
+        <w:ind w:left="5760" w:hanging="360"/>
+      </w:pPr>
+      <w:rPr>
+        <w:rFonts w:ascii="Courier New" w:hAnsi="Courier New" w:cs="Courier New" w:hint="default"/>
+      </w:rPr>
+    </w:lvl>
+    <w:lvl w:ilvl="8" w:tplc="FFFFFFFF" w:tentative="1">
+      <w:start w:val="1"/>
+      <w:numFmt w:val="bullet"/>
+      <w:lvlText w:val=""/>
+      <w:lvlJc w:val="left"/>
+      <w:pPr>
+        <w:ind w:left="6480" w:hanging="360"/>
+      </w:pPr>
+      <w:rPr>
+        <w:rFonts w:ascii="Wingdings" w:hAnsi="Wingdings" w:hint="default"/>
+      </w:rPr>
+    </w:lvl>
+  </w:abstractNum>
   <w:num w:numId="1" w16cid:durableId="1483887667">
+    <w:abstractNumId w:val="2"/>
+  </w:num>
+  <w:num w:numId="2" w16cid:durableId="1502163515">
+    <w:abstractNumId w:val="7"/>
+  </w:num>
+  <w:num w:numId="3" w16cid:durableId="1562788965">
+    <w:abstractNumId w:val="13"/>
+  </w:num>
+  <w:num w:numId="4" w16cid:durableId="1998266894">
     <w:abstractNumId w:val="1"/>
   </w:num>
-  <w:num w:numId="2" w16cid:durableId="1502163515">
-    <w:abstractNumId w:val="2"/>
+  <w:num w:numId="5" w16cid:durableId="1322808972">
+    <w:abstractNumId w:val="8"/>
   </w:num>
-  <w:num w:numId="3" w16cid:durableId="1562788965">
+  <w:num w:numId="6" w16cid:durableId="837694082">
+    <w:abstractNumId w:val="11"/>
+  </w:num>
+  <w:num w:numId="7" w16cid:durableId="823206007">
+    <w:abstractNumId w:val="9"/>
+  </w:num>
+  <w:num w:numId="8" w16cid:durableId="1363743005">
+    <w:abstractNumId w:val="6"/>
+  </w:num>
+  <w:num w:numId="9" w16cid:durableId="588124785">
+    <w:abstractNumId w:val="5"/>
+  </w:num>
+  <w:num w:numId="10" w16cid:durableId="1078095313">
+    <w:abstractNumId w:val="4"/>
+  </w:num>
+  <w:num w:numId="11" w16cid:durableId="1849127762">
+    <w:abstractNumId w:val="10"/>
+  </w:num>
+  <w:num w:numId="12" w16cid:durableId="1148668001">
+    <w:abstractNumId w:val="16"/>
+  </w:num>
+  <w:num w:numId="13" w16cid:durableId="31999563">
+    <w:abstractNumId w:val="15"/>
+  </w:num>
+  <w:num w:numId="14" w16cid:durableId="304706171">
     <w:abstractNumId w:val="3"/>
   </w:num>
-  <w:num w:numId="4" w16cid:durableId="1998266894">
+  <w:num w:numId="15" w16cid:durableId="745686882">
     <w:abstractNumId w:val="0"/>
+  </w:num>
+  <w:num w:numId="16" w16cid:durableId="1583219076">
+    <w:abstractNumId w:val="12"/>
+  </w:num>
+  <w:num w:numId="17" w16cid:durableId="585498789">
+    <w:abstractNumId w:val="14"/>
   </w:num>
 </w:numbering>
 </file>
@@ -2129,7 +5790,6 @@
     <w:basedOn w:val="Normalny"/>
     <w:next w:val="Normalny"/>
     <w:uiPriority w:val="9"/>
-    <w:semiHidden/>
     <w:unhideWhenUsed/>
     <w:qFormat/>
     <w:rsid w:val="007901B5"/>
@@ -2433,7 +6093,6 @@
     <w:name w:val="Nagłówek 4 Znak"/>
     <w:basedOn w:val="Domylnaczcionkaakapitu"/>
     <w:uiPriority w:val="9"/>
-    <w:semiHidden/>
     <w:rsid w:val="003206D7"/>
     <w:rPr>
       <w:rFonts w:eastAsiaTheme="majorEastAsia" w:cstheme="majorBidi"/>
@@ -2547,6 +6206,23 @@
       <w:i/>
       <w:iCs/>
       <w:color w:val="0F4761" w:themeColor="accent1" w:themeShade="BF"/>
+    </w:rPr>
+  </w:style>
+  <w:style w:type="paragraph" w:styleId="NormalnyWeb">
+    <w:name w:val="Normal (Web)"/>
+    <w:basedOn w:val="Normalny"/>
+    <w:uiPriority w:val="99"/>
+    <w:semiHidden/>
+    <w:unhideWhenUsed/>
+    <w:rsid w:val="00E667D2"/>
+    <w:pPr>
+      <w:spacing w:before="100" w:beforeAutospacing="1" w:after="100" w:afterAutospacing="1" w:line="240" w:lineRule="auto"/>
+    </w:pPr>
+    <w:rPr>
+      <w:rFonts w:ascii="Times New Roman" w:eastAsia="Times New Roman" w:hAnsi="Times New Roman" w:cs="Times New Roman"/>
+      <w:kern w:val="0"/>
+      <w:lang w:eastAsia="pl-PL"/>
+      <w14:ligatures w14:val="none"/>
     </w:rPr>
   </w:style>
 </w:styles>
@@ -2868,23 +6544,6 @@
 </file>
 
 <file path=customXml/item1.xml><?xml version="1.0" encoding="utf-8"?>
-<p:properties xmlns:p="http://schemas.microsoft.com/office/2006/metadata/properties" xmlns:xsi="http://www.w3.org/2001/XMLSchema-instance" xmlns:pc="http://schemas.microsoft.com/office/infopath/2007/PartnerControls">
-  <documentManagement>
-    <_activity xmlns="01a094b0-08a8-443b-bd9d-7d2701d1cf8a" xsi:nil="true"/>
-  </documentManagement>
-</p:properties>
-</file>
-
-<file path=customXml/item2.xml><?xml version="1.0" encoding="utf-8"?>
-<?mso-contentType ?>
-<FormTemplates xmlns="http://schemas.microsoft.com/sharepoint/v3/contenttype/forms">
-  <Display>DocumentLibraryForm</Display>
-  <Edit>DocumentLibraryForm</Edit>
-  <New>DocumentLibraryForm</New>
-</FormTemplates>
-</file>
-
-<file path=customXml/item3.xml><?xml version="1.0" encoding="utf-8"?>
 <ct:contentTypeSchema xmlns:ct="http://schemas.microsoft.com/office/2006/metadata/contentType" xmlns:ma="http://schemas.microsoft.com/office/2006/metadata/properties/metaAttributes" ct:_="" ma:_="" ma:contentTypeName="Dokument" ma:contentTypeID="0x010100CCB42EE1A2101A46A529E33B73FA5B9E" ma:contentTypeVersion="10" ma:contentTypeDescription="Utwórz nowy dokument." ma:contentTypeScope="" ma:versionID="fb28c9b49a9d7ee7992a0068d83f7825">
   <xsd:schema xmlns:xsd="http://www.w3.org/2001/XMLSchema" xmlns:xs="http://www.w3.org/2001/XMLSchema" xmlns:p="http://schemas.microsoft.com/office/2006/metadata/properties" xmlns:ns3="01a094b0-08a8-443b-bd9d-7d2701d1cf8a" targetNamespace="http://schemas.microsoft.com/office/2006/metadata/properties" ma:root="true" ma:fieldsID="4d7bfa7a1f1f07c1257d0e29d16acf8e" ns3:_="">
     <xsd:import namespace="01a094b0-08a8-443b-bd9d-7d2701d1cf8a"/>
@@ -3066,29 +6725,28 @@
 </ct:contentTypeSchema>
 </file>
 
+<file path=customXml/item2.xml><?xml version="1.0" encoding="utf-8"?>
+<?mso-contentType ?>
+<FormTemplates xmlns="http://schemas.microsoft.com/sharepoint/v3/contenttype/forms">
+  <Display>DocumentLibraryForm</Display>
+  <Edit>DocumentLibraryForm</Edit>
+  <New>DocumentLibraryForm</New>
+</FormTemplates>
+</file>
+
+<file path=customXml/item3.xml><?xml version="1.0" encoding="utf-8"?>
+<p:properties xmlns:p="http://schemas.microsoft.com/office/2006/metadata/properties" xmlns:xsi="http://www.w3.org/2001/XMLSchema-instance" xmlns:pc="http://schemas.microsoft.com/office/infopath/2007/PartnerControls">
+  <documentManagement>
+    <_activity xmlns="01a094b0-08a8-443b-bd9d-7d2701d1cf8a" xsi:nil="true"/>
+  </documentManagement>
+</p:properties>
+</file>
+
 <file path=customXml/item4.xml><?xml version="1.0" encoding="utf-8"?>
 <b:Sources xmlns:b="http://schemas.openxmlformats.org/officeDocument/2006/bibliography" xmlns="http://schemas.openxmlformats.org/officeDocument/2006/bibliography" SelectedStyle="\APASixthEditionOfficeOnline.xsl" StyleName="APA" Version="6"/>
 </file>
 
 <file path=customXml/itemProps1.xml><?xml version="1.0" encoding="utf-8"?>
-<ds:datastoreItem xmlns:ds="http://schemas.openxmlformats.org/officeDocument/2006/customXml" ds:itemID="{11275EE7-436D-44BB-874B-06A9C0948B83}">
-  <ds:schemaRefs>
-    <ds:schemaRef ds:uri="http://schemas.microsoft.com/office/2006/metadata/properties"/>
-    <ds:schemaRef ds:uri="http://schemas.microsoft.com/office/infopath/2007/PartnerControls"/>
-    <ds:schemaRef ds:uri="01a094b0-08a8-443b-bd9d-7d2701d1cf8a"/>
-  </ds:schemaRefs>
-</ds:datastoreItem>
-</file>
-
-<file path=customXml/itemProps2.xml><?xml version="1.0" encoding="utf-8"?>
-<ds:datastoreItem xmlns:ds="http://schemas.openxmlformats.org/officeDocument/2006/customXml" ds:itemID="{846F3F10-2E3D-4091-84D7-32B19F5B918C}">
-  <ds:schemaRefs>
-    <ds:schemaRef ds:uri="http://schemas.microsoft.com/sharepoint/v3/contenttype/forms"/>
-  </ds:schemaRefs>
-</ds:datastoreItem>
-</file>
-
-<file path=customXml/itemProps3.xml><?xml version="1.0" encoding="utf-8"?>
 <ds:datastoreItem xmlns:ds="http://schemas.openxmlformats.org/officeDocument/2006/customXml" ds:itemID="{7456FE10-DABE-41A2-B0AD-3BA76596A10A}">
   <ds:schemaRefs>
     <ds:schemaRef ds:uri="http://schemas.microsoft.com/office/2006/metadata/contentType"/>
@@ -3106,6 +6764,24 @@
 </ds:datastoreItem>
 </file>
 
+<file path=customXml/itemProps2.xml><?xml version="1.0" encoding="utf-8"?>
+<ds:datastoreItem xmlns:ds="http://schemas.openxmlformats.org/officeDocument/2006/customXml" ds:itemID="{846F3F10-2E3D-4091-84D7-32B19F5B918C}">
+  <ds:schemaRefs>
+    <ds:schemaRef ds:uri="http://schemas.microsoft.com/sharepoint/v3/contenttype/forms"/>
+  </ds:schemaRefs>
+</ds:datastoreItem>
+</file>
+
+<file path=customXml/itemProps3.xml><?xml version="1.0" encoding="utf-8"?>
+<ds:datastoreItem xmlns:ds="http://schemas.openxmlformats.org/officeDocument/2006/customXml" ds:itemID="{11275EE7-436D-44BB-874B-06A9C0948B83}">
+  <ds:schemaRefs>
+    <ds:schemaRef ds:uri="http://schemas.microsoft.com/office/2006/metadata/properties"/>
+    <ds:schemaRef ds:uri="http://schemas.microsoft.com/office/infopath/2007/PartnerControls"/>
+    <ds:schemaRef ds:uri="01a094b0-08a8-443b-bd9d-7d2701d1cf8a"/>
+  </ds:schemaRefs>
+</ds:datastoreItem>
+</file>
+
 <file path=customXml/itemProps4.xml><?xml version="1.0" encoding="utf-8"?>
 <ds:datastoreItem xmlns:ds="http://schemas.openxmlformats.org/officeDocument/2006/customXml" ds:itemID="{211C353F-6200-4B5E-8492-7D72958BB88A}">
   <ds:schemaRefs>

</xml_diff>